<commit_message>
calidad: agregar pruebas unitarias en frontend, apuntar app movil a Railway y actualizar plan de pruebas
</commit_message>
<xml_diff>
--- a/Documentacion/Unidad #3/3.1.2 Plan Pruebas Funcionales.docx
+++ b/Documentacion/Unidad #3/3.1.2 Plan Pruebas Funcionales.docx
@@ -3673,6 +3673,318 @@
           </w:p>
         </w:tc>
       </w:tr>
+      <w:tr>
+        <w:tc>
+          <w:tcPr>
+            <w:tcW w:type="dxa" w:w="1007"/>
+          </w:tcPr>
+          <w:p>
+            <w:r>
+              <w:t>CP-23</w:t>
+            </w:r>
+          </w:p>
+        </w:tc>
+        <w:tc>
+          <w:tcPr>
+            <w:tcW w:type="dxa" w:w="1006"/>
+          </w:tcPr>
+          <w:p>
+            <w:r/>
+          </w:p>
+        </w:tc>
+        <w:tc>
+          <w:tcPr>
+            <w:tcW w:type="dxa" w:w="1006"/>
+          </w:tcPr>
+          <w:p>
+            <w:r/>
+          </w:p>
+        </w:tc>
+        <w:tc>
+          <w:tcPr>
+            <w:tcW w:type="dxa" w:w="1007"/>
+          </w:tcPr>
+          <w:p>
+            <w:r/>
+          </w:p>
+        </w:tc>
+        <w:tc>
+          <w:tcPr>
+            <w:tcW w:type="dxa" w:w="1007"/>
+          </w:tcPr>
+          <w:p>
+            <w:r/>
+          </w:p>
+        </w:tc>
+        <w:tc>
+          <w:tcPr>
+            <w:tcW w:type="dxa" w:w="1007"/>
+          </w:tcPr>
+          <w:p>
+            <w:r/>
+          </w:p>
+        </w:tc>
+        <w:tc>
+          <w:tcPr>
+            <w:tcW w:type="dxa" w:w="1007"/>
+          </w:tcPr>
+          <w:p>
+            <w:r/>
+          </w:p>
+        </w:tc>
+        <w:tc>
+          <w:tcPr>
+            <w:tcW w:type="dxa" w:w="1007"/>
+          </w:tcPr>
+          <w:p>
+            <w:r>
+              <w:t>X</w:t>
+            </w:r>
+          </w:p>
+        </w:tc>
+        <w:tc>
+          <w:tcPr>
+            <w:tcW w:type="dxa" w:w="1007"/>
+          </w:tcPr>
+          <w:p>
+            <w:r/>
+          </w:p>
+        </w:tc>
+      </w:tr>
+      <w:tr>
+        <w:tc>
+          <w:tcPr>
+            <w:tcW w:type="dxa" w:w="1007"/>
+          </w:tcPr>
+          <w:p>
+            <w:r>
+              <w:t>CP-24</w:t>
+            </w:r>
+          </w:p>
+        </w:tc>
+        <w:tc>
+          <w:tcPr>
+            <w:tcW w:type="dxa" w:w="1006"/>
+          </w:tcPr>
+          <w:p>
+            <w:r/>
+          </w:p>
+        </w:tc>
+        <w:tc>
+          <w:tcPr>
+            <w:tcW w:type="dxa" w:w="1006"/>
+          </w:tcPr>
+          <w:p>
+            <w:r/>
+          </w:p>
+        </w:tc>
+        <w:tc>
+          <w:tcPr>
+            <w:tcW w:type="dxa" w:w="1007"/>
+          </w:tcPr>
+          <w:p>
+            <w:r/>
+          </w:p>
+        </w:tc>
+        <w:tc>
+          <w:tcPr>
+            <w:tcW w:type="dxa" w:w="1007"/>
+          </w:tcPr>
+          <w:p>
+            <w:r/>
+          </w:p>
+        </w:tc>
+        <w:tc>
+          <w:tcPr>
+            <w:tcW w:type="dxa" w:w="1007"/>
+          </w:tcPr>
+          <w:p>
+            <w:r/>
+          </w:p>
+        </w:tc>
+        <w:tc>
+          <w:tcPr>
+            <w:tcW w:type="dxa" w:w="1007"/>
+          </w:tcPr>
+          <w:p>
+            <w:r/>
+          </w:p>
+        </w:tc>
+        <w:tc>
+          <w:tcPr>
+            <w:tcW w:type="dxa" w:w="1007"/>
+          </w:tcPr>
+          <w:p>
+            <w:r/>
+          </w:p>
+        </w:tc>
+        <w:tc>
+          <w:tcPr>
+            <w:tcW w:type="dxa" w:w="1007"/>
+          </w:tcPr>
+          <w:p>
+            <w:r>
+              <w:t>X</w:t>
+            </w:r>
+          </w:p>
+        </w:tc>
+      </w:tr>
+      <w:tr>
+        <w:tc>
+          <w:tcPr>
+            <w:tcW w:type="dxa" w:w="1007"/>
+          </w:tcPr>
+          <w:p>
+            <w:r>
+              <w:t>CP-25</w:t>
+            </w:r>
+          </w:p>
+        </w:tc>
+        <w:tc>
+          <w:tcPr>
+            <w:tcW w:type="dxa" w:w="1006"/>
+          </w:tcPr>
+          <w:p>
+            <w:r/>
+          </w:p>
+        </w:tc>
+        <w:tc>
+          <w:tcPr>
+            <w:tcW w:type="dxa" w:w="1006"/>
+          </w:tcPr>
+          <w:p>
+            <w:r/>
+          </w:p>
+        </w:tc>
+        <w:tc>
+          <w:tcPr>
+            <w:tcW w:type="dxa" w:w="1007"/>
+          </w:tcPr>
+          <w:p>
+            <w:r/>
+          </w:p>
+        </w:tc>
+        <w:tc>
+          <w:tcPr>
+            <w:tcW w:type="dxa" w:w="1007"/>
+          </w:tcPr>
+          <w:p>
+            <w:r/>
+          </w:p>
+        </w:tc>
+        <w:tc>
+          <w:tcPr>
+            <w:tcW w:type="dxa" w:w="1007"/>
+          </w:tcPr>
+          <w:p>
+            <w:r>
+              <w:t>X</w:t>
+            </w:r>
+          </w:p>
+        </w:tc>
+        <w:tc>
+          <w:tcPr>
+            <w:tcW w:type="dxa" w:w="1007"/>
+          </w:tcPr>
+          <w:p>
+            <w:r/>
+          </w:p>
+        </w:tc>
+        <w:tc>
+          <w:tcPr>
+            <w:tcW w:type="dxa" w:w="1007"/>
+          </w:tcPr>
+          <w:p>
+            <w:r/>
+          </w:p>
+        </w:tc>
+        <w:tc>
+          <w:tcPr>
+            <w:tcW w:type="dxa" w:w="1007"/>
+          </w:tcPr>
+          <w:p>
+            <w:r/>
+          </w:p>
+        </w:tc>
+      </w:tr>
+      <w:tr>
+        <w:tc>
+          <w:tcPr>
+            <w:tcW w:type="dxa" w:w="1007"/>
+          </w:tcPr>
+          <w:p>
+            <w:r>
+              <w:t>CP-26</w:t>
+            </w:r>
+          </w:p>
+        </w:tc>
+        <w:tc>
+          <w:tcPr>
+            <w:tcW w:type="dxa" w:w="1006"/>
+          </w:tcPr>
+          <w:p>
+            <w:r/>
+          </w:p>
+        </w:tc>
+        <w:tc>
+          <w:tcPr>
+            <w:tcW w:type="dxa" w:w="1006"/>
+          </w:tcPr>
+          <w:p>
+            <w:r>
+              <w:t>X</w:t>
+            </w:r>
+          </w:p>
+        </w:tc>
+        <w:tc>
+          <w:tcPr>
+            <w:tcW w:type="dxa" w:w="1007"/>
+          </w:tcPr>
+          <w:p>
+            <w:r/>
+          </w:p>
+        </w:tc>
+        <w:tc>
+          <w:tcPr>
+            <w:tcW w:type="dxa" w:w="1007"/>
+          </w:tcPr>
+          <w:p>
+            <w:r/>
+          </w:p>
+        </w:tc>
+        <w:tc>
+          <w:tcPr>
+            <w:tcW w:type="dxa" w:w="1007"/>
+          </w:tcPr>
+          <w:p>
+            <w:r/>
+          </w:p>
+        </w:tc>
+        <w:tc>
+          <w:tcPr>
+            <w:tcW w:type="dxa" w:w="1007"/>
+          </w:tcPr>
+          <w:p>
+            <w:r/>
+          </w:p>
+        </w:tc>
+        <w:tc>
+          <w:tcPr>
+            <w:tcW w:type="dxa" w:w="1007"/>
+          </w:tcPr>
+          <w:p>
+            <w:r/>
+          </w:p>
+        </w:tc>
+        <w:tc>
+          <w:tcPr>
+            <w:tcW w:type="dxa" w:w="1007"/>
+          </w:tcPr>
+          <w:p>
+            <w:r/>
+          </w:p>
+        </w:tc>
+      </w:tr>
     </w:tbl>
     <w:p>
       <w:pPr>
@@ -7864,6 +8176,902 @@
                 <w:sz w:val="20"/>
               </w:rPr>
               <w:t>Resultado obtenido: Ejecutado con éxito. Se verifica el comportamiento esperado del sistema sin errores.</w:t>
+            </w:r>
+          </w:p>
+        </w:tc>
+      </w:tr>
+      <w:tr>
+        <w:tc>
+          <w:tcPr>
+            <w:tcW w:type="dxa" w:w="3021"/>
+          </w:tcPr>
+          <w:p>
+            <w:r>
+              <w:t>Prueba unitaria de Barra de Navegación (Navbar)</w:t>
+            </w:r>
+          </w:p>
+        </w:tc>
+        <w:tc>
+          <w:tcPr>
+            <w:tcW w:type="dxa" w:w="3021"/>
+          </w:tcPr>
+          <w:p>
+            <w:r>
+              <w:t>CP-23</w:t>
+            </w:r>
+          </w:p>
+        </w:tc>
+        <w:tc>
+          <w:tcPr>
+            <w:tcW w:type="dxa" w:w="3019"/>
+          </w:tcPr>
+          <w:p>
+            <w:r>
+              <w:t>CP-23</w:t>
+            </w:r>
+          </w:p>
+        </w:tc>
+      </w:tr>
+      <w:tr>
+        <w:tc>
+          <w:tcPr>
+            <w:tcW w:type="dxa" w:w="3021"/>
+          </w:tcPr>
+          <w:p>
+            <w:r>
+              <w:t>Prueba unitaria de Barra de Navegación (Navbar)</w:t>
+            </w:r>
+          </w:p>
+        </w:tc>
+        <w:tc>
+          <w:tcPr>
+            <w:tcW w:type="dxa" w:w="3021"/>
+          </w:tcPr>
+          <w:p>
+            <w:r>
+              <w:t>¿Prueba de despliegue?</w:t>
+            </w:r>
+          </w:p>
+        </w:tc>
+        <w:tc>
+          <w:tcPr>
+            <w:tcW w:type="dxa" w:w="3019"/>
+          </w:tcPr>
+          <w:p>
+            <w:r>
+              <w:t>No</w:t>
+            </w:r>
+          </w:p>
+        </w:tc>
+      </w:tr>
+      <w:tr>
+        <w:tc>
+          <w:tcPr>
+            <w:tcW w:type="dxa" w:w="3021"/>
+          </w:tcPr>
+          <w:p>
+            <w:r>
+              <w:t>Descripción: Verificar el renderizado de opciones según el rol del usuario (Público, Trabajador, Empresa, Administrador) y flujo de cierre de sesión.</w:t>
+            </w:r>
+          </w:p>
+        </w:tc>
+        <w:tc>
+          <w:tcPr>
+            <w:tcW w:type="dxa" w:w="3021"/>
+          </w:tcPr>
+          <w:p>
+            <w:r>
+              <w:t>Descripción: Verificar el renderizado de opciones según el rol del usuario (Público, Trabajador, Empresa, Administrador) y flujo de cierre de sesión.</w:t>
+            </w:r>
+          </w:p>
+        </w:tc>
+        <w:tc>
+          <w:tcPr>
+            <w:tcW w:type="dxa" w:w="3019"/>
+          </w:tcPr>
+          <w:p>
+            <w:r>
+              <w:t>Descripción: Verificar el renderizado de opciones según el rol del usuario (Público, Trabajador, Empresa, Administrador) y flujo de cierre de sesión.</w:t>
+            </w:r>
+          </w:p>
+        </w:tc>
+      </w:tr>
+      <w:tr>
+        <w:tc>
+          <w:tcPr>
+            <w:tcW w:type="dxa" w:w="3021"/>
+          </w:tcPr>
+          <w:p>
+            <w:r>
+              <w:t>Prerrequisitos: Componente renderizado bajo React Testing Library con mocks de enrutamiento y localStorage.</w:t>
+            </w:r>
+          </w:p>
+        </w:tc>
+        <w:tc>
+          <w:tcPr>
+            <w:tcW w:type="dxa" w:w="3021"/>
+          </w:tcPr>
+          <w:p>
+            <w:r>
+              <w:t>Prerrequisitos: Componente renderizado bajo React Testing Library con mocks de enrutamiento y localStorage.</w:t>
+            </w:r>
+          </w:p>
+        </w:tc>
+        <w:tc>
+          <w:tcPr>
+            <w:tcW w:type="dxa" w:w="3019"/>
+          </w:tcPr>
+          <w:p>
+            <w:r>
+              <w:t>Prerrequisitos: Componente renderizado bajo React Testing Library con mocks de enrutamiento y localStorage.</w:t>
+            </w:r>
+          </w:p>
+        </w:tc>
+      </w:tr>
+      <w:tr>
+        <w:tc>
+          <w:tcPr>
+            <w:tcW w:type="dxa" w:w="3021"/>
+          </w:tcPr>
+          <w:p>
+            <w:r>
+              <w:t>Pasos: 1. Renderizar Navbar sin sesión activa. 2. Cambiar a rol Trabajador/Empresa/Admin y verificar links de panel. 3. Hacer clic en "Cerrar Sesión" y confirmar.</w:t>
+            </w:r>
+          </w:p>
+        </w:tc>
+        <w:tc>
+          <w:tcPr>
+            <w:tcW w:type="dxa" w:w="3021"/>
+          </w:tcPr>
+          <w:p>
+            <w:r>
+              <w:t>Pasos: 1. Renderizar Navbar sin sesión activa. 2. Cambiar a rol Trabajador/Empresa/Admin y verificar links de panel. 3. Hacer clic en "Cerrar Sesión" y confirmar.</w:t>
+            </w:r>
+          </w:p>
+        </w:tc>
+        <w:tc>
+          <w:tcPr>
+            <w:tcW w:type="dxa" w:w="3019"/>
+          </w:tcPr>
+          <w:p>
+            <w:r>
+              <w:t>Pasos: 1. Renderizar Navbar sin sesión activa. 2. Cambiar a rol Trabajador/Empresa/Admin y verificar links de panel. 3. Hacer clic en "Cerrar Sesión" y confirmar.</w:t>
+            </w:r>
+          </w:p>
+        </w:tc>
+      </w:tr>
+      <w:tr>
+        <w:tc>
+          <w:tcPr>
+            <w:tcW w:type="dxa" w:w="3021"/>
+          </w:tcPr>
+          <w:p>
+            <w:r>
+              <w:t>Resultado esperado: Se muestran links públicos sin sesión, menús de dashboard correspondientes para Trabajador/Empresa/Admin, y se limpia la sesión en el logout.</w:t>
+            </w:r>
+          </w:p>
+        </w:tc>
+        <w:tc>
+          <w:tcPr>
+            <w:tcW w:type="dxa" w:w="3021"/>
+          </w:tcPr>
+          <w:p>
+            <w:r>
+              <w:t>Resultado esperado: Se muestran links públicos sin sesión, menús de dashboard correspondientes para Trabajador/Empresa/Admin, y se limpia la sesión en el logout.</w:t>
+            </w:r>
+          </w:p>
+        </w:tc>
+        <w:tc>
+          <w:tcPr>
+            <w:tcW w:type="dxa" w:w="3019"/>
+          </w:tcPr>
+          <w:p>
+            <w:r>
+              <w:t>Resultado esperado: Se muestran links públicos sin sesión, menús de dashboard correspondientes para Trabajador/Empresa/Admin, y se limpia la sesión en el logout.</w:t>
+            </w:r>
+          </w:p>
+        </w:tc>
+      </w:tr>
+      <w:tr>
+        <w:tc>
+          <w:tcPr>
+            <w:tcW w:type="dxa" w:w="3021"/>
+          </w:tcPr>
+          <w:p>
+            <w:r>
+              <w:t>Resultado obtenido: Ejecutado con éxito. Pruebas automatizadas en Vitest pasadas al 100% sin advertencias.</w:t>
+            </w:r>
+          </w:p>
+        </w:tc>
+        <w:tc>
+          <w:tcPr>
+            <w:tcW w:type="dxa" w:w="3021"/>
+          </w:tcPr>
+          <w:p>
+            <w:r>
+              <w:t>Resultado obtenido: Ejecutado con éxito. Pruebas automatizadas en Vitest pasadas al 100% sin advertencias.</w:t>
+            </w:r>
+          </w:p>
+        </w:tc>
+        <w:tc>
+          <w:tcPr>
+            <w:tcW w:type="dxa" w:w="3019"/>
+          </w:tcPr>
+          <w:p>
+            <w:r>
+              <w:t>Resultado obtenido: Ejecutado con éxito. Pruebas automatizadas en Vitest pasadas al 100% sin advertencias.</w:t>
+            </w:r>
+          </w:p>
+        </w:tc>
+      </w:tr>
+      <w:tr>
+        <w:tc>
+          <w:tcPr>
+            <w:tcW w:type="dxa" w:w="3021"/>
+          </w:tcPr>
+          <w:p>
+            <w:r>
+              <w:t>Prueba unitaria de Campana de Notificaciones</w:t>
+            </w:r>
+          </w:p>
+        </w:tc>
+        <w:tc>
+          <w:tcPr>
+            <w:tcW w:type="dxa" w:w="3021"/>
+          </w:tcPr>
+          <w:p>
+            <w:r>
+              <w:t>CP-24</w:t>
+            </w:r>
+          </w:p>
+        </w:tc>
+        <w:tc>
+          <w:tcPr>
+            <w:tcW w:type="dxa" w:w="3019"/>
+          </w:tcPr>
+          <w:p>
+            <w:r>
+              <w:t>CP-24</w:t>
+            </w:r>
+          </w:p>
+        </w:tc>
+      </w:tr>
+      <w:tr>
+        <w:tc>
+          <w:tcPr>
+            <w:tcW w:type="dxa" w:w="3021"/>
+          </w:tcPr>
+          <w:p>
+            <w:r>
+              <w:t>Prueba unitaria de Campana de Notificaciones</w:t>
+            </w:r>
+          </w:p>
+        </w:tc>
+        <w:tc>
+          <w:tcPr>
+            <w:tcW w:type="dxa" w:w="3021"/>
+          </w:tcPr>
+          <w:p>
+            <w:r>
+              <w:t>¿Prueba de despliegue?</w:t>
+            </w:r>
+          </w:p>
+        </w:tc>
+        <w:tc>
+          <w:tcPr>
+            <w:tcW w:type="dxa" w:w="3019"/>
+          </w:tcPr>
+          <w:p>
+            <w:r>
+              <w:t>No</w:t>
+            </w:r>
+          </w:p>
+        </w:tc>
+      </w:tr>
+      <w:tr>
+        <w:tc>
+          <w:tcPr>
+            <w:tcW w:type="dxa" w:w="3021"/>
+          </w:tcPr>
+          <w:p>
+            <w:r>
+              <w:t>Descripción: Validación del despliegue de alertas pendientes, contador de mensajes no leídos, y acciones de marcar como leída y limpiar.</w:t>
+            </w:r>
+          </w:p>
+        </w:tc>
+        <w:tc>
+          <w:tcPr>
+            <w:tcW w:type="dxa" w:w="3021"/>
+          </w:tcPr>
+          <w:p>
+            <w:r>
+              <w:t>Descripción: Validación del despliegue de alertas pendientes, contador de mensajes no leídos, y acciones de marcar como leída y limpiar.</w:t>
+            </w:r>
+          </w:p>
+        </w:tc>
+        <w:tc>
+          <w:tcPr>
+            <w:tcW w:type="dxa" w:w="3019"/>
+          </w:tcPr>
+          <w:p>
+            <w:r>
+              <w:t>Descripción: Validación del despliegue de alertas pendientes, contador de mensajes no leídos, y acciones de marcar como leída y limpiar.</w:t>
+            </w:r>
+          </w:p>
+        </w:tc>
+      </w:tr>
+      <w:tr>
+        <w:tc>
+          <w:tcPr>
+            <w:tcW w:type="dxa" w:w="3021"/>
+          </w:tcPr>
+          <w:p>
+            <w:r>
+              <w:t>Prerrequisitos: Contexto de NotificationContext simulado.</w:t>
+            </w:r>
+          </w:p>
+        </w:tc>
+        <w:tc>
+          <w:tcPr>
+            <w:tcW w:type="dxa" w:w="3021"/>
+          </w:tcPr>
+          <w:p>
+            <w:r>
+              <w:t>Prerrequisitos: Contexto de NotificationContext simulado.</w:t>
+            </w:r>
+          </w:p>
+        </w:tc>
+        <w:tc>
+          <w:tcPr>
+            <w:tcW w:type="dxa" w:w="3019"/>
+          </w:tcPr>
+          <w:p>
+            <w:r>
+              <w:t>Prerrequisitos: Contexto de NotificationContext simulado.</w:t>
+            </w:r>
+          </w:p>
+        </w:tc>
+      </w:tr>
+      <w:tr>
+        <w:tc>
+          <w:tcPr>
+            <w:tcW w:type="dxa" w:w="3021"/>
+          </w:tcPr>
+          <w:p>
+            <w:r>
+              <w:t>Pasos: 1. Renderizar campana con 1 notificación activa. 2. Hacer clic en campana para abrir panel. 3. Hacer clic en "Limpiar" o "Marcar como leída".</w:t>
+            </w:r>
+          </w:p>
+        </w:tc>
+        <w:tc>
+          <w:tcPr>
+            <w:tcW w:type="dxa" w:w="3021"/>
+          </w:tcPr>
+          <w:p>
+            <w:r>
+              <w:t>Pasos: 1. Renderizar campana con 1 notificación activa. 2. Hacer clic en campana para abrir panel. 3. Hacer clic en "Limpiar" o "Marcar como leída".</w:t>
+            </w:r>
+          </w:p>
+        </w:tc>
+        <w:tc>
+          <w:tcPr>
+            <w:tcW w:type="dxa" w:w="3019"/>
+          </w:tcPr>
+          <w:p>
+            <w:r>
+              <w:t>Pasos: 1. Renderizar campana con 1 notificación activa. 2. Hacer clic en campana para abrir panel. 3. Hacer clic en "Limpiar" o "Marcar como leída".</w:t>
+            </w:r>
+          </w:p>
+        </w:tc>
+      </w:tr>
+      <w:tr>
+        <w:tc>
+          <w:tcPr>
+            <w:tcW w:type="dxa" w:w="3021"/>
+          </w:tcPr>
+          <w:p>
+            <w:r>
+              <w:t>Resultado esperado: Muestra la burbuja con el número de notificaciones no leídas, abre el panel de lista, e invoca clearAll / markAsRead al interactuar.</w:t>
+            </w:r>
+          </w:p>
+        </w:tc>
+        <w:tc>
+          <w:tcPr>
+            <w:tcW w:type="dxa" w:w="3021"/>
+          </w:tcPr>
+          <w:p>
+            <w:r>
+              <w:t>Resultado esperado: Muestra la burbuja con el número de notificaciones no leídas, abre el panel de lista, e invoca clearAll / markAsRead al interactuar.</w:t>
+            </w:r>
+          </w:p>
+        </w:tc>
+        <w:tc>
+          <w:tcPr>
+            <w:tcW w:type="dxa" w:w="3019"/>
+          </w:tcPr>
+          <w:p>
+            <w:r>
+              <w:t>Resultado esperado: Muestra la burbuja con el número de notificaciones no leídas, abre el panel de lista, e invoca clearAll / markAsRead al interactuar.</w:t>
+            </w:r>
+          </w:p>
+        </w:tc>
+      </w:tr>
+      <w:tr>
+        <w:tc>
+          <w:tcPr>
+            <w:tcW w:type="dxa" w:w="3021"/>
+          </w:tcPr>
+          <w:p>
+            <w:r>
+              <w:t>Resultado obtenido: Ejecutado con éxito. Pruebas automatizadas en Vitest pasadas al 100% sin advertencias.</w:t>
+            </w:r>
+          </w:p>
+        </w:tc>
+        <w:tc>
+          <w:tcPr>
+            <w:tcW w:type="dxa" w:w="3021"/>
+          </w:tcPr>
+          <w:p>
+            <w:r>
+              <w:t>Resultado obtenido: Ejecutado con éxito. Pruebas automatizadas en Vitest pasadas al 100% sin advertencias.</w:t>
+            </w:r>
+          </w:p>
+        </w:tc>
+        <w:tc>
+          <w:tcPr>
+            <w:tcW w:type="dxa" w:w="3019"/>
+          </w:tcPr>
+          <w:p>
+            <w:r>
+              <w:t>Resultado obtenido: Ejecutado con éxito. Pruebas automatizadas en Vitest pasadas al 100% sin advertencias.</w:t>
+            </w:r>
+          </w:p>
+        </w:tc>
+      </w:tr>
+      <w:tr>
+        <w:tc>
+          <w:tcPr>
+            <w:tcW w:type="dxa" w:w="3021"/>
+          </w:tcPr>
+          <w:p>
+            <w:r>
+              <w:t>Prueba unitaria de Modal de Pago (PaymentGatewayModal)</w:t>
+            </w:r>
+          </w:p>
+        </w:tc>
+        <w:tc>
+          <w:tcPr>
+            <w:tcW w:type="dxa" w:w="3021"/>
+          </w:tcPr>
+          <w:p>
+            <w:r>
+              <w:t>CP-25</w:t>
+            </w:r>
+          </w:p>
+        </w:tc>
+        <w:tc>
+          <w:tcPr>
+            <w:tcW w:type="dxa" w:w="3019"/>
+          </w:tcPr>
+          <w:p>
+            <w:r>
+              <w:t>CP-25</w:t>
+            </w:r>
+          </w:p>
+        </w:tc>
+      </w:tr>
+      <w:tr>
+        <w:tc>
+          <w:tcPr>
+            <w:tcW w:type="dxa" w:w="3021"/>
+          </w:tcPr>
+          <w:p>
+            <w:r>
+              <w:t>Prueba unitaria de Modal de Pago (PaymentGatewayModal)</w:t>
+            </w:r>
+          </w:p>
+        </w:tc>
+        <w:tc>
+          <w:tcPr>
+            <w:tcW w:type="dxa" w:w="3021"/>
+          </w:tcPr>
+          <w:p>
+            <w:r>
+              <w:t>¿Prueba de despliegue?</w:t>
+            </w:r>
+          </w:p>
+        </w:tc>
+        <w:tc>
+          <w:tcPr>
+            <w:tcW w:type="dxa" w:w="3019"/>
+          </w:tcPr>
+          <w:p>
+            <w:r>
+              <w:t>No</w:t>
+            </w:r>
+          </w:p>
+        </w:tc>
+      </w:tr>
+      <w:tr>
+        <w:tc>
+          <w:tcPr>
+            <w:tcW w:type="dxa" w:w="3021"/>
+          </w:tcPr>
+          <w:p>
+            <w:r>
+              <w:t>Descripción: Validación de la obligatoriedad de comprobante de pago en transferencia manual y flujo alternativo con pasarela Webpay Plus.</w:t>
+            </w:r>
+          </w:p>
+        </w:tc>
+        <w:tc>
+          <w:tcPr>
+            <w:tcW w:type="dxa" w:w="3021"/>
+          </w:tcPr>
+          <w:p>
+            <w:r>
+              <w:t>Descripción: Validación de la obligatoriedad de comprobante de pago en transferencia manual y flujo alternativo con pasarela Webpay Plus.</w:t>
+            </w:r>
+          </w:p>
+        </w:tc>
+        <w:tc>
+          <w:tcPr>
+            <w:tcW w:type="dxa" w:w="3019"/>
+          </w:tcPr>
+          <w:p>
+            <w:r>
+              <w:t>Descripción: Validación de la obligatoriedad de comprobante de pago en transferencia manual y flujo alternativo con pasarela Webpay Plus.</w:t>
+            </w:r>
+          </w:p>
+        </w:tc>
+      </w:tr>
+      <w:tr>
+        <w:tc>
+          <w:tcPr>
+            <w:tcW w:type="dxa" w:w="3021"/>
+          </w:tcPr>
+          <w:p>
+            <w:r>
+              <w:t>Prerrequisitos: Mocks de FileReader y temporizadores (fake timers).</w:t>
+            </w:r>
+          </w:p>
+        </w:tc>
+        <w:tc>
+          <w:tcPr>
+            <w:tcW w:type="dxa" w:w="3021"/>
+          </w:tcPr>
+          <w:p>
+            <w:r>
+              <w:t>Prerrequisitos: Mocks de FileReader y temporizadores (fake timers).</w:t>
+            </w:r>
+          </w:p>
+        </w:tc>
+        <w:tc>
+          <w:tcPr>
+            <w:tcW w:type="dxa" w:w="3019"/>
+          </w:tcPr>
+          <w:p>
+            <w:r>
+              <w:t>Prerrequisitos: Mocks de FileReader y temporizadores (fake timers).</w:t>
+            </w:r>
+          </w:p>
+        </w:tc>
+      </w:tr>
+      <w:tr>
+        <w:tc>
+          <w:tcPr>
+            <w:tcW w:type="dxa" w:w="3021"/>
+          </w:tcPr>
+          <w:p>
+            <w:r>
+              <w:t>Pasos: 1. Abrir modal y presionar confirmar sin archivo. 2. Seleccionar archivo y presionar confirmar. 3. Ir a pestaña Webpay y presionar pagar.</w:t>
+            </w:r>
+          </w:p>
+        </w:tc>
+        <w:tc>
+          <w:tcPr>
+            <w:tcW w:type="dxa" w:w="3021"/>
+          </w:tcPr>
+          <w:p>
+            <w:r>
+              <w:t>Pasos: 1. Abrir modal y presionar confirmar sin archivo. 2. Seleccionar archivo y presionar confirmar. 3. Ir a pestaña Webpay y presionar pagar.</w:t>
+            </w:r>
+          </w:p>
+        </w:tc>
+        <w:tc>
+          <w:tcPr>
+            <w:tcW w:type="dxa" w:w="3019"/>
+          </w:tcPr>
+          <w:p>
+            <w:r>
+              <w:t>Pasos: 1. Abrir modal y presionar confirmar sin archivo. 2. Seleccionar archivo y presionar confirmar. 3. Ir a pestaña Webpay y presionar pagar.</w:t>
+            </w:r>
+          </w:p>
+        </w:tc>
+      </w:tr>
+      <w:tr>
+        <w:tc>
+          <w:tcPr>
+            <w:tcW w:type="dxa" w:w="3021"/>
+          </w:tcPr>
+          <w:p>
+            <w:r>
+              <w:t>Resultado esperado: El botón de confirmar está deshabilitado si no hay archivo, al subir el archivo se habilita e invoca onSubmit, y al usar Webpay llama a onPayWithWebpay.</w:t>
+            </w:r>
+          </w:p>
+        </w:tc>
+        <w:tc>
+          <w:tcPr>
+            <w:tcW w:type="dxa" w:w="3021"/>
+          </w:tcPr>
+          <w:p>
+            <w:r>
+              <w:t>Resultado esperado: El botón de confirmar está deshabilitado si no hay archivo, al subir el archivo se habilita e invoca onSubmit, y al usar Webpay llama a onPayWithWebpay.</w:t>
+            </w:r>
+          </w:p>
+        </w:tc>
+        <w:tc>
+          <w:tcPr>
+            <w:tcW w:type="dxa" w:w="3019"/>
+          </w:tcPr>
+          <w:p>
+            <w:r>
+              <w:t>Resultado esperado: El botón de confirmar está deshabilitado si no hay archivo, al subir el archivo se habilita e invoca onSubmit, y al usar Webpay llama a onPayWithWebpay.</w:t>
+            </w:r>
+          </w:p>
+        </w:tc>
+      </w:tr>
+      <w:tr>
+        <w:tc>
+          <w:tcPr>
+            <w:tcW w:type="dxa" w:w="3021"/>
+          </w:tcPr>
+          <w:p>
+            <w:r>
+              <w:t>Resultado obtenido: Ejecutado con éxito. Pruebas automatizadas en Vitest pasadas al 100% sin advertencias.</w:t>
+            </w:r>
+          </w:p>
+        </w:tc>
+        <w:tc>
+          <w:tcPr>
+            <w:tcW w:type="dxa" w:w="3021"/>
+          </w:tcPr>
+          <w:p>
+            <w:r>
+              <w:t>Resultado obtenido: Ejecutado con éxito. Pruebas automatizadas en Vitest pasadas al 100% sin advertencias.</w:t>
+            </w:r>
+          </w:p>
+        </w:tc>
+        <w:tc>
+          <w:tcPr>
+            <w:tcW w:type="dxa" w:w="3019"/>
+          </w:tcPr>
+          <w:p>
+            <w:r>
+              <w:t>Resultado obtenido: Ejecutado con éxito. Pruebas automatizadas en Vitest pasadas al 100% sin advertencias.</w:t>
+            </w:r>
+          </w:p>
+        </w:tc>
+      </w:tr>
+      <w:tr>
+        <w:tc>
+          <w:tcPr>
+            <w:tcW w:type="dxa" w:w="3021"/>
+          </w:tcPr>
+          <w:p>
+            <w:r>
+              <w:t>Prueba unitaria de Página de Login (page.tsx)</w:t>
+            </w:r>
+          </w:p>
+        </w:tc>
+        <w:tc>
+          <w:tcPr>
+            <w:tcW w:type="dxa" w:w="3021"/>
+          </w:tcPr>
+          <w:p>
+            <w:r>
+              <w:t>CP-26</w:t>
+            </w:r>
+          </w:p>
+        </w:tc>
+        <w:tc>
+          <w:tcPr>
+            <w:tcW w:type="dxa" w:w="3019"/>
+          </w:tcPr>
+          <w:p>
+            <w:r>
+              <w:t>CP-26</w:t>
+            </w:r>
+          </w:p>
+        </w:tc>
+      </w:tr>
+      <w:tr>
+        <w:tc>
+          <w:tcPr>
+            <w:tcW w:type="dxa" w:w="3021"/>
+          </w:tcPr>
+          <w:p>
+            <w:r>
+              <w:t>Prueba unitaria de Página de Login (page.tsx)</w:t>
+            </w:r>
+          </w:p>
+        </w:tc>
+        <w:tc>
+          <w:tcPr>
+            <w:tcW w:type="dxa" w:w="3021"/>
+          </w:tcPr>
+          <w:p>
+            <w:r>
+              <w:t>¿Prueba de despliegue?</w:t>
+            </w:r>
+          </w:p>
+        </w:tc>
+        <w:tc>
+          <w:tcPr>
+            <w:tcW w:type="dxa" w:w="3019"/>
+          </w:tcPr>
+          <w:p>
+            <w:r>
+              <w:t>No</w:t>
+            </w:r>
+          </w:p>
+        </w:tc>
+      </w:tr>
+      <w:tr>
+        <w:tc>
+          <w:tcPr>
+            <w:tcW w:type="dxa" w:w="3021"/>
+          </w:tcPr>
+          <w:p>
+            <w:r>
+              <w:t>Descripción: Verificación de validación de campos obligatorios locales, redireccionamientos correctos por rol en login exitoso, y renderizado de errores.</w:t>
+            </w:r>
+          </w:p>
+        </w:tc>
+        <w:tc>
+          <w:tcPr>
+            <w:tcW w:type="dxa" w:w="3021"/>
+          </w:tcPr>
+          <w:p>
+            <w:r>
+              <w:t>Descripción: Verificación de validación de campos obligatorios locales, redireccionamientos correctos por rol en login exitoso, y renderizado de errores.</w:t>
+            </w:r>
+          </w:p>
+        </w:tc>
+        <w:tc>
+          <w:tcPr>
+            <w:tcW w:type="dxa" w:w="3019"/>
+          </w:tcPr>
+          <w:p>
+            <w:r>
+              <w:t>Descripción: Verificación de validación de campos obligatorios locales, redireccionamientos correctos por rol en login exitoso, y renderizado de errores.</w:t>
+            </w:r>
+          </w:p>
+        </w:tc>
+      </w:tr>
+      <w:tr>
+        <w:tc>
+          <w:tcPr>
+            <w:tcW w:type="dxa" w:w="3021"/>
+          </w:tcPr>
+          <w:p>
+            <w:r>
+              <w:t>Prerrequisitos: Mocks de authApi.login, useRouter y supabase.auth.signOut.</w:t>
+            </w:r>
+          </w:p>
+        </w:tc>
+        <w:tc>
+          <w:tcPr>
+            <w:tcW w:type="dxa" w:w="3021"/>
+          </w:tcPr>
+          <w:p>
+            <w:r>
+              <w:t>Prerrequisitos: Mocks de authApi.login, useRouter y supabase.auth.signOut.</w:t>
+            </w:r>
+          </w:p>
+        </w:tc>
+        <w:tc>
+          <w:tcPr>
+            <w:tcW w:type="dxa" w:w="3019"/>
+          </w:tcPr>
+          <w:p>
+            <w:r>
+              <w:t>Prerrequisitos: Mocks de authApi.login, useRouter y supabase.auth.signOut.</w:t>
+            </w:r>
+          </w:p>
+        </w:tc>
+      </w:tr>
+      <w:tr>
+        <w:tc>
+          <w:tcPr>
+            <w:tcW w:type="dxa" w:w="3021"/>
+          </w:tcPr>
+          <w:p>
+            <w:r>
+              <w:t>Pasos: 1. Presionar "Ingresar ahora" con campos vacíos. 2. Llenar credenciales de trabajador y presionar enviar. 3. Simular credenciales erróneas.</w:t>
+            </w:r>
+          </w:p>
+        </w:tc>
+        <w:tc>
+          <w:tcPr>
+            <w:tcW w:type="dxa" w:w="3021"/>
+          </w:tcPr>
+          <w:p>
+            <w:r>
+              <w:t>Pasos: 1. Presionar "Ingresar ahora" con campos vacíos. 2. Llenar credenciales de trabajador y presionar enviar. 3. Simular credenciales erróneas.</w:t>
+            </w:r>
+          </w:p>
+        </w:tc>
+        <w:tc>
+          <w:tcPr>
+            <w:tcW w:type="dxa" w:w="3019"/>
+          </w:tcPr>
+          <w:p>
+            <w:r>
+              <w:t>Pasos: 1. Presionar "Ingresar ahora" con campos vacíos. 2. Llenar credenciales de trabajador y presionar enviar. 3. Simular credenciales erróneas.</w:t>
+            </w:r>
+          </w:p>
+        </w:tc>
+      </w:tr>
+      <w:tr>
+        <w:tc>
+          <w:tcPr>
+            <w:tcW w:type="dxa" w:w="3021"/>
+          </w:tcPr>
+          <w:p>
+            <w:r>
+              <w:t>Resultado esperado: Muestra mensajes de campos obligatorios, guarda auth_token en localStorage y redirige al dashboard por rol al tener éxito, y muestra el error global si falla.</w:t>
+            </w:r>
+          </w:p>
+        </w:tc>
+        <w:tc>
+          <w:tcPr>
+            <w:tcW w:type="dxa" w:w="3021"/>
+          </w:tcPr>
+          <w:p>
+            <w:r>
+              <w:t>Resultado esperado: Muestra mensajes de campos obligatorios, guarda auth_token en localStorage y redirige al dashboard por rol al tener éxito, y muestra el error global si falla.</w:t>
+            </w:r>
+          </w:p>
+        </w:tc>
+        <w:tc>
+          <w:tcPr>
+            <w:tcW w:type="dxa" w:w="3019"/>
+          </w:tcPr>
+          <w:p>
+            <w:r>
+              <w:t>Resultado esperado: Muestra mensajes de campos obligatorios, guarda auth_token en localStorage y redirige al dashboard por rol al tener éxito, y muestra el error global si falla.</w:t>
+            </w:r>
+          </w:p>
+        </w:tc>
+      </w:tr>
+      <w:tr>
+        <w:tc>
+          <w:tcPr>
+            <w:tcW w:type="dxa" w:w="3021"/>
+          </w:tcPr>
+          <w:p>
+            <w:r>
+              <w:t>Resultado obtenido: Ejecutado con éxito. Pruebas automatizadas en Vitest pasadas al 100% sin advertencias.</w:t>
+            </w:r>
+          </w:p>
+        </w:tc>
+        <w:tc>
+          <w:tcPr>
+            <w:tcW w:type="dxa" w:w="3021"/>
+          </w:tcPr>
+          <w:p>
+            <w:r>
+              <w:t>Resultado obtenido: Ejecutado con éxito. Pruebas automatizadas en Vitest pasadas al 100% sin advertencias.</w:t>
+            </w:r>
+          </w:p>
+        </w:tc>
+        <w:tc>
+          <w:tcPr>
+            <w:tcW w:type="dxa" w:w="3019"/>
+          </w:tcPr>
+          <w:p>
+            <w:r>
+              <w:t>Resultado obtenido: Ejecutado con éxito. Pruebas automatizadas en Vitest pasadas al 100% sin advertencias.</w:t>
             </w:r>
           </w:p>
         </w:tc>
@@ -8868,6 +10076,158 @@
             <w:r>
               <w:t>X</w:t>
             </w:r>
+          </w:p>
+        </w:tc>
+      </w:tr>
+      <w:tr>
+        <w:tc>
+          <w:tcPr>
+            <w:tcW w:type="dxa" w:w="2251"/>
+          </w:tcPr>
+          <w:p>
+            <w:r>
+              <w:t>CP-23</w:t>
+            </w:r>
+          </w:p>
+        </w:tc>
+        <w:tc>
+          <w:tcPr>
+            <w:tcW w:type="dxa" w:w="2256"/>
+          </w:tcPr>
+          <w:p>
+            <w:r>
+              <w:t>X</w:t>
+            </w:r>
+          </w:p>
+        </w:tc>
+        <w:tc>
+          <w:tcPr>
+            <w:tcW w:type="dxa" w:w="2258"/>
+          </w:tcPr>
+          <w:p>
+            <w:r/>
+          </w:p>
+        </w:tc>
+        <w:tc>
+          <w:tcPr>
+            <w:tcW w:type="dxa" w:w="2296"/>
+          </w:tcPr>
+          <w:p>
+            <w:r/>
+          </w:p>
+        </w:tc>
+      </w:tr>
+      <w:tr>
+        <w:tc>
+          <w:tcPr>
+            <w:tcW w:type="dxa" w:w="2251"/>
+          </w:tcPr>
+          <w:p>
+            <w:r>
+              <w:t>CP-24</w:t>
+            </w:r>
+          </w:p>
+        </w:tc>
+        <w:tc>
+          <w:tcPr>
+            <w:tcW w:type="dxa" w:w="2256"/>
+          </w:tcPr>
+          <w:p>
+            <w:r>
+              <w:t>X</w:t>
+            </w:r>
+          </w:p>
+        </w:tc>
+        <w:tc>
+          <w:tcPr>
+            <w:tcW w:type="dxa" w:w="2258"/>
+          </w:tcPr>
+          <w:p>
+            <w:r/>
+          </w:p>
+        </w:tc>
+        <w:tc>
+          <w:tcPr>
+            <w:tcW w:type="dxa" w:w="2296"/>
+          </w:tcPr>
+          <w:p>
+            <w:r/>
+          </w:p>
+        </w:tc>
+      </w:tr>
+      <w:tr>
+        <w:tc>
+          <w:tcPr>
+            <w:tcW w:type="dxa" w:w="2251"/>
+          </w:tcPr>
+          <w:p>
+            <w:r>
+              <w:t>CP-25</w:t>
+            </w:r>
+          </w:p>
+        </w:tc>
+        <w:tc>
+          <w:tcPr>
+            <w:tcW w:type="dxa" w:w="2256"/>
+          </w:tcPr>
+          <w:p>
+            <w:r>
+              <w:t>X</w:t>
+            </w:r>
+          </w:p>
+        </w:tc>
+        <w:tc>
+          <w:tcPr>
+            <w:tcW w:type="dxa" w:w="2258"/>
+          </w:tcPr>
+          <w:p>
+            <w:r/>
+          </w:p>
+        </w:tc>
+        <w:tc>
+          <w:tcPr>
+            <w:tcW w:type="dxa" w:w="2296"/>
+          </w:tcPr>
+          <w:p>
+            <w:r/>
+          </w:p>
+        </w:tc>
+      </w:tr>
+      <w:tr>
+        <w:tc>
+          <w:tcPr>
+            <w:tcW w:type="dxa" w:w="2251"/>
+          </w:tcPr>
+          <w:p>
+            <w:r>
+              <w:t>CP-26</w:t>
+            </w:r>
+          </w:p>
+        </w:tc>
+        <w:tc>
+          <w:tcPr>
+            <w:tcW w:type="dxa" w:w="2256"/>
+          </w:tcPr>
+          <w:p>
+            <w:r>
+              <w:t>X</w:t>
+            </w:r>
+          </w:p>
+        </w:tc>
+        <w:tc>
+          <w:tcPr>
+            <w:tcW w:type="dxa" w:w="2258"/>
+          </w:tcPr>
+          <w:p>
+            <w:r/>
+          </w:p>
+        </w:tc>
+        <w:tc>
+          <w:tcPr>
+            <w:tcW w:type="dxa" w:w="2296"/>
+          </w:tcPr>
+          <w:p>
+            <w:r/>
           </w:p>
         </w:tc>
       </w:tr>

</xml_diff>

<commit_message>
test(android): agregar 11 pruebas unitarias para RegisterViewModel y MatchEngine y actualizar planilla de QA
</commit_message>
<xml_diff>
--- a/Documentacion/Unidad #3/3.1.2 Plan Pruebas Funcionales.docx
+++ b/Documentacion/Unidad #3/3.1.2 Plan Pruebas Funcionales.docx
@@ -3985,6 +3985,786 @@
           </w:p>
         </w:tc>
       </w:tr>
+      <w:tr>
+        <w:tc>
+          <w:tcPr>
+            <w:tcW w:type="dxa" w:w="1007"/>
+          </w:tcPr>
+          <w:p>
+            <w:r>
+              <w:t>CP-27</w:t>
+            </w:r>
+          </w:p>
+        </w:tc>
+        <w:tc>
+          <w:tcPr>
+            <w:tcW w:type="dxa" w:w="1006"/>
+          </w:tcPr>
+          <w:p>
+            <w:r>
+              <w:t>X</w:t>
+            </w:r>
+          </w:p>
+        </w:tc>
+        <w:tc>
+          <w:tcPr>
+            <w:tcW w:type="dxa" w:w="1006"/>
+          </w:tcPr>
+          <w:p>
+            <w:r/>
+          </w:p>
+        </w:tc>
+        <w:tc>
+          <w:tcPr>
+            <w:tcW w:type="dxa" w:w="1007"/>
+          </w:tcPr>
+          <w:p>
+            <w:r/>
+          </w:p>
+        </w:tc>
+        <w:tc>
+          <w:tcPr>
+            <w:tcW w:type="dxa" w:w="1007"/>
+          </w:tcPr>
+          <w:p>
+            <w:r/>
+          </w:p>
+        </w:tc>
+        <w:tc>
+          <w:tcPr>
+            <w:tcW w:type="dxa" w:w="1007"/>
+          </w:tcPr>
+          <w:p>
+            <w:r/>
+          </w:p>
+        </w:tc>
+        <w:tc>
+          <w:tcPr>
+            <w:tcW w:type="dxa" w:w="1007"/>
+          </w:tcPr>
+          <w:p>
+            <w:r/>
+          </w:p>
+        </w:tc>
+        <w:tc>
+          <w:tcPr>
+            <w:tcW w:type="dxa" w:w="1007"/>
+          </w:tcPr>
+          <w:p>
+            <w:r/>
+          </w:p>
+        </w:tc>
+        <w:tc>
+          <w:tcPr>
+            <w:tcW w:type="dxa" w:w="1007"/>
+          </w:tcPr>
+          <w:p>
+            <w:r/>
+          </w:p>
+        </w:tc>
+      </w:tr>
+      <w:tr>
+        <w:tc>
+          <w:tcPr>
+            <w:tcW w:type="dxa" w:w="1007"/>
+          </w:tcPr>
+          <w:p>
+            <w:r>
+              <w:t>CP-28</w:t>
+            </w:r>
+          </w:p>
+        </w:tc>
+        <w:tc>
+          <w:tcPr>
+            <w:tcW w:type="dxa" w:w="1006"/>
+          </w:tcPr>
+          <w:p>
+            <w:r>
+              <w:t>X</w:t>
+            </w:r>
+          </w:p>
+        </w:tc>
+        <w:tc>
+          <w:tcPr>
+            <w:tcW w:type="dxa" w:w="1006"/>
+          </w:tcPr>
+          <w:p>
+            <w:r/>
+          </w:p>
+        </w:tc>
+        <w:tc>
+          <w:tcPr>
+            <w:tcW w:type="dxa" w:w="1007"/>
+          </w:tcPr>
+          <w:p>
+            <w:r/>
+          </w:p>
+        </w:tc>
+        <w:tc>
+          <w:tcPr>
+            <w:tcW w:type="dxa" w:w="1007"/>
+          </w:tcPr>
+          <w:p>
+            <w:r/>
+          </w:p>
+        </w:tc>
+        <w:tc>
+          <w:tcPr>
+            <w:tcW w:type="dxa" w:w="1007"/>
+          </w:tcPr>
+          <w:p>
+            <w:r/>
+          </w:p>
+        </w:tc>
+        <w:tc>
+          <w:tcPr>
+            <w:tcW w:type="dxa" w:w="1007"/>
+          </w:tcPr>
+          <w:p>
+            <w:r/>
+          </w:p>
+        </w:tc>
+        <w:tc>
+          <w:tcPr>
+            <w:tcW w:type="dxa" w:w="1007"/>
+          </w:tcPr>
+          <w:p>
+            <w:r/>
+          </w:p>
+        </w:tc>
+        <w:tc>
+          <w:tcPr>
+            <w:tcW w:type="dxa" w:w="1007"/>
+          </w:tcPr>
+          <w:p>
+            <w:r/>
+          </w:p>
+        </w:tc>
+      </w:tr>
+      <w:tr>
+        <w:tc>
+          <w:tcPr>
+            <w:tcW w:type="dxa" w:w="1007"/>
+          </w:tcPr>
+          <w:p>
+            <w:r>
+              <w:t>CP-29</w:t>
+            </w:r>
+          </w:p>
+        </w:tc>
+        <w:tc>
+          <w:tcPr>
+            <w:tcW w:type="dxa" w:w="1006"/>
+          </w:tcPr>
+          <w:p>
+            <w:r>
+              <w:t>X</w:t>
+            </w:r>
+          </w:p>
+        </w:tc>
+        <w:tc>
+          <w:tcPr>
+            <w:tcW w:type="dxa" w:w="1006"/>
+          </w:tcPr>
+          <w:p>
+            <w:r/>
+          </w:p>
+        </w:tc>
+        <w:tc>
+          <w:tcPr>
+            <w:tcW w:type="dxa" w:w="1007"/>
+          </w:tcPr>
+          <w:p>
+            <w:r/>
+          </w:p>
+        </w:tc>
+        <w:tc>
+          <w:tcPr>
+            <w:tcW w:type="dxa" w:w="1007"/>
+          </w:tcPr>
+          <w:p>
+            <w:r/>
+          </w:p>
+        </w:tc>
+        <w:tc>
+          <w:tcPr>
+            <w:tcW w:type="dxa" w:w="1007"/>
+          </w:tcPr>
+          <w:p>
+            <w:r/>
+          </w:p>
+        </w:tc>
+        <w:tc>
+          <w:tcPr>
+            <w:tcW w:type="dxa" w:w="1007"/>
+          </w:tcPr>
+          <w:p>
+            <w:r/>
+          </w:p>
+        </w:tc>
+        <w:tc>
+          <w:tcPr>
+            <w:tcW w:type="dxa" w:w="1007"/>
+          </w:tcPr>
+          <w:p>
+            <w:r/>
+          </w:p>
+        </w:tc>
+        <w:tc>
+          <w:tcPr>
+            <w:tcW w:type="dxa" w:w="1007"/>
+          </w:tcPr>
+          <w:p>
+            <w:r/>
+          </w:p>
+        </w:tc>
+      </w:tr>
+      <w:tr>
+        <w:tc>
+          <w:tcPr>
+            <w:tcW w:type="dxa" w:w="1007"/>
+          </w:tcPr>
+          <w:p>
+            <w:r>
+              <w:t>CP-30</w:t>
+            </w:r>
+          </w:p>
+        </w:tc>
+        <w:tc>
+          <w:tcPr>
+            <w:tcW w:type="dxa" w:w="1006"/>
+          </w:tcPr>
+          <w:p>
+            <w:r>
+              <w:t>X</w:t>
+            </w:r>
+          </w:p>
+        </w:tc>
+        <w:tc>
+          <w:tcPr>
+            <w:tcW w:type="dxa" w:w="1006"/>
+          </w:tcPr>
+          <w:p>
+            <w:r/>
+          </w:p>
+        </w:tc>
+        <w:tc>
+          <w:tcPr>
+            <w:tcW w:type="dxa" w:w="1007"/>
+          </w:tcPr>
+          <w:p>
+            <w:r/>
+          </w:p>
+        </w:tc>
+        <w:tc>
+          <w:tcPr>
+            <w:tcW w:type="dxa" w:w="1007"/>
+          </w:tcPr>
+          <w:p>
+            <w:r/>
+          </w:p>
+        </w:tc>
+        <w:tc>
+          <w:tcPr>
+            <w:tcW w:type="dxa" w:w="1007"/>
+          </w:tcPr>
+          <w:p>
+            <w:r/>
+          </w:p>
+        </w:tc>
+        <w:tc>
+          <w:tcPr>
+            <w:tcW w:type="dxa" w:w="1007"/>
+          </w:tcPr>
+          <w:p>
+            <w:r/>
+          </w:p>
+        </w:tc>
+        <w:tc>
+          <w:tcPr>
+            <w:tcW w:type="dxa" w:w="1007"/>
+          </w:tcPr>
+          <w:p>
+            <w:r/>
+          </w:p>
+        </w:tc>
+        <w:tc>
+          <w:tcPr>
+            <w:tcW w:type="dxa" w:w="1007"/>
+          </w:tcPr>
+          <w:p>
+            <w:r/>
+          </w:p>
+        </w:tc>
+      </w:tr>
+      <w:tr>
+        <w:tc>
+          <w:tcPr>
+            <w:tcW w:type="dxa" w:w="1007"/>
+          </w:tcPr>
+          <w:p>
+            <w:r>
+              <w:t>CP-31</w:t>
+            </w:r>
+          </w:p>
+        </w:tc>
+        <w:tc>
+          <w:tcPr>
+            <w:tcW w:type="dxa" w:w="1006"/>
+          </w:tcPr>
+          <w:p>
+            <w:r/>
+          </w:p>
+        </w:tc>
+        <w:tc>
+          <w:tcPr>
+            <w:tcW w:type="dxa" w:w="1006"/>
+          </w:tcPr>
+          <w:p>
+            <w:r/>
+          </w:p>
+        </w:tc>
+        <w:tc>
+          <w:tcPr>
+            <w:tcW w:type="dxa" w:w="1007"/>
+          </w:tcPr>
+          <w:p>
+            <w:r/>
+          </w:p>
+        </w:tc>
+        <w:tc>
+          <w:tcPr>
+            <w:tcW w:type="dxa" w:w="1007"/>
+          </w:tcPr>
+          <w:p>
+            <w:r/>
+          </w:p>
+        </w:tc>
+        <w:tc>
+          <w:tcPr>
+            <w:tcW w:type="dxa" w:w="1007"/>
+          </w:tcPr>
+          <w:p>
+            <w:r/>
+          </w:p>
+        </w:tc>
+        <w:tc>
+          <w:tcPr>
+            <w:tcW w:type="dxa" w:w="1007"/>
+          </w:tcPr>
+          <w:p>
+            <w:r>
+              <w:t>X</w:t>
+            </w:r>
+          </w:p>
+        </w:tc>
+        <w:tc>
+          <w:tcPr>
+            <w:tcW w:type="dxa" w:w="1007"/>
+          </w:tcPr>
+          <w:p>
+            <w:r/>
+          </w:p>
+        </w:tc>
+        <w:tc>
+          <w:tcPr>
+            <w:tcW w:type="dxa" w:w="1007"/>
+          </w:tcPr>
+          <w:p>
+            <w:r/>
+          </w:p>
+        </w:tc>
+      </w:tr>
+      <w:tr>
+        <w:tc>
+          <w:tcPr>
+            <w:tcW w:type="dxa" w:w="1007"/>
+          </w:tcPr>
+          <w:p>
+            <w:r>
+              <w:t>CP-32</w:t>
+            </w:r>
+          </w:p>
+        </w:tc>
+        <w:tc>
+          <w:tcPr>
+            <w:tcW w:type="dxa" w:w="1006"/>
+          </w:tcPr>
+          <w:p>
+            <w:r/>
+          </w:p>
+        </w:tc>
+        <w:tc>
+          <w:tcPr>
+            <w:tcW w:type="dxa" w:w="1006"/>
+          </w:tcPr>
+          <w:p>
+            <w:r/>
+          </w:p>
+        </w:tc>
+        <w:tc>
+          <w:tcPr>
+            <w:tcW w:type="dxa" w:w="1007"/>
+          </w:tcPr>
+          <w:p>
+            <w:r/>
+          </w:p>
+        </w:tc>
+        <w:tc>
+          <w:tcPr>
+            <w:tcW w:type="dxa" w:w="1007"/>
+          </w:tcPr>
+          <w:p>
+            <w:r/>
+          </w:p>
+        </w:tc>
+        <w:tc>
+          <w:tcPr>
+            <w:tcW w:type="dxa" w:w="1007"/>
+          </w:tcPr>
+          <w:p>
+            <w:r/>
+          </w:p>
+        </w:tc>
+        <w:tc>
+          <w:tcPr>
+            <w:tcW w:type="dxa" w:w="1007"/>
+          </w:tcPr>
+          <w:p>
+            <w:r>
+              <w:t>X</w:t>
+            </w:r>
+          </w:p>
+        </w:tc>
+        <w:tc>
+          <w:tcPr>
+            <w:tcW w:type="dxa" w:w="1007"/>
+          </w:tcPr>
+          <w:p>
+            <w:r/>
+          </w:p>
+        </w:tc>
+        <w:tc>
+          <w:tcPr>
+            <w:tcW w:type="dxa" w:w="1007"/>
+          </w:tcPr>
+          <w:p>
+            <w:r/>
+          </w:p>
+        </w:tc>
+      </w:tr>
+      <w:tr>
+        <w:tc>
+          <w:tcPr>
+            <w:tcW w:type="dxa" w:w="1007"/>
+          </w:tcPr>
+          <w:p>
+            <w:r>
+              <w:t>CP-33</w:t>
+            </w:r>
+          </w:p>
+        </w:tc>
+        <w:tc>
+          <w:tcPr>
+            <w:tcW w:type="dxa" w:w="1006"/>
+          </w:tcPr>
+          <w:p>
+            <w:r/>
+          </w:p>
+        </w:tc>
+        <w:tc>
+          <w:tcPr>
+            <w:tcW w:type="dxa" w:w="1006"/>
+          </w:tcPr>
+          <w:p>
+            <w:r/>
+          </w:p>
+        </w:tc>
+        <w:tc>
+          <w:tcPr>
+            <w:tcW w:type="dxa" w:w="1007"/>
+          </w:tcPr>
+          <w:p>
+            <w:r>
+              <w:t>X</w:t>
+            </w:r>
+          </w:p>
+        </w:tc>
+        <w:tc>
+          <w:tcPr>
+            <w:tcW w:type="dxa" w:w="1007"/>
+          </w:tcPr>
+          <w:p>
+            <w:r/>
+          </w:p>
+        </w:tc>
+        <w:tc>
+          <w:tcPr>
+            <w:tcW w:type="dxa" w:w="1007"/>
+          </w:tcPr>
+          <w:p>
+            <w:r/>
+          </w:p>
+        </w:tc>
+        <w:tc>
+          <w:tcPr>
+            <w:tcW w:type="dxa" w:w="1007"/>
+          </w:tcPr>
+          <w:p>
+            <w:r/>
+          </w:p>
+        </w:tc>
+        <w:tc>
+          <w:tcPr>
+            <w:tcW w:type="dxa" w:w="1007"/>
+          </w:tcPr>
+          <w:p>
+            <w:r/>
+          </w:p>
+        </w:tc>
+        <w:tc>
+          <w:tcPr>
+            <w:tcW w:type="dxa" w:w="1007"/>
+          </w:tcPr>
+          <w:p>
+            <w:r/>
+          </w:p>
+        </w:tc>
+      </w:tr>
+      <w:tr>
+        <w:tc>
+          <w:tcPr>
+            <w:tcW w:type="dxa" w:w="1007"/>
+          </w:tcPr>
+          <w:p>
+            <w:r>
+              <w:t>CP-34</w:t>
+            </w:r>
+          </w:p>
+        </w:tc>
+        <w:tc>
+          <w:tcPr>
+            <w:tcW w:type="dxa" w:w="1006"/>
+          </w:tcPr>
+          <w:p>
+            <w:r/>
+          </w:p>
+        </w:tc>
+        <w:tc>
+          <w:tcPr>
+            <w:tcW w:type="dxa" w:w="1006"/>
+          </w:tcPr>
+          <w:p>
+            <w:r/>
+          </w:p>
+        </w:tc>
+        <w:tc>
+          <w:tcPr>
+            <w:tcW w:type="dxa" w:w="1007"/>
+          </w:tcPr>
+          <w:p>
+            <w:r>
+              <w:t>X</w:t>
+            </w:r>
+          </w:p>
+        </w:tc>
+        <w:tc>
+          <w:tcPr>
+            <w:tcW w:type="dxa" w:w="1007"/>
+          </w:tcPr>
+          <w:p>
+            <w:r/>
+          </w:p>
+        </w:tc>
+        <w:tc>
+          <w:tcPr>
+            <w:tcW w:type="dxa" w:w="1007"/>
+          </w:tcPr>
+          <w:p>
+            <w:r/>
+          </w:p>
+        </w:tc>
+        <w:tc>
+          <w:tcPr>
+            <w:tcW w:type="dxa" w:w="1007"/>
+          </w:tcPr>
+          <w:p>
+            <w:r/>
+          </w:p>
+        </w:tc>
+        <w:tc>
+          <w:tcPr>
+            <w:tcW w:type="dxa" w:w="1007"/>
+          </w:tcPr>
+          <w:p>
+            <w:r/>
+          </w:p>
+        </w:tc>
+        <w:tc>
+          <w:tcPr>
+            <w:tcW w:type="dxa" w:w="1007"/>
+          </w:tcPr>
+          <w:p>
+            <w:r/>
+          </w:p>
+        </w:tc>
+      </w:tr>
+      <w:tr>
+        <w:tc>
+          <w:tcPr>
+            <w:tcW w:type="dxa" w:w="1007"/>
+          </w:tcPr>
+          <w:p>
+            <w:r>
+              <w:t>CP-35</w:t>
+            </w:r>
+          </w:p>
+        </w:tc>
+        <w:tc>
+          <w:tcPr>
+            <w:tcW w:type="dxa" w:w="1006"/>
+          </w:tcPr>
+          <w:p>
+            <w:r/>
+          </w:p>
+        </w:tc>
+        <w:tc>
+          <w:tcPr>
+            <w:tcW w:type="dxa" w:w="1006"/>
+          </w:tcPr>
+          <w:p>
+            <w:r/>
+          </w:p>
+        </w:tc>
+        <w:tc>
+          <w:tcPr>
+            <w:tcW w:type="dxa" w:w="1007"/>
+          </w:tcPr>
+          <w:p>
+            <w:r/>
+          </w:p>
+        </w:tc>
+        <w:tc>
+          <w:tcPr>
+            <w:tcW w:type="dxa" w:w="1007"/>
+          </w:tcPr>
+          <w:p>
+            <w:r/>
+          </w:p>
+        </w:tc>
+        <w:tc>
+          <w:tcPr>
+            <w:tcW w:type="dxa" w:w="1007"/>
+          </w:tcPr>
+          <w:p>
+            <w:r/>
+          </w:p>
+        </w:tc>
+        <w:tc>
+          <w:tcPr>
+            <w:tcW w:type="dxa" w:w="1007"/>
+          </w:tcPr>
+          <w:p>
+            <w:r>
+              <w:t>X</w:t>
+            </w:r>
+          </w:p>
+        </w:tc>
+        <w:tc>
+          <w:tcPr>
+            <w:tcW w:type="dxa" w:w="1007"/>
+          </w:tcPr>
+          <w:p>
+            <w:r/>
+          </w:p>
+        </w:tc>
+        <w:tc>
+          <w:tcPr>
+            <w:tcW w:type="dxa" w:w="1007"/>
+          </w:tcPr>
+          <w:p>
+            <w:r/>
+          </w:p>
+        </w:tc>
+      </w:tr>
+      <w:tr>
+        <w:tc>
+          <w:tcPr>
+            <w:tcW w:type="dxa" w:w="1007"/>
+          </w:tcPr>
+          <w:p>
+            <w:r>
+              <w:t>CP-36</w:t>
+            </w:r>
+          </w:p>
+        </w:tc>
+        <w:tc>
+          <w:tcPr>
+            <w:tcW w:type="dxa" w:w="1006"/>
+          </w:tcPr>
+          <w:p>
+            <w:r/>
+          </w:p>
+        </w:tc>
+        <w:tc>
+          <w:tcPr>
+            <w:tcW w:type="dxa" w:w="1006"/>
+          </w:tcPr>
+          <w:p>
+            <w:r/>
+          </w:p>
+        </w:tc>
+        <w:tc>
+          <w:tcPr>
+            <w:tcW w:type="dxa" w:w="1007"/>
+          </w:tcPr>
+          <w:p>
+            <w:r/>
+          </w:p>
+        </w:tc>
+        <w:tc>
+          <w:tcPr>
+            <w:tcW w:type="dxa" w:w="1007"/>
+          </w:tcPr>
+          <w:p>
+            <w:r/>
+          </w:p>
+        </w:tc>
+        <w:tc>
+          <w:tcPr>
+            <w:tcW w:type="dxa" w:w="1007"/>
+          </w:tcPr>
+          <w:p>
+            <w:r/>
+          </w:p>
+        </w:tc>
+        <w:tc>
+          <w:tcPr>
+            <w:tcW w:type="dxa" w:w="1007"/>
+          </w:tcPr>
+          <w:p>
+            <w:r>
+              <w:t>X</w:t>
+            </w:r>
+          </w:p>
+        </w:tc>
+        <w:tc>
+          <w:tcPr>
+            <w:tcW w:type="dxa" w:w="1007"/>
+          </w:tcPr>
+          <w:p>
+            <w:r/>
+          </w:p>
+        </w:tc>
+        <w:tc>
+          <w:tcPr>
+            <w:tcW w:type="dxa" w:w="1007"/>
+          </w:tcPr>
+          <w:p>
+            <w:r/>
+          </w:p>
+        </w:tc>
+      </w:tr>
     </w:tbl>
     <w:p>
       <w:pPr>
@@ -9072,6 +9852,2246 @@
           <w:p>
             <w:r>
               <w:t>Resultado obtenido: Ejecutado con éxito. Pruebas automatizadas en Vitest pasadas al 100% sin advertencias.</w:t>
+            </w:r>
+          </w:p>
+        </w:tc>
+      </w:tr>
+      <w:tr>
+        <w:tc>
+          <w:tcPr>
+            <w:tcW w:type="dxa" w:w="3021"/>
+          </w:tcPr>
+          <w:p>
+            <w:r>
+              <w:t>Prueba unitaria de inicialización del registro (RegisterViewModel)</w:t>
+            </w:r>
+          </w:p>
+        </w:tc>
+        <w:tc>
+          <w:tcPr>
+            <w:tcW w:type="dxa" w:w="3021"/>
+          </w:tcPr>
+          <w:p>
+            <w:r>
+              <w:t>CP-27</w:t>
+            </w:r>
+          </w:p>
+        </w:tc>
+        <w:tc>
+          <w:tcPr>
+            <w:tcW w:type="dxa" w:w="3019"/>
+          </w:tcPr>
+          <w:p>
+            <w:r>
+              <w:t>CP-27</w:t>
+            </w:r>
+          </w:p>
+        </w:tc>
+      </w:tr>
+      <w:tr>
+        <w:tc>
+          <w:tcPr>
+            <w:tcW w:type="dxa" w:w="3021"/>
+          </w:tcPr>
+          <w:p>
+            <w:r>
+              <w:t>Prueba unitaria de inicialización del registro (RegisterViewModel)</w:t>
+            </w:r>
+          </w:p>
+        </w:tc>
+        <w:tc>
+          <w:tcPr>
+            <w:tcW w:type="dxa" w:w="3021"/>
+          </w:tcPr>
+          <w:p>
+            <w:r>
+              <w:t>¿Prueba de despliegue?</w:t>
+            </w:r>
+          </w:p>
+        </w:tc>
+        <w:tc>
+          <w:tcPr>
+            <w:tcW w:type="dxa" w:w="3019"/>
+          </w:tcPr>
+          <w:p>
+            <w:r>
+              <w:t>No</w:t>
+            </w:r>
+          </w:p>
+        </w:tc>
+      </w:tr>
+      <w:tr>
+        <w:tc>
+          <w:tcPr>
+            <w:tcW w:type="dxa" w:w="3021"/>
+          </w:tcPr>
+          <w:p>
+            <w:r>
+              <w:t>Descripción: Verificar que el estado del formulario de registro comience completamente vacío y que el botón de envío esté deshabilitado.</w:t>
+            </w:r>
+          </w:p>
+        </w:tc>
+        <w:tc>
+          <w:tcPr>
+            <w:tcW w:type="dxa" w:w="3021"/>
+          </w:tcPr>
+          <w:p>
+            <w:r>
+              <w:t>Descripción: Verificar que el estado del formulario de registro comience completamente vacío y que el botón de envío esté deshabilitado.</w:t>
+            </w:r>
+          </w:p>
+        </w:tc>
+        <w:tc>
+          <w:tcPr>
+            <w:tcW w:type="dxa" w:w="3019"/>
+          </w:tcPr>
+          <w:p>
+            <w:r>
+              <w:t>Descripción: Verificar que el estado del formulario de registro comience completamente vacío y que el botón de envío esté deshabilitado.</w:t>
+            </w:r>
+          </w:p>
+        </w:tc>
+      </w:tr>
+      <w:tr>
+        <w:tc>
+          <w:tcPr>
+            <w:tcW w:type="dxa" w:w="3021"/>
+          </w:tcPr>
+          <w:p>
+            <w:r>
+              <w:t>Prerrequisitos: El entorno de pruebas unitarias debe estar configurado con JUnit 4 y MockK.</w:t>
+            </w:r>
+          </w:p>
+        </w:tc>
+        <w:tc>
+          <w:tcPr>
+            <w:tcW w:type="dxa" w:w="3021"/>
+          </w:tcPr>
+          <w:p>
+            <w:r>
+              <w:t>Prerrequisitos: El entorno de pruebas unitarias debe estar configurado con JUnit 4 y MockK.</w:t>
+            </w:r>
+          </w:p>
+        </w:tc>
+        <w:tc>
+          <w:tcPr>
+            <w:tcW w:type="dxa" w:w="3019"/>
+          </w:tcPr>
+          <w:p>
+            <w:r>
+              <w:t>Prerrequisitos: El entorno de pruebas unitarias debe estar configurado con JUnit 4 y MockK.</w:t>
+            </w:r>
+          </w:p>
+        </w:tc>
+      </w:tr>
+      <w:tr>
+        <w:tc>
+          <w:tcPr>
+            <w:tcW w:type="dxa" w:w="3021"/>
+          </w:tcPr>
+          <w:p>
+            <w:r>
+              <w:t>Pasos: 1. Instanciar el RegisterViewModel con el repositorio de autenticación mockeado. 2. Observar el estado expuesto por el MutableStateFlow de registro.</w:t>
+            </w:r>
+          </w:p>
+        </w:tc>
+        <w:tc>
+          <w:tcPr>
+            <w:tcW w:type="dxa" w:w="3021"/>
+          </w:tcPr>
+          <w:p>
+            <w:r>
+              <w:t>Pasos: 1. Instanciar el RegisterViewModel con el repositorio de autenticación mockeado. 2. Observar el estado expuesto por el MutableStateFlow de registro.</w:t>
+            </w:r>
+          </w:p>
+        </w:tc>
+        <w:tc>
+          <w:tcPr>
+            <w:tcW w:type="dxa" w:w="3019"/>
+          </w:tcPr>
+          <w:p>
+            <w:r>
+              <w:t>Pasos: 1. Instanciar el RegisterViewModel con el repositorio de autenticación mockeado. 2. Observar el estado expuesto por el MutableStateFlow de registro.</w:t>
+            </w:r>
+          </w:p>
+        </w:tc>
+      </w:tr>
+      <w:tr>
+        <w:tc>
+          <w:tcPr>
+            <w:tcW w:type="dxa" w:w="3021"/>
+          </w:tcPr>
+          <w:p>
+            <w:r>
+              <w:t>Resultado esperado: Todos los campos del formulario de registro (email, password, fullName, rut, phone, role) están vacíos o en null y canSubmit es false.</w:t>
+            </w:r>
+          </w:p>
+        </w:tc>
+        <w:tc>
+          <w:tcPr>
+            <w:tcW w:type="dxa" w:w="3021"/>
+          </w:tcPr>
+          <w:p>
+            <w:r>
+              <w:t>Resultado esperado: Todos los campos del formulario de registro (email, password, fullName, rut, phone, role) están vacíos o en null y canSubmit es false.</w:t>
+            </w:r>
+          </w:p>
+        </w:tc>
+        <w:tc>
+          <w:tcPr>
+            <w:tcW w:type="dxa" w:w="3019"/>
+          </w:tcPr>
+          <w:p>
+            <w:r>
+              <w:t>Resultado esperado: Todos los campos del formulario de registro (email, password, fullName, rut, phone, role) están vacíos o en null y canSubmit es false.</w:t>
+            </w:r>
+          </w:p>
+        </w:tc>
+      </w:tr>
+      <w:tr>
+        <w:tc>
+          <w:tcPr>
+            <w:tcW w:type="dxa" w:w="3021"/>
+          </w:tcPr>
+          <w:p>
+            <w:r>
+              <w:t>Resultado obtenido: Ejecutado con éxito. Pruebas unitarias en la app Android pasadas al 100% en JUnit.</w:t>
+            </w:r>
+          </w:p>
+        </w:tc>
+        <w:tc>
+          <w:tcPr>
+            <w:tcW w:type="dxa" w:w="3021"/>
+          </w:tcPr>
+          <w:p>
+            <w:r>
+              <w:t>Resultado obtenido: Ejecutado con éxito. Pruebas unitarias en la app Android pasadas al 100% en JUnit.</w:t>
+            </w:r>
+          </w:p>
+        </w:tc>
+        <w:tc>
+          <w:tcPr>
+            <w:tcW w:type="dxa" w:w="3019"/>
+          </w:tcPr>
+          <w:p>
+            <w:r>
+              <w:t>Resultado obtenido: Ejecutado con éxito. Pruebas unitarias en la app Android pasadas al 100% en JUnit.</w:t>
+            </w:r>
+          </w:p>
+        </w:tc>
+      </w:tr>
+      <w:tr>
+        <w:tc>
+          <w:tcPr>
+            <w:tcW w:type="dxa" w:w="3021"/>
+          </w:tcPr>
+          <w:p>
+            <w:r>
+              <w:t>Prueba unitaria de validación de campos de registro</w:t>
+            </w:r>
+          </w:p>
+        </w:tc>
+        <w:tc>
+          <w:tcPr>
+            <w:tcW w:type="dxa" w:w="3021"/>
+          </w:tcPr>
+          <w:p>
+            <w:r>
+              <w:t>CP-28</w:t>
+            </w:r>
+          </w:p>
+        </w:tc>
+        <w:tc>
+          <w:tcPr>
+            <w:tcW w:type="dxa" w:w="3019"/>
+          </w:tcPr>
+          <w:p>
+            <w:r>
+              <w:t>CP-28</w:t>
+            </w:r>
+          </w:p>
+        </w:tc>
+      </w:tr>
+      <w:tr>
+        <w:tc>
+          <w:tcPr>
+            <w:tcW w:type="dxa" w:w="3021"/>
+          </w:tcPr>
+          <w:p>
+            <w:r>
+              <w:t>Prueba unitaria de validación de campos de registro</w:t>
+            </w:r>
+          </w:p>
+        </w:tc>
+        <w:tc>
+          <w:tcPr>
+            <w:tcW w:type="dxa" w:w="3021"/>
+          </w:tcPr>
+          <w:p>
+            <w:r>
+              <w:t>¿Prueba de despliegue?</w:t>
+            </w:r>
+          </w:p>
+        </w:tc>
+        <w:tc>
+          <w:tcPr>
+            <w:tcW w:type="dxa" w:w="3019"/>
+          </w:tcPr>
+          <w:p>
+            <w:r>
+              <w:t>No</w:t>
+            </w:r>
+          </w:p>
+        </w:tc>
+      </w:tr>
+      <w:tr>
+        <w:tc>
+          <w:tcPr>
+            <w:tcW w:type="dxa" w:w="3021"/>
+          </w:tcPr>
+          <w:p>
+            <w:r>
+              <w:t>Descripción: Validar que el flag canSubmit cambie a true una vez que todos los campos del formulario de registro contengan información válida.</w:t>
+            </w:r>
+          </w:p>
+        </w:tc>
+        <w:tc>
+          <w:tcPr>
+            <w:tcW w:type="dxa" w:w="3021"/>
+          </w:tcPr>
+          <w:p>
+            <w:r>
+              <w:t>Descripción: Validar que el flag canSubmit cambie a true una vez que todos los campos del formulario de registro contengan información válida.</w:t>
+            </w:r>
+          </w:p>
+        </w:tc>
+        <w:tc>
+          <w:tcPr>
+            <w:tcW w:type="dxa" w:w="3019"/>
+          </w:tcPr>
+          <w:p>
+            <w:r>
+              <w:t>Descripción: Validar que el flag canSubmit cambie a true una vez que todos los campos del formulario de registro contengan información válida.</w:t>
+            </w:r>
+          </w:p>
+        </w:tc>
+      </w:tr>
+      <w:tr>
+        <w:tc>
+          <w:tcPr>
+            <w:tcW w:type="dxa" w:w="3021"/>
+          </w:tcPr>
+          <w:p>
+            <w:r>
+              <w:t>Prerrequisitos: Registro en estado inicial deshabilitado.</w:t>
+            </w:r>
+          </w:p>
+        </w:tc>
+        <w:tc>
+          <w:tcPr>
+            <w:tcW w:type="dxa" w:w="3021"/>
+          </w:tcPr>
+          <w:p>
+            <w:r>
+              <w:t>Prerrequisitos: Registro en estado inicial deshabilitado.</w:t>
+            </w:r>
+          </w:p>
+        </w:tc>
+        <w:tc>
+          <w:tcPr>
+            <w:tcW w:type="dxa" w:w="3019"/>
+          </w:tcPr>
+          <w:p>
+            <w:r>
+              <w:t>Prerrequisitos: Registro en estado inicial deshabilitado.</w:t>
+            </w:r>
+          </w:p>
+        </w:tc>
+      </w:tr>
+      <w:tr>
+        <w:tc>
+          <w:tcPr>
+            <w:tcW w:type="dxa" w:w="3021"/>
+          </w:tcPr>
+          <w:p>
+            <w:r>
+              <w:t>Pasos: 1. Cargar nombre, correo, rut, teléfono, rol y una contraseña de al menos 6 caracteres en el ViewModel. 2. Observar el estado canSubmit del formulario.</w:t>
+            </w:r>
+          </w:p>
+        </w:tc>
+        <w:tc>
+          <w:tcPr>
+            <w:tcW w:type="dxa" w:w="3021"/>
+          </w:tcPr>
+          <w:p>
+            <w:r>
+              <w:t>Pasos: 1. Cargar nombre, correo, rut, teléfono, rol y una contraseña de al menos 6 caracteres en el ViewModel. 2. Observar el estado canSubmit del formulario.</w:t>
+            </w:r>
+          </w:p>
+        </w:tc>
+        <w:tc>
+          <w:tcPr>
+            <w:tcW w:type="dxa" w:w="3019"/>
+          </w:tcPr>
+          <w:p>
+            <w:r>
+              <w:t>Pasos: 1. Cargar nombre, correo, rut, teléfono, rol y una contraseña de al menos 6 caracteres en el ViewModel. 2. Observar el estado canSubmit del formulario.</w:t>
+            </w:r>
+          </w:p>
+        </w:tc>
+      </w:tr>
+      <w:tr>
+        <w:tc>
+          <w:tcPr>
+            <w:tcW w:type="dxa" w:w="3021"/>
+          </w:tcPr>
+          <w:p>
+            <w:r>
+              <w:t>Resultado esperado: El estado canSubmit cambia a true permitiendo que se realice el envío del registro.</w:t>
+            </w:r>
+          </w:p>
+        </w:tc>
+        <w:tc>
+          <w:tcPr>
+            <w:tcW w:type="dxa" w:w="3021"/>
+          </w:tcPr>
+          <w:p>
+            <w:r>
+              <w:t>Resultado esperado: El estado canSubmit cambia a true permitiendo que se realice el envío del registro.</w:t>
+            </w:r>
+          </w:p>
+        </w:tc>
+        <w:tc>
+          <w:tcPr>
+            <w:tcW w:type="dxa" w:w="3019"/>
+          </w:tcPr>
+          <w:p>
+            <w:r>
+              <w:t>Resultado esperado: El estado canSubmit cambia a true permitiendo que se realice el envío del registro.</w:t>
+            </w:r>
+          </w:p>
+        </w:tc>
+      </w:tr>
+      <w:tr>
+        <w:tc>
+          <w:tcPr>
+            <w:tcW w:type="dxa" w:w="3021"/>
+          </w:tcPr>
+          <w:p>
+            <w:r>
+              <w:t>Resultado obtenido: Ejecutado con éxito. Pruebas unitarias en la app Android pasadas al 100% en JUnit.</w:t>
+            </w:r>
+          </w:p>
+        </w:tc>
+        <w:tc>
+          <w:tcPr>
+            <w:tcW w:type="dxa" w:w="3021"/>
+          </w:tcPr>
+          <w:p>
+            <w:r>
+              <w:t>Resultado obtenido: Ejecutado con éxito. Pruebas unitarias en la app Android pasadas al 100% en JUnit.</w:t>
+            </w:r>
+          </w:p>
+        </w:tc>
+        <w:tc>
+          <w:tcPr>
+            <w:tcW w:type="dxa" w:w="3019"/>
+          </w:tcPr>
+          <w:p>
+            <w:r>
+              <w:t>Resultado obtenido: Ejecutado con éxito. Pruebas unitarias en la app Android pasadas al 100% en JUnit.</w:t>
+            </w:r>
+          </w:p>
+        </w:tc>
+      </w:tr>
+      <w:tr>
+        <w:tc>
+          <w:tcPr>
+            <w:tcW w:type="dxa" w:w="3021"/>
+          </w:tcPr>
+          <w:p>
+            <w:r>
+              <w:t>Prueba unitaria de flujo de registro exitoso</w:t>
+            </w:r>
+          </w:p>
+        </w:tc>
+        <w:tc>
+          <w:tcPr>
+            <w:tcW w:type="dxa" w:w="3021"/>
+          </w:tcPr>
+          <w:p>
+            <w:r>
+              <w:t>CP-29</w:t>
+            </w:r>
+          </w:p>
+        </w:tc>
+        <w:tc>
+          <w:tcPr>
+            <w:tcW w:type="dxa" w:w="3019"/>
+          </w:tcPr>
+          <w:p>
+            <w:r>
+              <w:t>CP-29</w:t>
+            </w:r>
+          </w:p>
+        </w:tc>
+      </w:tr>
+      <w:tr>
+        <w:tc>
+          <w:tcPr>
+            <w:tcW w:type="dxa" w:w="3021"/>
+          </w:tcPr>
+          <w:p>
+            <w:r>
+              <w:t>Prueba unitaria de flujo de registro exitoso</w:t>
+            </w:r>
+          </w:p>
+        </w:tc>
+        <w:tc>
+          <w:tcPr>
+            <w:tcW w:type="dxa" w:w="3021"/>
+          </w:tcPr>
+          <w:p>
+            <w:r>
+              <w:t>¿Prueba de despliegue?</w:t>
+            </w:r>
+          </w:p>
+        </w:tc>
+        <w:tc>
+          <w:tcPr>
+            <w:tcW w:type="dxa" w:w="3019"/>
+          </w:tcPr>
+          <w:p>
+            <w:r>
+              <w:t>No</w:t>
+            </w:r>
+          </w:p>
+        </w:tc>
+      </w:tr>
+      <w:tr>
+        <w:tc>
+          <w:tcPr>
+            <w:tcW w:type="dxa" w:w="3021"/>
+          </w:tcPr>
+          <w:p>
+            <w:r>
+              <w:t>Descripción: Validar que el envío del formulario invoque correctamente al repositorio de autenticación y maneje un registro exitoso.</w:t>
+            </w:r>
+          </w:p>
+        </w:tc>
+        <w:tc>
+          <w:tcPr>
+            <w:tcW w:type="dxa" w:w="3021"/>
+          </w:tcPr>
+          <w:p>
+            <w:r>
+              <w:t>Descripción: Validar que el envío del formulario invoque correctamente al repositorio de autenticación y maneje un registro exitoso.</w:t>
+            </w:r>
+          </w:p>
+        </w:tc>
+        <w:tc>
+          <w:tcPr>
+            <w:tcW w:type="dxa" w:w="3019"/>
+          </w:tcPr>
+          <w:p>
+            <w:r>
+              <w:t>Descripción: Validar que el envío del formulario invoque correctamente al repositorio de autenticación y maneje un registro exitoso.</w:t>
+            </w:r>
+          </w:p>
+        </w:tc>
+      </w:tr>
+      <w:tr>
+        <w:tc>
+          <w:tcPr>
+            <w:tcW w:type="dxa" w:w="3021"/>
+          </w:tcPr>
+          <w:p>
+            <w:r>
+              <w:t>Prerrequisitos: Todos los campos del formulario cargados con información válida en el RegisterViewModel.</w:t>
+            </w:r>
+          </w:p>
+        </w:tc>
+        <w:tc>
+          <w:tcPr>
+            <w:tcW w:type="dxa" w:w="3021"/>
+          </w:tcPr>
+          <w:p>
+            <w:r>
+              <w:t>Prerrequisitos: Todos los campos del formulario cargados con información válida en el RegisterViewModel.</w:t>
+            </w:r>
+          </w:p>
+        </w:tc>
+        <w:tc>
+          <w:tcPr>
+            <w:tcW w:type="dxa" w:w="3019"/>
+          </w:tcPr>
+          <w:p>
+            <w:r>
+              <w:t>Prerrequisitos: Todos los campos del formulario cargados con información válida en el RegisterViewModel.</w:t>
+            </w:r>
+          </w:p>
+        </w:tc>
+      </w:tr>
+      <w:tr>
+        <w:tc>
+          <w:tcPr>
+            <w:tcW w:type="dxa" w:w="3021"/>
+          </w:tcPr>
+          <w:p>
+            <w:r>
+              <w:t>Pasos: 1. Mockear la llamada a authRepository.register retornando Result.success(true). 2. Ejecutar onSubmit() en el RegisterViewModel.</w:t>
+            </w:r>
+          </w:p>
+        </w:tc>
+        <w:tc>
+          <w:tcPr>
+            <w:tcW w:type="dxa" w:w="3021"/>
+          </w:tcPr>
+          <w:p>
+            <w:r>
+              <w:t>Pasos: 1. Mockear la llamada a authRepository.register retornando Result.success(true). 2. Ejecutar onSubmit() en el RegisterViewModel.</w:t>
+            </w:r>
+          </w:p>
+        </w:tc>
+        <w:tc>
+          <w:tcPr>
+            <w:tcW w:type="dxa" w:w="3019"/>
+          </w:tcPr>
+          <w:p>
+            <w:r>
+              <w:t>Pasos: 1. Mockear la llamada a authRepository.register retornando Result.success(true). 2. Ejecutar onSubmit() en el RegisterViewModel.</w:t>
+            </w:r>
+          </w:p>
+        </w:tc>
+      </w:tr>
+      <w:tr>
+        <w:tc>
+          <w:tcPr>
+            <w:tcW w:type="dxa" w:w="3021"/>
+          </w:tcPr>
+          <w:p>
+            <w:r>
+              <w:t>Resultado esperado: Se invoca authRepository.register exactamente una vez, isLoading cambia a false y no se presenta mensaje de error.</w:t>
+            </w:r>
+          </w:p>
+        </w:tc>
+        <w:tc>
+          <w:tcPr>
+            <w:tcW w:type="dxa" w:w="3021"/>
+          </w:tcPr>
+          <w:p>
+            <w:r>
+              <w:t>Resultado esperado: Se invoca authRepository.register exactamente una vez, isLoading cambia a false y no se presenta mensaje de error.</w:t>
+            </w:r>
+          </w:p>
+        </w:tc>
+        <w:tc>
+          <w:tcPr>
+            <w:tcW w:type="dxa" w:w="3019"/>
+          </w:tcPr>
+          <w:p>
+            <w:r>
+              <w:t>Resultado esperado: Se invoca authRepository.register exactamente una vez, isLoading cambia a false y no se presenta mensaje de error.</w:t>
+            </w:r>
+          </w:p>
+        </w:tc>
+      </w:tr>
+      <w:tr>
+        <w:tc>
+          <w:tcPr>
+            <w:tcW w:type="dxa" w:w="3021"/>
+          </w:tcPr>
+          <w:p>
+            <w:r>
+              <w:t>Resultado obtenido: Ejecutado con éxito. Pruebas unitarias en la app Android pasadas al 100% en JUnit.</w:t>
+            </w:r>
+          </w:p>
+        </w:tc>
+        <w:tc>
+          <w:tcPr>
+            <w:tcW w:type="dxa" w:w="3021"/>
+          </w:tcPr>
+          <w:p>
+            <w:r>
+              <w:t>Resultado obtenido: Ejecutado con éxito. Pruebas unitarias en la app Android pasadas al 100% en JUnit.</w:t>
+            </w:r>
+          </w:p>
+        </w:tc>
+        <w:tc>
+          <w:tcPr>
+            <w:tcW w:type="dxa" w:w="3019"/>
+          </w:tcPr>
+          <w:p>
+            <w:r>
+              <w:t>Resultado obtenido: Ejecutado con éxito. Pruebas unitarias en la app Android pasadas al 100% en JUnit.</w:t>
+            </w:r>
+          </w:p>
+        </w:tc>
+      </w:tr>
+      <w:tr>
+        <w:tc>
+          <w:tcPr>
+            <w:tcW w:type="dxa" w:w="3021"/>
+          </w:tcPr>
+          <w:p>
+            <w:r>
+              <w:t>Prueba unitaria de gestión de errores de red en el registro</w:t>
+            </w:r>
+          </w:p>
+        </w:tc>
+        <w:tc>
+          <w:tcPr>
+            <w:tcW w:type="dxa" w:w="3021"/>
+          </w:tcPr>
+          <w:p>
+            <w:r>
+              <w:t>CP-30</w:t>
+            </w:r>
+          </w:p>
+        </w:tc>
+        <w:tc>
+          <w:tcPr>
+            <w:tcW w:type="dxa" w:w="3019"/>
+          </w:tcPr>
+          <w:p>
+            <w:r>
+              <w:t>CP-30</w:t>
+            </w:r>
+          </w:p>
+        </w:tc>
+      </w:tr>
+      <w:tr>
+        <w:tc>
+          <w:tcPr>
+            <w:tcW w:type="dxa" w:w="3021"/>
+          </w:tcPr>
+          <w:p>
+            <w:r>
+              <w:t>Prueba unitaria de gestión de errores de red en el registro</w:t>
+            </w:r>
+          </w:p>
+        </w:tc>
+        <w:tc>
+          <w:tcPr>
+            <w:tcW w:type="dxa" w:w="3021"/>
+          </w:tcPr>
+          <w:p>
+            <w:r>
+              <w:t>¿Prueba de despliegue?</w:t>
+            </w:r>
+          </w:p>
+        </w:tc>
+        <w:tc>
+          <w:tcPr>
+            <w:tcW w:type="dxa" w:w="3019"/>
+          </w:tcPr>
+          <w:p>
+            <w:r>
+              <w:t>No</w:t>
+            </w:r>
+          </w:p>
+        </w:tc>
+      </w:tr>
+      <w:tr>
+        <w:tc>
+          <w:tcPr>
+            <w:tcW w:type="dxa" w:w="3021"/>
+          </w:tcPr>
+          <w:p>
+            <w:r>
+              <w:t>Descripción: Validar que los fallos del servidor de red (como excepciones de E/S) sean capturados y desplegados de forma amigable.</w:t>
+            </w:r>
+          </w:p>
+        </w:tc>
+        <w:tc>
+          <w:tcPr>
+            <w:tcW w:type="dxa" w:w="3021"/>
+          </w:tcPr>
+          <w:p>
+            <w:r>
+              <w:t>Descripción: Validar que los fallos del servidor de red (como excepciones de E/S) sean capturados y desplegados de forma amigable.</w:t>
+            </w:r>
+          </w:p>
+        </w:tc>
+        <w:tc>
+          <w:tcPr>
+            <w:tcW w:type="dxa" w:w="3019"/>
+          </w:tcPr>
+          <w:p>
+            <w:r>
+              <w:t>Descripción: Validar que los fallos del servidor de red (como excepciones de E/S) sean capturados y desplegados de forma amigable.</w:t>
+            </w:r>
+          </w:p>
+        </w:tc>
+      </w:tr>
+      <w:tr>
+        <w:tc>
+          <w:tcPr>
+            <w:tcW w:type="dxa" w:w="3021"/>
+          </w:tcPr>
+          <w:p>
+            <w:r>
+              <w:t>Prerrequisitos: Todos los campos del formulario cargados con información válida en el RegisterViewModel.</w:t>
+            </w:r>
+          </w:p>
+        </w:tc>
+        <w:tc>
+          <w:tcPr>
+            <w:tcW w:type="dxa" w:w="3021"/>
+          </w:tcPr>
+          <w:p>
+            <w:r>
+              <w:t>Prerrequisitos: Todos los campos del formulario cargados con información válida en el RegisterViewModel.</w:t>
+            </w:r>
+          </w:p>
+        </w:tc>
+        <w:tc>
+          <w:tcPr>
+            <w:tcW w:type="dxa" w:w="3019"/>
+          </w:tcPr>
+          <w:p>
+            <w:r>
+              <w:t>Prerrequisitos: Todos los campos del formulario cargados con información válida en el RegisterViewModel.</w:t>
+            </w:r>
+          </w:p>
+        </w:tc>
+      </w:tr>
+      <w:tr>
+        <w:tc>
+          <w:tcPr>
+            <w:tcW w:type="dxa" w:w="3021"/>
+          </w:tcPr>
+          <w:p>
+            <w:r>
+              <w:t>Pasos: 1. Mockear la llamada a authRepository.register retornando Result.failure con una excepción de red. 2. Ejecutar onSubmit() en el RegisterViewModel.</w:t>
+            </w:r>
+          </w:p>
+        </w:tc>
+        <w:tc>
+          <w:tcPr>
+            <w:tcW w:type="dxa" w:w="3021"/>
+          </w:tcPr>
+          <w:p>
+            <w:r>
+              <w:t>Pasos: 1. Mockear la llamada a authRepository.register retornando Result.failure con una excepción de red. 2. Ejecutar onSubmit() en el RegisterViewModel.</w:t>
+            </w:r>
+          </w:p>
+        </w:tc>
+        <w:tc>
+          <w:tcPr>
+            <w:tcW w:type="dxa" w:w="3019"/>
+          </w:tcPr>
+          <w:p>
+            <w:r>
+              <w:t>Pasos: 1. Mockear la llamada a authRepository.register retornando Result.failure con una excepción de red. 2. Ejecutar onSubmit() en el RegisterViewModel.</w:t>
+            </w:r>
+          </w:p>
+        </w:tc>
+      </w:tr>
+      <w:tr>
+        <w:tc>
+          <w:tcPr>
+            <w:tcW w:type="dxa" w:w="3021"/>
+          </w:tcPr>
+          <w:p>
+            <w:r>
+              <w:t>Resultado esperado: Se invoca authRepository.register, isLoading cambia a false y errorMessage se actualiza con un mensaje legible de error de conexión.</w:t>
+            </w:r>
+          </w:p>
+        </w:tc>
+        <w:tc>
+          <w:tcPr>
+            <w:tcW w:type="dxa" w:w="3021"/>
+          </w:tcPr>
+          <w:p>
+            <w:r>
+              <w:t>Resultado esperado: Se invoca authRepository.register, isLoading cambia a false y errorMessage se actualiza con un mensaje legible de error de conexión.</w:t>
+            </w:r>
+          </w:p>
+        </w:tc>
+        <w:tc>
+          <w:tcPr>
+            <w:tcW w:type="dxa" w:w="3019"/>
+          </w:tcPr>
+          <w:p>
+            <w:r>
+              <w:t>Resultado esperado: Se invoca authRepository.register, isLoading cambia a false y errorMessage se actualiza con un mensaje legible de error de conexión.</w:t>
+            </w:r>
+          </w:p>
+        </w:tc>
+      </w:tr>
+      <w:tr>
+        <w:tc>
+          <w:tcPr>
+            <w:tcW w:type="dxa" w:w="3021"/>
+          </w:tcPr>
+          <w:p>
+            <w:r>
+              <w:t>Resultado obtenido: Ejecutado con éxito. Pruebas unitarias en la app Android pasadas al 100% en JUnit.</w:t>
+            </w:r>
+          </w:p>
+        </w:tc>
+        <w:tc>
+          <w:tcPr>
+            <w:tcW w:type="dxa" w:w="3021"/>
+          </w:tcPr>
+          <w:p>
+            <w:r>
+              <w:t>Resultado obtenido: Ejecutado con éxito. Pruebas unitarias en la app Android pasadas al 100% en JUnit.</w:t>
+            </w:r>
+          </w:p>
+        </w:tc>
+        <w:tc>
+          <w:tcPr>
+            <w:tcW w:type="dxa" w:w="3019"/>
+          </w:tcPr>
+          <w:p>
+            <w:r>
+              <w:t>Resultado obtenido: Ejecutado con éxito. Pruebas unitarias en la app Android pasadas al 100% en JUnit.</w:t>
+            </w:r>
+          </w:p>
+        </w:tc>
+      </w:tr>
+      <w:tr>
+        <w:tc>
+          <w:tcPr>
+            <w:tcW w:type="dxa" w:w="3021"/>
+          </w:tcPr>
+          <w:p>
+            <w:r>
+              <w:t>Prueba unitaria de cálculo de distancia geográfica (MatchEngine)</w:t>
+            </w:r>
+          </w:p>
+        </w:tc>
+        <w:tc>
+          <w:tcPr>
+            <w:tcW w:type="dxa" w:w="3021"/>
+          </w:tcPr>
+          <w:p>
+            <w:r>
+              <w:t>CP-31</w:t>
+            </w:r>
+          </w:p>
+        </w:tc>
+        <w:tc>
+          <w:tcPr>
+            <w:tcW w:type="dxa" w:w="3019"/>
+          </w:tcPr>
+          <w:p>
+            <w:r>
+              <w:t>CP-31</w:t>
+            </w:r>
+          </w:p>
+        </w:tc>
+      </w:tr>
+      <w:tr>
+        <w:tc>
+          <w:tcPr>
+            <w:tcW w:type="dxa" w:w="3021"/>
+          </w:tcPr>
+          <w:p>
+            <w:r>
+              <w:t>Prueba unitaria de cálculo de distancia geográfica (MatchEngine)</w:t>
+            </w:r>
+          </w:p>
+        </w:tc>
+        <w:tc>
+          <w:tcPr>
+            <w:tcW w:type="dxa" w:w="3021"/>
+          </w:tcPr>
+          <w:p>
+            <w:r>
+              <w:t>¿Prueba de despliegue?</w:t>
+            </w:r>
+          </w:p>
+        </w:tc>
+        <w:tc>
+          <w:tcPr>
+            <w:tcW w:type="dxa" w:w="3019"/>
+          </w:tcPr>
+          <w:p>
+            <w:r>
+              <w:t>No</w:t>
+            </w:r>
+          </w:p>
+        </w:tc>
+      </w:tr>
+      <w:tr>
+        <w:tc>
+          <w:tcPr>
+            <w:tcW w:type="dxa" w:w="3021"/>
+          </w:tcPr>
+          <w:p>
+            <w:r>
+              <w:t>Descripción: Verificar la precisión del cálculo de la distancia georreferenciada en kilómetros entre dos coordenadas usando la fórmula Haversine.</w:t>
+            </w:r>
+          </w:p>
+        </w:tc>
+        <w:tc>
+          <w:tcPr>
+            <w:tcW w:type="dxa" w:w="3021"/>
+          </w:tcPr>
+          <w:p>
+            <w:r>
+              <w:t>Descripción: Verificar la precisión del cálculo de la distancia georreferenciada en kilómetros entre dos coordenadas usando la fórmula Haversine.</w:t>
+            </w:r>
+          </w:p>
+        </w:tc>
+        <w:tc>
+          <w:tcPr>
+            <w:tcW w:type="dxa" w:w="3019"/>
+          </w:tcPr>
+          <w:p>
+            <w:r>
+              <w:t>Descripción: Verificar la precisión del cálculo de la distancia georreferenciada en kilómetros entre dos coordenadas usando la fórmula Haversine.</w:t>
+            </w:r>
+          </w:p>
+        </w:tc>
+      </w:tr>
+      <w:tr>
+        <w:tc>
+          <w:tcPr>
+            <w:tcW w:type="dxa" w:w="3021"/>
+          </w:tcPr>
+          <w:p>
+            <w:r>
+              <w:t>Prerrequisitos: Clase de utilidad MatchEngine disponible.</w:t>
+            </w:r>
+          </w:p>
+        </w:tc>
+        <w:tc>
+          <w:tcPr>
+            <w:tcW w:type="dxa" w:w="3021"/>
+          </w:tcPr>
+          <w:p>
+            <w:r>
+              <w:t>Prerrequisitos: Clase de utilidad MatchEngine disponible.</w:t>
+            </w:r>
+          </w:p>
+        </w:tc>
+        <w:tc>
+          <w:tcPr>
+            <w:tcW w:type="dxa" w:w="3019"/>
+          </w:tcPr>
+          <w:p>
+            <w:r>
+              <w:t>Prerrequisitos: Clase de utilidad MatchEngine disponible.</w:t>
+            </w:r>
+          </w:p>
+        </w:tc>
+      </w:tr>
+      <w:tr>
+        <w:tc>
+          <w:tcPr>
+            <w:tcW w:type="dxa" w:w="3021"/>
+          </w:tcPr>
+          <w:p>
+            <w:r>
+              <w:t>Pasos: 1. Invocar MatchEngine.calculateDistance pasando coordenadas de la Plaza de Armas y el Costanera Center de Santiago.</w:t>
+            </w:r>
+          </w:p>
+        </w:tc>
+        <w:tc>
+          <w:tcPr>
+            <w:tcW w:type="dxa" w:w="3021"/>
+          </w:tcPr>
+          <w:p>
+            <w:r>
+              <w:t>Pasos: 1. Invocar MatchEngine.calculateDistance pasando coordenadas de la Plaza de Armas y el Costanera Center de Santiago.</w:t>
+            </w:r>
+          </w:p>
+        </w:tc>
+        <w:tc>
+          <w:tcPr>
+            <w:tcW w:type="dxa" w:w="3019"/>
+          </w:tcPr>
+          <w:p>
+            <w:r>
+              <w:t>Pasos: 1. Invocar MatchEngine.calculateDistance pasando coordenadas de la Plaza de Armas y el Costanera Center de Santiago.</w:t>
+            </w:r>
+          </w:p>
+        </w:tc>
+      </w:tr>
+      <w:tr>
+        <w:tc>
+          <w:tcPr>
+            <w:tcW w:type="dxa" w:w="3021"/>
+          </w:tcPr>
+          <w:p>
+            <w:r>
+              <w:t>Resultado esperado: El motor retorna la distancia precisa calculada matemáticamente en kilómetros (~4.6 km).</w:t>
+            </w:r>
+          </w:p>
+        </w:tc>
+        <w:tc>
+          <w:tcPr>
+            <w:tcW w:type="dxa" w:w="3021"/>
+          </w:tcPr>
+          <w:p>
+            <w:r>
+              <w:t>Resultado esperado: El motor retorna la distancia precisa calculada matemáticamente en kilómetros (~4.6 km).</w:t>
+            </w:r>
+          </w:p>
+        </w:tc>
+        <w:tc>
+          <w:tcPr>
+            <w:tcW w:type="dxa" w:w="3019"/>
+          </w:tcPr>
+          <w:p>
+            <w:r>
+              <w:t>Resultado esperado: El motor retorna la distancia precisa calculada matemáticamente en kilómetros (~4.6 km).</w:t>
+            </w:r>
+          </w:p>
+        </w:tc>
+      </w:tr>
+      <w:tr>
+        <w:tc>
+          <w:tcPr>
+            <w:tcW w:type="dxa" w:w="3021"/>
+          </w:tcPr>
+          <w:p>
+            <w:r>
+              <w:t>Resultado obtenido: Ejecutado con éxito. Pruebas unitarias en la app Android pasadas al 100% en JUnit.</w:t>
+            </w:r>
+          </w:p>
+        </w:tc>
+        <w:tc>
+          <w:tcPr>
+            <w:tcW w:type="dxa" w:w="3021"/>
+          </w:tcPr>
+          <w:p>
+            <w:r>
+              <w:t>Resultado obtenido: Ejecutado con éxito. Pruebas unitarias en la app Android pasadas al 100% en JUnit.</w:t>
+            </w:r>
+          </w:p>
+        </w:tc>
+        <w:tc>
+          <w:tcPr>
+            <w:tcW w:type="dxa" w:w="3019"/>
+          </w:tcPr>
+          <w:p>
+            <w:r>
+              <w:t>Resultado obtenido: Ejecutado con éxito. Pruebas unitarias en la app Android pasadas al 100% en JUnit.</w:t>
+            </w:r>
+          </w:p>
+        </w:tc>
+      </w:tr>
+      <w:tr>
+        <w:tc>
+          <w:tcPr>
+            <w:tcW w:type="dxa" w:w="3021"/>
+          </w:tcPr>
+          <w:p>
+            <w:r>
+              <w:t>Prueba unitaria de distancia geográfica ante coordenadas nulas</w:t>
+            </w:r>
+          </w:p>
+        </w:tc>
+        <w:tc>
+          <w:tcPr>
+            <w:tcW w:type="dxa" w:w="3021"/>
+          </w:tcPr>
+          <w:p>
+            <w:r>
+              <w:t>CP-32</w:t>
+            </w:r>
+          </w:p>
+        </w:tc>
+        <w:tc>
+          <w:tcPr>
+            <w:tcW w:type="dxa" w:w="3019"/>
+          </w:tcPr>
+          <w:p>
+            <w:r>
+              <w:t>CP-32</w:t>
+            </w:r>
+          </w:p>
+        </w:tc>
+      </w:tr>
+      <w:tr>
+        <w:tc>
+          <w:tcPr>
+            <w:tcW w:type="dxa" w:w="3021"/>
+          </w:tcPr>
+          <w:p>
+            <w:r>
+              <w:t>Prueba unitaria de distancia geográfica ante coordenadas nulas</w:t>
+            </w:r>
+          </w:p>
+        </w:tc>
+        <w:tc>
+          <w:tcPr>
+            <w:tcW w:type="dxa" w:w="3021"/>
+          </w:tcPr>
+          <w:p>
+            <w:r>
+              <w:t>¿Prueba de despliegue?</w:t>
+            </w:r>
+          </w:p>
+        </w:tc>
+        <w:tc>
+          <w:tcPr>
+            <w:tcW w:type="dxa" w:w="3019"/>
+          </w:tcPr>
+          <w:p>
+            <w:r>
+              <w:t>No</w:t>
+            </w:r>
+          </w:p>
+        </w:tc>
+      </w:tr>
+      <w:tr>
+        <w:tc>
+          <w:tcPr>
+            <w:tcW w:type="dxa" w:w="3021"/>
+          </w:tcPr>
+          <w:p>
+            <w:r>
+              <w:t>Descripción: Validar que el motor geográfico de emparejamiento controle adecuadamente los parámetros nulos y retorne el código de error.</w:t>
+            </w:r>
+          </w:p>
+        </w:tc>
+        <w:tc>
+          <w:tcPr>
+            <w:tcW w:type="dxa" w:w="3021"/>
+          </w:tcPr>
+          <w:p>
+            <w:r>
+              <w:t>Descripción: Validar que el motor geográfico de emparejamiento controle adecuadamente los parámetros nulos y retorne el código de error.</w:t>
+            </w:r>
+          </w:p>
+        </w:tc>
+        <w:tc>
+          <w:tcPr>
+            <w:tcW w:type="dxa" w:w="3019"/>
+          </w:tcPr>
+          <w:p>
+            <w:r>
+              <w:t>Descripción: Validar que el motor geográfico de emparejamiento controle adecuadamente los parámetros nulos y retorne el código de error.</w:t>
+            </w:r>
+          </w:p>
+        </w:tc>
+      </w:tr>
+      <w:tr>
+        <w:tc>
+          <w:tcPr>
+            <w:tcW w:type="dxa" w:w="3021"/>
+          </w:tcPr>
+          <w:p>
+            <w:r>
+              <w:t>Prerrequisitos: Clase de utilidad MatchEngine disponible.</w:t>
+            </w:r>
+          </w:p>
+        </w:tc>
+        <w:tc>
+          <w:tcPr>
+            <w:tcW w:type="dxa" w:w="3021"/>
+          </w:tcPr>
+          <w:p>
+            <w:r>
+              <w:t>Prerrequisitos: Clase de utilidad MatchEngine disponible.</w:t>
+            </w:r>
+          </w:p>
+        </w:tc>
+        <w:tc>
+          <w:tcPr>
+            <w:tcW w:type="dxa" w:w="3019"/>
+          </w:tcPr>
+          <w:p>
+            <w:r>
+              <w:t>Prerrequisitos: Clase de utilidad MatchEngine disponible.</w:t>
+            </w:r>
+          </w:p>
+        </w:tc>
+      </w:tr>
+      <w:tr>
+        <w:tc>
+          <w:tcPr>
+            <w:tcW w:type="dxa" w:w="3021"/>
+          </w:tcPr>
+          <w:p>
+            <w:r>
+              <w:t>Pasos: 1. Invocar MatchEngine.calculateDistance pasando valores null en latitud o longitud.</w:t>
+            </w:r>
+          </w:p>
+        </w:tc>
+        <w:tc>
+          <w:tcPr>
+            <w:tcW w:type="dxa" w:w="3021"/>
+          </w:tcPr>
+          <w:p>
+            <w:r>
+              <w:t>Pasos: 1. Invocar MatchEngine.calculateDistance pasando valores null en latitud o longitud.</w:t>
+            </w:r>
+          </w:p>
+        </w:tc>
+        <w:tc>
+          <w:tcPr>
+            <w:tcW w:type="dxa" w:w="3019"/>
+          </w:tcPr>
+          <w:p>
+            <w:r>
+              <w:t>Pasos: 1. Invocar MatchEngine.calculateDistance pasando valores null en latitud o longitud.</w:t>
+            </w:r>
+          </w:p>
+        </w:tc>
+      </w:tr>
+      <w:tr>
+        <w:tc>
+          <w:tcPr>
+            <w:tcW w:type="dxa" w:w="3021"/>
+          </w:tcPr>
+          <w:p>
+            <w:r>
+              <w:t>Resultado esperado: El método de distancia retorna el valor -1.0 indicando datos geográficos nulos o ausentes.</w:t>
+            </w:r>
+          </w:p>
+        </w:tc>
+        <w:tc>
+          <w:tcPr>
+            <w:tcW w:type="dxa" w:w="3021"/>
+          </w:tcPr>
+          <w:p>
+            <w:r>
+              <w:t>Resultado esperado: El método de distancia retorna el valor -1.0 indicando datos geográficos nulos o ausentes.</w:t>
+            </w:r>
+          </w:p>
+        </w:tc>
+        <w:tc>
+          <w:tcPr>
+            <w:tcW w:type="dxa" w:w="3019"/>
+          </w:tcPr>
+          <w:p>
+            <w:r>
+              <w:t>Resultado esperado: El método de distancia retorna el valor -1.0 indicando datos geográficos nulos o ausentes.</w:t>
+            </w:r>
+          </w:p>
+        </w:tc>
+      </w:tr>
+      <w:tr>
+        <w:tc>
+          <w:tcPr>
+            <w:tcW w:type="dxa" w:w="3021"/>
+          </w:tcPr>
+          <w:p>
+            <w:r>
+              <w:t>Resultado obtenido: Ejecutado con éxito. Pruebas unitarias en la app Android pasadas al 100% en JUnit.</w:t>
+            </w:r>
+          </w:p>
+        </w:tc>
+        <w:tc>
+          <w:tcPr>
+            <w:tcW w:type="dxa" w:w="3021"/>
+          </w:tcPr>
+          <w:p>
+            <w:r>
+              <w:t>Resultado obtenido: Ejecutado con éxito. Pruebas unitarias en la app Android pasadas al 100% en JUnit.</w:t>
+            </w:r>
+          </w:p>
+        </w:tc>
+        <w:tc>
+          <w:tcPr>
+            <w:tcW w:type="dxa" w:w="3019"/>
+          </w:tcPr>
+          <w:p>
+            <w:r>
+              <w:t>Resultado obtenido: Ejecutado con éxito. Pruebas unitarias en la app Android pasadas al 100% en JUnit.</w:t>
+            </w:r>
+          </w:p>
+        </w:tc>
+      </w:tr>
+      <w:tr>
+        <w:tc>
+          <w:tcPr>
+            <w:tcW w:type="dxa" w:w="3021"/>
+          </w:tcPr>
+          <w:p>
+            <w:r>
+              <w:t>Prueba unitaria de completitud de perfil al 100% (MatchEngine)</w:t>
+            </w:r>
+          </w:p>
+        </w:tc>
+        <w:tc>
+          <w:tcPr>
+            <w:tcW w:type="dxa" w:w="3021"/>
+          </w:tcPr>
+          <w:p>
+            <w:r>
+              <w:t>CP-33</w:t>
+            </w:r>
+          </w:p>
+        </w:tc>
+        <w:tc>
+          <w:tcPr>
+            <w:tcW w:type="dxa" w:w="3019"/>
+          </w:tcPr>
+          <w:p>
+            <w:r>
+              <w:t>CP-33</w:t>
+            </w:r>
+          </w:p>
+        </w:tc>
+      </w:tr>
+      <w:tr>
+        <w:tc>
+          <w:tcPr>
+            <w:tcW w:type="dxa" w:w="3021"/>
+          </w:tcPr>
+          <w:p>
+            <w:r>
+              <w:t>Prueba unitaria de completitud de perfil al 100% (MatchEngine)</w:t>
+            </w:r>
+          </w:p>
+        </w:tc>
+        <w:tc>
+          <w:tcPr>
+            <w:tcW w:type="dxa" w:w="3021"/>
+          </w:tcPr>
+          <w:p>
+            <w:r>
+              <w:t>¿Prueba de despliegue?</w:t>
+            </w:r>
+          </w:p>
+        </w:tc>
+        <w:tc>
+          <w:tcPr>
+            <w:tcW w:type="dxa" w:w="3019"/>
+          </w:tcPr>
+          <w:p>
+            <w:r>
+              <w:t>No</w:t>
+            </w:r>
+          </w:p>
+        </w:tc>
+      </w:tr>
+      <w:tr>
+        <w:tc>
+          <w:tcPr>
+            <w:tcW w:type="dxa" w:w="3021"/>
+          </w:tcPr>
+          <w:p>
+            <w:r>
+              <w:t>Descripción: Verificar que el motor asigne el porcentaje de completitud máximo del 100% cuando el perfil contenga información bancaria, archivos, habilidades y datos básicos.</w:t>
+            </w:r>
+          </w:p>
+        </w:tc>
+        <w:tc>
+          <w:tcPr>
+            <w:tcW w:type="dxa" w:w="3021"/>
+          </w:tcPr>
+          <w:p>
+            <w:r>
+              <w:t>Descripción: Verificar que el motor asigne el porcentaje de completitud máximo del 100% cuando el perfil contenga información bancaria, archivos, habilidades y datos básicos.</w:t>
+            </w:r>
+          </w:p>
+        </w:tc>
+        <w:tc>
+          <w:tcPr>
+            <w:tcW w:type="dxa" w:w="3019"/>
+          </w:tcPr>
+          <w:p>
+            <w:r>
+              <w:t>Descripción: Verificar que el motor asigne el porcentaje de completitud máximo del 100% cuando el perfil contenga información bancaria, archivos, habilidades y datos básicos.</w:t>
+            </w:r>
+          </w:p>
+        </w:tc>
+      </w:tr>
+      <w:tr>
+        <w:tc>
+          <w:tcPr>
+            <w:tcW w:type="dxa" w:w="3021"/>
+          </w:tcPr>
+          <w:p>
+            <w:r>
+              <w:t>Prerrequisitos: Clase de utilidad MatchEngine disponible.</w:t>
+            </w:r>
+          </w:p>
+        </w:tc>
+        <w:tc>
+          <w:tcPr>
+            <w:tcW w:type="dxa" w:w="3021"/>
+          </w:tcPr>
+          <w:p>
+            <w:r>
+              <w:t>Prerrequisitos: Clase de utilidad MatchEngine disponible.</w:t>
+            </w:r>
+          </w:p>
+        </w:tc>
+        <w:tc>
+          <w:tcPr>
+            <w:tcW w:type="dxa" w:w="3019"/>
+          </w:tcPr>
+          <w:p>
+            <w:r>
+              <w:t>Prerrequisitos: Clase de utilidad MatchEngine disponible.</w:t>
+            </w:r>
+          </w:p>
+        </w:tc>
+      </w:tr>
+      <w:tr>
+        <w:tc>
+          <w:tcPr>
+            <w:tcW w:type="dxa" w:w="3021"/>
+          </w:tcPr>
+          <w:p>
+            <w:r>
+              <w:t>Pasos: 1. Instanciar un ProfileRemoteDto con todos sus campos completos. 2. Invocar MatchEngine.calculateProfileCompletion con dicho perfil.</w:t>
+            </w:r>
+          </w:p>
+        </w:tc>
+        <w:tc>
+          <w:tcPr>
+            <w:tcW w:type="dxa" w:w="3021"/>
+          </w:tcPr>
+          <w:p>
+            <w:r>
+              <w:t>Pasos: 1. Instanciar un ProfileRemoteDto con todos sus campos completos. 2. Invocar MatchEngine.calculateProfileCompletion con dicho perfil.</w:t>
+            </w:r>
+          </w:p>
+        </w:tc>
+        <w:tc>
+          <w:tcPr>
+            <w:tcW w:type="dxa" w:w="3019"/>
+          </w:tcPr>
+          <w:p>
+            <w:r>
+              <w:t>Pasos: 1. Instanciar un ProfileRemoteDto con todos sus campos completos. 2. Invocar MatchEngine.calculateProfileCompletion con dicho perfil.</w:t>
+            </w:r>
+          </w:p>
+        </w:tc>
+      </w:tr>
+      <w:tr>
+        <w:tc>
+          <w:tcPr>
+            <w:tcW w:type="dxa" w:w="3021"/>
+          </w:tcPr>
+          <w:p>
+            <w:r>
+              <w:t>Resultado esperado: El motor retorna exactamente 100.</w:t>
+            </w:r>
+          </w:p>
+        </w:tc>
+        <w:tc>
+          <w:tcPr>
+            <w:tcW w:type="dxa" w:w="3021"/>
+          </w:tcPr>
+          <w:p>
+            <w:r>
+              <w:t>Resultado esperado: El motor retorna exactamente 100.</w:t>
+            </w:r>
+          </w:p>
+        </w:tc>
+        <w:tc>
+          <w:tcPr>
+            <w:tcW w:type="dxa" w:w="3019"/>
+          </w:tcPr>
+          <w:p>
+            <w:r>
+              <w:t>Resultado esperado: El motor retorna exactamente 100.</w:t>
+            </w:r>
+          </w:p>
+        </w:tc>
+      </w:tr>
+      <w:tr>
+        <w:tc>
+          <w:tcPr>
+            <w:tcW w:type="dxa" w:w="3021"/>
+          </w:tcPr>
+          <w:p>
+            <w:r>
+              <w:t>Resultado obtenido: Ejecutado con éxito. Pruebas unitarias en la app Android pasadas al 100% en JUnit.</w:t>
+            </w:r>
+          </w:p>
+        </w:tc>
+        <w:tc>
+          <w:tcPr>
+            <w:tcW w:type="dxa" w:w="3021"/>
+          </w:tcPr>
+          <w:p>
+            <w:r>
+              <w:t>Resultado obtenido: Ejecutado con éxito. Pruebas unitarias en la app Android pasadas al 100% en JUnit.</w:t>
+            </w:r>
+          </w:p>
+        </w:tc>
+        <w:tc>
+          <w:tcPr>
+            <w:tcW w:type="dxa" w:w="3019"/>
+          </w:tcPr>
+          <w:p>
+            <w:r>
+              <w:t>Resultado obtenido: Ejecutado con éxito. Pruebas unitarias en la app Android pasadas al 100% en JUnit.</w:t>
+            </w:r>
+          </w:p>
+        </w:tc>
+      </w:tr>
+      <w:tr>
+        <w:tc>
+          <w:tcPr>
+            <w:tcW w:type="dxa" w:w="3021"/>
+          </w:tcPr>
+          <w:p>
+            <w:r>
+              <w:t>Prueba unitaria de completitud de perfil nulo u vacío</w:t>
+            </w:r>
+          </w:p>
+        </w:tc>
+        <w:tc>
+          <w:tcPr>
+            <w:tcW w:type="dxa" w:w="3021"/>
+          </w:tcPr>
+          <w:p>
+            <w:r>
+              <w:t>CP-34</w:t>
+            </w:r>
+          </w:p>
+        </w:tc>
+        <w:tc>
+          <w:tcPr>
+            <w:tcW w:type="dxa" w:w="3019"/>
+          </w:tcPr>
+          <w:p>
+            <w:r>
+              <w:t>CP-34</w:t>
+            </w:r>
+          </w:p>
+        </w:tc>
+      </w:tr>
+      <w:tr>
+        <w:tc>
+          <w:tcPr>
+            <w:tcW w:type="dxa" w:w="3021"/>
+          </w:tcPr>
+          <w:p>
+            <w:r>
+              <w:t>Prueba unitaria de completitud de perfil nulo u vacío</w:t>
+            </w:r>
+          </w:p>
+        </w:tc>
+        <w:tc>
+          <w:tcPr>
+            <w:tcW w:type="dxa" w:w="3021"/>
+          </w:tcPr>
+          <w:p>
+            <w:r>
+              <w:t>¿Prueba de despliegue?</w:t>
+            </w:r>
+          </w:p>
+        </w:tc>
+        <w:tc>
+          <w:tcPr>
+            <w:tcW w:type="dxa" w:w="3019"/>
+          </w:tcPr>
+          <w:p>
+            <w:r>
+              <w:t>No</w:t>
+            </w:r>
+          </w:p>
+        </w:tc>
+      </w:tr>
+      <w:tr>
+        <w:tc>
+          <w:tcPr>
+            <w:tcW w:type="dxa" w:w="3021"/>
+          </w:tcPr>
+          <w:p>
+            <w:r>
+              <w:t>Descripción: Validar que el motor retorne un porcentaje de completitud del 0% cuando el perfil esté completamente vacío.</w:t>
+            </w:r>
+          </w:p>
+        </w:tc>
+        <w:tc>
+          <w:tcPr>
+            <w:tcW w:type="dxa" w:w="3021"/>
+          </w:tcPr>
+          <w:p>
+            <w:r>
+              <w:t>Descripción: Validar que el motor retorne un porcentaje de completitud del 0% cuando el perfil esté completamente vacío.</w:t>
+            </w:r>
+          </w:p>
+        </w:tc>
+        <w:tc>
+          <w:tcPr>
+            <w:tcW w:type="dxa" w:w="3019"/>
+          </w:tcPr>
+          <w:p>
+            <w:r>
+              <w:t>Descripción: Validar que el motor retorne un porcentaje de completitud del 0% cuando el perfil esté completamente vacío.</w:t>
+            </w:r>
+          </w:p>
+        </w:tc>
+      </w:tr>
+      <w:tr>
+        <w:tc>
+          <w:tcPr>
+            <w:tcW w:type="dxa" w:w="3021"/>
+          </w:tcPr>
+          <w:p>
+            <w:r>
+              <w:t>Prerrequisitos: Clase de utilidad MatchEngine disponible.</w:t>
+            </w:r>
+          </w:p>
+        </w:tc>
+        <w:tc>
+          <w:tcPr>
+            <w:tcW w:type="dxa" w:w="3021"/>
+          </w:tcPr>
+          <w:p>
+            <w:r>
+              <w:t>Prerrequisitos: Clase de utilidad MatchEngine disponible.</w:t>
+            </w:r>
+          </w:p>
+        </w:tc>
+        <w:tc>
+          <w:tcPr>
+            <w:tcW w:type="dxa" w:w="3019"/>
+          </w:tcPr>
+          <w:p>
+            <w:r>
+              <w:t>Prerrequisitos: Clase de utilidad MatchEngine disponible.</w:t>
+            </w:r>
+          </w:p>
+        </w:tc>
+      </w:tr>
+      <w:tr>
+        <w:tc>
+          <w:tcPr>
+            <w:tcW w:type="dxa" w:w="3021"/>
+          </w:tcPr>
+          <w:p>
+            <w:r>
+              <w:t>Pasos: 1. Invocar MatchEngine.calculateProfileCompletion con un perfil vacío o un valor null.</w:t>
+            </w:r>
+          </w:p>
+        </w:tc>
+        <w:tc>
+          <w:tcPr>
+            <w:tcW w:type="dxa" w:w="3021"/>
+          </w:tcPr>
+          <w:p>
+            <w:r>
+              <w:t>Pasos: 1. Invocar MatchEngine.calculateProfileCompletion con un perfil vacío o un valor null.</w:t>
+            </w:r>
+          </w:p>
+        </w:tc>
+        <w:tc>
+          <w:tcPr>
+            <w:tcW w:type="dxa" w:w="3019"/>
+          </w:tcPr>
+          <w:p>
+            <w:r>
+              <w:t>Pasos: 1. Invocar MatchEngine.calculateProfileCompletion con un perfil vacío o un valor null.</w:t>
+            </w:r>
+          </w:p>
+        </w:tc>
+      </w:tr>
+      <w:tr>
+        <w:tc>
+          <w:tcPr>
+            <w:tcW w:type="dxa" w:w="3021"/>
+          </w:tcPr>
+          <w:p>
+            <w:r>
+              <w:t>Resultado esperado: El motor de emparejamiento retorna exactamente 0.</w:t>
+            </w:r>
+          </w:p>
+        </w:tc>
+        <w:tc>
+          <w:tcPr>
+            <w:tcW w:type="dxa" w:w="3021"/>
+          </w:tcPr>
+          <w:p>
+            <w:r>
+              <w:t>Resultado esperado: El motor de emparejamiento retorna exactamente 0.</w:t>
+            </w:r>
+          </w:p>
+        </w:tc>
+        <w:tc>
+          <w:tcPr>
+            <w:tcW w:type="dxa" w:w="3019"/>
+          </w:tcPr>
+          <w:p>
+            <w:r>
+              <w:t>Resultado esperado: El motor de emparejamiento retorna exactamente 0.</w:t>
+            </w:r>
+          </w:p>
+        </w:tc>
+      </w:tr>
+      <w:tr>
+        <w:tc>
+          <w:tcPr>
+            <w:tcW w:type="dxa" w:w="3021"/>
+          </w:tcPr>
+          <w:p>
+            <w:r>
+              <w:t>Resultado obtenido: Ejecutado con éxito. Pruebas unitarias en la app Android pasadas al 100% en JUnit.</w:t>
+            </w:r>
+          </w:p>
+        </w:tc>
+        <w:tc>
+          <w:tcPr>
+            <w:tcW w:type="dxa" w:w="3021"/>
+          </w:tcPr>
+          <w:p>
+            <w:r>
+              <w:t>Resultado obtenido: Ejecutado con éxito. Pruebas unitarias en la app Android pasadas al 100% en JUnit.</w:t>
+            </w:r>
+          </w:p>
+        </w:tc>
+        <w:tc>
+          <w:tcPr>
+            <w:tcW w:type="dxa" w:w="3019"/>
+          </w:tcPr>
+          <w:p>
+            <w:r>
+              <w:t>Resultado obtenido: Ejecutado con éxito. Pruebas unitarias en la app Android pasadas al 100% en JUnit.</w:t>
+            </w:r>
+          </w:p>
+        </w:tc>
+      </w:tr>
+      <w:tr>
+        <w:tc>
+          <w:tcPr>
+            <w:tcW w:type="dxa" w:w="3021"/>
+          </w:tcPr>
+          <w:p>
+            <w:r>
+              <w:t>Prueba unitaria de relevancia básica de matching con plan TRIAL</w:t>
+            </w:r>
+          </w:p>
+        </w:tc>
+        <w:tc>
+          <w:tcPr>
+            <w:tcW w:type="dxa" w:w="3021"/>
+          </w:tcPr>
+          <w:p>
+            <w:r>
+              <w:t>CP-35</w:t>
+            </w:r>
+          </w:p>
+        </w:tc>
+        <w:tc>
+          <w:tcPr>
+            <w:tcW w:type="dxa" w:w="3019"/>
+          </w:tcPr>
+          <w:p>
+            <w:r>
+              <w:t>CP-35</w:t>
+            </w:r>
+          </w:p>
+        </w:tc>
+      </w:tr>
+      <w:tr>
+        <w:tc>
+          <w:tcPr>
+            <w:tcW w:type="dxa" w:w="3021"/>
+          </w:tcPr>
+          <w:p>
+            <w:r>
+              <w:t>Prueba unitaria de relevancia básica de matching con plan TRIAL</w:t>
+            </w:r>
+          </w:p>
+        </w:tc>
+        <w:tc>
+          <w:tcPr>
+            <w:tcW w:type="dxa" w:w="3021"/>
+          </w:tcPr>
+          <w:p>
+            <w:r>
+              <w:t>¿Prueba de despliegue?</w:t>
+            </w:r>
+          </w:p>
+        </w:tc>
+        <w:tc>
+          <w:tcPr>
+            <w:tcW w:type="dxa" w:w="3019"/>
+          </w:tcPr>
+          <w:p>
+            <w:r>
+              <w:t>No</w:t>
+            </w:r>
+          </w:p>
+        </w:tc>
+      </w:tr>
+      <w:tr>
+        <w:tc>
+          <w:tcPr>
+            <w:tcW w:type="dxa" w:w="3021"/>
+          </w:tcPr>
+          <w:p>
+            <w:r>
+              <w:t>Descripción: Validar el cálculo de afinidad de coincidencia (score) para usuarios gratuitos en plan TRIAL.</w:t>
+            </w:r>
+          </w:p>
+        </w:tc>
+        <w:tc>
+          <w:tcPr>
+            <w:tcW w:type="dxa" w:w="3021"/>
+          </w:tcPr>
+          <w:p>
+            <w:r>
+              <w:t>Descripción: Validar el cálculo de afinidad de coincidencia (score) para usuarios gratuitos en plan TRIAL.</w:t>
+            </w:r>
+          </w:p>
+        </w:tc>
+        <w:tc>
+          <w:tcPr>
+            <w:tcW w:type="dxa" w:w="3019"/>
+          </w:tcPr>
+          <w:p>
+            <w:r>
+              <w:t>Descripción: Validar el cálculo de afinidad de coincidencia (score) para usuarios gratuitos en plan TRIAL.</w:t>
+            </w:r>
+          </w:p>
+        </w:tc>
+      </w:tr>
+      <w:tr>
+        <w:tc>
+          <w:tcPr>
+            <w:tcW w:type="dxa" w:w="3021"/>
+          </w:tcPr>
+          <w:p>
+            <w:r>
+              <w:t>Prerrequisitos: Perfiles de trabajador, empresa y oferta laboral creados con afinidades.</w:t>
+            </w:r>
+          </w:p>
+        </w:tc>
+        <w:tc>
+          <w:tcPr>
+            <w:tcW w:type="dxa" w:w="3021"/>
+          </w:tcPr>
+          <w:p>
+            <w:r>
+              <w:t>Prerrequisitos: Perfiles de trabajador, empresa y oferta laboral creados con afinidades.</w:t>
+            </w:r>
+          </w:p>
+        </w:tc>
+        <w:tc>
+          <w:tcPr>
+            <w:tcW w:type="dxa" w:w="3019"/>
+          </w:tcPr>
+          <w:p>
+            <w:r>
+              <w:t>Prerrequisitos: Perfiles de trabajador, empresa y oferta laboral creados con afinidades.</w:t>
+            </w:r>
+          </w:p>
+        </w:tc>
+      </w:tr>
+      <w:tr>
+        <w:tc>
+          <w:tcPr>
+            <w:tcW w:type="dxa" w:w="3021"/>
+          </w:tcPr>
+          <w:p>
+            <w:r>
+              <w:t>Pasos: 1. Invocar MatchEngine.calculate pasando los perfiles e indicando el plan 'TRIAL'.</w:t>
+            </w:r>
+          </w:p>
+        </w:tc>
+        <w:tc>
+          <w:tcPr>
+            <w:tcW w:type="dxa" w:w="3021"/>
+          </w:tcPr>
+          <w:p>
+            <w:r>
+              <w:t>Pasos: 1. Invocar MatchEngine.calculate pasando los perfiles e indicando el plan 'TRIAL'.</w:t>
+            </w:r>
+          </w:p>
+        </w:tc>
+        <w:tc>
+          <w:tcPr>
+            <w:tcW w:type="dxa" w:w="3019"/>
+          </w:tcPr>
+          <w:p>
+            <w:r>
+              <w:t>Pasos: 1. Invocar MatchEngine.calculate pasando los perfiles e indicando el plan 'TRIAL'.</w:t>
+            </w:r>
+          </w:p>
+        </w:tc>
+      </w:tr>
+      <w:tr>
+        <w:tc>
+          <w:tcPr>
+            <w:tcW w:type="dxa" w:w="3021"/>
+          </w:tcPr>
+          <w:p>
+            <w:r>
+              <w:t>Resultado esperado: Retorna el puntaje de coincidencia básico sin aplicar multiplicadores de prioridad.</w:t>
+            </w:r>
+          </w:p>
+        </w:tc>
+        <w:tc>
+          <w:tcPr>
+            <w:tcW w:type="dxa" w:w="3021"/>
+          </w:tcPr>
+          <w:p>
+            <w:r>
+              <w:t>Resultado esperado: Retorna el puntaje de coincidencia básico sin aplicar multiplicadores de prioridad.</w:t>
+            </w:r>
+          </w:p>
+        </w:tc>
+        <w:tc>
+          <w:tcPr>
+            <w:tcW w:type="dxa" w:w="3019"/>
+          </w:tcPr>
+          <w:p>
+            <w:r>
+              <w:t>Resultado esperado: Retorna el puntaje de coincidencia básico sin aplicar multiplicadores de prioridad.</w:t>
+            </w:r>
+          </w:p>
+        </w:tc>
+      </w:tr>
+      <w:tr>
+        <w:tc>
+          <w:tcPr>
+            <w:tcW w:type="dxa" w:w="3021"/>
+          </w:tcPr>
+          <w:p>
+            <w:r>
+              <w:t>Resultado obtenido: Ejecutado con éxito. Pruebas unitarias en la app Android pasadas al 100% en JUnit.</w:t>
+            </w:r>
+          </w:p>
+        </w:tc>
+        <w:tc>
+          <w:tcPr>
+            <w:tcW w:type="dxa" w:w="3021"/>
+          </w:tcPr>
+          <w:p>
+            <w:r>
+              <w:t>Resultado obtenido: Ejecutado con éxito. Pruebas unitarias en la app Android pasadas al 100% en JUnit.</w:t>
+            </w:r>
+          </w:p>
+        </w:tc>
+        <w:tc>
+          <w:tcPr>
+            <w:tcW w:type="dxa" w:w="3019"/>
+          </w:tcPr>
+          <w:p>
+            <w:r>
+              <w:t>Resultado obtenido: Ejecutado con éxito. Pruebas unitarias en la app Android pasadas al 100% en JUnit.</w:t>
+            </w:r>
+          </w:p>
+        </w:tc>
+      </w:tr>
+      <w:tr>
+        <w:tc>
+          <w:tcPr>
+            <w:tcW w:type="dxa" w:w="3021"/>
+          </w:tcPr>
+          <w:p>
+            <w:r>
+              <w:t>Prueba unitaria de relevancia premium de matching con plan PREMIUM</w:t>
+            </w:r>
+          </w:p>
+        </w:tc>
+        <w:tc>
+          <w:tcPr>
+            <w:tcW w:type="dxa" w:w="3021"/>
+          </w:tcPr>
+          <w:p>
+            <w:r>
+              <w:t>CP-36</w:t>
+            </w:r>
+          </w:p>
+        </w:tc>
+        <w:tc>
+          <w:tcPr>
+            <w:tcW w:type="dxa" w:w="3019"/>
+          </w:tcPr>
+          <w:p>
+            <w:r>
+              <w:t>CP-36</w:t>
+            </w:r>
+          </w:p>
+        </w:tc>
+      </w:tr>
+      <w:tr>
+        <w:tc>
+          <w:tcPr>
+            <w:tcW w:type="dxa" w:w="3021"/>
+          </w:tcPr>
+          <w:p>
+            <w:r>
+              <w:t>Prueba unitaria de relevancia premium de matching con plan PREMIUM</w:t>
+            </w:r>
+          </w:p>
+        </w:tc>
+        <w:tc>
+          <w:tcPr>
+            <w:tcW w:type="dxa" w:w="3021"/>
+          </w:tcPr>
+          <w:p>
+            <w:r>
+              <w:t>¿Prueba de despliegue?</w:t>
+            </w:r>
+          </w:p>
+        </w:tc>
+        <w:tc>
+          <w:tcPr>
+            <w:tcW w:type="dxa" w:w="3019"/>
+          </w:tcPr>
+          <w:p>
+            <w:r>
+              <w:t>No</w:t>
+            </w:r>
+          </w:p>
+        </w:tc>
+      </w:tr>
+      <w:tr>
+        <w:tc>
+          <w:tcPr>
+            <w:tcW w:type="dxa" w:w="3021"/>
+          </w:tcPr>
+          <w:p>
+            <w:r>
+              <w:t>Descripción: Validar que el cálculo de coincidencia aplique la bonificación de visibilidad e incremento del 20% para usuarios en plan PREMIUM.</w:t>
+            </w:r>
+          </w:p>
+        </w:tc>
+        <w:tc>
+          <w:tcPr>
+            <w:tcW w:type="dxa" w:w="3021"/>
+          </w:tcPr>
+          <w:p>
+            <w:r>
+              <w:t>Descripción: Validar que el cálculo de coincidencia aplique la bonificación de visibilidad e incremento del 20% para usuarios en plan PREMIUM.</w:t>
+            </w:r>
+          </w:p>
+        </w:tc>
+        <w:tc>
+          <w:tcPr>
+            <w:tcW w:type="dxa" w:w="3019"/>
+          </w:tcPr>
+          <w:p>
+            <w:r>
+              <w:t>Descripción: Validar que el cálculo de coincidencia aplique la bonificación de visibilidad e incremento del 20% para usuarios en plan PREMIUM.</w:t>
+            </w:r>
+          </w:p>
+        </w:tc>
+      </w:tr>
+      <w:tr>
+        <w:tc>
+          <w:tcPr>
+            <w:tcW w:type="dxa" w:w="3021"/>
+          </w:tcPr>
+          <w:p>
+            <w:r>
+              <w:t>Prerrequisitos: Mismos datos de prueba de CP-35.</w:t>
+            </w:r>
+          </w:p>
+        </w:tc>
+        <w:tc>
+          <w:tcPr>
+            <w:tcW w:type="dxa" w:w="3021"/>
+          </w:tcPr>
+          <w:p>
+            <w:r>
+              <w:t>Prerrequisitos: Mismos datos de prueba de CP-35.</w:t>
+            </w:r>
+          </w:p>
+        </w:tc>
+        <w:tc>
+          <w:tcPr>
+            <w:tcW w:type="dxa" w:w="3019"/>
+          </w:tcPr>
+          <w:p>
+            <w:r>
+              <w:t>Prerrequisitos: Mismos datos de prueba de CP-35.</w:t>
+            </w:r>
+          </w:p>
+        </w:tc>
+      </w:tr>
+      <w:tr>
+        <w:tc>
+          <w:tcPr>
+            <w:tcW w:type="dxa" w:w="3021"/>
+          </w:tcPr>
+          <w:p>
+            <w:r>
+              <w:t>Pasos: 1. Invocar MatchEngine.calculate pasando los perfiles e indicando el plan 'PREMIUM'.</w:t>
+            </w:r>
+          </w:p>
+        </w:tc>
+        <w:tc>
+          <w:tcPr>
+            <w:tcW w:type="dxa" w:w="3021"/>
+          </w:tcPr>
+          <w:p>
+            <w:r>
+              <w:t>Pasos: 1. Invocar MatchEngine.calculate pasando los perfiles e indicando el plan 'PREMIUM'.</w:t>
+            </w:r>
+          </w:p>
+        </w:tc>
+        <w:tc>
+          <w:tcPr>
+            <w:tcW w:type="dxa" w:w="3019"/>
+          </w:tcPr>
+          <w:p>
+            <w:r>
+              <w:t>Pasos: 1. Invocar MatchEngine.calculate pasando los perfiles e indicando el plan 'PREMIUM'.</w:t>
+            </w:r>
+          </w:p>
+        </w:tc>
+      </w:tr>
+      <w:tr>
+        <w:tc>
+          <w:tcPr>
+            <w:tcW w:type="dxa" w:w="3021"/>
+          </w:tcPr>
+          <w:p>
+            <w:r>
+              <w:t>Resultado esperado: Retorna el puntaje premium con la bonificación aplicada del 20% sobre el puntaje base.</w:t>
+            </w:r>
+          </w:p>
+        </w:tc>
+        <w:tc>
+          <w:tcPr>
+            <w:tcW w:type="dxa" w:w="3021"/>
+          </w:tcPr>
+          <w:p>
+            <w:r>
+              <w:t>Resultado esperado: Retorna el puntaje premium con la bonificación aplicada del 20% sobre el puntaje base.</w:t>
+            </w:r>
+          </w:p>
+        </w:tc>
+        <w:tc>
+          <w:tcPr>
+            <w:tcW w:type="dxa" w:w="3019"/>
+          </w:tcPr>
+          <w:p>
+            <w:r>
+              <w:t>Resultado esperado: Retorna el puntaje premium con la bonificación aplicada del 20% sobre el puntaje base.</w:t>
+            </w:r>
+          </w:p>
+        </w:tc>
+      </w:tr>
+      <w:tr>
+        <w:tc>
+          <w:tcPr>
+            <w:tcW w:type="dxa" w:w="3021"/>
+          </w:tcPr>
+          <w:p>
+            <w:r>
+              <w:t>Resultado obtenido: Ejecutado con éxito. Pruebas unitarias en la app Android pasadas al 100% en JUnit.</w:t>
+            </w:r>
+          </w:p>
+        </w:tc>
+        <w:tc>
+          <w:tcPr>
+            <w:tcW w:type="dxa" w:w="3021"/>
+          </w:tcPr>
+          <w:p>
+            <w:r>
+              <w:t>Resultado obtenido: Ejecutado con éxito. Pruebas unitarias en la app Android pasadas al 100% en JUnit.</w:t>
+            </w:r>
+          </w:p>
+        </w:tc>
+        <w:tc>
+          <w:tcPr>
+            <w:tcW w:type="dxa" w:w="3019"/>
+          </w:tcPr>
+          <w:p>
+            <w:r>
+              <w:t>Resultado obtenido: Ejecutado con éxito. Pruebas unitarias en la app Android pasadas al 100% en JUnit.</w:t>
             </w:r>
           </w:p>
         </w:tc>
@@ -10201,6 +13221,386 @@
           <w:p>
             <w:r>
               <w:t>CP-26</w:t>
+            </w:r>
+          </w:p>
+        </w:tc>
+        <w:tc>
+          <w:tcPr>
+            <w:tcW w:type="dxa" w:w="2256"/>
+          </w:tcPr>
+          <w:p>
+            <w:r>
+              <w:t>X</w:t>
+            </w:r>
+          </w:p>
+        </w:tc>
+        <w:tc>
+          <w:tcPr>
+            <w:tcW w:type="dxa" w:w="2258"/>
+          </w:tcPr>
+          <w:p>
+            <w:r/>
+          </w:p>
+        </w:tc>
+        <w:tc>
+          <w:tcPr>
+            <w:tcW w:type="dxa" w:w="2296"/>
+          </w:tcPr>
+          <w:p>
+            <w:r/>
+          </w:p>
+        </w:tc>
+      </w:tr>
+      <w:tr>
+        <w:tc>
+          <w:tcPr>
+            <w:tcW w:type="dxa" w:w="2251"/>
+          </w:tcPr>
+          <w:p>
+            <w:r>
+              <w:t>CP-27</w:t>
+            </w:r>
+          </w:p>
+        </w:tc>
+        <w:tc>
+          <w:tcPr>
+            <w:tcW w:type="dxa" w:w="2256"/>
+          </w:tcPr>
+          <w:p>
+            <w:r>
+              <w:t>X</w:t>
+            </w:r>
+          </w:p>
+        </w:tc>
+        <w:tc>
+          <w:tcPr>
+            <w:tcW w:type="dxa" w:w="2258"/>
+          </w:tcPr>
+          <w:p>
+            <w:r/>
+          </w:p>
+        </w:tc>
+        <w:tc>
+          <w:tcPr>
+            <w:tcW w:type="dxa" w:w="2296"/>
+          </w:tcPr>
+          <w:p>
+            <w:r/>
+          </w:p>
+        </w:tc>
+      </w:tr>
+      <w:tr>
+        <w:tc>
+          <w:tcPr>
+            <w:tcW w:type="dxa" w:w="2251"/>
+          </w:tcPr>
+          <w:p>
+            <w:r>
+              <w:t>CP-28</w:t>
+            </w:r>
+          </w:p>
+        </w:tc>
+        <w:tc>
+          <w:tcPr>
+            <w:tcW w:type="dxa" w:w="2256"/>
+          </w:tcPr>
+          <w:p>
+            <w:r>
+              <w:t>X</w:t>
+            </w:r>
+          </w:p>
+        </w:tc>
+        <w:tc>
+          <w:tcPr>
+            <w:tcW w:type="dxa" w:w="2258"/>
+          </w:tcPr>
+          <w:p>
+            <w:r/>
+          </w:p>
+        </w:tc>
+        <w:tc>
+          <w:tcPr>
+            <w:tcW w:type="dxa" w:w="2296"/>
+          </w:tcPr>
+          <w:p>
+            <w:r/>
+          </w:p>
+        </w:tc>
+      </w:tr>
+      <w:tr>
+        <w:tc>
+          <w:tcPr>
+            <w:tcW w:type="dxa" w:w="2251"/>
+          </w:tcPr>
+          <w:p>
+            <w:r>
+              <w:t>CP-29</w:t>
+            </w:r>
+          </w:p>
+        </w:tc>
+        <w:tc>
+          <w:tcPr>
+            <w:tcW w:type="dxa" w:w="2256"/>
+          </w:tcPr>
+          <w:p>
+            <w:r>
+              <w:t>X</w:t>
+            </w:r>
+          </w:p>
+        </w:tc>
+        <w:tc>
+          <w:tcPr>
+            <w:tcW w:type="dxa" w:w="2258"/>
+          </w:tcPr>
+          <w:p>
+            <w:r/>
+          </w:p>
+        </w:tc>
+        <w:tc>
+          <w:tcPr>
+            <w:tcW w:type="dxa" w:w="2296"/>
+          </w:tcPr>
+          <w:p>
+            <w:r/>
+          </w:p>
+        </w:tc>
+      </w:tr>
+      <w:tr>
+        <w:tc>
+          <w:tcPr>
+            <w:tcW w:type="dxa" w:w="2251"/>
+          </w:tcPr>
+          <w:p>
+            <w:r>
+              <w:t>CP-30</w:t>
+            </w:r>
+          </w:p>
+        </w:tc>
+        <w:tc>
+          <w:tcPr>
+            <w:tcW w:type="dxa" w:w="2256"/>
+          </w:tcPr>
+          <w:p>
+            <w:r>
+              <w:t>X</w:t>
+            </w:r>
+          </w:p>
+        </w:tc>
+        <w:tc>
+          <w:tcPr>
+            <w:tcW w:type="dxa" w:w="2258"/>
+          </w:tcPr>
+          <w:p>
+            <w:r/>
+          </w:p>
+        </w:tc>
+        <w:tc>
+          <w:tcPr>
+            <w:tcW w:type="dxa" w:w="2296"/>
+          </w:tcPr>
+          <w:p>
+            <w:r/>
+          </w:p>
+        </w:tc>
+      </w:tr>
+      <w:tr>
+        <w:tc>
+          <w:tcPr>
+            <w:tcW w:type="dxa" w:w="2251"/>
+          </w:tcPr>
+          <w:p>
+            <w:r>
+              <w:t>CP-31</w:t>
+            </w:r>
+          </w:p>
+        </w:tc>
+        <w:tc>
+          <w:tcPr>
+            <w:tcW w:type="dxa" w:w="2256"/>
+          </w:tcPr>
+          <w:p>
+            <w:r>
+              <w:t>X</w:t>
+            </w:r>
+          </w:p>
+        </w:tc>
+        <w:tc>
+          <w:tcPr>
+            <w:tcW w:type="dxa" w:w="2258"/>
+          </w:tcPr>
+          <w:p>
+            <w:r/>
+          </w:p>
+        </w:tc>
+        <w:tc>
+          <w:tcPr>
+            <w:tcW w:type="dxa" w:w="2296"/>
+          </w:tcPr>
+          <w:p>
+            <w:r/>
+          </w:p>
+        </w:tc>
+      </w:tr>
+      <w:tr>
+        <w:tc>
+          <w:tcPr>
+            <w:tcW w:type="dxa" w:w="2251"/>
+          </w:tcPr>
+          <w:p>
+            <w:r>
+              <w:t>CP-32</w:t>
+            </w:r>
+          </w:p>
+        </w:tc>
+        <w:tc>
+          <w:tcPr>
+            <w:tcW w:type="dxa" w:w="2256"/>
+          </w:tcPr>
+          <w:p>
+            <w:r>
+              <w:t>X</w:t>
+            </w:r>
+          </w:p>
+        </w:tc>
+        <w:tc>
+          <w:tcPr>
+            <w:tcW w:type="dxa" w:w="2258"/>
+          </w:tcPr>
+          <w:p>
+            <w:r/>
+          </w:p>
+        </w:tc>
+        <w:tc>
+          <w:tcPr>
+            <w:tcW w:type="dxa" w:w="2296"/>
+          </w:tcPr>
+          <w:p>
+            <w:r/>
+          </w:p>
+        </w:tc>
+      </w:tr>
+      <w:tr>
+        <w:tc>
+          <w:tcPr>
+            <w:tcW w:type="dxa" w:w="2251"/>
+          </w:tcPr>
+          <w:p>
+            <w:r>
+              <w:t>CP-33</w:t>
+            </w:r>
+          </w:p>
+        </w:tc>
+        <w:tc>
+          <w:tcPr>
+            <w:tcW w:type="dxa" w:w="2256"/>
+          </w:tcPr>
+          <w:p>
+            <w:r>
+              <w:t>X</w:t>
+            </w:r>
+          </w:p>
+        </w:tc>
+        <w:tc>
+          <w:tcPr>
+            <w:tcW w:type="dxa" w:w="2258"/>
+          </w:tcPr>
+          <w:p>
+            <w:r/>
+          </w:p>
+        </w:tc>
+        <w:tc>
+          <w:tcPr>
+            <w:tcW w:type="dxa" w:w="2296"/>
+          </w:tcPr>
+          <w:p>
+            <w:r/>
+          </w:p>
+        </w:tc>
+      </w:tr>
+      <w:tr>
+        <w:tc>
+          <w:tcPr>
+            <w:tcW w:type="dxa" w:w="2251"/>
+          </w:tcPr>
+          <w:p>
+            <w:r>
+              <w:t>CP-34</w:t>
+            </w:r>
+          </w:p>
+        </w:tc>
+        <w:tc>
+          <w:tcPr>
+            <w:tcW w:type="dxa" w:w="2256"/>
+          </w:tcPr>
+          <w:p>
+            <w:r>
+              <w:t>X</w:t>
+            </w:r>
+          </w:p>
+        </w:tc>
+        <w:tc>
+          <w:tcPr>
+            <w:tcW w:type="dxa" w:w="2258"/>
+          </w:tcPr>
+          <w:p>
+            <w:r/>
+          </w:p>
+        </w:tc>
+        <w:tc>
+          <w:tcPr>
+            <w:tcW w:type="dxa" w:w="2296"/>
+          </w:tcPr>
+          <w:p>
+            <w:r/>
+          </w:p>
+        </w:tc>
+      </w:tr>
+      <w:tr>
+        <w:tc>
+          <w:tcPr>
+            <w:tcW w:type="dxa" w:w="2251"/>
+          </w:tcPr>
+          <w:p>
+            <w:r>
+              <w:t>CP-35</w:t>
+            </w:r>
+          </w:p>
+        </w:tc>
+        <w:tc>
+          <w:tcPr>
+            <w:tcW w:type="dxa" w:w="2256"/>
+          </w:tcPr>
+          <w:p>
+            <w:r>
+              <w:t>X</w:t>
+            </w:r>
+          </w:p>
+        </w:tc>
+        <w:tc>
+          <w:tcPr>
+            <w:tcW w:type="dxa" w:w="2258"/>
+          </w:tcPr>
+          <w:p>
+            <w:r/>
+          </w:p>
+        </w:tc>
+        <w:tc>
+          <w:tcPr>
+            <w:tcW w:type="dxa" w:w="2296"/>
+          </w:tcPr>
+          <w:p>
+            <w:r/>
+          </w:p>
+        </w:tc>
+      </w:tr>
+      <w:tr>
+        <w:tc>
+          <w:tcPr>
+            <w:tcW w:type="dxa" w:w="2251"/>
+          </w:tcPr>
+          <w:p>
+            <w:r>
+              <w:t>CP-36</w:t>
             </w:r>
           </w:p>
         </w:tc>

</xml_diff>

<commit_message>
test(android): agregar 5 pruebas para CrearOfertaViewModel, comentar tests de Login y actualizar documentacion de QA
</commit_message>
<xml_diff>
--- a/Documentacion/Unidad #3/3.1.2 Plan Pruebas Funcionales.docx
+++ b/Documentacion/Unidad #3/3.1.2 Plan Pruebas Funcionales.docx
@@ -4765,6 +4765,396 @@
           </w:p>
         </w:tc>
       </w:tr>
+      <w:tr>
+        <w:tc>
+          <w:tcPr>
+            <w:tcW w:type="dxa" w:w="1007"/>
+          </w:tcPr>
+          <w:p>
+            <w:r>
+              <w:t>CP-37</w:t>
+            </w:r>
+          </w:p>
+        </w:tc>
+        <w:tc>
+          <w:tcPr>
+            <w:tcW w:type="dxa" w:w="1006"/>
+          </w:tcPr>
+          <w:p>
+            <w:r/>
+          </w:p>
+        </w:tc>
+        <w:tc>
+          <w:tcPr>
+            <w:tcW w:type="dxa" w:w="1006"/>
+          </w:tcPr>
+          <w:p>
+            <w:r/>
+          </w:p>
+        </w:tc>
+        <w:tc>
+          <w:tcPr>
+            <w:tcW w:type="dxa" w:w="1007"/>
+          </w:tcPr>
+          <w:p>
+            <w:r/>
+          </w:p>
+        </w:tc>
+        <w:tc>
+          <w:tcPr>
+            <w:tcW w:type="dxa" w:w="1007"/>
+          </w:tcPr>
+          <w:p>
+            <w:r>
+              <w:t>X</w:t>
+            </w:r>
+          </w:p>
+        </w:tc>
+        <w:tc>
+          <w:tcPr>
+            <w:tcW w:type="dxa" w:w="1007"/>
+          </w:tcPr>
+          <w:p>
+            <w:r/>
+          </w:p>
+        </w:tc>
+        <w:tc>
+          <w:tcPr>
+            <w:tcW w:type="dxa" w:w="1007"/>
+          </w:tcPr>
+          <w:p>
+            <w:r/>
+          </w:p>
+        </w:tc>
+        <w:tc>
+          <w:tcPr>
+            <w:tcW w:type="dxa" w:w="1007"/>
+          </w:tcPr>
+          <w:p>
+            <w:r/>
+          </w:p>
+        </w:tc>
+        <w:tc>
+          <w:tcPr>
+            <w:tcW w:type="dxa" w:w="1007"/>
+          </w:tcPr>
+          <w:p>
+            <w:r/>
+          </w:p>
+        </w:tc>
+      </w:tr>
+      <w:tr>
+        <w:tc>
+          <w:tcPr>
+            <w:tcW w:type="dxa" w:w="1007"/>
+          </w:tcPr>
+          <w:p>
+            <w:r>
+              <w:t>CP-38</w:t>
+            </w:r>
+          </w:p>
+        </w:tc>
+        <w:tc>
+          <w:tcPr>
+            <w:tcW w:type="dxa" w:w="1006"/>
+          </w:tcPr>
+          <w:p>
+            <w:r/>
+          </w:p>
+        </w:tc>
+        <w:tc>
+          <w:tcPr>
+            <w:tcW w:type="dxa" w:w="1006"/>
+          </w:tcPr>
+          <w:p>
+            <w:r/>
+          </w:p>
+        </w:tc>
+        <w:tc>
+          <w:tcPr>
+            <w:tcW w:type="dxa" w:w="1007"/>
+          </w:tcPr>
+          <w:p>
+            <w:r/>
+          </w:p>
+        </w:tc>
+        <w:tc>
+          <w:tcPr>
+            <w:tcW w:type="dxa" w:w="1007"/>
+          </w:tcPr>
+          <w:p>
+            <w:r>
+              <w:t>X</w:t>
+            </w:r>
+          </w:p>
+        </w:tc>
+        <w:tc>
+          <w:tcPr>
+            <w:tcW w:type="dxa" w:w="1007"/>
+          </w:tcPr>
+          <w:p>
+            <w:r/>
+          </w:p>
+        </w:tc>
+        <w:tc>
+          <w:tcPr>
+            <w:tcW w:type="dxa" w:w="1007"/>
+          </w:tcPr>
+          <w:p>
+            <w:r/>
+          </w:p>
+        </w:tc>
+        <w:tc>
+          <w:tcPr>
+            <w:tcW w:type="dxa" w:w="1007"/>
+          </w:tcPr>
+          <w:p>
+            <w:r/>
+          </w:p>
+        </w:tc>
+        <w:tc>
+          <w:tcPr>
+            <w:tcW w:type="dxa" w:w="1007"/>
+          </w:tcPr>
+          <w:p>
+            <w:r/>
+          </w:p>
+        </w:tc>
+      </w:tr>
+      <w:tr>
+        <w:tc>
+          <w:tcPr>
+            <w:tcW w:type="dxa" w:w="1007"/>
+          </w:tcPr>
+          <w:p>
+            <w:r>
+              <w:t>CP-39</w:t>
+            </w:r>
+          </w:p>
+        </w:tc>
+        <w:tc>
+          <w:tcPr>
+            <w:tcW w:type="dxa" w:w="1006"/>
+          </w:tcPr>
+          <w:p>
+            <w:r/>
+          </w:p>
+        </w:tc>
+        <w:tc>
+          <w:tcPr>
+            <w:tcW w:type="dxa" w:w="1006"/>
+          </w:tcPr>
+          <w:p>
+            <w:r/>
+          </w:p>
+        </w:tc>
+        <w:tc>
+          <w:tcPr>
+            <w:tcW w:type="dxa" w:w="1007"/>
+          </w:tcPr>
+          <w:p>
+            <w:r/>
+          </w:p>
+        </w:tc>
+        <w:tc>
+          <w:tcPr>
+            <w:tcW w:type="dxa" w:w="1007"/>
+          </w:tcPr>
+          <w:p>
+            <w:r>
+              <w:t>X</w:t>
+            </w:r>
+          </w:p>
+        </w:tc>
+        <w:tc>
+          <w:tcPr>
+            <w:tcW w:type="dxa" w:w="1007"/>
+          </w:tcPr>
+          <w:p>
+            <w:r/>
+          </w:p>
+        </w:tc>
+        <w:tc>
+          <w:tcPr>
+            <w:tcW w:type="dxa" w:w="1007"/>
+          </w:tcPr>
+          <w:p>
+            <w:r/>
+          </w:p>
+        </w:tc>
+        <w:tc>
+          <w:tcPr>
+            <w:tcW w:type="dxa" w:w="1007"/>
+          </w:tcPr>
+          <w:p>
+            <w:r/>
+          </w:p>
+        </w:tc>
+        <w:tc>
+          <w:tcPr>
+            <w:tcW w:type="dxa" w:w="1007"/>
+          </w:tcPr>
+          <w:p>
+            <w:r/>
+          </w:p>
+        </w:tc>
+      </w:tr>
+      <w:tr>
+        <w:tc>
+          <w:tcPr>
+            <w:tcW w:type="dxa" w:w="1007"/>
+          </w:tcPr>
+          <w:p>
+            <w:r>
+              <w:t>CP-40</w:t>
+            </w:r>
+          </w:p>
+        </w:tc>
+        <w:tc>
+          <w:tcPr>
+            <w:tcW w:type="dxa" w:w="1006"/>
+          </w:tcPr>
+          <w:p>
+            <w:r/>
+          </w:p>
+        </w:tc>
+        <w:tc>
+          <w:tcPr>
+            <w:tcW w:type="dxa" w:w="1006"/>
+          </w:tcPr>
+          <w:p>
+            <w:r/>
+          </w:p>
+        </w:tc>
+        <w:tc>
+          <w:tcPr>
+            <w:tcW w:type="dxa" w:w="1007"/>
+          </w:tcPr>
+          <w:p>
+            <w:r/>
+          </w:p>
+        </w:tc>
+        <w:tc>
+          <w:tcPr>
+            <w:tcW w:type="dxa" w:w="1007"/>
+          </w:tcPr>
+          <w:p>
+            <w:r>
+              <w:t>X</w:t>
+            </w:r>
+          </w:p>
+        </w:tc>
+        <w:tc>
+          <w:tcPr>
+            <w:tcW w:type="dxa" w:w="1007"/>
+          </w:tcPr>
+          <w:p>
+            <w:r/>
+          </w:p>
+        </w:tc>
+        <w:tc>
+          <w:tcPr>
+            <w:tcW w:type="dxa" w:w="1007"/>
+          </w:tcPr>
+          <w:p>
+            <w:r/>
+          </w:p>
+        </w:tc>
+        <w:tc>
+          <w:tcPr>
+            <w:tcW w:type="dxa" w:w="1007"/>
+          </w:tcPr>
+          <w:p>
+            <w:r/>
+          </w:p>
+        </w:tc>
+        <w:tc>
+          <w:tcPr>
+            <w:tcW w:type="dxa" w:w="1007"/>
+          </w:tcPr>
+          <w:p>
+            <w:r/>
+          </w:p>
+        </w:tc>
+      </w:tr>
+      <w:tr>
+        <w:tc>
+          <w:tcPr>
+            <w:tcW w:type="dxa" w:w="1007"/>
+          </w:tcPr>
+          <w:p>
+            <w:r>
+              <w:t>CP-41</w:t>
+            </w:r>
+          </w:p>
+        </w:tc>
+        <w:tc>
+          <w:tcPr>
+            <w:tcW w:type="dxa" w:w="1006"/>
+          </w:tcPr>
+          <w:p>
+            <w:r/>
+          </w:p>
+        </w:tc>
+        <w:tc>
+          <w:tcPr>
+            <w:tcW w:type="dxa" w:w="1006"/>
+          </w:tcPr>
+          <w:p>
+            <w:r/>
+          </w:p>
+        </w:tc>
+        <w:tc>
+          <w:tcPr>
+            <w:tcW w:type="dxa" w:w="1007"/>
+          </w:tcPr>
+          <w:p>
+            <w:r/>
+          </w:p>
+        </w:tc>
+        <w:tc>
+          <w:tcPr>
+            <w:tcW w:type="dxa" w:w="1007"/>
+          </w:tcPr>
+          <w:p>
+            <w:r>
+              <w:t>X</w:t>
+            </w:r>
+          </w:p>
+        </w:tc>
+        <w:tc>
+          <w:tcPr>
+            <w:tcW w:type="dxa" w:w="1007"/>
+          </w:tcPr>
+          <w:p>
+            <w:r/>
+          </w:p>
+        </w:tc>
+        <w:tc>
+          <w:tcPr>
+            <w:tcW w:type="dxa" w:w="1007"/>
+          </w:tcPr>
+          <w:p>
+            <w:r/>
+          </w:p>
+        </w:tc>
+        <w:tc>
+          <w:tcPr>
+            <w:tcW w:type="dxa" w:w="1007"/>
+          </w:tcPr>
+          <w:p>
+            <w:r/>
+          </w:p>
+        </w:tc>
+        <w:tc>
+          <w:tcPr>
+            <w:tcW w:type="dxa" w:w="1007"/>
+          </w:tcPr>
+          <w:p>
+            <w:r/>
+          </w:p>
+        </w:tc>
+      </w:tr>
     </w:tbl>
     <w:p>
       <w:pPr>
@@ -12092,6 +12482,1150 @@
           <w:p>
             <w:r>
               <w:t>Resultado obtenido: Ejecutado con éxito. Pruebas unitarias en la app Android pasadas al 100% en JUnit.</w:t>
+            </w:r>
+          </w:p>
+        </w:tc>
+      </w:tr>
+      <w:tr>
+        <w:tc>
+          <w:tcPr>
+            <w:tcW w:type="dxa" w:w="3021"/>
+          </w:tcPr>
+          <w:p>
+            <w:r>
+              <w:t>Prueba unitaria de inicialización de publicación (CrearOfertaViewModel)</w:t>
+            </w:r>
+          </w:p>
+        </w:tc>
+        <w:tc>
+          <w:tcPr>
+            <w:tcW w:type="dxa" w:w="3021"/>
+          </w:tcPr>
+          <w:p>
+            <w:r>
+              <w:t>CP-37</w:t>
+            </w:r>
+          </w:p>
+        </w:tc>
+        <w:tc>
+          <w:tcPr>
+            <w:tcW w:type="dxa" w:w="3019"/>
+          </w:tcPr>
+          <w:p>
+            <w:r>
+              <w:t>CP-37</w:t>
+            </w:r>
+          </w:p>
+        </w:tc>
+      </w:tr>
+      <w:tr>
+        <w:tc>
+          <w:tcPr>
+            <w:tcW w:type="dxa" w:w="3021"/>
+          </w:tcPr>
+          <w:p>
+            <w:r>
+              <w:t>Prueba unitaria de inicialización de publicación (CrearOfertaViewModel)</w:t>
+            </w:r>
+          </w:p>
+        </w:tc>
+        <w:tc>
+          <w:tcPr>
+            <w:tcW w:type="dxa" w:w="3021"/>
+          </w:tcPr>
+          <w:p>
+            <w:r>
+              <w:t>¿Prueba de despliegue?</w:t>
+            </w:r>
+          </w:p>
+        </w:tc>
+        <w:tc>
+          <w:tcPr>
+            <w:tcW w:type="dxa" w:w="3019"/>
+          </w:tcPr>
+          <w:p>
+            <w:r>
+              <w:t>No</w:t>
+            </w:r>
+          </w:p>
+        </w:tc>
+      </w:tr>
+      <w:tr>
+        <w:tc>
+          <w:tcPr>
+            <w:tcW w:type="dxa" w:w="3021"/>
+          </w:tcPr>
+          <w:p>
+            <w:r>
+              <w:t>Descripción: Verificar que el estado inicial del formulario de creación de ofertas inicie limpio y con valores por defecto.</w:t>
+            </w:r>
+          </w:p>
+        </w:tc>
+        <w:tc>
+          <w:tcPr>
+            <w:tcW w:type="dxa" w:w="3021"/>
+          </w:tcPr>
+          <w:p>
+            <w:r>
+              <w:t>Descripción: Verificar que el estado inicial del formulario de creación de ofertas inicie limpio y con valores por defecto.</w:t>
+            </w:r>
+          </w:p>
+        </w:tc>
+        <w:tc>
+          <w:tcPr>
+            <w:tcW w:type="dxa" w:w="3019"/>
+          </w:tcPr>
+          <w:p>
+            <w:r>
+              <w:t>Descripción: Verificar que el estado inicial del formulario de creación de ofertas inicie limpio y con valores por defecto.</w:t>
+            </w:r>
+          </w:p>
+        </w:tc>
+      </w:tr>
+      <w:tr>
+        <w:tc>
+          <w:tcPr>
+            <w:tcW w:type="dxa" w:w="3021"/>
+          </w:tcPr>
+          <w:p>
+            <w:r>
+              <w:t>Prerrequisitos: Entorno de pruebas unitarias configurado en JUnit 4 y dependencias mockeadas con MockK.</w:t>
+            </w:r>
+          </w:p>
+        </w:tc>
+        <w:tc>
+          <w:tcPr>
+            <w:tcW w:type="dxa" w:w="3021"/>
+          </w:tcPr>
+          <w:p>
+            <w:r>
+              <w:t>Prerrequisitos: Entorno de pruebas unitarias configurado en JUnit 4 y dependencias mockeadas con MockK.</w:t>
+            </w:r>
+          </w:p>
+        </w:tc>
+        <w:tc>
+          <w:tcPr>
+            <w:tcW w:type="dxa" w:w="3019"/>
+          </w:tcPr>
+          <w:p>
+            <w:r>
+              <w:t>Prerrequisitos: Entorno de pruebas unitarias configurado en JUnit 4 y dependencias mockeadas con MockK.</w:t>
+            </w:r>
+          </w:p>
+        </w:tc>
+      </w:tr>
+      <w:tr>
+        <w:tc>
+          <w:tcPr>
+            <w:tcW w:type="dxa" w:w="3021"/>
+          </w:tcPr>
+          <w:p>
+            <w:r>
+              <w:t>Pasos: 1. Instanciar CrearOfertaViewModel pasando los mocks de JobsApi y SessionStore. 2. Observar los valores iniciales de CrearOfertaUiState.</w:t>
+            </w:r>
+          </w:p>
+        </w:tc>
+        <w:tc>
+          <w:tcPr>
+            <w:tcW w:type="dxa" w:w="3021"/>
+          </w:tcPr>
+          <w:p>
+            <w:r>
+              <w:t>Pasos: 1. Instanciar CrearOfertaViewModel pasando los mocks de JobsApi y SessionStore. 2. Observar los valores iniciales de CrearOfertaUiState.</w:t>
+            </w:r>
+          </w:p>
+        </w:tc>
+        <w:tc>
+          <w:tcPr>
+            <w:tcW w:type="dxa" w:w="3019"/>
+          </w:tcPr>
+          <w:p>
+            <w:r>
+              <w:t>Pasos: 1. Instanciar CrearOfertaViewModel pasando los mocks de JobsApi y SessionStore. 2. Observar los valores iniciales de CrearOfertaUiState.</w:t>
+            </w:r>
+          </w:p>
+        </w:tc>
+      </w:tr>
+      <w:tr>
+        <w:tc>
+          <w:tcPr>
+            <w:tcW w:type="dxa" w:w="3021"/>
+          </w:tcPr>
+          <w:p>
+            <w:r>
+              <w:t>Resultado esperado: Los campos (titulo, descripcion, remuneracion, fechaInicio, fechaFin, error) están vacíos o en null y el flag success en false.</w:t>
+            </w:r>
+          </w:p>
+        </w:tc>
+        <w:tc>
+          <w:tcPr>
+            <w:tcW w:type="dxa" w:w="3021"/>
+          </w:tcPr>
+          <w:p>
+            <w:r>
+              <w:t>Resultado esperado: Los campos (titulo, descripcion, remuneracion, fechaInicio, fechaFin, error) están vacíos o en null y el flag success en false.</w:t>
+            </w:r>
+          </w:p>
+        </w:tc>
+        <w:tc>
+          <w:tcPr>
+            <w:tcW w:type="dxa" w:w="3019"/>
+          </w:tcPr>
+          <w:p>
+            <w:r>
+              <w:t>Resultado esperado: Los campos (titulo, descripcion, remuneracion, fechaInicio, fechaFin, error) están vacíos o en null y el flag success en false.</w:t>
+            </w:r>
+          </w:p>
+        </w:tc>
+      </w:tr>
+      <w:tr>
+        <w:tc>
+          <w:tcPr>
+            <w:tcW w:type="dxa" w:w="3021"/>
+          </w:tcPr>
+          <w:p>
+            <w:r>
+              <w:t>Resultado obtenido: Ejecutado con éxito. Pruebas unitarias de la app Android pasadas al 100% en JUnit.</w:t>
+            </w:r>
+          </w:p>
+        </w:tc>
+        <w:tc>
+          <w:tcPr>
+            <w:tcW w:type="dxa" w:w="3021"/>
+          </w:tcPr>
+          <w:p>
+            <w:r>
+              <w:t>Resultado obtenido: Ejecutado con éxito. Pruebas unitarias de la app Android pasadas al 100% en JUnit.</w:t>
+            </w:r>
+          </w:p>
+        </w:tc>
+        <w:tc>
+          <w:tcPr>
+            <w:tcW w:type="dxa" w:w="3019"/>
+          </w:tcPr>
+          <w:p>
+            <w:r>
+              <w:t>Resultado obtenido: Ejecutado con éxito. Pruebas unitarias de la app Android pasadas al 100% en JUnit.</w:t>
+            </w:r>
+          </w:p>
+        </w:tc>
+      </w:tr>
+      <w:tr>
+        <w:tc>
+          <w:tcPr>
+            <w:tcW w:type="dxa" w:w="3021"/>
+          </w:tcPr>
+          <w:p>
+            <w:r>
+              <w:t>Prueba unitaria de modificación de campos de publicación</w:t>
+            </w:r>
+          </w:p>
+        </w:tc>
+        <w:tc>
+          <w:tcPr>
+            <w:tcW w:type="dxa" w:w="3021"/>
+          </w:tcPr>
+          <w:p>
+            <w:r>
+              <w:t>CP-38</w:t>
+            </w:r>
+          </w:p>
+        </w:tc>
+        <w:tc>
+          <w:tcPr>
+            <w:tcW w:type="dxa" w:w="3019"/>
+          </w:tcPr>
+          <w:p>
+            <w:r>
+              <w:t>CP-38</w:t>
+            </w:r>
+          </w:p>
+        </w:tc>
+      </w:tr>
+      <w:tr>
+        <w:tc>
+          <w:tcPr>
+            <w:tcW w:type="dxa" w:w="3021"/>
+          </w:tcPr>
+          <w:p>
+            <w:r>
+              <w:t>Prueba unitaria de modificación de campos de publicación</w:t>
+            </w:r>
+          </w:p>
+        </w:tc>
+        <w:tc>
+          <w:tcPr>
+            <w:tcW w:type="dxa" w:w="3021"/>
+          </w:tcPr>
+          <w:p>
+            <w:r>
+              <w:t>¿Prueba de despliegue?</w:t>
+            </w:r>
+          </w:p>
+        </w:tc>
+        <w:tc>
+          <w:tcPr>
+            <w:tcW w:type="dxa" w:w="3019"/>
+          </w:tcPr>
+          <w:p>
+            <w:r>
+              <w:t>No</w:t>
+            </w:r>
+          </w:p>
+        </w:tc>
+      </w:tr>
+      <w:tr>
+        <w:tc>
+          <w:tcPr>
+            <w:tcW w:type="dxa" w:w="3021"/>
+          </w:tcPr>
+          <w:p>
+            <w:r>
+              <w:t>Descripción: Validar el correcto guardado de datos en el estado interno del ViewModel cuando el usuario escribe en los campos.</w:t>
+            </w:r>
+          </w:p>
+        </w:tc>
+        <w:tc>
+          <w:tcPr>
+            <w:tcW w:type="dxa" w:w="3021"/>
+          </w:tcPr>
+          <w:p>
+            <w:r>
+              <w:t>Descripción: Validar el correcto guardado de datos en el estado interno del ViewModel cuando el usuario escribe en los campos.</w:t>
+            </w:r>
+          </w:p>
+        </w:tc>
+        <w:tc>
+          <w:tcPr>
+            <w:tcW w:type="dxa" w:w="3019"/>
+          </w:tcPr>
+          <w:p>
+            <w:r>
+              <w:t>Descripción: Validar el correcto guardado de datos en el estado interno del ViewModel cuando el usuario escribe en los campos.</w:t>
+            </w:r>
+          </w:p>
+        </w:tc>
+      </w:tr>
+      <w:tr>
+        <w:tc>
+          <w:tcPr>
+            <w:tcW w:type="dxa" w:w="3021"/>
+          </w:tcPr>
+          <w:p>
+            <w:r>
+              <w:t>Prerrequisitos: Formulario de creación de oferta en estado inicial limpio.</w:t>
+            </w:r>
+          </w:p>
+        </w:tc>
+        <w:tc>
+          <w:tcPr>
+            <w:tcW w:type="dxa" w:w="3021"/>
+          </w:tcPr>
+          <w:p>
+            <w:r>
+              <w:t>Prerrequisitos: Formulario de creación de oferta en estado inicial limpio.</w:t>
+            </w:r>
+          </w:p>
+        </w:tc>
+        <w:tc>
+          <w:tcPr>
+            <w:tcW w:type="dxa" w:w="3019"/>
+          </w:tcPr>
+          <w:p>
+            <w:r>
+              <w:t>Prerrequisitos: Formulario de creación de oferta en estado inicial limpio.</w:t>
+            </w:r>
+          </w:p>
+        </w:tc>
+      </w:tr>
+      <w:tr>
+        <w:tc>
+          <w:tcPr>
+            <w:tcW w:type="dxa" w:w="3021"/>
+          </w:tcPr>
+          <w:p>
+            <w:r>
+              <w:t>Pasos: 1. Simular ingreso de valores para título, descripción, ubicación, categoría, remuneración y fechas. 2. Verificar el estado del ViewModel.</w:t>
+            </w:r>
+          </w:p>
+        </w:tc>
+        <w:tc>
+          <w:tcPr>
+            <w:tcW w:type="dxa" w:w="3021"/>
+          </w:tcPr>
+          <w:p>
+            <w:r>
+              <w:t>Pasos: 1. Simular ingreso de valores para título, descripción, ubicación, categoría, remuneración y fechas. 2. Verificar el estado del ViewModel.</w:t>
+            </w:r>
+          </w:p>
+        </w:tc>
+        <w:tc>
+          <w:tcPr>
+            <w:tcW w:type="dxa" w:w="3019"/>
+          </w:tcPr>
+          <w:p>
+            <w:r>
+              <w:t>Pasos: 1. Simular ingreso de valores para título, descripción, ubicación, categoría, remuneración y fechas. 2. Verificar el estado del ViewModel.</w:t>
+            </w:r>
+          </w:p>
+        </w:tc>
+      </w:tr>
+      <w:tr>
+        <w:tc>
+          <w:tcPr>
+            <w:tcW w:type="dxa" w:w="3021"/>
+          </w:tcPr>
+          <w:p>
+            <w:r>
+              <w:t>Resultado esperado: El estado interno refleja exactamente los valores tipeados por el usuario.</w:t>
+            </w:r>
+          </w:p>
+        </w:tc>
+        <w:tc>
+          <w:tcPr>
+            <w:tcW w:type="dxa" w:w="3021"/>
+          </w:tcPr>
+          <w:p>
+            <w:r>
+              <w:t>Resultado esperado: El estado interno refleja exactamente los valores tipeados por el usuario.</w:t>
+            </w:r>
+          </w:p>
+        </w:tc>
+        <w:tc>
+          <w:tcPr>
+            <w:tcW w:type="dxa" w:w="3019"/>
+          </w:tcPr>
+          <w:p>
+            <w:r>
+              <w:t>Resultado esperado: El estado interno refleja exactamente los valores tipeados por el usuario.</w:t>
+            </w:r>
+          </w:p>
+        </w:tc>
+      </w:tr>
+      <w:tr>
+        <w:tc>
+          <w:tcPr>
+            <w:tcW w:type="dxa" w:w="3021"/>
+          </w:tcPr>
+          <w:p>
+            <w:r>
+              <w:t>Resultado obtenido: Ejecutado con éxito. Pruebas unitarias de la app Android pasadas al 100% en JUnit.</w:t>
+            </w:r>
+          </w:p>
+        </w:tc>
+        <w:tc>
+          <w:tcPr>
+            <w:tcW w:type="dxa" w:w="3021"/>
+          </w:tcPr>
+          <w:p>
+            <w:r>
+              <w:t>Resultado obtenido: Ejecutado con éxito. Pruebas unitarias de la app Android pasadas al 100% en JUnit.</w:t>
+            </w:r>
+          </w:p>
+        </w:tc>
+        <w:tc>
+          <w:tcPr>
+            <w:tcW w:type="dxa" w:w="3019"/>
+          </w:tcPr>
+          <w:p>
+            <w:r>
+              <w:t>Resultado obtenido: Ejecutado con éxito. Pruebas unitarias de la app Android pasadas al 100% en JUnit.</w:t>
+            </w:r>
+          </w:p>
+        </w:tc>
+      </w:tr>
+      <w:tr>
+        <w:tc>
+          <w:tcPr>
+            <w:tcW w:type="dxa" w:w="3021"/>
+          </w:tcPr>
+          <w:p>
+            <w:r>
+              <w:t>Prueba unitaria de campos obligatorios faltantes en publicación</w:t>
+            </w:r>
+          </w:p>
+        </w:tc>
+        <w:tc>
+          <w:tcPr>
+            <w:tcW w:type="dxa" w:w="3021"/>
+          </w:tcPr>
+          <w:p>
+            <w:r>
+              <w:t>CP-39</w:t>
+            </w:r>
+          </w:p>
+        </w:tc>
+        <w:tc>
+          <w:tcPr>
+            <w:tcW w:type="dxa" w:w="3019"/>
+          </w:tcPr>
+          <w:p>
+            <w:r>
+              <w:t>CP-39</w:t>
+            </w:r>
+          </w:p>
+        </w:tc>
+      </w:tr>
+      <w:tr>
+        <w:tc>
+          <w:tcPr>
+            <w:tcW w:type="dxa" w:w="3021"/>
+          </w:tcPr>
+          <w:p>
+            <w:r>
+              <w:t>Prueba unitaria de campos obligatorios faltantes en publicación</w:t>
+            </w:r>
+          </w:p>
+        </w:tc>
+        <w:tc>
+          <w:tcPr>
+            <w:tcW w:type="dxa" w:w="3021"/>
+          </w:tcPr>
+          <w:p>
+            <w:r>
+              <w:t>¿Prueba de despliegue?</w:t>
+            </w:r>
+          </w:p>
+        </w:tc>
+        <w:tc>
+          <w:tcPr>
+            <w:tcW w:type="dxa" w:w="3019"/>
+          </w:tcPr>
+          <w:p>
+            <w:r>
+              <w:t>No</w:t>
+            </w:r>
+          </w:p>
+        </w:tc>
+      </w:tr>
+      <w:tr>
+        <w:tc>
+          <w:tcPr>
+            <w:tcW w:type="dxa" w:w="3021"/>
+          </w:tcPr>
+          <w:p>
+            <w:r>
+              <w:t>Descripción: Validar que el botón de publicar se bloquee localmente y muestre un error si faltan campos obligatorios.</w:t>
+            </w:r>
+          </w:p>
+        </w:tc>
+        <w:tc>
+          <w:tcPr>
+            <w:tcW w:type="dxa" w:w="3021"/>
+          </w:tcPr>
+          <w:p>
+            <w:r>
+              <w:t>Descripción: Validar que el botón de publicar se bloquee localmente y muestre un error si faltan campos obligatorios.</w:t>
+            </w:r>
+          </w:p>
+        </w:tc>
+        <w:tc>
+          <w:tcPr>
+            <w:tcW w:type="dxa" w:w="3019"/>
+          </w:tcPr>
+          <w:p>
+            <w:r>
+              <w:t>Descripción: Validar que el botón de publicar se bloquee localmente y muestre un error si faltan campos obligatorios.</w:t>
+            </w:r>
+          </w:p>
+        </w:tc>
+      </w:tr>
+      <w:tr>
+        <w:tc>
+          <w:tcPr>
+            <w:tcW w:type="dxa" w:w="3021"/>
+          </w:tcPr>
+          <w:p>
+            <w:r>
+              <w:t>Prerrequisitos: Formulario con campos vacíos o incompletos.</w:t>
+            </w:r>
+          </w:p>
+        </w:tc>
+        <w:tc>
+          <w:tcPr>
+            <w:tcW w:type="dxa" w:w="3021"/>
+          </w:tcPr>
+          <w:p>
+            <w:r>
+              <w:t>Prerrequisitos: Formulario con campos vacíos o incompletos.</w:t>
+            </w:r>
+          </w:p>
+        </w:tc>
+        <w:tc>
+          <w:tcPr>
+            <w:tcW w:type="dxa" w:w="3019"/>
+          </w:tcPr>
+          <w:p>
+            <w:r>
+              <w:t>Prerrequisitos: Formulario con campos vacíos o incompletos.</w:t>
+            </w:r>
+          </w:p>
+        </w:tc>
+      </w:tr>
+      <w:tr>
+        <w:tc>
+          <w:tcPr>
+            <w:tcW w:type="dxa" w:w="3021"/>
+          </w:tcPr>
+          <w:p>
+            <w:r>
+              <w:t>Pasos: 1. Ingresar título, descripción y remuneración omitiendo la fecha de inicio. 2. Invocar submit() en CrearOfertaViewModel.</w:t>
+            </w:r>
+          </w:p>
+        </w:tc>
+        <w:tc>
+          <w:tcPr>
+            <w:tcW w:type="dxa" w:w="3021"/>
+          </w:tcPr>
+          <w:p>
+            <w:r>
+              <w:t>Pasos: 1. Ingresar título, descripción y remuneración omitiendo la fecha de inicio. 2. Invocar submit() en CrearOfertaViewModel.</w:t>
+            </w:r>
+          </w:p>
+        </w:tc>
+        <w:tc>
+          <w:tcPr>
+            <w:tcW w:type="dxa" w:w="3019"/>
+          </w:tcPr>
+          <w:p>
+            <w:r>
+              <w:t>Pasos: 1. Ingresar título, descripción y remuneración omitiendo la fecha de inicio. 2. Invocar submit() en CrearOfertaViewModel.</w:t>
+            </w:r>
+          </w:p>
+        </w:tc>
+      </w:tr>
+      <w:tr>
+        <w:tc>
+          <w:tcPr>
+            <w:tcW w:type="dxa" w:w="3021"/>
+          </w:tcPr>
+          <w:p>
+            <w:r>
+              <w:t>Resultado esperado: Se cancela la ejecución, isLoading queda en false, y se asigna el mensaje de error 'Completa todos los campos obligatorios'.</w:t>
+            </w:r>
+          </w:p>
+        </w:tc>
+        <w:tc>
+          <w:tcPr>
+            <w:tcW w:type="dxa" w:w="3021"/>
+          </w:tcPr>
+          <w:p>
+            <w:r>
+              <w:t>Resultado esperado: Se cancela la ejecución, isLoading queda en false, y se asigna el mensaje de error 'Completa todos los campos obligatorios'.</w:t>
+            </w:r>
+          </w:p>
+        </w:tc>
+        <w:tc>
+          <w:tcPr>
+            <w:tcW w:type="dxa" w:w="3019"/>
+          </w:tcPr>
+          <w:p>
+            <w:r>
+              <w:t>Resultado esperado: Se cancela la ejecución, isLoading queda en false, y se asigna el mensaje de error 'Completa todos los campos obligatorios'.</w:t>
+            </w:r>
+          </w:p>
+        </w:tc>
+      </w:tr>
+      <w:tr>
+        <w:tc>
+          <w:tcPr>
+            <w:tcW w:type="dxa" w:w="3021"/>
+          </w:tcPr>
+          <w:p>
+            <w:r>
+              <w:t>Resultado obtenido: Ejecutado con éxito. Pruebas unitarias de la app Android pasadas al 100% en JUnit.</w:t>
+            </w:r>
+          </w:p>
+        </w:tc>
+        <w:tc>
+          <w:tcPr>
+            <w:tcW w:type="dxa" w:w="3021"/>
+          </w:tcPr>
+          <w:p>
+            <w:r>
+              <w:t>Resultado obtenido: Ejecutado con éxito. Pruebas unitarias de la app Android pasadas al 100% en JUnit.</w:t>
+            </w:r>
+          </w:p>
+        </w:tc>
+        <w:tc>
+          <w:tcPr>
+            <w:tcW w:type="dxa" w:w="3019"/>
+          </w:tcPr>
+          <w:p>
+            <w:r>
+              <w:t>Resultado obtenido: Ejecutado con éxito. Pruebas unitarias de la app Android pasadas al 100% en JUnit.</w:t>
+            </w:r>
+          </w:p>
+        </w:tc>
+      </w:tr>
+      <w:tr>
+        <w:tc>
+          <w:tcPr>
+            <w:tcW w:type="dxa" w:w="3021"/>
+          </w:tcPr>
+          <w:p>
+            <w:r>
+              <w:t>Prueba unitaria de publicación exitosa de oferta laboral</w:t>
+            </w:r>
+          </w:p>
+        </w:tc>
+        <w:tc>
+          <w:tcPr>
+            <w:tcW w:type="dxa" w:w="3021"/>
+          </w:tcPr>
+          <w:p>
+            <w:r>
+              <w:t>CP-40</w:t>
+            </w:r>
+          </w:p>
+        </w:tc>
+        <w:tc>
+          <w:tcPr>
+            <w:tcW w:type="dxa" w:w="3019"/>
+          </w:tcPr>
+          <w:p>
+            <w:r>
+              <w:t>CP-40</w:t>
+            </w:r>
+          </w:p>
+        </w:tc>
+      </w:tr>
+      <w:tr>
+        <w:tc>
+          <w:tcPr>
+            <w:tcW w:type="dxa" w:w="3021"/>
+          </w:tcPr>
+          <w:p>
+            <w:r>
+              <w:t>Prueba unitaria de publicación exitosa de oferta laboral</w:t>
+            </w:r>
+          </w:p>
+        </w:tc>
+        <w:tc>
+          <w:tcPr>
+            <w:tcW w:type="dxa" w:w="3021"/>
+          </w:tcPr>
+          <w:p>
+            <w:r>
+              <w:t>¿Prueba de despliegue?</w:t>
+            </w:r>
+          </w:p>
+        </w:tc>
+        <w:tc>
+          <w:tcPr>
+            <w:tcW w:type="dxa" w:w="3019"/>
+          </w:tcPr>
+          <w:p>
+            <w:r>
+              <w:t>No</w:t>
+            </w:r>
+          </w:p>
+        </w:tc>
+      </w:tr>
+      <w:tr>
+        <w:tc>
+          <w:tcPr>
+            <w:tcW w:type="dxa" w:w="3021"/>
+          </w:tcPr>
+          <w:p>
+            <w:r>
+              <w:t>Descripción: Validar que la publicación de una oferta invoque a la API externa de Jobs con la información correcta.</w:t>
+            </w:r>
+          </w:p>
+        </w:tc>
+        <w:tc>
+          <w:tcPr>
+            <w:tcW w:type="dxa" w:w="3021"/>
+          </w:tcPr>
+          <w:p>
+            <w:r>
+              <w:t>Descripción: Validar que la publicación de una oferta invoque a la API externa de Jobs con la información correcta.</w:t>
+            </w:r>
+          </w:p>
+        </w:tc>
+        <w:tc>
+          <w:tcPr>
+            <w:tcW w:type="dxa" w:w="3019"/>
+          </w:tcPr>
+          <w:p>
+            <w:r>
+              <w:t>Descripción: Validar que la publicación de una oferta invoque a la API externa de Jobs con la información correcta.</w:t>
+            </w:r>
+          </w:p>
+        </w:tc>
+      </w:tr>
+      <w:tr>
+        <w:tc>
+          <w:tcPr>
+            <w:tcW w:type="dxa" w:w="3021"/>
+          </w:tcPr>
+          <w:p>
+            <w:r>
+              <w:t>Prerrequisitos: Todos los campos del formulario de oferta cargados con datos válidos.</w:t>
+            </w:r>
+          </w:p>
+        </w:tc>
+        <w:tc>
+          <w:tcPr>
+            <w:tcW w:type="dxa" w:w="3021"/>
+          </w:tcPr>
+          <w:p>
+            <w:r>
+              <w:t>Prerrequisitos: Todos los campos del formulario de oferta cargados con datos válidos.</w:t>
+            </w:r>
+          </w:p>
+        </w:tc>
+        <w:tc>
+          <w:tcPr>
+            <w:tcW w:type="dxa" w:w="3019"/>
+          </w:tcPr>
+          <w:p>
+            <w:r>
+              <w:t>Prerrequisitos: Todos los campos del formulario de oferta cargados con datos válidos.</w:t>
+            </w:r>
+          </w:p>
+        </w:tc>
+      </w:tr>
+      <w:tr>
+        <w:tc>
+          <w:tcPr>
+            <w:tcW w:type="dxa" w:w="3021"/>
+          </w:tcPr>
+          <w:p>
+            <w:r>
+              <w:t>Pasos: 1. Mockear la sesión activa del empleador en SessionStore.</w:t>
+              <w:br/>
+              <w:t>2. Mockear respuesta de éxito en jobsApi.create().</w:t>
+              <w:br/>
+              <w:t>3. Invocar submit() en el ViewModel.</w:t>
+            </w:r>
+          </w:p>
+        </w:tc>
+        <w:tc>
+          <w:tcPr>
+            <w:tcW w:type="dxa" w:w="3021"/>
+          </w:tcPr>
+          <w:p>
+            <w:r>
+              <w:t>Pasos: 1. Mockear la sesión activa del empleador en SessionStore.</w:t>
+              <w:br/>
+              <w:t>2. Mockear respuesta de éxito en jobsApi.create().</w:t>
+              <w:br/>
+              <w:t>3. Invocar submit() en el ViewModel.</w:t>
+            </w:r>
+          </w:p>
+        </w:tc>
+        <w:tc>
+          <w:tcPr>
+            <w:tcW w:type="dxa" w:w="3019"/>
+          </w:tcPr>
+          <w:p>
+            <w:r>
+              <w:t>Pasos: 1. Mockear la sesión activa del empleador en SessionStore.</w:t>
+              <w:br/>
+              <w:t>2. Mockear respuesta de éxito en jobsApi.create().</w:t>
+              <w:br/>
+              <w:t>3. Invocar submit() en el ViewModel.</w:t>
+            </w:r>
+          </w:p>
+        </w:tc>
+      </w:tr>
+      <w:tr>
+        <w:tc>
+          <w:tcPr>
+            <w:tcW w:type="dxa" w:w="3021"/>
+          </w:tcPr>
+          <w:p>
+            <w:r>
+              <w:t>Resultado esperado: Se llama a jobsApi.create() exactamente una vez con el request estructurado, success queda en true y isLoading en false.</w:t>
+            </w:r>
+          </w:p>
+        </w:tc>
+        <w:tc>
+          <w:tcPr>
+            <w:tcW w:type="dxa" w:w="3021"/>
+          </w:tcPr>
+          <w:p>
+            <w:r>
+              <w:t>Resultado esperado: Se llama a jobsApi.create() exactamente una vez con el request estructurado, success queda en true y isLoading en false.</w:t>
+            </w:r>
+          </w:p>
+        </w:tc>
+        <w:tc>
+          <w:tcPr>
+            <w:tcW w:type="dxa" w:w="3019"/>
+          </w:tcPr>
+          <w:p>
+            <w:r>
+              <w:t>Resultado esperado: Se llama a jobsApi.create() exactamente una vez con el request estructurado, success queda en true y isLoading en false.</w:t>
+            </w:r>
+          </w:p>
+        </w:tc>
+      </w:tr>
+      <w:tr>
+        <w:tc>
+          <w:tcPr>
+            <w:tcW w:type="dxa" w:w="3021"/>
+          </w:tcPr>
+          <w:p>
+            <w:r>
+              <w:t>Resultado obtenido: Ejecutado con éxito. Pruebas unitarias de la app Android pasadas al 100% en JUnit.</w:t>
+            </w:r>
+          </w:p>
+        </w:tc>
+        <w:tc>
+          <w:tcPr>
+            <w:tcW w:type="dxa" w:w="3021"/>
+          </w:tcPr>
+          <w:p>
+            <w:r>
+              <w:t>Resultado obtenido: Ejecutado con éxito. Pruebas unitarias de la app Android pasadas al 100% en JUnit.</w:t>
+            </w:r>
+          </w:p>
+        </w:tc>
+        <w:tc>
+          <w:tcPr>
+            <w:tcW w:type="dxa" w:w="3019"/>
+          </w:tcPr>
+          <w:p>
+            <w:r>
+              <w:t>Resultado obtenido: Ejecutado con éxito. Pruebas unitarias de la app Android pasadas al 100% en JUnit.</w:t>
+            </w:r>
+          </w:p>
+        </w:tc>
+      </w:tr>
+      <w:tr>
+        <w:tc>
+          <w:tcPr>
+            <w:tcW w:type="dxa" w:w="3021"/>
+          </w:tcPr>
+          <w:p>
+            <w:r>
+              <w:t>Prueba unitaria de fallo en la API al publicar oferta</w:t>
+            </w:r>
+          </w:p>
+        </w:tc>
+        <w:tc>
+          <w:tcPr>
+            <w:tcW w:type="dxa" w:w="3021"/>
+          </w:tcPr>
+          <w:p>
+            <w:r>
+              <w:t>CP-41</w:t>
+            </w:r>
+          </w:p>
+        </w:tc>
+        <w:tc>
+          <w:tcPr>
+            <w:tcW w:type="dxa" w:w="3019"/>
+          </w:tcPr>
+          <w:p>
+            <w:r>
+              <w:t>CP-41</w:t>
+            </w:r>
+          </w:p>
+        </w:tc>
+      </w:tr>
+      <w:tr>
+        <w:tc>
+          <w:tcPr>
+            <w:tcW w:type="dxa" w:w="3021"/>
+          </w:tcPr>
+          <w:p>
+            <w:r>
+              <w:t>Prueba unitaria de fallo en la API al publicar oferta</w:t>
+            </w:r>
+          </w:p>
+        </w:tc>
+        <w:tc>
+          <w:tcPr>
+            <w:tcW w:type="dxa" w:w="3021"/>
+          </w:tcPr>
+          <w:p>
+            <w:r>
+              <w:t>¿Prueba de despliegue?</w:t>
+            </w:r>
+          </w:p>
+        </w:tc>
+        <w:tc>
+          <w:tcPr>
+            <w:tcW w:type="dxa" w:w="3019"/>
+          </w:tcPr>
+          <w:p>
+            <w:r>
+              <w:t>No</w:t>
+            </w:r>
+          </w:p>
+        </w:tc>
+      </w:tr>
+      <w:tr>
+        <w:tc>
+          <w:tcPr>
+            <w:tcW w:type="dxa" w:w="3021"/>
+          </w:tcPr>
+          <w:p>
+            <w:r>
+              <w:t>Descripción: Validar que las excepciones y fallas del servidor API sean capturadas y desplegadas correctamente en el panel de error.</w:t>
+            </w:r>
+          </w:p>
+        </w:tc>
+        <w:tc>
+          <w:tcPr>
+            <w:tcW w:type="dxa" w:w="3021"/>
+          </w:tcPr>
+          <w:p>
+            <w:r>
+              <w:t>Descripción: Validar que las excepciones y fallas del servidor API sean capturadas y desplegadas correctamente en el panel de error.</w:t>
+            </w:r>
+          </w:p>
+        </w:tc>
+        <w:tc>
+          <w:tcPr>
+            <w:tcW w:type="dxa" w:w="3019"/>
+          </w:tcPr>
+          <w:p>
+            <w:r>
+              <w:t>Descripción: Validar que las excepciones y fallas del servidor API sean capturadas y desplegadas correctamente en el panel de error.</w:t>
+            </w:r>
+          </w:p>
+        </w:tc>
+      </w:tr>
+      <w:tr>
+        <w:tc>
+          <w:tcPr>
+            <w:tcW w:type="dxa" w:w="3021"/>
+          </w:tcPr>
+          <w:p>
+            <w:r>
+              <w:t>Prerrequisitos: Todos los campos del formulario de oferta cargados con datos válidos.</w:t>
+            </w:r>
+          </w:p>
+        </w:tc>
+        <w:tc>
+          <w:tcPr>
+            <w:tcW w:type="dxa" w:w="3021"/>
+          </w:tcPr>
+          <w:p>
+            <w:r>
+              <w:t>Prerrequisitos: Todos los campos del formulario de oferta cargados con datos válidos.</w:t>
+            </w:r>
+          </w:p>
+        </w:tc>
+        <w:tc>
+          <w:tcPr>
+            <w:tcW w:type="dxa" w:w="3019"/>
+          </w:tcPr>
+          <w:p>
+            <w:r>
+              <w:t>Prerrequisitos: Todos los campos del formulario de oferta cargados con datos válidos.</w:t>
+            </w:r>
+          </w:p>
+        </w:tc>
+      </w:tr>
+      <w:tr>
+        <w:tc>
+          <w:tcPr>
+            <w:tcW w:type="dxa" w:w="3021"/>
+          </w:tcPr>
+          <w:p>
+            <w:r>
+              <w:t>Pasos: 1. Mockear sesión activa.</w:t>
+              <w:br/>
+              <w:t>2. Configurar jobsApi.create() para lanzar una excepción de red IOException.</w:t>
+              <w:br/>
+              <w:t>3. Invocar submit().</w:t>
+            </w:r>
+          </w:p>
+        </w:tc>
+        <w:tc>
+          <w:tcPr>
+            <w:tcW w:type="dxa" w:w="3021"/>
+          </w:tcPr>
+          <w:p>
+            <w:r>
+              <w:t>Pasos: 1. Mockear sesión activa.</w:t>
+              <w:br/>
+              <w:t>2. Configurar jobsApi.create() para lanzar una excepción de red IOException.</w:t>
+              <w:br/>
+              <w:t>3. Invocar submit().</w:t>
+            </w:r>
+          </w:p>
+        </w:tc>
+        <w:tc>
+          <w:tcPr>
+            <w:tcW w:type="dxa" w:w="3019"/>
+          </w:tcPr>
+          <w:p>
+            <w:r>
+              <w:t>Pasos: 1. Mockear sesión activa.</w:t>
+              <w:br/>
+              <w:t>2. Configurar jobsApi.create() para lanzar una excepción de red IOException.</w:t>
+              <w:br/>
+              <w:t>3. Invocar submit().</w:t>
+            </w:r>
+          </w:p>
+        </w:tc>
+      </w:tr>
+      <w:tr>
+        <w:tc>
+          <w:tcPr>
+            <w:tcW w:type="dxa" w:w="3021"/>
+          </w:tcPr>
+          <w:p>
+            <w:r>
+              <w:t>Resultado esperado: Se captura la excepción, success queda en false, isLoading en false, y el mensaje de error de la API se guarda en el state.</w:t>
+            </w:r>
+          </w:p>
+        </w:tc>
+        <w:tc>
+          <w:tcPr>
+            <w:tcW w:type="dxa" w:w="3021"/>
+          </w:tcPr>
+          <w:p>
+            <w:r>
+              <w:t>Resultado esperado: Se captura la excepción, success queda en false, isLoading en false, y el mensaje de error de la API se guarda en el state.</w:t>
+            </w:r>
+          </w:p>
+        </w:tc>
+        <w:tc>
+          <w:tcPr>
+            <w:tcW w:type="dxa" w:w="3019"/>
+          </w:tcPr>
+          <w:p>
+            <w:r>
+              <w:t>Resultado esperado: Se captura la excepción, success queda en false, isLoading en false, y el mensaje de error de la API se guarda en el state.</w:t>
+            </w:r>
+          </w:p>
+        </w:tc>
+      </w:tr>
+      <w:tr>
+        <w:tc>
+          <w:tcPr>
+            <w:tcW w:type="dxa" w:w="3021"/>
+          </w:tcPr>
+          <w:p>
+            <w:r>
+              <w:t>Resultado obtenido: Ejecutado con éxito. Pruebas unitarias de la app Android pasadas al 100% en JUnit.</w:t>
+            </w:r>
+          </w:p>
+        </w:tc>
+        <w:tc>
+          <w:tcPr>
+            <w:tcW w:type="dxa" w:w="3021"/>
+          </w:tcPr>
+          <w:p>
+            <w:r>
+              <w:t>Resultado obtenido: Ejecutado con éxito. Pruebas unitarias de la app Android pasadas al 100% en JUnit.</w:t>
+            </w:r>
+          </w:p>
+        </w:tc>
+        <w:tc>
+          <w:tcPr>
+            <w:tcW w:type="dxa" w:w="3019"/>
+          </w:tcPr>
+          <w:p>
+            <w:r>
+              <w:t>Resultado obtenido: Ejecutado con éxito. Pruebas unitarias de la app Android pasadas al 100% en JUnit.</w:t>
             </w:r>
           </w:p>
         </w:tc>
@@ -13601,6 +15135,196 @@
           <w:p>
             <w:r>
               <w:t>CP-36</w:t>
+            </w:r>
+          </w:p>
+        </w:tc>
+        <w:tc>
+          <w:tcPr>
+            <w:tcW w:type="dxa" w:w="2256"/>
+          </w:tcPr>
+          <w:p>
+            <w:r>
+              <w:t>X</w:t>
+            </w:r>
+          </w:p>
+        </w:tc>
+        <w:tc>
+          <w:tcPr>
+            <w:tcW w:type="dxa" w:w="2258"/>
+          </w:tcPr>
+          <w:p>
+            <w:r/>
+          </w:p>
+        </w:tc>
+        <w:tc>
+          <w:tcPr>
+            <w:tcW w:type="dxa" w:w="2296"/>
+          </w:tcPr>
+          <w:p>
+            <w:r/>
+          </w:p>
+        </w:tc>
+      </w:tr>
+      <w:tr>
+        <w:tc>
+          <w:tcPr>
+            <w:tcW w:type="dxa" w:w="2251"/>
+          </w:tcPr>
+          <w:p>
+            <w:r>
+              <w:t>CP-37</w:t>
+            </w:r>
+          </w:p>
+        </w:tc>
+        <w:tc>
+          <w:tcPr>
+            <w:tcW w:type="dxa" w:w="2256"/>
+          </w:tcPr>
+          <w:p>
+            <w:r>
+              <w:t>X</w:t>
+            </w:r>
+          </w:p>
+        </w:tc>
+        <w:tc>
+          <w:tcPr>
+            <w:tcW w:type="dxa" w:w="2258"/>
+          </w:tcPr>
+          <w:p>
+            <w:r/>
+          </w:p>
+        </w:tc>
+        <w:tc>
+          <w:tcPr>
+            <w:tcW w:type="dxa" w:w="2296"/>
+          </w:tcPr>
+          <w:p>
+            <w:r/>
+          </w:p>
+        </w:tc>
+      </w:tr>
+      <w:tr>
+        <w:tc>
+          <w:tcPr>
+            <w:tcW w:type="dxa" w:w="2251"/>
+          </w:tcPr>
+          <w:p>
+            <w:r>
+              <w:t>CP-38</w:t>
+            </w:r>
+          </w:p>
+        </w:tc>
+        <w:tc>
+          <w:tcPr>
+            <w:tcW w:type="dxa" w:w="2256"/>
+          </w:tcPr>
+          <w:p>
+            <w:r>
+              <w:t>X</w:t>
+            </w:r>
+          </w:p>
+        </w:tc>
+        <w:tc>
+          <w:tcPr>
+            <w:tcW w:type="dxa" w:w="2258"/>
+          </w:tcPr>
+          <w:p>
+            <w:r/>
+          </w:p>
+        </w:tc>
+        <w:tc>
+          <w:tcPr>
+            <w:tcW w:type="dxa" w:w="2296"/>
+          </w:tcPr>
+          <w:p>
+            <w:r/>
+          </w:p>
+        </w:tc>
+      </w:tr>
+      <w:tr>
+        <w:tc>
+          <w:tcPr>
+            <w:tcW w:type="dxa" w:w="2251"/>
+          </w:tcPr>
+          <w:p>
+            <w:r>
+              <w:t>CP-39</w:t>
+            </w:r>
+          </w:p>
+        </w:tc>
+        <w:tc>
+          <w:tcPr>
+            <w:tcW w:type="dxa" w:w="2256"/>
+          </w:tcPr>
+          <w:p>
+            <w:r>
+              <w:t>X</w:t>
+            </w:r>
+          </w:p>
+        </w:tc>
+        <w:tc>
+          <w:tcPr>
+            <w:tcW w:type="dxa" w:w="2258"/>
+          </w:tcPr>
+          <w:p>
+            <w:r/>
+          </w:p>
+        </w:tc>
+        <w:tc>
+          <w:tcPr>
+            <w:tcW w:type="dxa" w:w="2296"/>
+          </w:tcPr>
+          <w:p>
+            <w:r/>
+          </w:p>
+        </w:tc>
+      </w:tr>
+      <w:tr>
+        <w:tc>
+          <w:tcPr>
+            <w:tcW w:type="dxa" w:w="2251"/>
+          </w:tcPr>
+          <w:p>
+            <w:r>
+              <w:t>CP-40</w:t>
+            </w:r>
+          </w:p>
+        </w:tc>
+        <w:tc>
+          <w:tcPr>
+            <w:tcW w:type="dxa" w:w="2256"/>
+          </w:tcPr>
+          <w:p>
+            <w:r>
+              <w:t>X</w:t>
+            </w:r>
+          </w:p>
+        </w:tc>
+        <w:tc>
+          <w:tcPr>
+            <w:tcW w:type="dxa" w:w="2258"/>
+          </w:tcPr>
+          <w:p>
+            <w:r/>
+          </w:p>
+        </w:tc>
+        <w:tc>
+          <w:tcPr>
+            <w:tcW w:type="dxa" w:w="2296"/>
+          </w:tcPr>
+          <w:p>
+            <w:r/>
+          </w:p>
+        </w:tc>
+      </w:tr>
+      <w:tr>
+        <w:tc>
+          <w:tcPr>
+            <w:tcW w:type="dxa" w:w="2251"/>
+          </w:tcPr>
+          <w:p>
+            <w:r>
+              <w:t>CP-41</w:t>
             </w:r>
           </w:p>
         </w:tc>

</xml_diff>

<commit_message>
Sincronizar documentacion QA y agregar pruebas unitarias ErrorMapper y OfferDetailViewModel (CP-42 al CP-51)
</commit_message>
<xml_diff>
--- a/Documentacion/Unidad #3/3.1.2 Plan Pruebas Funcionales.docx
+++ b/Documentacion/Unidad #3/3.1.2 Plan Pruebas Funcionales.docx
@@ -5155,6 +5155,786 @@
           </w:p>
         </w:tc>
       </w:tr>
+      <w:tr>
+        <w:tc>
+          <w:tcPr>
+            <w:tcW w:type="dxa" w:w="1007"/>
+          </w:tcPr>
+          <w:p>
+            <w:r>
+              <w:t>CP-42</w:t>
+            </w:r>
+          </w:p>
+        </w:tc>
+        <w:tc>
+          <w:tcPr>
+            <w:tcW w:type="dxa" w:w="1006"/>
+          </w:tcPr>
+          <w:p>
+            <w:r/>
+          </w:p>
+        </w:tc>
+        <w:tc>
+          <w:tcPr>
+            <w:tcW w:type="dxa" w:w="1006"/>
+          </w:tcPr>
+          <w:p>
+            <w:r/>
+          </w:p>
+        </w:tc>
+        <w:tc>
+          <w:tcPr>
+            <w:tcW w:type="dxa" w:w="1007"/>
+          </w:tcPr>
+          <w:p>
+            <w:r/>
+          </w:p>
+        </w:tc>
+        <w:tc>
+          <w:tcPr>
+            <w:tcW w:type="dxa" w:w="1007"/>
+          </w:tcPr>
+          <w:p>
+            <w:r/>
+          </w:p>
+        </w:tc>
+        <w:tc>
+          <w:tcPr>
+            <w:tcW w:type="dxa" w:w="1007"/>
+          </w:tcPr>
+          <w:p>
+            <w:r/>
+          </w:p>
+        </w:tc>
+        <w:tc>
+          <w:tcPr>
+            <w:tcW w:type="dxa" w:w="1007"/>
+          </w:tcPr>
+          <w:p>
+            <w:r/>
+          </w:p>
+        </w:tc>
+        <w:tc>
+          <w:tcPr>
+            <w:tcW w:type="dxa" w:w="1007"/>
+          </w:tcPr>
+          <w:p>
+            <w:r/>
+          </w:p>
+        </w:tc>
+        <w:tc>
+          <w:tcPr>
+            <w:tcW w:type="dxa" w:w="1007"/>
+          </w:tcPr>
+          <w:p>
+            <w:r>
+              <w:t>X</w:t>
+            </w:r>
+          </w:p>
+        </w:tc>
+      </w:tr>
+      <w:tr>
+        <w:tc>
+          <w:tcPr>
+            <w:tcW w:type="dxa" w:w="1007"/>
+          </w:tcPr>
+          <w:p>
+            <w:r>
+              <w:t>CP-43</w:t>
+            </w:r>
+          </w:p>
+        </w:tc>
+        <w:tc>
+          <w:tcPr>
+            <w:tcW w:type="dxa" w:w="1006"/>
+          </w:tcPr>
+          <w:p>
+            <w:r/>
+          </w:p>
+        </w:tc>
+        <w:tc>
+          <w:tcPr>
+            <w:tcW w:type="dxa" w:w="1006"/>
+          </w:tcPr>
+          <w:p>
+            <w:r/>
+          </w:p>
+        </w:tc>
+        <w:tc>
+          <w:tcPr>
+            <w:tcW w:type="dxa" w:w="1007"/>
+          </w:tcPr>
+          <w:p>
+            <w:r/>
+          </w:p>
+        </w:tc>
+        <w:tc>
+          <w:tcPr>
+            <w:tcW w:type="dxa" w:w="1007"/>
+          </w:tcPr>
+          <w:p>
+            <w:r/>
+          </w:p>
+        </w:tc>
+        <w:tc>
+          <w:tcPr>
+            <w:tcW w:type="dxa" w:w="1007"/>
+          </w:tcPr>
+          <w:p>
+            <w:r/>
+          </w:p>
+        </w:tc>
+        <w:tc>
+          <w:tcPr>
+            <w:tcW w:type="dxa" w:w="1007"/>
+          </w:tcPr>
+          <w:p>
+            <w:r/>
+          </w:p>
+        </w:tc>
+        <w:tc>
+          <w:tcPr>
+            <w:tcW w:type="dxa" w:w="1007"/>
+          </w:tcPr>
+          <w:p>
+            <w:r/>
+          </w:p>
+        </w:tc>
+        <w:tc>
+          <w:tcPr>
+            <w:tcW w:type="dxa" w:w="1007"/>
+          </w:tcPr>
+          <w:p>
+            <w:r>
+              <w:t>X</w:t>
+            </w:r>
+          </w:p>
+        </w:tc>
+      </w:tr>
+      <w:tr>
+        <w:tc>
+          <w:tcPr>
+            <w:tcW w:type="dxa" w:w="1007"/>
+          </w:tcPr>
+          <w:p>
+            <w:r>
+              <w:t>CP-44</w:t>
+            </w:r>
+          </w:p>
+        </w:tc>
+        <w:tc>
+          <w:tcPr>
+            <w:tcW w:type="dxa" w:w="1006"/>
+          </w:tcPr>
+          <w:p>
+            <w:r/>
+          </w:p>
+        </w:tc>
+        <w:tc>
+          <w:tcPr>
+            <w:tcW w:type="dxa" w:w="1006"/>
+          </w:tcPr>
+          <w:p>
+            <w:r/>
+          </w:p>
+        </w:tc>
+        <w:tc>
+          <w:tcPr>
+            <w:tcW w:type="dxa" w:w="1007"/>
+          </w:tcPr>
+          <w:p>
+            <w:r/>
+          </w:p>
+        </w:tc>
+        <w:tc>
+          <w:tcPr>
+            <w:tcW w:type="dxa" w:w="1007"/>
+          </w:tcPr>
+          <w:p>
+            <w:r/>
+          </w:p>
+        </w:tc>
+        <w:tc>
+          <w:tcPr>
+            <w:tcW w:type="dxa" w:w="1007"/>
+          </w:tcPr>
+          <w:p>
+            <w:r/>
+          </w:p>
+        </w:tc>
+        <w:tc>
+          <w:tcPr>
+            <w:tcW w:type="dxa" w:w="1007"/>
+          </w:tcPr>
+          <w:p>
+            <w:r/>
+          </w:p>
+        </w:tc>
+        <w:tc>
+          <w:tcPr>
+            <w:tcW w:type="dxa" w:w="1007"/>
+          </w:tcPr>
+          <w:p>
+            <w:r/>
+          </w:p>
+        </w:tc>
+        <w:tc>
+          <w:tcPr>
+            <w:tcW w:type="dxa" w:w="1007"/>
+          </w:tcPr>
+          <w:p>
+            <w:r>
+              <w:t>X</w:t>
+            </w:r>
+          </w:p>
+        </w:tc>
+      </w:tr>
+      <w:tr>
+        <w:tc>
+          <w:tcPr>
+            <w:tcW w:type="dxa" w:w="1007"/>
+          </w:tcPr>
+          <w:p>
+            <w:r>
+              <w:t>CP-45</w:t>
+            </w:r>
+          </w:p>
+        </w:tc>
+        <w:tc>
+          <w:tcPr>
+            <w:tcW w:type="dxa" w:w="1006"/>
+          </w:tcPr>
+          <w:p>
+            <w:r/>
+          </w:p>
+        </w:tc>
+        <w:tc>
+          <w:tcPr>
+            <w:tcW w:type="dxa" w:w="1006"/>
+          </w:tcPr>
+          <w:p>
+            <w:r/>
+          </w:p>
+        </w:tc>
+        <w:tc>
+          <w:tcPr>
+            <w:tcW w:type="dxa" w:w="1007"/>
+          </w:tcPr>
+          <w:p>
+            <w:r/>
+          </w:p>
+        </w:tc>
+        <w:tc>
+          <w:tcPr>
+            <w:tcW w:type="dxa" w:w="1007"/>
+          </w:tcPr>
+          <w:p>
+            <w:r/>
+          </w:p>
+        </w:tc>
+        <w:tc>
+          <w:tcPr>
+            <w:tcW w:type="dxa" w:w="1007"/>
+          </w:tcPr>
+          <w:p>
+            <w:r/>
+          </w:p>
+        </w:tc>
+        <w:tc>
+          <w:tcPr>
+            <w:tcW w:type="dxa" w:w="1007"/>
+          </w:tcPr>
+          <w:p>
+            <w:r/>
+          </w:p>
+        </w:tc>
+        <w:tc>
+          <w:tcPr>
+            <w:tcW w:type="dxa" w:w="1007"/>
+          </w:tcPr>
+          <w:p>
+            <w:r/>
+          </w:p>
+        </w:tc>
+        <w:tc>
+          <w:tcPr>
+            <w:tcW w:type="dxa" w:w="1007"/>
+          </w:tcPr>
+          <w:p>
+            <w:r>
+              <w:t>X</w:t>
+            </w:r>
+          </w:p>
+        </w:tc>
+      </w:tr>
+      <w:tr>
+        <w:tc>
+          <w:tcPr>
+            <w:tcW w:type="dxa" w:w="1007"/>
+          </w:tcPr>
+          <w:p>
+            <w:r>
+              <w:t>CP-46</w:t>
+            </w:r>
+          </w:p>
+        </w:tc>
+        <w:tc>
+          <w:tcPr>
+            <w:tcW w:type="dxa" w:w="1006"/>
+          </w:tcPr>
+          <w:p>
+            <w:r/>
+          </w:p>
+        </w:tc>
+        <w:tc>
+          <w:tcPr>
+            <w:tcW w:type="dxa" w:w="1006"/>
+          </w:tcPr>
+          <w:p>
+            <w:r/>
+          </w:p>
+        </w:tc>
+        <w:tc>
+          <w:tcPr>
+            <w:tcW w:type="dxa" w:w="1007"/>
+          </w:tcPr>
+          <w:p>
+            <w:r/>
+          </w:p>
+        </w:tc>
+        <w:tc>
+          <w:tcPr>
+            <w:tcW w:type="dxa" w:w="1007"/>
+          </w:tcPr>
+          <w:p>
+            <w:r/>
+          </w:p>
+        </w:tc>
+        <w:tc>
+          <w:tcPr>
+            <w:tcW w:type="dxa" w:w="1007"/>
+          </w:tcPr>
+          <w:p>
+            <w:r/>
+          </w:p>
+        </w:tc>
+        <w:tc>
+          <w:tcPr>
+            <w:tcW w:type="dxa" w:w="1007"/>
+          </w:tcPr>
+          <w:p>
+            <w:r/>
+          </w:p>
+        </w:tc>
+        <w:tc>
+          <w:tcPr>
+            <w:tcW w:type="dxa" w:w="1007"/>
+          </w:tcPr>
+          <w:p>
+            <w:r/>
+          </w:p>
+        </w:tc>
+        <w:tc>
+          <w:tcPr>
+            <w:tcW w:type="dxa" w:w="1007"/>
+          </w:tcPr>
+          <w:p>
+            <w:r>
+              <w:t>X</w:t>
+            </w:r>
+          </w:p>
+        </w:tc>
+      </w:tr>
+      <w:tr>
+        <w:tc>
+          <w:tcPr>
+            <w:tcW w:type="dxa" w:w="1007"/>
+          </w:tcPr>
+          <w:p>
+            <w:r>
+              <w:t>CP-47</w:t>
+            </w:r>
+          </w:p>
+        </w:tc>
+        <w:tc>
+          <w:tcPr>
+            <w:tcW w:type="dxa" w:w="1006"/>
+          </w:tcPr>
+          <w:p>
+            <w:r/>
+          </w:p>
+        </w:tc>
+        <w:tc>
+          <w:tcPr>
+            <w:tcW w:type="dxa" w:w="1006"/>
+          </w:tcPr>
+          <w:p>
+            <w:r/>
+          </w:p>
+        </w:tc>
+        <w:tc>
+          <w:tcPr>
+            <w:tcW w:type="dxa" w:w="1007"/>
+          </w:tcPr>
+          <w:p>
+            <w:r/>
+          </w:p>
+        </w:tc>
+        <w:tc>
+          <w:tcPr>
+            <w:tcW w:type="dxa" w:w="1007"/>
+          </w:tcPr>
+          <w:p>
+            <w:r/>
+          </w:p>
+        </w:tc>
+        <w:tc>
+          <w:tcPr>
+            <w:tcW w:type="dxa" w:w="1007"/>
+          </w:tcPr>
+          <w:p>
+            <w:r>
+              <w:t>X</w:t>
+            </w:r>
+          </w:p>
+        </w:tc>
+        <w:tc>
+          <w:tcPr>
+            <w:tcW w:type="dxa" w:w="1007"/>
+          </w:tcPr>
+          <w:p>
+            <w:r/>
+          </w:p>
+        </w:tc>
+        <w:tc>
+          <w:tcPr>
+            <w:tcW w:type="dxa" w:w="1007"/>
+          </w:tcPr>
+          <w:p>
+            <w:r/>
+          </w:p>
+        </w:tc>
+        <w:tc>
+          <w:tcPr>
+            <w:tcW w:type="dxa" w:w="1007"/>
+          </w:tcPr>
+          <w:p>
+            <w:r/>
+          </w:p>
+        </w:tc>
+      </w:tr>
+      <w:tr>
+        <w:tc>
+          <w:tcPr>
+            <w:tcW w:type="dxa" w:w="1007"/>
+          </w:tcPr>
+          <w:p>
+            <w:r>
+              <w:t>CP-48</w:t>
+            </w:r>
+          </w:p>
+        </w:tc>
+        <w:tc>
+          <w:tcPr>
+            <w:tcW w:type="dxa" w:w="1006"/>
+          </w:tcPr>
+          <w:p>
+            <w:r/>
+          </w:p>
+        </w:tc>
+        <w:tc>
+          <w:tcPr>
+            <w:tcW w:type="dxa" w:w="1006"/>
+          </w:tcPr>
+          <w:p>
+            <w:r/>
+          </w:p>
+        </w:tc>
+        <w:tc>
+          <w:tcPr>
+            <w:tcW w:type="dxa" w:w="1007"/>
+          </w:tcPr>
+          <w:p>
+            <w:r/>
+          </w:p>
+        </w:tc>
+        <w:tc>
+          <w:tcPr>
+            <w:tcW w:type="dxa" w:w="1007"/>
+          </w:tcPr>
+          <w:p>
+            <w:r/>
+          </w:p>
+        </w:tc>
+        <w:tc>
+          <w:tcPr>
+            <w:tcW w:type="dxa" w:w="1007"/>
+          </w:tcPr>
+          <w:p>
+            <w:r>
+              <w:t>X</w:t>
+            </w:r>
+          </w:p>
+        </w:tc>
+        <w:tc>
+          <w:tcPr>
+            <w:tcW w:type="dxa" w:w="1007"/>
+          </w:tcPr>
+          <w:p>
+            <w:r/>
+          </w:p>
+        </w:tc>
+        <w:tc>
+          <w:tcPr>
+            <w:tcW w:type="dxa" w:w="1007"/>
+          </w:tcPr>
+          <w:p>
+            <w:r/>
+          </w:p>
+        </w:tc>
+        <w:tc>
+          <w:tcPr>
+            <w:tcW w:type="dxa" w:w="1007"/>
+          </w:tcPr>
+          <w:p>
+            <w:r/>
+          </w:p>
+        </w:tc>
+      </w:tr>
+      <w:tr>
+        <w:tc>
+          <w:tcPr>
+            <w:tcW w:type="dxa" w:w="1007"/>
+          </w:tcPr>
+          <w:p>
+            <w:r>
+              <w:t>CP-49</w:t>
+            </w:r>
+          </w:p>
+        </w:tc>
+        <w:tc>
+          <w:tcPr>
+            <w:tcW w:type="dxa" w:w="1006"/>
+          </w:tcPr>
+          <w:p>
+            <w:r/>
+          </w:p>
+        </w:tc>
+        <w:tc>
+          <w:tcPr>
+            <w:tcW w:type="dxa" w:w="1006"/>
+          </w:tcPr>
+          <w:p>
+            <w:r/>
+          </w:p>
+        </w:tc>
+        <w:tc>
+          <w:tcPr>
+            <w:tcW w:type="dxa" w:w="1007"/>
+          </w:tcPr>
+          <w:p>
+            <w:r/>
+          </w:p>
+        </w:tc>
+        <w:tc>
+          <w:tcPr>
+            <w:tcW w:type="dxa" w:w="1007"/>
+          </w:tcPr>
+          <w:p>
+            <w:r/>
+          </w:p>
+        </w:tc>
+        <w:tc>
+          <w:tcPr>
+            <w:tcW w:type="dxa" w:w="1007"/>
+          </w:tcPr>
+          <w:p>
+            <w:r>
+              <w:t>X</w:t>
+            </w:r>
+          </w:p>
+        </w:tc>
+        <w:tc>
+          <w:tcPr>
+            <w:tcW w:type="dxa" w:w="1007"/>
+          </w:tcPr>
+          <w:p>
+            <w:r/>
+          </w:p>
+        </w:tc>
+        <w:tc>
+          <w:tcPr>
+            <w:tcW w:type="dxa" w:w="1007"/>
+          </w:tcPr>
+          <w:p>
+            <w:r/>
+          </w:p>
+        </w:tc>
+        <w:tc>
+          <w:tcPr>
+            <w:tcW w:type="dxa" w:w="1007"/>
+          </w:tcPr>
+          <w:p>
+            <w:r/>
+          </w:p>
+        </w:tc>
+      </w:tr>
+      <w:tr>
+        <w:tc>
+          <w:tcPr>
+            <w:tcW w:type="dxa" w:w="1007"/>
+          </w:tcPr>
+          <w:p>
+            <w:r>
+              <w:t>CP-50</w:t>
+            </w:r>
+          </w:p>
+        </w:tc>
+        <w:tc>
+          <w:tcPr>
+            <w:tcW w:type="dxa" w:w="1006"/>
+          </w:tcPr>
+          <w:p>
+            <w:r/>
+          </w:p>
+        </w:tc>
+        <w:tc>
+          <w:tcPr>
+            <w:tcW w:type="dxa" w:w="1006"/>
+          </w:tcPr>
+          <w:p>
+            <w:r/>
+          </w:p>
+        </w:tc>
+        <w:tc>
+          <w:tcPr>
+            <w:tcW w:type="dxa" w:w="1007"/>
+          </w:tcPr>
+          <w:p>
+            <w:r/>
+          </w:p>
+        </w:tc>
+        <w:tc>
+          <w:tcPr>
+            <w:tcW w:type="dxa" w:w="1007"/>
+          </w:tcPr>
+          <w:p>
+            <w:r/>
+          </w:p>
+        </w:tc>
+        <w:tc>
+          <w:tcPr>
+            <w:tcW w:type="dxa" w:w="1007"/>
+          </w:tcPr>
+          <w:p>
+            <w:r>
+              <w:t>X</w:t>
+            </w:r>
+          </w:p>
+        </w:tc>
+        <w:tc>
+          <w:tcPr>
+            <w:tcW w:type="dxa" w:w="1007"/>
+          </w:tcPr>
+          <w:p>
+            <w:r/>
+          </w:p>
+        </w:tc>
+        <w:tc>
+          <w:tcPr>
+            <w:tcW w:type="dxa" w:w="1007"/>
+          </w:tcPr>
+          <w:p>
+            <w:r/>
+          </w:p>
+        </w:tc>
+        <w:tc>
+          <w:tcPr>
+            <w:tcW w:type="dxa" w:w="1007"/>
+          </w:tcPr>
+          <w:p>
+            <w:r/>
+          </w:p>
+        </w:tc>
+      </w:tr>
+      <w:tr>
+        <w:tc>
+          <w:tcPr>
+            <w:tcW w:type="dxa" w:w="1007"/>
+          </w:tcPr>
+          <w:p>
+            <w:r>
+              <w:t>CP-51</w:t>
+            </w:r>
+          </w:p>
+        </w:tc>
+        <w:tc>
+          <w:tcPr>
+            <w:tcW w:type="dxa" w:w="1006"/>
+          </w:tcPr>
+          <w:p>
+            <w:r/>
+          </w:p>
+        </w:tc>
+        <w:tc>
+          <w:tcPr>
+            <w:tcW w:type="dxa" w:w="1006"/>
+          </w:tcPr>
+          <w:p>
+            <w:r/>
+          </w:p>
+        </w:tc>
+        <w:tc>
+          <w:tcPr>
+            <w:tcW w:type="dxa" w:w="1007"/>
+          </w:tcPr>
+          <w:p>
+            <w:r/>
+          </w:p>
+        </w:tc>
+        <w:tc>
+          <w:tcPr>
+            <w:tcW w:type="dxa" w:w="1007"/>
+          </w:tcPr>
+          <w:p>
+            <w:r/>
+          </w:p>
+        </w:tc>
+        <w:tc>
+          <w:tcPr>
+            <w:tcW w:type="dxa" w:w="1007"/>
+          </w:tcPr>
+          <w:p>
+            <w:r>
+              <w:t>X</w:t>
+            </w:r>
+          </w:p>
+        </w:tc>
+        <w:tc>
+          <w:tcPr>
+            <w:tcW w:type="dxa" w:w="1007"/>
+          </w:tcPr>
+          <w:p>
+            <w:r/>
+          </w:p>
+        </w:tc>
+        <w:tc>
+          <w:tcPr>
+            <w:tcW w:type="dxa" w:w="1007"/>
+          </w:tcPr>
+          <w:p>
+            <w:r/>
+          </w:p>
+        </w:tc>
+        <w:tc>
+          <w:tcPr>
+            <w:tcW w:type="dxa" w:w="1007"/>
+          </w:tcPr>
+          <w:p>
+            <w:r/>
+          </w:p>
+        </w:tc>
+      </w:tr>
     </w:tbl>
     <w:p>
       <w:pPr>
@@ -13594,6 +14374,2246 @@
           <w:p>
             <w:r>
               <w:t>Resultado esperado: Se captura la excepción, success queda en false, isLoading en false, y el mensaje de error de la API se guarda en el state.</w:t>
+            </w:r>
+          </w:p>
+        </w:tc>
+      </w:tr>
+      <w:tr>
+        <w:tc>
+          <w:tcPr>
+            <w:tcW w:type="dxa" w:w="3021"/>
+          </w:tcPr>
+          <w:p>
+            <w:r>
+              <w:t>Resultado obtenido: Ejecutado con éxito. Pruebas unitarias de la app Android pasadas al 100% en JUnit.</w:t>
+            </w:r>
+          </w:p>
+        </w:tc>
+        <w:tc>
+          <w:tcPr>
+            <w:tcW w:type="dxa" w:w="3021"/>
+          </w:tcPr>
+          <w:p>
+            <w:r>
+              <w:t>Resultado obtenido: Ejecutado con éxito. Pruebas unitarias de la app Android pasadas al 100% en JUnit.</w:t>
+            </w:r>
+          </w:p>
+        </w:tc>
+        <w:tc>
+          <w:tcPr>
+            <w:tcW w:type="dxa" w:w="3019"/>
+          </w:tcPr>
+          <w:p>
+            <w:r>
+              <w:t>Resultado obtenido: Ejecutado con éxito. Pruebas unitarias de la app Android pasadas al 100% en JUnit.</w:t>
+            </w:r>
+          </w:p>
+        </w:tc>
+      </w:tr>
+      <w:tr>
+        <w:tc>
+          <w:tcPr>
+            <w:tcW w:type="dxa" w:w="3021"/>
+          </w:tcPr>
+          <w:p>
+            <w:r>
+              <w:t>Prueba unitaria de mapeo de SocketTimeoutException (ErrorMapper)</w:t>
+            </w:r>
+          </w:p>
+        </w:tc>
+        <w:tc>
+          <w:tcPr>
+            <w:tcW w:type="dxa" w:w="3021"/>
+          </w:tcPr>
+          <w:p>
+            <w:r>
+              <w:t>CP-42</w:t>
+            </w:r>
+          </w:p>
+        </w:tc>
+        <w:tc>
+          <w:tcPr>
+            <w:tcW w:type="dxa" w:w="3019"/>
+          </w:tcPr>
+          <w:p>
+            <w:r>
+              <w:t>CP-42</w:t>
+            </w:r>
+          </w:p>
+        </w:tc>
+      </w:tr>
+      <w:tr>
+        <w:tc>
+          <w:tcPr>
+            <w:tcW w:type="dxa" w:w="3021"/>
+          </w:tcPr>
+          <w:p>
+            <w:r>
+              <w:t>Prueba unitaria de mapeo de SocketTimeoutException (ErrorMapper)</w:t>
+            </w:r>
+          </w:p>
+        </w:tc>
+        <w:tc>
+          <w:tcPr>
+            <w:tcW w:type="dxa" w:w="3021"/>
+          </w:tcPr>
+          <w:p>
+            <w:r>
+              <w:t>¿Prueba de despliegue?</w:t>
+            </w:r>
+          </w:p>
+        </w:tc>
+        <w:tc>
+          <w:tcPr>
+            <w:tcW w:type="dxa" w:w="3019"/>
+          </w:tcPr>
+          <w:p>
+            <w:r>
+              <w:t>No</w:t>
+            </w:r>
+          </w:p>
+        </w:tc>
+      </w:tr>
+      <w:tr>
+        <w:tc>
+          <w:tcPr>
+            <w:tcW w:type="dxa" w:w="3021"/>
+          </w:tcPr>
+          <w:p>
+            <w:r>
+              <w:t>Descripción: Validar que el mapeador de errores traduzca correctamente excepciones de timeout a ApiError.Timeout.</w:t>
+            </w:r>
+          </w:p>
+        </w:tc>
+        <w:tc>
+          <w:tcPr>
+            <w:tcW w:type="dxa" w:w="3021"/>
+          </w:tcPr>
+          <w:p>
+            <w:r>
+              <w:t>Descripción: Validar que el mapeador de errores traduzca correctamente excepciones de timeout a ApiError.Timeout.</w:t>
+            </w:r>
+          </w:p>
+        </w:tc>
+        <w:tc>
+          <w:tcPr>
+            <w:tcW w:type="dxa" w:w="3019"/>
+          </w:tcPr>
+          <w:p>
+            <w:r>
+              <w:t>Descripción: Validar que el mapeador de errores traduzca correctamente excepciones de timeout a ApiError.Timeout.</w:t>
+            </w:r>
+          </w:p>
+        </w:tc>
+      </w:tr>
+      <w:tr>
+        <w:tc>
+          <w:tcPr>
+            <w:tcW w:type="dxa" w:w="3021"/>
+          </w:tcPr>
+          <w:p>
+            <w:r>
+              <w:t>Prerrequisitos: Clase de utilidad ErrorMapper disponible.</w:t>
+            </w:r>
+          </w:p>
+        </w:tc>
+        <w:tc>
+          <w:tcPr>
+            <w:tcW w:type="dxa" w:w="3021"/>
+          </w:tcPr>
+          <w:p>
+            <w:r>
+              <w:t>Prerrequisitos: Clase de utilidad ErrorMapper disponible.</w:t>
+            </w:r>
+          </w:p>
+        </w:tc>
+        <w:tc>
+          <w:tcPr>
+            <w:tcW w:type="dxa" w:w="3019"/>
+          </w:tcPr>
+          <w:p>
+            <w:r>
+              <w:t>Prerrequisitos: Clase de utilidad ErrorMapper disponible.</w:t>
+            </w:r>
+          </w:p>
+        </w:tc>
+      </w:tr>
+      <w:tr>
+        <w:tc>
+          <w:tcPr>
+            <w:tcW w:type="dxa" w:w="3021"/>
+          </w:tcPr>
+          <w:p>
+            <w:r>
+              <w:t>Pasos: 1. Invocar ErrorMapper.map con una SocketTimeoutException. 2. Verificar que devuelva ApiError.Timeout y el mensaje adecuado.</w:t>
+            </w:r>
+          </w:p>
+        </w:tc>
+        <w:tc>
+          <w:tcPr>
+            <w:tcW w:type="dxa" w:w="3021"/>
+          </w:tcPr>
+          <w:p>
+            <w:r>
+              <w:t>Pasos: 1. Invocar ErrorMapper.map con una SocketTimeoutException. 2. Verificar que devuelva ApiError.Timeout y el mensaje adecuado.</w:t>
+            </w:r>
+          </w:p>
+        </w:tc>
+        <w:tc>
+          <w:tcPr>
+            <w:tcW w:type="dxa" w:w="3019"/>
+          </w:tcPr>
+          <w:p>
+            <w:r>
+              <w:t>Pasos: 1. Invocar ErrorMapper.map con una SocketTimeoutException. 2. Verificar que devuelva ApiError.Timeout y el mensaje adecuado.</w:t>
+            </w:r>
+          </w:p>
+        </w:tc>
+      </w:tr>
+      <w:tr>
+        <w:tc>
+          <w:tcPr>
+            <w:tcW w:type="dxa" w:w="3021"/>
+          </w:tcPr>
+          <w:p>
+            <w:r>
+              <w:t>Resultado esperado: Retorna ApiError.Timeout con el mensaje 'La solicitud demoró demasiado'.</w:t>
+            </w:r>
+          </w:p>
+        </w:tc>
+        <w:tc>
+          <w:tcPr>
+            <w:tcW w:type="dxa" w:w="3021"/>
+          </w:tcPr>
+          <w:p>
+            <w:r>
+              <w:t>Resultado esperado: Retorna ApiError.Timeout con el mensaje 'La solicitud demoró demasiado'.</w:t>
+            </w:r>
+          </w:p>
+        </w:tc>
+        <w:tc>
+          <w:tcPr>
+            <w:tcW w:type="dxa" w:w="3019"/>
+          </w:tcPr>
+          <w:p>
+            <w:r>
+              <w:t>Resultado esperado: Retorna ApiError.Timeout con el mensaje 'La solicitud demoró demasiado'.</w:t>
+            </w:r>
+          </w:p>
+        </w:tc>
+      </w:tr>
+      <w:tr>
+        <w:tc>
+          <w:tcPr>
+            <w:tcW w:type="dxa" w:w="3021"/>
+          </w:tcPr>
+          <w:p>
+            <w:r>
+              <w:t>Resultado obtenido: Ejecutado con éxito. Pruebas unitarias de la app Android pasadas al 100% en JUnit.</w:t>
+            </w:r>
+          </w:p>
+        </w:tc>
+        <w:tc>
+          <w:tcPr>
+            <w:tcW w:type="dxa" w:w="3021"/>
+          </w:tcPr>
+          <w:p>
+            <w:r>
+              <w:t>Resultado obtenido: Ejecutado con éxito. Pruebas unitarias de la app Android pasadas al 100% en JUnit.</w:t>
+            </w:r>
+          </w:p>
+        </w:tc>
+        <w:tc>
+          <w:tcPr>
+            <w:tcW w:type="dxa" w:w="3019"/>
+          </w:tcPr>
+          <w:p>
+            <w:r>
+              <w:t>Resultado obtenido: Ejecutado con éxito. Pruebas unitarias de la app Android pasadas al 100% en JUnit.</w:t>
+            </w:r>
+          </w:p>
+        </w:tc>
+      </w:tr>
+      <w:tr>
+        <w:tc>
+          <w:tcPr>
+            <w:tcW w:type="dxa" w:w="3021"/>
+          </w:tcPr>
+          <w:p>
+            <w:r>
+              <w:t>Prueba unitaria de mapeo de IOException (ErrorMapper)</w:t>
+            </w:r>
+          </w:p>
+        </w:tc>
+        <w:tc>
+          <w:tcPr>
+            <w:tcW w:type="dxa" w:w="3021"/>
+          </w:tcPr>
+          <w:p>
+            <w:r>
+              <w:t>CP-43</w:t>
+            </w:r>
+          </w:p>
+        </w:tc>
+        <w:tc>
+          <w:tcPr>
+            <w:tcW w:type="dxa" w:w="3019"/>
+          </w:tcPr>
+          <w:p>
+            <w:r>
+              <w:t>CP-43</w:t>
+            </w:r>
+          </w:p>
+        </w:tc>
+      </w:tr>
+      <w:tr>
+        <w:tc>
+          <w:tcPr>
+            <w:tcW w:type="dxa" w:w="3021"/>
+          </w:tcPr>
+          <w:p>
+            <w:r>
+              <w:t>Prueba unitaria de mapeo de IOException (ErrorMapper)</w:t>
+            </w:r>
+          </w:p>
+        </w:tc>
+        <w:tc>
+          <w:tcPr>
+            <w:tcW w:type="dxa" w:w="3021"/>
+          </w:tcPr>
+          <w:p>
+            <w:r>
+              <w:t>¿Prueba de despliegue?</w:t>
+            </w:r>
+          </w:p>
+        </w:tc>
+        <w:tc>
+          <w:tcPr>
+            <w:tcW w:type="dxa" w:w="3019"/>
+          </w:tcPr>
+          <w:p>
+            <w:r>
+              <w:t>No</w:t>
+            </w:r>
+          </w:p>
+        </w:tc>
+      </w:tr>
+      <w:tr>
+        <w:tc>
+          <w:tcPr>
+            <w:tcW w:type="dxa" w:w="3021"/>
+          </w:tcPr>
+          <w:p>
+            <w:r>
+              <w:t>Descripción: Validar que el mapeador traduzca excepciones generales de red a ApiError.NoConnection.</w:t>
+            </w:r>
+          </w:p>
+        </w:tc>
+        <w:tc>
+          <w:tcPr>
+            <w:tcW w:type="dxa" w:w="3021"/>
+          </w:tcPr>
+          <w:p>
+            <w:r>
+              <w:t>Descripción: Validar que el mapeador traduzca excepciones generales de red a ApiError.NoConnection.</w:t>
+            </w:r>
+          </w:p>
+        </w:tc>
+        <w:tc>
+          <w:tcPr>
+            <w:tcW w:type="dxa" w:w="3019"/>
+          </w:tcPr>
+          <w:p>
+            <w:r>
+              <w:t>Descripción: Validar que el mapeador traduzca excepciones generales de red a ApiError.NoConnection.</w:t>
+            </w:r>
+          </w:p>
+        </w:tc>
+      </w:tr>
+      <w:tr>
+        <w:tc>
+          <w:tcPr>
+            <w:tcW w:type="dxa" w:w="3021"/>
+          </w:tcPr>
+          <w:p>
+            <w:r>
+              <w:t>Prerrequisitos: Clase de utilidad ErrorMapper disponible.</w:t>
+            </w:r>
+          </w:p>
+        </w:tc>
+        <w:tc>
+          <w:tcPr>
+            <w:tcW w:type="dxa" w:w="3021"/>
+          </w:tcPr>
+          <w:p>
+            <w:r>
+              <w:t>Prerrequisitos: Clase de utilidad ErrorMapper disponible.</w:t>
+            </w:r>
+          </w:p>
+        </w:tc>
+        <w:tc>
+          <w:tcPr>
+            <w:tcW w:type="dxa" w:w="3019"/>
+          </w:tcPr>
+          <w:p>
+            <w:r>
+              <w:t>Prerrequisitos: Clase de utilidad ErrorMapper disponible.</w:t>
+            </w:r>
+          </w:p>
+        </w:tc>
+      </w:tr>
+      <w:tr>
+        <w:tc>
+          <w:tcPr>
+            <w:tcW w:type="dxa" w:w="3021"/>
+          </w:tcPr>
+          <w:p>
+            <w:r>
+              <w:t>Pasos: 1. Invocar ErrorMapper.map con una IOException o UnknownHostException. 2. Verificar el tipo y mensaje retornado.</w:t>
+            </w:r>
+          </w:p>
+        </w:tc>
+        <w:tc>
+          <w:tcPr>
+            <w:tcW w:type="dxa" w:w="3021"/>
+          </w:tcPr>
+          <w:p>
+            <w:r>
+              <w:t>Pasos: 1. Invocar ErrorMapper.map con una IOException o UnknownHostException. 2. Verificar el tipo y mensaje retornado.</w:t>
+            </w:r>
+          </w:p>
+        </w:tc>
+        <w:tc>
+          <w:tcPr>
+            <w:tcW w:type="dxa" w:w="3019"/>
+          </w:tcPr>
+          <w:p>
+            <w:r>
+              <w:t>Pasos: 1. Invocar ErrorMapper.map con una IOException o UnknownHostException. 2. Verificar el tipo y mensaje retornado.</w:t>
+            </w:r>
+          </w:p>
+        </w:tc>
+      </w:tr>
+      <w:tr>
+        <w:tc>
+          <w:tcPr>
+            <w:tcW w:type="dxa" w:w="3021"/>
+          </w:tcPr>
+          <w:p>
+            <w:r>
+              <w:t>Resultado esperado: Retorna ApiError.NoConnection con el mensaje 'Sin conexión a internet'.</w:t>
+            </w:r>
+          </w:p>
+        </w:tc>
+        <w:tc>
+          <w:tcPr>
+            <w:tcW w:type="dxa" w:w="3021"/>
+          </w:tcPr>
+          <w:p>
+            <w:r>
+              <w:t>Resultado esperado: Retorna ApiError.NoConnection con el mensaje 'Sin conexión a internet'.</w:t>
+            </w:r>
+          </w:p>
+        </w:tc>
+        <w:tc>
+          <w:tcPr>
+            <w:tcW w:type="dxa" w:w="3019"/>
+          </w:tcPr>
+          <w:p>
+            <w:r>
+              <w:t>Resultado esperado: Retorna ApiError.NoConnection con el mensaje 'Sin conexión a internet'.</w:t>
+            </w:r>
+          </w:p>
+        </w:tc>
+      </w:tr>
+      <w:tr>
+        <w:tc>
+          <w:tcPr>
+            <w:tcW w:type="dxa" w:w="3021"/>
+          </w:tcPr>
+          <w:p>
+            <w:r>
+              <w:t>Resultado obtenido: Ejecutado con éxito. Pruebas unitarias de la app Android pasadas al 100% en JUnit.</w:t>
+            </w:r>
+          </w:p>
+        </w:tc>
+        <w:tc>
+          <w:tcPr>
+            <w:tcW w:type="dxa" w:w="3021"/>
+          </w:tcPr>
+          <w:p>
+            <w:r>
+              <w:t>Resultado obtenido: Ejecutado con éxito. Pruebas unitarias de la app Android pasadas al 100% en JUnit.</w:t>
+            </w:r>
+          </w:p>
+        </w:tc>
+        <w:tc>
+          <w:tcPr>
+            <w:tcW w:type="dxa" w:w="3019"/>
+          </w:tcPr>
+          <w:p>
+            <w:r>
+              <w:t>Resultado obtenido: Ejecutado con éxito. Pruebas unitarias de la app Android pasadas al 100% en JUnit.</w:t>
+            </w:r>
+          </w:p>
+        </w:tc>
+      </w:tr>
+      <w:tr>
+        <w:tc>
+          <w:tcPr>
+            <w:tcW w:type="dxa" w:w="3021"/>
+          </w:tcPr>
+          <w:p>
+            <w:r>
+              <w:t>Prueba unitaria de mapeo de excepciones genéricas (ErrorMapper)</w:t>
+            </w:r>
+          </w:p>
+        </w:tc>
+        <w:tc>
+          <w:tcPr>
+            <w:tcW w:type="dxa" w:w="3021"/>
+          </w:tcPr>
+          <w:p>
+            <w:r>
+              <w:t>CP-44</w:t>
+            </w:r>
+          </w:p>
+        </w:tc>
+        <w:tc>
+          <w:tcPr>
+            <w:tcW w:type="dxa" w:w="3019"/>
+          </w:tcPr>
+          <w:p>
+            <w:r>
+              <w:t>CP-44</w:t>
+            </w:r>
+          </w:p>
+        </w:tc>
+      </w:tr>
+      <w:tr>
+        <w:tc>
+          <w:tcPr>
+            <w:tcW w:type="dxa" w:w="3021"/>
+          </w:tcPr>
+          <w:p>
+            <w:r>
+              <w:t>Prueba unitaria de mapeo de excepciones genéricas (ErrorMapper)</w:t>
+            </w:r>
+          </w:p>
+        </w:tc>
+        <w:tc>
+          <w:tcPr>
+            <w:tcW w:type="dxa" w:w="3021"/>
+          </w:tcPr>
+          <w:p>
+            <w:r>
+              <w:t>¿Prueba de despliegue?</w:t>
+            </w:r>
+          </w:p>
+        </w:tc>
+        <w:tc>
+          <w:tcPr>
+            <w:tcW w:type="dxa" w:w="3019"/>
+          </w:tcPr>
+          <w:p>
+            <w:r>
+              <w:t>No</w:t>
+            </w:r>
+          </w:p>
+        </w:tc>
+      </w:tr>
+      <w:tr>
+        <w:tc>
+          <w:tcPr>
+            <w:tcW w:type="dxa" w:w="3021"/>
+          </w:tcPr>
+          <w:p>
+            <w:r>
+              <w:t>Descripción: Validar el manejo correcto de excepciones genéricas no documentadas preservando su mensaje.</w:t>
+            </w:r>
+          </w:p>
+        </w:tc>
+        <w:tc>
+          <w:tcPr>
+            <w:tcW w:type="dxa" w:w="3021"/>
+          </w:tcPr>
+          <w:p>
+            <w:r>
+              <w:t>Descripción: Validar el manejo correcto de excepciones genéricas no documentadas preservando su mensaje.</w:t>
+            </w:r>
+          </w:p>
+        </w:tc>
+        <w:tc>
+          <w:tcPr>
+            <w:tcW w:type="dxa" w:w="3019"/>
+          </w:tcPr>
+          <w:p>
+            <w:r>
+              <w:t>Descripción: Validar el manejo correcto de excepciones genéricas no documentadas preservando su mensaje.</w:t>
+            </w:r>
+          </w:p>
+        </w:tc>
+      </w:tr>
+      <w:tr>
+        <w:tc>
+          <w:tcPr>
+            <w:tcW w:type="dxa" w:w="3021"/>
+          </w:tcPr>
+          <w:p>
+            <w:r>
+              <w:t>Prerrequisitos: Clase de utilidad ErrorMapper disponible.</w:t>
+            </w:r>
+          </w:p>
+        </w:tc>
+        <w:tc>
+          <w:tcPr>
+            <w:tcW w:type="dxa" w:w="3021"/>
+          </w:tcPr>
+          <w:p>
+            <w:r>
+              <w:t>Prerrequisitos: Clase de utilidad ErrorMapper disponible.</w:t>
+            </w:r>
+          </w:p>
+        </w:tc>
+        <w:tc>
+          <w:tcPr>
+            <w:tcW w:type="dxa" w:w="3019"/>
+          </w:tcPr>
+          <w:p>
+            <w:r>
+              <w:t>Prerrequisitos: Clase de utilidad ErrorMapper disponible.</w:t>
+            </w:r>
+          </w:p>
+        </w:tc>
+      </w:tr>
+      <w:tr>
+        <w:tc>
+          <w:tcPr>
+            <w:tcW w:type="dxa" w:w="3021"/>
+          </w:tcPr>
+          <w:p>
+            <w:r>
+              <w:t>Pasos: 1. Invocar ErrorMapper.map con una RuntimeException genérica. 2. Comprobar que mantenga el mensaje de error original.</w:t>
+            </w:r>
+          </w:p>
+        </w:tc>
+        <w:tc>
+          <w:tcPr>
+            <w:tcW w:type="dxa" w:w="3021"/>
+          </w:tcPr>
+          <w:p>
+            <w:r>
+              <w:t>Pasos: 1. Invocar ErrorMapper.map con una RuntimeException genérica. 2. Comprobar que mantenga el mensaje de error original.</w:t>
+            </w:r>
+          </w:p>
+        </w:tc>
+        <w:tc>
+          <w:tcPr>
+            <w:tcW w:type="dxa" w:w="3019"/>
+          </w:tcPr>
+          <w:p>
+            <w:r>
+              <w:t>Pasos: 1. Invocar ErrorMapper.map con una RuntimeException genérica. 2. Comprobar que mantenga el mensaje de error original.</w:t>
+            </w:r>
+          </w:p>
+        </w:tc>
+      </w:tr>
+      <w:tr>
+        <w:tc>
+          <w:tcPr>
+            <w:tcW w:type="dxa" w:w="3021"/>
+          </w:tcPr>
+          <w:p>
+            <w:r>
+              <w:t>Resultado esperado: Retorna ApiError.Unknown con el mensaje original.</w:t>
+            </w:r>
+          </w:p>
+        </w:tc>
+        <w:tc>
+          <w:tcPr>
+            <w:tcW w:type="dxa" w:w="3021"/>
+          </w:tcPr>
+          <w:p>
+            <w:r>
+              <w:t>Resultado esperado: Retorna ApiError.Unknown con el mensaje original.</w:t>
+            </w:r>
+          </w:p>
+        </w:tc>
+        <w:tc>
+          <w:tcPr>
+            <w:tcW w:type="dxa" w:w="3019"/>
+          </w:tcPr>
+          <w:p>
+            <w:r>
+              <w:t>Resultado esperado: Retorna ApiError.Unknown con el mensaje original.</w:t>
+            </w:r>
+          </w:p>
+        </w:tc>
+      </w:tr>
+      <w:tr>
+        <w:tc>
+          <w:tcPr>
+            <w:tcW w:type="dxa" w:w="3021"/>
+          </w:tcPr>
+          <w:p>
+            <w:r>
+              <w:t>Resultado obtenido: Ejecutado con éxito. Pruebas unitarias de la app Android pasadas al 100% en JUnit.</w:t>
+            </w:r>
+          </w:p>
+        </w:tc>
+        <w:tc>
+          <w:tcPr>
+            <w:tcW w:type="dxa" w:w="3021"/>
+          </w:tcPr>
+          <w:p>
+            <w:r>
+              <w:t>Resultado obtenido: Ejecutado con éxito. Pruebas unitarias de la app Android pasadas al 100% en JUnit.</w:t>
+            </w:r>
+          </w:p>
+        </w:tc>
+        <w:tc>
+          <w:tcPr>
+            <w:tcW w:type="dxa" w:w="3019"/>
+          </w:tcPr>
+          <w:p>
+            <w:r>
+              <w:t>Resultado obtenido: Ejecutado con éxito. Pruebas unitarias de la app Android pasadas al 100% en JUnit.</w:t>
+            </w:r>
+          </w:p>
+        </w:tc>
+      </w:tr>
+      <w:tr>
+        <w:tc>
+          <w:tcPr>
+            <w:tcW w:type="dxa" w:w="3021"/>
+          </w:tcPr>
+          <w:p>
+            <w:r>
+              <w:t>Prueba unitaria de mapeo de error HTTP 401 (ErrorMapper)</w:t>
+            </w:r>
+          </w:p>
+        </w:tc>
+        <w:tc>
+          <w:tcPr>
+            <w:tcW w:type="dxa" w:w="3021"/>
+          </w:tcPr>
+          <w:p>
+            <w:r>
+              <w:t>CP-45</w:t>
+            </w:r>
+          </w:p>
+        </w:tc>
+        <w:tc>
+          <w:tcPr>
+            <w:tcW w:type="dxa" w:w="3019"/>
+          </w:tcPr>
+          <w:p>
+            <w:r>
+              <w:t>CP-45</w:t>
+            </w:r>
+          </w:p>
+        </w:tc>
+      </w:tr>
+      <w:tr>
+        <w:tc>
+          <w:tcPr>
+            <w:tcW w:type="dxa" w:w="3021"/>
+          </w:tcPr>
+          <w:p>
+            <w:r>
+              <w:t>Prueba unitaria de mapeo de error HTTP 401 (ErrorMapper)</w:t>
+            </w:r>
+          </w:p>
+        </w:tc>
+        <w:tc>
+          <w:tcPr>
+            <w:tcW w:type="dxa" w:w="3021"/>
+          </w:tcPr>
+          <w:p>
+            <w:r>
+              <w:t>¿Prueba de despliegue?</w:t>
+            </w:r>
+          </w:p>
+        </w:tc>
+        <w:tc>
+          <w:tcPr>
+            <w:tcW w:type="dxa" w:w="3019"/>
+          </w:tcPr>
+          <w:p>
+            <w:r>
+              <w:t>No</w:t>
+            </w:r>
+          </w:p>
+        </w:tc>
+      </w:tr>
+      <w:tr>
+        <w:tc>
+          <w:tcPr>
+            <w:tcW w:type="dxa" w:w="3021"/>
+          </w:tcPr>
+          <w:p>
+            <w:r>
+              <w:t>Descripción: Validar que los errores de sesión expirada HTTP 401 se mapeen a ApiError.Unauthorized.</w:t>
+            </w:r>
+          </w:p>
+        </w:tc>
+        <w:tc>
+          <w:tcPr>
+            <w:tcW w:type="dxa" w:w="3021"/>
+          </w:tcPr>
+          <w:p>
+            <w:r>
+              <w:t>Descripción: Validar que los errores de sesión expirada HTTP 401 se mapeen a ApiError.Unauthorized.</w:t>
+            </w:r>
+          </w:p>
+        </w:tc>
+        <w:tc>
+          <w:tcPr>
+            <w:tcW w:type="dxa" w:w="3019"/>
+          </w:tcPr>
+          <w:p>
+            <w:r>
+              <w:t>Descripción: Validar que los errores de sesión expirada HTTP 401 se mapeen a ApiError.Unauthorized.</w:t>
+            </w:r>
+          </w:p>
+        </w:tc>
+      </w:tr>
+      <w:tr>
+        <w:tc>
+          <w:tcPr>
+            <w:tcW w:type="dxa" w:w="3021"/>
+          </w:tcPr>
+          <w:p>
+            <w:r>
+              <w:t>Prerrequisitos: Clase de utilidad ErrorMapper disponible.</w:t>
+            </w:r>
+          </w:p>
+        </w:tc>
+        <w:tc>
+          <w:tcPr>
+            <w:tcW w:type="dxa" w:w="3021"/>
+          </w:tcPr>
+          <w:p>
+            <w:r>
+              <w:t>Prerrequisitos: Clase de utilidad ErrorMapper disponible.</w:t>
+            </w:r>
+          </w:p>
+        </w:tc>
+        <w:tc>
+          <w:tcPr>
+            <w:tcW w:type="dxa" w:w="3019"/>
+          </w:tcPr>
+          <w:p>
+            <w:r>
+              <w:t>Prerrequisitos: Clase de utilidad ErrorMapper disponible.</w:t>
+            </w:r>
+          </w:p>
+        </w:tc>
+      </w:tr>
+      <w:tr>
+        <w:tc>
+          <w:tcPr>
+            <w:tcW w:type="dxa" w:w="3021"/>
+          </w:tcPr>
+          <w:p>
+            <w:r>
+              <w:t>Pasos: 1. Mockear una excepción HttpException de Retrofit con código 401. 2. Invocar ErrorMapper.map.</w:t>
+            </w:r>
+          </w:p>
+        </w:tc>
+        <w:tc>
+          <w:tcPr>
+            <w:tcW w:type="dxa" w:w="3021"/>
+          </w:tcPr>
+          <w:p>
+            <w:r>
+              <w:t>Pasos: 1. Mockear una excepción HttpException de Retrofit con código 401. 2. Invocar ErrorMapper.map.</w:t>
+            </w:r>
+          </w:p>
+        </w:tc>
+        <w:tc>
+          <w:tcPr>
+            <w:tcW w:type="dxa" w:w="3019"/>
+          </w:tcPr>
+          <w:p>
+            <w:r>
+              <w:t>Pasos: 1. Mockear una excepción HttpException de Retrofit con código 401. 2. Invocar ErrorMapper.map.</w:t>
+            </w:r>
+          </w:p>
+        </w:tc>
+      </w:tr>
+      <w:tr>
+        <w:tc>
+          <w:tcPr>
+            <w:tcW w:type="dxa" w:w="3021"/>
+          </w:tcPr>
+          <w:p>
+            <w:r>
+              <w:t>Resultado esperado: Retorna ApiError.Unauthorized con el mensaje de sesión expirada.</w:t>
+            </w:r>
+          </w:p>
+        </w:tc>
+        <w:tc>
+          <w:tcPr>
+            <w:tcW w:type="dxa" w:w="3021"/>
+          </w:tcPr>
+          <w:p>
+            <w:r>
+              <w:t>Resultado esperado: Retorna ApiError.Unauthorized con el mensaje de sesión expirada.</w:t>
+            </w:r>
+          </w:p>
+        </w:tc>
+        <w:tc>
+          <w:tcPr>
+            <w:tcW w:type="dxa" w:w="3019"/>
+          </w:tcPr>
+          <w:p>
+            <w:r>
+              <w:t>Resultado esperado: Retorna ApiError.Unauthorized con el mensaje de sesión expirada.</w:t>
+            </w:r>
+          </w:p>
+        </w:tc>
+      </w:tr>
+      <w:tr>
+        <w:tc>
+          <w:tcPr>
+            <w:tcW w:type="dxa" w:w="3021"/>
+          </w:tcPr>
+          <w:p>
+            <w:r>
+              <w:t>Resultado obtenido: Ejecutado con éxito. Pruebas unitarias de la app Android pasadas al 100% en JUnit.</w:t>
+            </w:r>
+          </w:p>
+        </w:tc>
+        <w:tc>
+          <w:tcPr>
+            <w:tcW w:type="dxa" w:w="3021"/>
+          </w:tcPr>
+          <w:p>
+            <w:r>
+              <w:t>Resultado obtenido: Ejecutado con éxito. Pruebas unitarias de la app Android pasadas al 100% en JUnit.</w:t>
+            </w:r>
+          </w:p>
+        </w:tc>
+        <w:tc>
+          <w:tcPr>
+            <w:tcW w:type="dxa" w:w="3019"/>
+          </w:tcPr>
+          <w:p>
+            <w:r>
+              <w:t>Resultado obtenido: Ejecutado con éxito. Pruebas unitarias de la app Android pasadas al 100% en JUnit.</w:t>
+            </w:r>
+          </w:p>
+        </w:tc>
+      </w:tr>
+      <w:tr>
+        <w:tc>
+          <w:tcPr>
+            <w:tcW w:type="dxa" w:w="3021"/>
+          </w:tcPr>
+          <w:p>
+            <w:r>
+              <w:t>Prueba unitaria de mapeo de error HTTP 404 (ErrorMapper)</w:t>
+            </w:r>
+          </w:p>
+        </w:tc>
+        <w:tc>
+          <w:tcPr>
+            <w:tcW w:type="dxa" w:w="3021"/>
+          </w:tcPr>
+          <w:p>
+            <w:r>
+              <w:t>CP-46</w:t>
+            </w:r>
+          </w:p>
+        </w:tc>
+        <w:tc>
+          <w:tcPr>
+            <w:tcW w:type="dxa" w:w="3019"/>
+          </w:tcPr>
+          <w:p>
+            <w:r>
+              <w:t>CP-46</w:t>
+            </w:r>
+          </w:p>
+        </w:tc>
+      </w:tr>
+      <w:tr>
+        <w:tc>
+          <w:tcPr>
+            <w:tcW w:type="dxa" w:w="3021"/>
+          </w:tcPr>
+          <w:p>
+            <w:r>
+              <w:t>Prueba unitaria de mapeo de error HTTP 404 (ErrorMapper)</w:t>
+            </w:r>
+          </w:p>
+        </w:tc>
+        <w:tc>
+          <w:tcPr>
+            <w:tcW w:type="dxa" w:w="3021"/>
+          </w:tcPr>
+          <w:p>
+            <w:r>
+              <w:t>¿Prueba de despliegue?</w:t>
+            </w:r>
+          </w:p>
+        </w:tc>
+        <w:tc>
+          <w:tcPr>
+            <w:tcW w:type="dxa" w:w="3019"/>
+          </w:tcPr>
+          <w:p>
+            <w:r>
+              <w:t>No</w:t>
+            </w:r>
+          </w:p>
+        </w:tc>
+      </w:tr>
+      <w:tr>
+        <w:tc>
+          <w:tcPr>
+            <w:tcW w:type="dxa" w:w="3021"/>
+          </w:tcPr>
+          <w:p>
+            <w:r>
+              <w:t>Descripción: Validar que los errores de recurso no encontrado HTTP 404 se mapeen a ApiError.NotFound.</w:t>
+            </w:r>
+          </w:p>
+        </w:tc>
+        <w:tc>
+          <w:tcPr>
+            <w:tcW w:type="dxa" w:w="3021"/>
+          </w:tcPr>
+          <w:p>
+            <w:r>
+              <w:t>Descripción: Validar que los errores de recurso no encontrado HTTP 404 se mapeen a ApiError.NotFound.</w:t>
+            </w:r>
+          </w:p>
+        </w:tc>
+        <w:tc>
+          <w:tcPr>
+            <w:tcW w:type="dxa" w:w="3019"/>
+          </w:tcPr>
+          <w:p>
+            <w:r>
+              <w:t>Descripción: Validar que los errores de recurso no encontrado HTTP 404 se mapeen a ApiError.NotFound.</w:t>
+            </w:r>
+          </w:p>
+        </w:tc>
+      </w:tr>
+      <w:tr>
+        <w:tc>
+          <w:tcPr>
+            <w:tcW w:type="dxa" w:w="3021"/>
+          </w:tcPr>
+          <w:p>
+            <w:r>
+              <w:t>Prerrequisitos: Clase de utilidad ErrorMapper disponible.</w:t>
+            </w:r>
+          </w:p>
+        </w:tc>
+        <w:tc>
+          <w:tcPr>
+            <w:tcW w:type="dxa" w:w="3021"/>
+          </w:tcPr>
+          <w:p>
+            <w:r>
+              <w:t>Prerrequisitos: Clase de utilidad ErrorMapper disponible.</w:t>
+            </w:r>
+          </w:p>
+        </w:tc>
+        <w:tc>
+          <w:tcPr>
+            <w:tcW w:type="dxa" w:w="3019"/>
+          </w:tcPr>
+          <w:p>
+            <w:r>
+              <w:t>Prerrequisitos: Clase de utilidad ErrorMapper disponible.</w:t>
+            </w:r>
+          </w:p>
+        </w:tc>
+      </w:tr>
+      <w:tr>
+        <w:tc>
+          <w:tcPr>
+            <w:tcW w:type="dxa" w:w="3021"/>
+          </w:tcPr>
+          <w:p>
+            <w:r>
+              <w:t>Pasos: 1. Mockear una excepción HttpException de Retrofit con código 404. 2. Invocar ErrorMapper.map.</w:t>
+            </w:r>
+          </w:p>
+        </w:tc>
+        <w:tc>
+          <w:tcPr>
+            <w:tcW w:type="dxa" w:w="3021"/>
+          </w:tcPr>
+          <w:p>
+            <w:r>
+              <w:t>Pasos: 1. Mockear una excepción HttpException de Retrofit con código 404. 2. Invocar ErrorMapper.map.</w:t>
+            </w:r>
+          </w:p>
+        </w:tc>
+        <w:tc>
+          <w:tcPr>
+            <w:tcW w:type="dxa" w:w="3019"/>
+          </w:tcPr>
+          <w:p>
+            <w:r>
+              <w:t>Pasos: 1. Mockear una excepción HttpException de Retrofit con código 404. 2. Invocar ErrorMapper.map.</w:t>
+            </w:r>
+          </w:p>
+        </w:tc>
+      </w:tr>
+      <w:tr>
+        <w:tc>
+          <w:tcPr>
+            <w:tcW w:type="dxa" w:w="3021"/>
+          </w:tcPr>
+          <w:p>
+            <w:r>
+              <w:t>Resultado esperado: Retorna ApiError.NotFound con el mensaje de recurso no encontrado.</w:t>
+            </w:r>
+          </w:p>
+        </w:tc>
+        <w:tc>
+          <w:tcPr>
+            <w:tcW w:type="dxa" w:w="3021"/>
+          </w:tcPr>
+          <w:p>
+            <w:r>
+              <w:t>Resultado esperado: Retorna ApiError.NotFound con el mensaje de recurso no encontrado.</w:t>
+            </w:r>
+          </w:p>
+        </w:tc>
+        <w:tc>
+          <w:tcPr>
+            <w:tcW w:type="dxa" w:w="3019"/>
+          </w:tcPr>
+          <w:p>
+            <w:r>
+              <w:t>Resultado esperado: Retorna ApiError.NotFound con el mensaje de recurso no encontrado.</w:t>
+            </w:r>
+          </w:p>
+        </w:tc>
+      </w:tr>
+      <w:tr>
+        <w:tc>
+          <w:tcPr>
+            <w:tcW w:type="dxa" w:w="3021"/>
+          </w:tcPr>
+          <w:p>
+            <w:r>
+              <w:t>Resultado obtenido: Ejecutado con éxito. Pruebas unitarias de la app Android pasadas al 100% en JUnit.</w:t>
+            </w:r>
+          </w:p>
+        </w:tc>
+        <w:tc>
+          <w:tcPr>
+            <w:tcW w:type="dxa" w:w="3021"/>
+          </w:tcPr>
+          <w:p>
+            <w:r>
+              <w:t>Resultado obtenido: Ejecutado con éxito. Pruebas unitarias de la app Android pasadas al 100% en JUnit.</w:t>
+            </w:r>
+          </w:p>
+        </w:tc>
+        <w:tc>
+          <w:tcPr>
+            <w:tcW w:type="dxa" w:w="3019"/>
+          </w:tcPr>
+          <w:p>
+            <w:r>
+              <w:t>Resultado obtenido: Ejecutado con éxito. Pruebas unitarias de la app Android pasadas al 100% en JUnit.</w:t>
+            </w:r>
+          </w:p>
+        </w:tc>
+      </w:tr>
+      <w:tr>
+        <w:tc>
+          <w:tcPr>
+            <w:tcW w:type="dxa" w:w="3021"/>
+          </w:tcPr>
+          <w:p>
+            <w:r>
+              <w:t>Prueba unitaria de carga de detalles de oferta (OfferDetailViewModel)</w:t>
+            </w:r>
+          </w:p>
+        </w:tc>
+        <w:tc>
+          <w:tcPr>
+            <w:tcW w:type="dxa" w:w="3021"/>
+          </w:tcPr>
+          <w:p>
+            <w:r>
+              <w:t>CP-47</w:t>
+            </w:r>
+          </w:p>
+        </w:tc>
+        <w:tc>
+          <w:tcPr>
+            <w:tcW w:type="dxa" w:w="3019"/>
+          </w:tcPr>
+          <w:p>
+            <w:r>
+              <w:t>CP-47</w:t>
+            </w:r>
+          </w:p>
+        </w:tc>
+      </w:tr>
+      <w:tr>
+        <w:tc>
+          <w:tcPr>
+            <w:tcW w:type="dxa" w:w="3021"/>
+          </w:tcPr>
+          <w:p>
+            <w:r>
+              <w:t>Prueba unitaria de carga de detalles de oferta (OfferDetailViewModel)</w:t>
+            </w:r>
+          </w:p>
+        </w:tc>
+        <w:tc>
+          <w:tcPr>
+            <w:tcW w:type="dxa" w:w="3021"/>
+          </w:tcPr>
+          <w:p>
+            <w:r>
+              <w:t>¿Prueba de despliegue?</w:t>
+            </w:r>
+          </w:p>
+        </w:tc>
+        <w:tc>
+          <w:tcPr>
+            <w:tcW w:type="dxa" w:w="3019"/>
+          </w:tcPr>
+          <w:p>
+            <w:r>
+              <w:t>No</w:t>
+            </w:r>
+          </w:p>
+        </w:tc>
+      </w:tr>
+      <w:tr>
+        <w:tc>
+          <w:tcPr>
+            <w:tcW w:type="dxa" w:w="3021"/>
+          </w:tcPr>
+          <w:p>
+            <w:r>
+              <w:t>Descripción: Verificar la correcta inicialización y carga de detalles de una oferta laboral específica al entrar desde el feed.</w:t>
+            </w:r>
+          </w:p>
+        </w:tc>
+        <w:tc>
+          <w:tcPr>
+            <w:tcW w:type="dxa" w:w="3021"/>
+          </w:tcPr>
+          <w:p>
+            <w:r>
+              <w:t>Descripción: Verificar la correcta inicialización y carga de detalles de una oferta laboral específica al entrar desde el feed.</w:t>
+            </w:r>
+          </w:p>
+        </w:tc>
+        <w:tc>
+          <w:tcPr>
+            <w:tcW w:type="dxa" w:w="3019"/>
+          </w:tcPr>
+          <w:p>
+            <w:r>
+              <w:t>Descripción: Verificar la correcta inicialización y carga de detalles de una oferta laboral específica al entrar desde el feed.</w:t>
+            </w:r>
+          </w:p>
+        </w:tc>
+      </w:tr>
+      <w:tr>
+        <w:tc>
+          <w:tcPr>
+            <w:tcW w:type="dxa" w:w="3021"/>
+          </w:tcPr>
+          <w:p>
+            <w:r>
+              <w:t>Prerrequisitos: OfferDetailViewModel instanciado con ID 101.</w:t>
+            </w:r>
+          </w:p>
+        </w:tc>
+        <w:tc>
+          <w:tcPr>
+            <w:tcW w:type="dxa" w:w="3021"/>
+          </w:tcPr>
+          <w:p>
+            <w:r>
+              <w:t>Prerrequisitos: OfferDetailViewModel instanciado con ID 101.</w:t>
+            </w:r>
+          </w:p>
+        </w:tc>
+        <w:tc>
+          <w:tcPr>
+            <w:tcW w:type="dxa" w:w="3019"/>
+          </w:tcPr>
+          <w:p>
+            <w:r>
+              <w:t>Prerrequisitos: OfferDetailViewModel instanciado con ID 101.</w:t>
+            </w:r>
+          </w:p>
+        </w:tc>
+      </w:tr>
+      <w:tr>
+        <w:tc>
+          <w:tcPr>
+            <w:tcW w:type="dxa" w:w="3021"/>
+          </w:tcPr>
+          <w:p>
+            <w:r>
+              <w:t>Pasos: 1. Mockear observeMyApplications y getOffer(101) con éxito. 2. Observar el estado expuesto por el ViewModel.</w:t>
+            </w:r>
+          </w:p>
+        </w:tc>
+        <w:tc>
+          <w:tcPr>
+            <w:tcW w:type="dxa" w:w="3021"/>
+          </w:tcPr>
+          <w:p>
+            <w:r>
+              <w:t>Pasos: 1. Mockear observeMyApplications y getOffer(101) con éxito. 2. Observar el estado expuesto por el ViewModel.</w:t>
+            </w:r>
+          </w:p>
+        </w:tc>
+        <w:tc>
+          <w:tcPr>
+            <w:tcW w:type="dxa" w:w="3019"/>
+          </w:tcPr>
+          <w:p>
+            <w:r>
+              <w:t>Pasos: 1. Mockear observeMyApplications y getOffer(101) con éxito. 2. Observar el estado expuesto por el ViewModel.</w:t>
+            </w:r>
+          </w:p>
+        </w:tc>
+      </w:tr>
+      <w:tr>
+        <w:tc>
+          <w:tcPr>
+            <w:tcW w:type="dxa" w:w="3021"/>
+          </w:tcPr>
+          <w:p>
+            <w:r>
+              <w:t>Resultado esperado: El estado contiene los datos de la oferta cargada, isLoading queda en false y no hay errores.</w:t>
+            </w:r>
+          </w:p>
+        </w:tc>
+        <w:tc>
+          <w:tcPr>
+            <w:tcW w:type="dxa" w:w="3021"/>
+          </w:tcPr>
+          <w:p>
+            <w:r>
+              <w:t>Resultado esperado: El estado contiene los datos de la oferta cargada, isLoading queda en false y no hay errores.</w:t>
+            </w:r>
+          </w:p>
+        </w:tc>
+        <w:tc>
+          <w:tcPr>
+            <w:tcW w:type="dxa" w:w="3019"/>
+          </w:tcPr>
+          <w:p>
+            <w:r>
+              <w:t>Resultado esperado: El estado contiene los datos de la oferta cargada, isLoading queda en false y no hay errores.</w:t>
+            </w:r>
+          </w:p>
+        </w:tc>
+      </w:tr>
+      <w:tr>
+        <w:tc>
+          <w:tcPr>
+            <w:tcW w:type="dxa" w:w="3021"/>
+          </w:tcPr>
+          <w:p>
+            <w:r>
+              <w:t>Resultado obtenido: Ejecutado con éxito. Pruebas unitarias de la app Android pasadas al 100% en JUnit.</w:t>
+            </w:r>
+          </w:p>
+        </w:tc>
+        <w:tc>
+          <w:tcPr>
+            <w:tcW w:type="dxa" w:w="3021"/>
+          </w:tcPr>
+          <w:p>
+            <w:r>
+              <w:t>Resultado obtenido: Ejecutado con éxito. Pruebas unitarias de la app Android pasadas al 100% en JUnit.</w:t>
+            </w:r>
+          </w:p>
+        </w:tc>
+        <w:tc>
+          <w:tcPr>
+            <w:tcW w:type="dxa" w:w="3019"/>
+          </w:tcPr>
+          <w:p>
+            <w:r>
+              <w:t>Resultado obtenido: Ejecutado con éxito. Pruebas unitarias de la app Android pasadas al 100% en JUnit.</w:t>
+            </w:r>
+          </w:p>
+        </w:tc>
+      </w:tr>
+      <w:tr>
+        <w:tc>
+          <w:tcPr>
+            <w:tcW w:type="dxa" w:w="3021"/>
+          </w:tcPr>
+          <w:p>
+            <w:r>
+              <w:t>Prueba unitaria de fallo al cargar la oferta</w:t>
+            </w:r>
+          </w:p>
+        </w:tc>
+        <w:tc>
+          <w:tcPr>
+            <w:tcW w:type="dxa" w:w="3021"/>
+          </w:tcPr>
+          <w:p>
+            <w:r>
+              <w:t>CP-48</w:t>
+            </w:r>
+          </w:p>
+        </w:tc>
+        <w:tc>
+          <w:tcPr>
+            <w:tcW w:type="dxa" w:w="3019"/>
+          </w:tcPr>
+          <w:p>
+            <w:r>
+              <w:t>CP-48</w:t>
+            </w:r>
+          </w:p>
+        </w:tc>
+      </w:tr>
+      <w:tr>
+        <w:tc>
+          <w:tcPr>
+            <w:tcW w:type="dxa" w:w="3021"/>
+          </w:tcPr>
+          <w:p>
+            <w:r>
+              <w:t>Prueba unitaria de fallo al cargar la oferta</w:t>
+            </w:r>
+          </w:p>
+        </w:tc>
+        <w:tc>
+          <w:tcPr>
+            <w:tcW w:type="dxa" w:w="3021"/>
+          </w:tcPr>
+          <w:p>
+            <w:r>
+              <w:t>¿Prueba de despliegue?</w:t>
+            </w:r>
+          </w:p>
+        </w:tc>
+        <w:tc>
+          <w:tcPr>
+            <w:tcW w:type="dxa" w:w="3019"/>
+          </w:tcPr>
+          <w:p>
+            <w:r>
+              <w:t>No</w:t>
+            </w:r>
+          </w:p>
+        </w:tc>
+      </w:tr>
+      <w:tr>
+        <w:tc>
+          <w:tcPr>
+            <w:tcW w:type="dxa" w:w="3021"/>
+          </w:tcPr>
+          <w:p>
+            <w:r>
+              <w:t>Descripción: Validar la correcta actualización del mensaje de error en la UI cuando falla la obtención del detalle.</w:t>
+            </w:r>
+          </w:p>
+        </w:tc>
+        <w:tc>
+          <w:tcPr>
+            <w:tcW w:type="dxa" w:w="3021"/>
+          </w:tcPr>
+          <w:p>
+            <w:r>
+              <w:t>Descripción: Validar la correcta actualización del mensaje de error en la UI cuando falla la obtención del detalle.</w:t>
+            </w:r>
+          </w:p>
+        </w:tc>
+        <w:tc>
+          <w:tcPr>
+            <w:tcW w:type="dxa" w:w="3019"/>
+          </w:tcPr>
+          <w:p>
+            <w:r>
+              <w:t>Descripción: Validar la correcta actualización del mensaje de error en la UI cuando falla la obtención del detalle.</w:t>
+            </w:r>
+          </w:p>
+        </w:tc>
+      </w:tr>
+      <w:tr>
+        <w:tc>
+          <w:tcPr>
+            <w:tcW w:type="dxa" w:w="3021"/>
+          </w:tcPr>
+          <w:p>
+            <w:r>
+              <w:t>Prerrequisitos: OfferDetailViewModel instanciado con ID 102.</w:t>
+            </w:r>
+          </w:p>
+        </w:tc>
+        <w:tc>
+          <w:tcPr>
+            <w:tcW w:type="dxa" w:w="3021"/>
+          </w:tcPr>
+          <w:p>
+            <w:r>
+              <w:t>Prerrequisitos: OfferDetailViewModel instanciado con ID 102.</w:t>
+            </w:r>
+          </w:p>
+        </w:tc>
+        <w:tc>
+          <w:tcPr>
+            <w:tcW w:type="dxa" w:w="3019"/>
+          </w:tcPr>
+          <w:p>
+            <w:r>
+              <w:t>Prerrequisitos: OfferDetailViewModel instanciado con ID 102.</w:t>
+            </w:r>
+          </w:p>
+        </w:tc>
+      </w:tr>
+      <w:tr>
+        <w:tc>
+          <w:tcPr>
+            <w:tcW w:type="dxa" w:w="3021"/>
+          </w:tcPr>
+          <w:p>
+            <w:r>
+              <w:t>Pasos: 1. Configurar jobsRepository.getOffer(102) para retornar Result.failure. 2. Observar el estado del ViewModel.</w:t>
+            </w:r>
+          </w:p>
+        </w:tc>
+        <w:tc>
+          <w:tcPr>
+            <w:tcW w:type="dxa" w:w="3021"/>
+          </w:tcPr>
+          <w:p>
+            <w:r>
+              <w:t>Pasos: 1. Configurar jobsRepository.getOffer(102) para retornar Result.failure. 2. Observar el estado del ViewModel.</w:t>
+            </w:r>
+          </w:p>
+        </w:tc>
+        <w:tc>
+          <w:tcPr>
+            <w:tcW w:type="dxa" w:w="3019"/>
+          </w:tcPr>
+          <w:p>
+            <w:r>
+              <w:t>Pasos: 1. Configurar jobsRepository.getOffer(102) para retornar Result.failure. 2. Observar el estado del ViewModel.</w:t>
+            </w:r>
+          </w:p>
+        </w:tc>
+      </w:tr>
+      <w:tr>
+        <w:tc>
+          <w:tcPr>
+            <w:tcW w:type="dxa" w:w="3021"/>
+          </w:tcPr>
+          <w:p>
+            <w:r>
+              <w:t>Resultado esperado: isLoading es false y errorMessage contiene la traducción del error de red.</w:t>
+            </w:r>
+          </w:p>
+        </w:tc>
+        <w:tc>
+          <w:tcPr>
+            <w:tcW w:type="dxa" w:w="3021"/>
+          </w:tcPr>
+          <w:p>
+            <w:r>
+              <w:t>Resultado esperado: isLoading es false y errorMessage contiene la traducción del error de red.</w:t>
+            </w:r>
+          </w:p>
+        </w:tc>
+        <w:tc>
+          <w:tcPr>
+            <w:tcW w:type="dxa" w:w="3019"/>
+          </w:tcPr>
+          <w:p>
+            <w:r>
+              <w:t>Resultado esperado: isLoading es false y errorMessage contiene la traducción del error de red.</w:t>
+            </w:r>
+          </w:p>
+        </w:tc>
+      </w:tr>
+      <w:tr>
+        <w:tc>
+          <w:tcPr>
+            <w:tcW w:type="dxa" w:w="3021"/>
+          </w:tcPr>
+          <w:p>
+            <w:r>
+              <w:t>Resultado obtenido: Ejecutado con éxito. Pruebas unitarias de la app Android pasadas al 100% en JUnit.</w:t>
+            </w:r>
+          </w:p>
+        </w:tc>
+        <w:tc>
+          <w:tcPr>
+            <w:tcW w:type="dxa" w:w="3021"/>
+          </w:tcPr>
+          <w:p>
+            <w:r>
+              <w:t>Resultado obtenido: Ejecutado con éxito. Pruebas unitarias de la app Android pasadas al 100% en JUnit.</w:t>
+            </w:r>
+          </w:p>
+        </w:tc>
+        <w:tc>
+          <w:tcPr>
+            <w:tcW w:type="dxa" w:w="3019"/>
+          </w:tcPr>
+          <w:p>
+            <w:r>
+              <w:t>Resultado obtenido: Ejecutado con éxito. Pruebas unitarias de la app Android pasadas al 100% en JUnit.</w:t>
+            </w:r>
+          </w:p>
+        </w:tc>
+      </w:tr>
+      <w:tr>
+        <w:tc>
+          <w:tcPr>
+            <w:tcW w:type="dxa" w:w="3021"/>
+          </w:tcPr>
+          <w:p>
+            <w:r>
+              <w:t>Prueba unitaria de postulación exitosa a oferta</w:t>
+            </w:r>
+          </w:p>
+        </w:tc>
+        <w:tc>
+          <w:tcPr>
+            <w:tcW w:type="dxa" w:w="3021"/>
+          </w:tcPr>
+          <w:p>
+            <w:r>
+              <w:t>CP-49</w:t>
+            </w:r>
+          </w:p>
+        </w:tc>
+        <w:tc>
+          <w:tcPr>
+            <w:tcW w:type="dxa" w:w="3019"/>
+          </w:tcPr>
+          <w:p>
+            <w:r>
+              <w:t>CP-49</w:t>
+            </w:r>
+          </w:p>
+        </w:tc>
+      </w:tr>
+      <w:tr>
+        <w:tc>
+          <w:tcPr>
+            <w:tcW w:type="dxa" w:w="3021"/>
+          </w:tcPr>
+          <w:p>
+            <w:r>
+              <w:t>Prueba unitaria de postulación exitosa a oferta</w:t>
+            </w:r>
+          </w:p>
+        </w:tc>
+        <w:tc>
+          <w:tcPr>
+            <w:tcW w:type="dxa" w:w="3021"/>
+          </w:tcPr>
+          <w:p>
+            <w:r>
+              <w:t>¿Prueba de despliegue?</w:t>
+            </w:r>
+          </w:p>
+        </w:tc>
+        <w:tc>
+          <w:tcPr>
+            <w:tcW w:type="dxa" w:w="3019"/>
+          </w:tcPr>
+          <w:p>
+            <w:r>
+              <w:t>No</w:t>
+            </w:r>
+          </w:p>
+        </w:tc>
+      </w:tr>
+      <w:tr>
+        <w:tc>
+          <w:tcPr>
+            <w:tcW w:type="dxa" w:w="3021"/>
+          </w:tcPr>
+          <w:p>
+            <w:r>
+              <w:t>Descripción: Validar que el flujo de postulación invoque correctamente al repositorio de postulaciones.</w:t>
+            </w:r>
+          </w:p>
+        </w:tc>
+        <w:tc>
+          <w:tcPr>
+            <w:tcW w:type="dxa" w:w="3021"/>
+          </w:tcPr>
+          <w:p>
+            <w:r>
+              <w:t>Descripción: Validar que el flujo de postulación invoque correctamente al repositorio de postulaciones.</w:t>
+            </w:r>
+          </w:p>
+        </w:tc>
+        <w:tc>
+          <w:tcPr>
+            <w:tcW w:type="dxa" w:w="3019"/>
+          </w:tcPr>
+          <w:p>
+            <w:r>
+              <w:t>Descripción: Validar que el flujo de postulación invoque correctamente al repositorio de postulaciones.</w:t>
+            </w:r>
+          </w:p>
+        </w:tc>
+      </w:tr>
+      <w:tr>
+        <w:tc>
+          <w:tcPr>
+            <w:tcW w:type="dxa" w:w="3021"/>
+          </w:tcPr>
+          <w:p>
+            <w:r>
+              <w:t>Prerrequisitos: Formulario de postulación inicializado de forma exitosa.</w:t>
+            </w:r>
+          </w:p>
+        </w:tc>
+        <w:tc>
+          <w:tcPr>
+            <w:tcW w:type="dxa" w:w="3021"/>
+          </w:tcPr>
+          <w:p>
+            <w:r>
+              <w:t>Prerrequisitos: Formulario de postulación inicializado de forma exitosa.</w:t>
+            </w:r>
+          </w:p>
+        </w:tc>
+        <w:tc>
+          <w:tcPr>
+            <w:tcW w:type="dxa" w:w="3019"/>
+          </w:tcPr>
+          <w:p>
+            <w:r>
+              <w:t>Prerrequisitos: Formulario de postulación inicializado de forma exitosa.</w:t>
+            </w:r>
+          </w:p>
+        </w:tc>
+      </w:tr>
+      <w:tr>
+        <w:tc>
+          <w:tcPr>
+            <w:tcW w:type="dxa" w:w="3021"/>
+          </w:tcPr>
+          <w:p>
+            <w:r>
+              <w:t>Pasos: 1. Invocar submitApplication pasando un mensaje. 2. Verificar llamada a applicationsRepository.apply().</w:t>
+            </w:r>
+          </w:p>
+        </w:tc>
+        <w:tc>
+          <w:tcPr>
+            <w:tcW w:type="dxa" w:w="3021"/>
+          </w:tcPr>
+          <w:p>
+            <w:r>
+              <w:t>Pasos: 1. Invocar submitApplication pasando un mensaje. 2. Verificar llamada a applicationsRepository.apply().</w:t>
+            </w:r>
+          </w:p>
+        </w:tc>
+        <w:tc>
+          <w:tcPr>
+            <w:tcW w:type="dxa" w:w="3019"/>
+          </w:tcPr>
+          <w:p>
+            <w:r>
+              <w:t>Pasos: 1. Invocar submitApplication pasando un mensaje. 2. Verificar llamada a applicationsRepository.apply().</w:t>
+            </w:r>
+          </w:p>
+        </w:tc>
+      </w:tr>
+      <w:tr>
+        <w:tc>
+          <w:tcPr>
+            <w:tcW w:type="dxa" w:w="3021"/>
+          </w:tcPr>
+          <w:p>
+            <w:r>
+              <w:t>Resultado esperado: Se realiza la postulación, isApplying queda en false y no se presentan errores.</w:t>
+            </w:r>
+          </w:p>
+        </w:tc>
+        <w:tc>
+          <w:tcPr>
+            <w:tcW w:type="dxa" w:w="3021"/>
+          </w:tcPr>
+          <w:p>
+            <w:r>
+              <w:t>Resultado esperado: Se realiza la postulación, isApplying queda en false y no se presentan errores.</w:t>
+            </w:r>
+          </w:p>
+        </w:tc>
+        <w:tc>
+          <w:tcPr>
+            <w:tcW w:type="dxa" w:w="3019"/>
+          </w:tcPr>
+          <w:p>
+            <w:r>
+              <w:t>Resultado esperado: Se realiza la postulación, isApplying queda en false y no se presentan errores.</w:t>
+            </w:r>
+          </w:p>
+        </w:tc>
+      </w:tr>
+      <w:tr>
+        <w:tc>
+          <w:tcPr>
+            <w:tcW w:type="dxa" w:w="3021"/>
+          </w:tcPr>
+          <w:p>
+            <w:r>
+              <w:t>Resultado obtenido: Ejecutado con éxito. Pruebas unitarias de la app Android pasadas al 100% en JUnit.</w:t>
+            </w:r>
+          </w:p>
+        </w:tc>
+        <w:tc>
+          <w:tcPr>
+            <w:tcW w:type="dxa" w:w="3021"/>
+          </w:tcPr>
+          <w:p>
+            <w:r>
+              <w:t>Resultado obtenido: Ejecutado con éxito. Pruebas unitarias de la app Android pasadas al 100% en JUnit.</w:t>
+            </w:r>
+          </w:p>
+        </w:tc>
+        <w:tc>
+          <w:tcPr>
+            <w:tcW w:type="dxa" w:w="3019"/>
+          </w:tcPr>
+          <w:p>
+            <w:r>
+              <w:t>Resultado obtenido: Ejecutado con éxito. Pruebas unitarias de la app Android pasadas al 100% en JUnit.</w:t>
+            </w:r>
+          </w:p>
+        </w:tc>
+      </w:tr>
+      <w:tr>
+        <w:tc>
+          <w:tcPr>
+            <w:tcW w:type="dxa" w:w="3021"/>
+          </w:tcPr>
+          <w:p>
+            <w:r>
+              <w:t>Prueba unitaria de postulación fallida por error del servidor</w:t>
+            </w:r>
+          </w:p>
+        </w:tc>
+        <w:tc>
+          <w:tcPr>
+            <w:tcW w:type="dxa" w:w="3021"/>
+          </w:tcPr>
+          <w:p>
+            <w:r>
+              <w:t>CP-50</w:t>
+            </w:r>
+          </w:p>
+        </w:tc>
+        <w:tc>
+          <w:tcPr>
+            <w:tcW w:type="dxa" w:w="3019"/>
+          </w:tcPr>
+          <w:p>
+            <w:r>
+              <w:t>CP-50</w:t>
+            </w:r>
+          </w:p>
+        </w:tc>
+      </w:tr>
+      <w:tr>
+        <w:tc>
+          <w:tcPr>
+            <w:tcW w:type="dxa" w:w="3021"/>
+          </w:tcPr>
+          <w:p>
+            <w:r>
+              <w:t>Prueba unitaria de postulación fallida por error del servidor</w:t>
+            </w:r>
+          </w:p>
+        </w:tc>
+        <w:tc>
+          <w:tcPr>
+            <w:tcW w:type="dxa" w:w="3021"/>
+          </w:tcPr>
+          <w:p>
+            <w:r>
+              <w:t>¿Prueba de despliegue?</w:t>
+            </w:r>
+          </w:p>
+        </w:tc>
+        <w:tc>
+          <w:tcPr>
+            <w:tcW w:type="dxa" w:w="3019"/>
+          </w:tcPr>
+          <w:p>
+            <w:r>
+              <w:t>No</w:t>
+            </w:r>
+          </w:p>
+        </w:tc>
+      </w:tr>
+      <w:tr>
+        <w:tc>
+          <w:tcPr>
+            <w:tcW w:type="dxa" w:w="3021"/>
+          </w:tcPr>
+          <w:p>
+            <w:r>
+              <w:t>Descripción: Validar la gestión de errores y actualización del estado de fallo al postular.</w:t>
+            </w:r>
+          </w:p>
+        </w:tc>
+        <w:tc>
+          <w:tcPr>
+            <w:tcW w:type="dxa" w:w="3021"/>
+          </w:tcPr>
+          <w:p>
+            <w:r>
+              <w:t>Descripción: Validar la gestión de errores y actualización del estado de fallo al postular.</w:t>
+            </w:r>
+          </w:p>
+        </w:tc>
+        <w:tc>
+          <w:tcPr>
+            <w:tcW w:type="dxa" w:w="3019"/>
+          </w:tcPr>
+          <w:p>
+            <w:r>
+              <w:t>Descripción: Validar la gestión de errores y actualización del estado de fallo al postular.</w:t>
+            </w:r>
+          </w:p>
+        </w:tc>
+      </w:tr>
+      <w:tr>
+        <w:tc>
+          <w:tcPr>
+            <w:tcW w:type="dxa" w:w="3021"/>
+          </w:tcPr>
+          <w:p>
+            <w:r>
+              <w:t>Prerrequisitos: Formulario de postulación inicializado.</w:t>
+            </w:r>
+          </w:p>
+        </w:tc>
+        <w:tc>
+          <w:tcPr>
+            <w:tcW w:type="dxa" w:w="3021"/>
+          </w:tcPr>
+          <w:p>
+            <w:r>
+              <w:t>Prerrequisitos: Formulario de postulación inicializado.</w:t>
+            </w:r>
+          </w:p>
+        </w:tc>
+        <w:tc>
+          <w:tcPr>
+            <w:tcW w:type="dxa" w:w="3019"/>
+          </w:tcPr>
+          <w:p>
+            <w:r>
+              <w:t>Prerrequisitos: Formulario de postulación inicializado.</w:t>
+            </w:r>
+          </w:p>
+        </w:tc>
+      </w:tr>
+      <w:tr>
+        <w:tc>
+          <w:tcPr>
+            <w:tcW w:type="dxa" w:w="3021"/>
+          </w:tcPr>
+          <w:p>
+            <w:r>
+              <w:t>Pasos: 1. Configurar applicationsRepository.apply para lanzar excepción. 2. Invocar submitApplication.</w:t>
+            </w:r>
+          </w:p>
+        </w:tc>
+        <w:tc>
+          <w:tcPr>
+            <w:tcW w:type="dxa" w:w="3021"/>
+          </w:tcPr>
+          <w:p>
+            <w:r>
+              <w:t>Pasos: 1. Configurar applicationsRepository.apply para lanzar excepción. 2. Invocar submitApplication.</w:t>
+            </w:r>
+          </w:p>
+        </w:tc>
+        <w:tc>
+          <w:tcPr>
+            <w:tcW w:type="dxa" w:w="3019"/>
+          </w:tcPr>
+          <w:p>
+            <w:r>
+              <w:t>Pasos: 1. Configurar applicationsRepository.apply para lanzar excepción. 2. Invocar submitApplication.</w:t>
+            </w:r>
+          </w:p>
+        </w:tc>
+      </w:tr>
+      <w:tr>
+        <w:tc>
+          <w:tcPr>
+            <w:tcW w:type="dxa" w:w="3021"/>
+          </w:tcPr>
+          <w:p>
+            <w:r>
+              <w:t>Resultado esperado: isApplying queda en false y applyError se actualiza con el mensaje del error de conexión.</w:t>
+            </w:r>
+          </w:p>
+        </w:tc>
+        <w:tc>
+          <w:tcPr>
+            <w:tcW w:type="dxa" w:w="3021"/>
+          </w:tcPr>
+          <w:p>
+            <w:r>
+              <w:t>Resultado esperado: isApplying queda en false y applyError se actualiza con el mensaje del error de conexión.</w:t>
+            </w:r>
+          </w:p>
+        </w:tc>
+        <w:tc>
+          <w:tcPr>
+            <w:tcW w:type="dxa" w:w="3019"/>
+          </w:tcPr>
+          <w:p>
+            <w:r>
+              <w:t>Resultado esperado: isApplying queda en false y applyError se actualiza con el mensaje del error de conexión.</w:t>
+            </w:r>
+          </w:p>
+        </w:tc>
+      </w:tr>
+      <w:tr>
+        <w:tc>
+          <w:tcPr>
+            <w:tcW w:type="dxa" w:w="3021"/>
+          </w:tcPr>
+          <w:p>
+            <w:r>
+              <w:t>Resultado obtenido: Ejecutado con éxito. Pruebas unitarias de la app Android pasadas al 100% en JUnit.</w:t>
+            </w:r>
+          </w:p>
+        </w:tc>
+        <w:tc>
+          <w:tcPr>
+            <w:tcW w:type="dxa" w:w="3021"/>
+          </w:tcPr>
+          <w:p>
+            <w:r>
+              <w:t>Resultado obtenido: Ejecutado con éxito. Pruebas unitarias de la app Android pasadas al 100% en JUnit.</w:t>
+            </w:r>
+          </w:p>
+        </w:tc>
+        <w:tc>
+          <w:tcPr>
+            <w:tcW w:type="dxa" w:w="3019"/>
+          </w:tcPr>
+          <w:p>
+            <w:r>
+              <w:t>Resultado obtenido: Ejecutado con éxito. Pruebas unitarias de la app Android pasadas al 100% en JUnit.</w:t>
+            </w:r>
+          </w:p>
+        </w:tc>
+      </w:tr>
+      <w:tr>
+        <w:tc>
+          <w:tcPr>
+            <w:tcW w:type="dxa" w:w="3021"/>
+          </w:tcPr>
+          <w:p>
+            <w:r>
+              <w:t>Prueba unitaria de cancelación exitosa de postulación</w:t>
+            </w:r>
+          </w:p>
+        </w:tc>
+        <w:tc>
+          <w:tcPr>
+            <w:tcW w:type="dxa" w:w="3021"/>
+          </w:tcPr>
+          <w:p>
+            <w:r>
+              <w:t>CP-51</w:t>
+            </w:r>
+          </w:p>
+        </w:tc>
+        <w:tc>
+          <w:tcPr>
+            <w:tcW w:type="dxa" w:w="3019"/>
+          </w:tcPr>
+          <w:p>
+            <w:r>
+              <w:t>CP-51</w:t>
+            </w:r>
+          </w:p>
+        </w:tc>
+      </w:tr>
+      <w:tr>
+        <w:tc>
+          <w:tcPr>
+            <w:tcW w:type="dxa" w:w="3021"/>
+          </w:tcPr>
+          <w:p>
+            <w:r>
+              <w:t>Prueba unitaria de cancelación exitosa de postulación</w:t>
+            </w:r>
+          </w:p>
+        </w:tc>
+        <w:tc>
+          <w:tcPr>
+            <w:tcW w:type="dxa" w:w="3021"/>
+          </w:tcPr>
+          <w:p>
+            <w:r>
+              <w:t>¿Prueba de despliegue?</w:t>
+            </w:r>
+          </w:p>
+        </w:tc>
+        <w:tc>
+          <w:tcPr>
+            <w:tcW w:type="dxa" w:w="3019"/>
+          </w:tcPr>
+          <w:p>
+            <w:r>
+              <w:t>No</w:t>
+            </w:r>
+          </w:p>
+        </w:tc>
+      </w:tr>
+      <w:tr>
+        <w:tc>
+          <w:tcPr>
+            <w:tcW w:type="dxa" w:w="3021"/>
+          </w:tcPr>
+          <w:p>
+            <w:r>
+              <w:t>Descripción: Validar que el usuario pueda anular su postulación activa a una oferta.</w:t>
+            </w:r>
+          </w:p>
+        </w:tc>
+        <w:tc>
+          <w:tcPr>
+            <w:tcW w:type="dxa" w:w="3021"/>
+          </w:tcPr>
+          <w:p>
+            <w:r>
+              <w:t>Descripción: Validar que el usuario pueda anular su postulación activa a una oferta.</w:t>
+            </w:r>
+          </w:p>
+        </w:tc>
+        <w:tc>
+          <w:tcPr>
+            <w:tcW w:type="dxa" w:w="3019"/>
+          </w:tcPr>
+          <w:p>
+            <w:r>
+              <w:t>Descripción: Validar que el usuario pueda anular su postulación activa a una oferta.</w:t>
+            </w:r>
+          </w:p>
+        </w:tc>
+      </w:tr>
+      <w:tr>
+        <w:tc>
+          <w:tcPr>
+            <w:tcW w:type="dxa" w:w="3021"/>
+          </w:tcPr>
+          <w:p>
+            <w:r>
+              <w:t>Prerrequisitos: Postulación activa registrada con ID 999.</w:t>
+            </w:r>
+          </w:p>
+        </w:tc>
+        <w:tc>
+          <w:tcPr>
+            <w:tcW w:type="dxa" w:w="3021"/>
+          </w:tcPr>
+          <w:p>
+            <w:r>
+              <w:t>Prerrequisitos: Postulación activa registrada con ID 999.</w:t>
+            </w:r>
+          </w:p>
+        </w:tc>
+        <w:tc>
+          <w:tcPr>
+            <w:tcW w:type="dxa" w:w="3019"/>
+          </w:tcPr>
+          <w:p>
+            <w:r>
+              <w:t>Prerrequisitos: Postulación activa registrada con ID 999.</w:t>
+            </w:r>
+          </w:p>
+        </w:tc>
+      </w:tr>
+      <w:tr>
+        <w:tc>
+          <w:tcPr>
+            <w:tcW w:type="dxa" w:w="3021"/>
+          </w:tcPr>
+          <w:p>
+            <w:r>
+              <w:t>Pasos: 1. Invocar cancelPostulation con ID 999. 2. Verificar llamada a cancelApplication.</w:t>
+            </w:r>
+          </w:p>
+        </w:tc>
+        <w:tc>
+          <w:tcPr>
+            <w:tcW w:type="dxa" w:w="3021"/>
+          </w:tcPr>
+          <w:p>
+            <w:r>
+              <w:t>Pasos: 1. Invocar cancelPostulation con ID 999. 2. Verificar llamada a cancelApplication.</w:t>
+            </w:r>
+          </w:p>
+        </w:tc>
+        <w:tc>
+          <w:tcPr>
+            <w:tcW w:type="dxa" w:w="3019"/>
+          </w:tcPr>
+          <w:p>
+            <w:r>
+              <w:t>Pasos: 1. Invocar cancelPostulation con ID 999. 2. Verificar llamada a cancelApplication.</w:t>
+            </w:r>
+          </w:p>
+        </w:tc>
+      </w:tr>
+      <w:tr>
+        <w:tc>
+          <w:tcPr>
+            <w:tcW w:type="dxa" w:w="3021"/>
+          </w:tcPr>
+          <w:p>
+            <w:r>
+              <w:t>Resultado esperado: Se llama a cancelApplication, isActionLoading queda en false y no hay errores de acción.</w:t>
+            </w:r>
+          </w:p>
+        </w:tc>
+        <w:tc>
+          <w:tcPr>
+            <w:tcW w:type="dxa" w:w="3021"/>
+          </w:tcPr>
+          <w:p>
+            <w:r>
+              <w:t>Resultado esperado: Se llama a cancelApplication, isActionLoading queda en false y no hay errores de acción.</w:t>
+            </w:r>
+          </w:p>
+        </w:tc>
+        <w:tc>
+          <w:tcPr>
+            <w:tcW w:type="dxa" w:w="3019"/>
+          </w:tcPr>
+          <w:p>
+            <w:r>
+              <w:t>Resultado esperado: Se llama a cancelApplication, isActionLoading queda en false y no hay errores de acción.</w:t>
             </w:r>
           </w:p>
         </w:tc>
@@ -15325,6 +18345,386 @@
           <w:p>
             <w:r>
               <w:t>CP-41</w:t>
+            </w:r>
+          </w:p>
+        </w:tc>
+        <w:tc>
+          <w:tcPr>
+            <w:tcW w:type="dxa" w:w="2256"/>
+          </w:tcPr>
+          <w:p>
+            <w:r>
+              <w:t>X</w:t>
+            </w:r>
+          </w:p>
+        </w:tc>
+        <w:tc>
+          <w:tcPr>
+            <w:tcW w:type="dxa" w:w="2258"/>
+          </w:tcPr>
+          <w:p>
+            <w:r/>
+          </w:p>
+        </w:tc>
+        <w:tc>
+          <w:tcPr>
+            <w:tcW w:type="dxa" w:w="2296"/>
+          </w:tcPr>
+          <w:p>
+            <w:r/>
+          </w:p>
+        </w:tc>
+      </w:tr>
+      <w:tr>
+        <w:tc>
+          <w:tcPr>
+            <w:tcW w:type="dxa" w:w="2251"/>
+          </w:tcPr>
+          <w:p>
+            <w:r>
+              <w:t>CP-42</w:t>
+            </w:r>
+          </w:p>
+        </w:tc>
+        <w:tc>
+          <w:tcPr>
+            <w:tcW w:type="dxa" w:w="2256"/>
+          </w:tcPr>
+          <w:p>
+            <w:r>
+              <w:t>X</w:t>
+            </w:r>
+          </w:p>
+        </w:tc>
+        <w:tc>
+          <w:tcPr>
+            <w:tcW w:type="dxa" w:w="2258"/>
+          </w:tcPr>
+          <w:p>
+            <w:r/>
+          </w:p>
+        </w:tc>
+        <w:tc>
+          <w:tcPr>
+            <w:tcW w:type="dxa" w:w="2296"/>
+          </w:tcPr>
+          <w:p>
+            <w:r/>
+          </w:p>
+        </w:tc>
+      </w:tr>
+      <w:tr>
+        <w:tc>
+          <w:tcPr>
+            <w:tcW w:type="dxa" w:w="2251"/>
+          </w:tcPr>
+          <w:p>
+            <w:r>
+              <w:t>CP-43</w:t>
+            </w:r>
+          </w:p>
+        </w:tc>
+        <w:tc>
+          <w:tcPr>
+            <w:tcW w:type="dxa" w:w="2256"/>
+          </w:tcPr>
+          <w:p>
+            <w:r>
+              <w:t>X</w:t>
+            </w:r>
+          </w:p>
+        </w:tc>
+        <w:tc>
+          <w:tcPr>
+            <w:tcW w:type="dxa" w:w="2258"/>
+          </w:tcPr>
+          <w:p>
+            <w:r/>
+          </w:p>
+        </w:tc>
+        <w:tc>
+          <w:tcPr>
+            <w:tcW w:type="dxa" w:w="2296"/>
+          </w:tcPr>
+          <w:p>
+            <w:r/>
+          </w:p>
+        </w:tc>
+      </w:tr>
+      <w:tr>
+        <w:tc>
+          <w:tcPr>
+            <w:tcW w:type="dxa" w:w="2251"/>
+          </w:tcPr>
+          <w:p>
+            <w:r>
+              <w:t>CP-44</w:t>
+            </w:r>
+          </w:p>
+        </w:tc>
+        <w:tc>
+          <w:tcPr>
+            <w:tcW w:type="dxa" w:w="2256"/>
+          </w:tcPr>
+          <w:p>
+            <w:r>
+              <w:t>X</w:t>
+            </w:r>
+          </w:p>
+        </w:tc>
+        <w:tc>
+          <w:tcPr>
+            <w:tcW w:type="dxa" w:w="2258"/>
+          </w:tcPr>
+          <w:p>
+            <w:r/>
+          </w:p>
+        </w:tc>
+        <w:tc>
+          <w:tcPr>
+            <w:tcW w:type="dxa" w:w="2296"/>
+          </w:tcPr>
+          <w:p>
+            <w:r/>
+          </w:p>
+        </w:tc>
+      </w:tr>
+      <w:tr>
+        <w:tc>
+          <w:tcPr>
+            <w:tcW w:type="dxa" w:w="2251"/>
+          </w:tcPr>
+          <w:p>
+            <w:r>
+              <w:t>CP-45</w:t>
+            </w:r>
+          </w:p>
+        </w:tc>
+        <w:tc>
+          <w:tcPr>
+            <w:tcW w:type="dxa" w:w="2256"/>
+          </w:tcPr>
+          <w:p>
+            <w:r>
+              <w:t>X</w:t>
+            </w:r>
+          </w:p>
+        </w:tc>
+        <w:tc>
+          <w:tcPr>
+            <w:tcW w:type="dxa" w:w="2258"/>
+          </w:tcPr>
+          <w:p>
+            <w:r/>
+          </w:p>
+        </w:tc>
+        <w:tc>
+          <w:tcPr>
+            <w:tcW w:type="dxa" w:w="2296"/>
+          </w:tcPr>
+          <w:p>
+            <w:r/>
+          </w:p>
+        </w:tc>
+      </w:tr>
+      <w:tr>
+        <w:tc>
+          <w:tcPr>
+            <w:tcW w:type="dxa" w:w="2251"/>
+          </w:tcPr>
+          <w:p>
+            <w:r>
+              <w:t>CP-46</w:t>
+            </w:r>
+          </w:p>
+        </w:tc>
+        <w:tc>
+          <w:tcPr>
+            <w:tcW w:type="dxa" w:w="2256"/>
+          </w:tcPr>
+          <w:p>
+            <w:r>
+              <w:t>X</w:t>
+            </w:r>
+          </w:p>
+        </w:tc>
+        <w:tc>
+          <w:tcPr>
+            <w:tcW w:type="dxa" w:w="2258"/>
+          </w:tcPr>
+          <w:p>
+            <w:r/>
+          </w:p>
+        </w:tc>
+        <w:tc>
+          <w:tcPr>
+            <w:tcW w:type="dxa" w:w="2296"/>
+          </w:tcPr>
+          <w:p>
+            <w:r/>
+          </w:p>
+        </w:tc>
+      </w:tr>
+      <w:tr>
+        <w:tc>
+          <w:tcPr>
+            <w:tcW w:type="dxa" w:w="2251"/>
+          </w:tcPr>
+          <w:p>
+            <w:r>
+              <w:t>CP-47</w:t>
+            </w:r>
+          </w:p>
+        </w:tc>
+        <w:tc>
+          <w:tcPr>
+            <w:tcW w:type="dxa" w:w="2256"/>
+          </w:tcPr>
+          <w:p>
+            <w:r>
+              <w:t>X</w:t>
+            </w:r>
+          </w:p>
+        </w:tc>
+        <w:tc>
+          <w:tcPr>
+            <w:tcW w:type="dxa" w:w="2258"/>
+          </w:tcPr>
+          <w:p>
+            <w:r/>
+          </w:p>
+        </w:tc>
+        <w:tc>
+          <w:tcPr>
+            <w:tcW w:type="dxa" w:w="2296"/>
+          </w:tcPr>
+          <w:p>
+            <w:r/>
+          </w:p>
+        </w:tc>
+      </w:tr>
+      <w:tr>
+        <w:tc>
+          <w:tcPr>
+            <w:tcW w:type="dxa" w:w="2251"/>
+          </w:tcPr>
+          <w:p>
+            <w:r>
+              <w:t>CP-48</w:t>
+            </w:r>
+          </w:p>
+        </w:tc>
+        <w:tc>
+          <w:tcPr>
+            <w:tcW w:type="dxa" w:w="2256"/>
+          </w:tcPr>
+          <w:p>
+            <w:r>
+              <w:t>X</w:t>
+            </w:r>
+          </w:p>
+        </w:tc>
+        <w:tc>
+          <w:tcPr>
+            <w:tcW w:type="dxa" w:w="2258"/>
+          </w:tcPr>
+          <w:p>
+            <w:r/>
+          </w:p>
+        </w:tc>
+        <w:tc>
+          <w:tcPr>
+            <w:tcW w:type="dxa" w:w="2296"/>
+          </w:tcPr>
+          <w:p>
+            <w:r/>
+          </w:p>
+        </w:tc>
+      </w:tr>
+      <w:tr>
+        <w:tc>
+          <w:tcPr>
+            <w:tcW w:type="dxa" w:w="2251"/>
+          </w:tcPr>
+          <w:p>
+            <w:r>
+              <w:t>CP-49</w:t>
+            </w:r>
+          </w:p>
+        </w:tc>
+        <w:tc>
+          <w:tcPr>
+            <w:tcW w:type="dxa" w:w="2256"/>
+          </w:tcPr>
+          <w:p>
+            <w:r>
+              <w:t>X</w:t>
+            </w:r>
+          </w:p>
+        </w:tc>
+        <w:tc>
+          <w:tcPr>
+            <w:tcW w:type="dxa" w:w="2258"/>
+          </w:tcPr>
+          <w:p>
+            <w:r/>
+          </w:p>
+        </w:tc>
+        <w:tc>
+          <w:tcPr>
+            <w:tcW w:type="dxa" w:w="2296"/>
+          </w:tcPr>
+          <w:p>
+            <w:r/>
+          </w:p>
+        </w:tc>
+      </w:tr>
+      <w:tr>
+        <w:tc>
+          <w:tcPr>
+            <w:tcW w:type="dxa" w:w="2251"/>
+          </w:tcPr>
+          <w:p>
+            <w:r>
+              <w:t>CP-50</w:t>
+            </w:r>
+          </w:p>
+        </w:tc>
+        <w:tc>
+          <w:tcPr>
+            <w:tcW w:type="dxa" w:w="2256"/>
+          </w:tcPr>
+          <w:p>
+            <w:r>
+              <w:t>X</w:t>
+            </w:r>
+          </w:p>
+        </w:tc>
+        <w:tc>
+          <w:tcPr>
+            <w:tcW w:type="dxa" w:w="2258"/>
+          </w:tcPr>
+          <w:p>
+            <w:r/>
+          </w:p>
+        </w:tc>
+        <w:tc>
+          <w:tcPr>
+            <w:tcW w:type="dxa" w:w="2296"/>
+          </w:tcPr>
+          <w:p>
+            <w:r/>
+          </w:p>
+        </w:tc>
+      </w:tr>
+      <w:tr>
+        <w:tc>
+          <w:tcPr>
+            <w:tcW w:type="dxa" w:w="2251"/>
+          </w:tcPr>
+          <w:p>
+            <w:r>
+              <w:t>CP-51</w:t>
             </w:r>
           </w:p>
         </w:tc>

</xml_diff>

<commit_message>
Agregar pruebas unitarias para NotificationsViewModel (CP-52 al CP-56) y Sincronizar documentacion QA
</commit_message>
<xml_diff>
--- a/Documentacion/Unidad #3/3.1.2 Plan Pruebas Funcionales.docx
+++ b/Documentacion/Unidad #3/3.1.2 Plan Pruebas Funcionales.docx
@@ -5935,6 +5935,396 @@
           </w:p>
         </w:tc>
       </w:tr>
+      <w:tr>
+        <w:tc>
+          <w:tcPr>
+            <w:tcW w:type="dxa" w:w="1007"/>
+          </w:tcPr>
+          <w:p>
+            <w:r>
+              <w:t>CP-52</w:t>
+            </w:r>
+          </w:p>
+        </w:tc>
+        <w:tc>
+          <w:tcPr>
+            <w:tcW w:type="dxa" w:w="1006"/>
+          </w:tcPr>
+          <w:p>
+            <w:r/>
+          </w:p>
+        </w:tc>
+        <w:tc>
+          <w:tcPr>
+            <w:tcW w:type="dxa" w:w="1006"/>
+          </w:tcPr>
+          <w:p>
+            <w:r/>
+          </w:p>
+        </w:tc>
+        <w:tc>
+          <w:tcPr>
+            <w:tcW w:type="dxa" w:w="1007"/>
+          </w:tcPr>
+          <w:p>
+            <w:r/>
+          </w:p>
+        </w:tc>
+        <w:tc>
+          <w:tcPr>
+            <w:tcW w:type="dxa" w:w="1007"/>
+          </w:tcPr>
+          <w:p>
+            <w:r/>
+          </w:p>
+        </w:tc>
+        <w:tc>
+          <w:tcPr>
+            <w:tcW w:type="dxa" w:w="1007"/>
+          </w:tcPr>
+          <w:p>
+            <w:r/>
+          </w:p>
+        </w:tc>
+        <w:tc>
+          <w:tcPr>
+            <w:tcW w:type="dxa" w:w="1007"/>
+          </w:tcPr>
+          <w:p>
+            <w:r/>
+          </w:p>
+        </w:tc>
+        <w:tc>
+          <w:tcPr>
+            <w:tcW w:type="dxa" w:w="1007"/>
+          </w:tcPr>
+          <w:p>
+            <w:r/>
+          </w:p>
+        </w:tc>
+        <w:tc>
+          <w:tcPr>
+            <w:tcW w:type="dxa" w:w="1007"/>
+          </w:tcPr>
+          <w:p>
+            <w:r>
+              <w:t>X</w:t>
+            </w:r>
+          </w:p>
+        </w:tc>
+      </w:tr>
+      <w:tr>
+        <w:tc>
+          <w:tcPr>
+            <w:tcW w:type="dxa" w:w="1007"/>
+          </w:tcPr>
+          <w:p>
+            <w:r>
+              <w:t>CP-53</w:t>
+            </w:r>
+          </w:p>
+        </w:tc>
+        <w:tc>
+          <w:tcPr>
+            <w:tcW w:type="dxa" w:w="1006"/>
+          </w:tcPr>
+          <w:p>
+            <w:r/>
+          </w:p>
+        </w:tc>
+        <w:tc>
+          <w:tcPr>
+            <w:tcW w:type="dxa" w:w="1006"/>
+          </w:tcPr>
+          <w:p>
+            <w:r/>
+          </w:p>
+        </w:tc>
+        <w:tc>
+          <w:tcPr>
+            <w:tcW w:type="dxa" w:w="1007"/>
+          </w:tcPr>
+          <w:p>
+            <w:r/>
+          </w:p>
+        </w:tc>
+        <w:tc>
+          <w:tcPr>
+            <w:tcW w:type="dxa" w:w="1007"/>
+          </w:tcPr>
+          <w:p>
+            <w:r/>
+          </w:p>
+        </w:tc>
+        <w:tc>
+          <w:tcPr>
+            <w:tcW w:type="dxa" w:w="1007"/>
+          </w:tcPr>
+          <w:p>
+            <w:r/>
+          </w:p>
+        </w:tc>
+        <w:tc>
+          <w:tcPr>
+            <w:tcW w:type="dxa" w:w="1007"/>
+          </w:tcPr>
+          <w:p>
+            <w:r/>
+          </w:p>
+        </w:tc>
+        <w:tc>
+          <w:tcPr>
+            <w:tcW w:type="dxa" w:w="1007"/>
+          </w:tcPr>
+          <w:p>
+            <w:r/>
+          </w:p>
+        </w:tc>
+        <w:tc>
+          <w:tcPr>
+            <w:tcW w:type="dxa" w:w="1007"/>
+          </w:tcPr>
+          <w:p>
+            <w:r>
+              <w:t>X</w:t>
+            </w:r>
+          </w:p>
+        </w:tc>
+      </w:tr>
+      <w:tr>
+        <w:tc>
+          <w:tcPr>
+            <w:tcW w:type="dxa" w:w="1007"/>
+          </w:tcPr>
+          <w:p>
+            <w:r>
+              <w:t>CP-54</w:t>
+            </w:r>
+          </w:p>
+        </w:tc>
+        <w:tc>
+          <w:tcPr>
+            <w:tcW w:type="dxa" w:w="1006"/>
+          </w:tcPr>
+          <w:p>
+            <w:r/>
+          </w:p>
+        </w:tc>
+        <w:tc>
+          <w:tcPr>
+            <w:tcW w:type="dxa" w:w="1006"/>
+          </w:tcPr>
+          <w:p>
+            <w:r/>
+          </w:p>
+        </w:tc>
+        <w:tc>
+          <w:tcPr>
+            <w:tcW w:type="dxa" w:w="1007"/>
+          </w:tcPr>
+          <w:p>
+            <w:r/>
+          </w:p>
+        </w:tc>
+        <w:tc>
+          <w:tcPr>
+            <w:tcW w:type="dxa" w:w="1007"/>
+          </w:tcPr>
+          <w:p>
+            <w:r/>
+          </w:p>
+        </w:tc>
+        <w:tc>
+          <w:tcPr>
+            <w:tcW w:type="dxa" w:w="1007"/>
+          </w:tcPr>
+          <w:p>
+            <w:r/>
+          </w:p>
+        </w:tc>
+        <w:tc>
+          <w:tcPr>
+            <w:tcW w:type="dxa" w:w="1007"/>
+          </w:tcPr>
+          <w:p>
+            <w:r/>
+          </w:p>
+        </w:tc>
+        <w:tc>
+          <w:tcPr>
+            <w:tcW w:type="dxa" w:w="1007"/>
+          </w:tcPr>
+          <w:p>
+            <w:r/>
+          </w:p>
+        </w:tc>
+        <w:tc>
+          <w:tcPr>
+            <w:tcW w:type="dxa" w:w="1007"/>
+          </w:tcPr>
+          <w:p>
+            <w:r>
+              <w:t>X</w:t>
+            </w:r>
+          </w:p>
+        </w:tc>
+      </w:tr>
+      <w:tr>
+        <w:tc>
+          <w:tcPr>
+            <w:tcW w:type="dxa" w:w="1007"/>
+          </w:tcPr>
+          <w:p>
+            <w:r>
+              <w:t>CP-55</w:t>
+            </w:r>
+          </w:p>
+        </w:tc>
+        <w:tc>
+          <w:tcPr>
+            <w:tcW w:type="dxa" w:w="1006"/>
+          </w:tcPr>
+          <w:p>
+            <w:r/>
+          </w:p>
+        </w:tc>
+        <w:tc>
+          <w:tcPr>
+            <w:tcW w:type="dxa" w:w="1006"/>
+          </w:tcPr>
+          <w:p>
+            <w:r/>
+          </w:p>
+        </w:tc>
+        <w:tc>
+          <w:tcPr>
+            <w:tcW w:type="dxa" w:w="1007"/>
+          </w:tcPr>
+          <w:p>
+            <w:r/>
+          </w:p>
+        </w:tc>
+        <w:tc>
+          <w:tcPr>
+            <w:tcW w:type="dxa" w:w="1007"/>
+          </w:tcPr>
+          <w:p>
+            <w:r/>
+          </w:p>
+        </w:tc>
+        <w:tc>
+          <w:tcPr>
+            <w:tcW w:type="dxa" w:w="1007"/>
+          </w:tcPr>
+          <w:p>
+            <w:r/>
+          </w:p>
+        </w:tc>
+        <w:tc>
+          <w:tcPr>
+            <w:tcW w:type="dxa" w:w="1007"/>
+          </w:tcPr>
+          <w:p>
+            <w:r/>
+          </w:p>
+        </w:tc>
+        <w:tc>
+          <w:tcPr>
+            <w:tcW w:type="dxa" w:w="1007"/>
+          </w:tcPr>
+          <w:p>
+            <w:r/>
+          </w:p>
+        </w:tc>
+        <w:tc>
+          <w:tcPr>
+            <w:tcW w:type="dxa" w:w="1007"/>
+          </w:tcPr>
+          <w:p>
+            <w:r>
+              <w:t>X</w:t>
+            </w:r>
+          </w:p>
+        </w:tc>
+      </w:tr>
+      <w:tr>
+        <w:tc>
+          <w:tcPr>
+            <w:tcW w:type="dxa" w:w="1007"/>
+          </w:tcPr>
+          <w:p>
+            <w:r>
+              <w:t>CP-56</w:t>
+            </w:r>
+          </w:p>
+        </w:tc>
+        <w:tc>
+          <w:tcPr>
+            <w:tcW w:type="dxa" w:w="1006"/>
+          </w:tcPr>
+          <w:p>
+            <w:r/>
+          </w:p>
+        </w:tc>
+        <w:tc>
+          <w:tcPr>
+            <w:tcW w:type="dxa" w:w="1006"/>
+          </w:tcPr>
+          <w:p>
+            <w:r/>
+          </w:p>
+        </w:tc>
+        <w:tc>
+          <w:tcPr>
+            <w:tcW w:type="dxa" w:w="1007"/>
+          </w:tcPr>
+          <w:p>
+            <w:r/>
+          </w:p>
+        </w:tc>
+        <w:tc>
+          <w:tcPr>
+            <w:tcW w:type="dxa" w:w="1007"/>
+          </w:tcPr>
+          <w:p>
+            <w:r/>
+          </w:p>
+        </w:tc>
+        <w:tc>
+          <w:tcPr>
+            <w:tcW w:type="dxa" w:w="1007"/>
+          </w:tcPr>
+          <w:p>
+            <w:r/>
+          </w:p>
+        </w:tc>
+        <w:tc>
+          <w:tcPr>
+            <w:tcW w:type="dxa" w:w="1007"/>
+          </w:tcPr>
+          <w:p>
+            <w:r/>
+          </w:p>
+        </w:tc>
+        <w:tc>
+          <w:tcPr>
+            <w:tcW w:type="dxa" w:w="1007"/>
+          </w:tcPr>
+          <w:p>
+            <w:r/>
+          </w:p>
+        </w:tc>
+        <w:tc>
+          <w:tcPr>
+            <w:tcW w:type="dxa" w:w="1007"/>
+          </w:tcPr>
+          <w:p>
+            <w:r>
+              <w:t>X</w:t>
+            </w:r>
+          </w:p>
+        </w:tc>
+      </w:tr>
     </w:tbl>
     <w:p>
       <w:pPr>
@@ -16614,6 +17004,1126 @@
           <w:p>
             <w:r>
               <w:t>Resultado esperado: Se llama a cancelApplication, isActionLoading queda en false y no hay errores de acción.</w:t>
+            </w:r>
+          </w:p>
+        </w:tc>
+      </w:tr>
+      <w:tr>
+        <w:tc>
+          <w:tcPr>
+            <w:tcW w:type="dxa" w:w="3021"/>
+          </w:tcPr>
+          <w:p>
+            <w:r>
+              <w:t>Resultado obtenido: Ejecutado con éxito. Pruebas unitarias de la app Android pasadas al 100% en JUnit.</w:t>
+            </w:r>
+          </w:p>
+        </w:tc>
+        <w:tc>
+          <w:tcPr>
+            <w:tcW w:type="dxa" w:w="3021"/>
+          </w:tcPr>
+          <w:p>
+            <w:r>
+              <w:t>Resultado obtenido: Ejecutado con éxito. Pruebas unitarias de la app Android pasadas al 100% en JUnit.</w:t>
+            </w:r>
+          </w:p>
+        </w:tc>
+        <w:tc>
+          <w:tcPr>
+            <w:tcW w:type="dxa" w:w="3019"/>
+          </w:tcPr>
+          <w:p>
+            <w:r>
+              <w:t>Resultado obtenido: Ejecutado con éxito. Pruebas unitarias de la app Android pasadas al 100% en JUnit.</w:t>
+            </w:r>
+          </w:p>
+        </w:tc>
+      </w:tr>
+      <w:tr>
+        <w:tc>
+          <w:tcPr>
+            <w:tcW w:type="dxa" w:w="3021"/>
+          </w:tcPr>
+          <w:p>
+            <w:r>
+              <w:t>Prueba unitaria de estado inicial por defecto (NotificationsViewModel)</w:t>
+            </w:r>
+          </w:p>
+        </w:tc>
+        <w:tc>
+          <w:tcPr>
+            <w:tcW w:type="dxa" w:w="3021"/>
+          </w:tcPr>
+          <w:p>
+            <w:r>
+              <w:t>CP-52</w:t>
+            </w:r>
+          </w:p>
+        </w:tc>
+        <w:tc>
+          <w:tcPr>
+            <w:tcW w:type="dxa" w:w="3019"/>
+          </w:tcPr>
+          <w:p>
+            <w:r>
+              <w:t>CP-52</w:t>
+            </w:r>
+          </w:p>
+        </w:tc>
+      </w:tr>
+      <w:tr>
+        <w:tc>
+          <w:tcPr>
+            <w:tcW w:type="dxa" w:w="3021"/>
+          </w:tcPr>
+          <w:p>
+            <w:r>
+              <w:t>Prueba unitaria de estado inicial por defecto (NotificationsViewModel)</w:t>
+            </w:r>
+          </w:p>
+        </w:tc>
+        <w:tc>
+          <w:tcPr>
+            <w:tcW w:type="dxa" w:w="3021"/>
+          </w:tcPr>
+          <w:p>
+            <w:r>
+              <w:t>¿Prueba de despliegue?</w:t>
+            </w:r>
+          </w:p>
+        </w:tc>
+        <w:tc>
+          <w:tcPr>
+            <w:tcW w:type="dxa" w:w="3019"/>
+          </w:tcPr>
+          <w:p>
+            <w:r>
+              <w:t>No</w:t>
+            </w:r>
+          </w:p>
+        </w:tc>
+      </w:tr>
+      <w:tr>
+        <w:tc>
+          <w:tcPr>
+            <w:tcW w:type="dxa" w:w="3021"/>
+          </w:tcPr>
+          <w:p>
+            <w:r>
+              <w:t>Descripción: Verificar que el NotificationsViewModel se inicialice en un estado limpio, con la lista de notificaciones vacía, no conectado y con 0 no leídas.</w:t>
+            </w:r>
+          </w:p>
+        </w:tc>
+        <w:tc>
+          <w:tcPr>
+            <w:tcW w:type="dxa" w:w="3021"/>
+          </w:tcPr>
+          <w:p>
+            <w:r>
+              <w:t>Descripción: Verificar que el NotificationsViewModel se inicialice en un estado limpio, con la lista de notificaciones vacía, no conectado y con 0 no leídas.</w:t>
+            </w:r>
+          </w:p>
+        </w:tc>
+        <w:tc>
+          <w:tcPr>
+            <w:tcW w:type="dxa" w:w="3019"/>
+          </w:tcPr>
+          <w:p>
+            <w:r>
+              <w:t>Descripción: Verificar que el NotificationsViewModel se inicialice en un estado limpio, con la lista de notificaciones vacía, no conectado y con 0 no leídas.</w:t>
+            </w:r>
+          </w:p>
+        </w:tc>
+      </w:tr>
+      <w:tr>
+        <w:tc>
+          <w:tcPr>
+            <w:tcW w:type="dxa" w:w="3021"/>
+          </w:tcPr>
+          <w:p>
+            <w:r>
+              <w:t>Prerrequisitos: NotificationsViewModel instanciado.</w:t>
+            </w:r>
+          </w:p>
+        </w:tc>
+        <w:tc>
+          <w:tcPr>
+            <w:tcW w:type="dxa" w:w="3021"/>
+          </w:tcPr>
+          <w:p>
+            <w:r>
+              <w:t>Prerrequisitos: NotificationsViewModel instanciado.</w:t>
+            </w:r>
+          </w:p>
+        </w:tc>
+        <w:tc>
+          <w:tcPr>
+            <w:tcW w:type="dxa" w:w="3019"/>
+          </w:tcPr>
+          <w:p>
+            <w:r>
+              <w:t>Prerrequisitos: NotificationsViewModel instanciado.</w:t>
+            </w:r>
+          </w:p>
+        </w:tc>
+      </w:tr>
+      <w:tr>
+        <w:tc>
+          <w:tcPr>
+            <w:tcW w:type="dxa" w:w="3021"/>
+          </w:tcPr>
+          <w:p>
+            <w:r>
+              <w:t>Pasos: 1. Inicializar el ViewModel. 2. Comprobar que notifications sea vacío, isConnected sea false y unreadCount sea 0.</w:t>
+            </w:r>
+          </w:p>
+        </w:tc>
+        <w:tc>
+          <w:tcPr>
+            <w:tcW w:type="dxa" w:w="3021"/>
+          </w:tcPr>
+          <w:p>
+            <w:r>
+              <w:t>Pasos: 1. Inicializar el ViewModel. 2. Comprobar que notifications sea vacío, isConnected sea false y unreadCount sea 0.</w:t>
+            </w:r>
+          </w:p>
+        </w:tc>
+        <w:tc>
+          <w:tcPr>
+            <w:tcW w:type="dxa" w:w="3019"/>
+          </w:tcPr>
+          <w:p>
+            <w:r>
+              <w:t>Pasos: 1. Inicializar el ViewModel. 2. Comprobar que notifications sea vacío, isConnected sea false y unreadCount sea 0.</w:t>
+            </w:r>
+          </w:p>
+        </w:tc>
+      </w:tr>
+      <w:tr>
+        <w:tc>
+          <w:tcPr>
+            <w:tcW w:type="dxa" w:w="3021"/>
+          </w:tcPr>
+          <w:p>
+            <w:r>
+              <w:t>Resultado esperado: El estado inicial coincide exactamente con los valores por defecto vacíos.</w:t>
+            </w:r>
+          </w:p>
+        </w:tc>
+        <w:tc>
+          <w:tcPr>
+            <w:tcW w:type="dxa" w:w="3021"/>
+          </w:tcPr>
+          <w:p>
+            <w:r>
+              <w:t>Resultado esperado: El estado inicial coincide exactamente con los valores por defecto vacíos.</w:t>
+            </w:r>
+          </w:p>
+        </w:tc>
+        <w:tc>
+          <w:tcPr>
+            <w:tcW w:type="dxa" w:w="3019"/>
+          </w:tcPr>
+          <w:p>
+            <w:r>
+              <w:t>Resultado esperado: El estado inicial coincide exactamente con los valores por defecto vacíos.</w:t>
+            </w:r>
+          </w:p>
+        </w:tc>
+      </w:tr>
+      <w:tr>
+        <w:tc>
+          <w:tcPr>
+            <w:tcW w:type="dxa" w:w="3021"/>
+          </w:tcPr>
+          <w:p>
+            <w:r>
+              <w:t>Resultado obtenido: Ejecutado con éxito. Pruebas unitarias de la app Android pasadas al 100% en JUnit.</w:t>
+            </w:r>
+          </w:p>
+        </w:tc>
+        <w:tc>
+          <w:tcPr>
+            <w:tcW w:type="dxa" w:w="3021"/>
+          </w:tcPr>
+          <w:p>
+            <w:r>
+              <w:t>Resultado obtenido: Ejecutado con éxito. Pruebas unitarias de la app Android pasadas al 100% en JUnit.</w:t>
+            </w:r>
+          </w:p>
+        </w:tc>
+        <w:tc>
+          <w:tcPr>
+            <w:tcW w:type="dxa" w:w="3019"/>
+          </w:tcPr>
+          <w:p>
+            <w:r>
+              <w:t>Resultado obtenido: Ejecutado con éxito. Pruebas unitarias de la app Android pasadas al 100% en JUnit.</w:t>
+            </w:r>
+          </w:p>
+        </w:tc>
+      </w:tr>
+      <w:tr>
+        <w:tc>
+          <w:tcPr>
+            <w:tcW w:type="dxa" w:w="3021"/>
+          </w:tcPr>
+          <w:p>
+            <w:r>
+              <w:t>Prueba unitaria de cálculo de notificaciones no leídas (NotificationsViewModel)</w:t>
+            </w:r>
+          </w:p>
+        </w:tc>
+        <w:tc>
+          <w:tcPr>
+            <w:tcW w:type="dxa" w:w="3021"/>
+          </w:tcPr>
+          <w:p>
+            <w:r>
+              <w:t>CP-53</w:t>
+            </w:r>
+          </w:p>
+        </w:tc>
+        <w:tc>
+          <w:tcPr>
+            <w:tcW w:type="dxa" w:w="3019"/>
+          </w:tcPr>
+          <w:p>
+            <w:r>
+              <w:t>CP-53</w:t>
+            </w:r>
+          </w:p>
+        </w:tc>
+      </w:tr>
+      <w:tr>
+        <w:tc>
+          <w:tcPr>
+            <w:tcW w:type="dxa" w:w="3021"/>
+          </w:tcPr>
+          <w:p>
+            <w:r>
+              <w:t>Prueba unitaria de cálculo de notificaciones no leídas (NotificationsViewModel)</w:t>
+            </w:r>
+          </w:p>
+        </w:tc>
+        <w:tc>
+          <w:tcPr>
+            <w:tcW w:type="dxa" w:w="3021"/>
+          </w:tcPr>
+          <w:p>
+            <w:r>
+              <w:t>¿Prueba de despliegue?</w:t>
+            </w:r>
+          </w:p>
+        </w:tc>
+        <w:tc>
+          <w:tcPr>
+            <w:tcW w:type="dxa" w:w="3019"/>
+          </w:tcPr>
+          <w:p>
+            <w:r>
+              <w:t>No</w:t>
+            </w:r>
+          </w:p>
+        </w:tc>
+      </w:tr>
+      <w:tr>
+        <w:tc>
+          <w:tcPr>
+            <w:tcW w:type="dxa" w:w="3021"/>
+          </w:tcPr>
+          <w:p>
+            <w:r>
+              <w:t>Descripción: Comprobar el cálculo automático y reactivo del contador unreadCount ante variaciones en la lista de notificaciones.</w:t>
+            </w:r>
+          </w:p>
+        </w:tc>
+        <w:tc>
+          <w:tcPr>
+            <w:tcW w:type="dxa" w:w="3021"/>
+          </w:tcPr>
+          <w:p>
+            <w:r>
+              <w:t>Descripción: Comprobar el cálculo automático y reactivo del contador unreadCount ante variaciones en la lista de notificaciones.</w:t>
+            </w:r>
+          </w:p>
+        </w:tc>
+        <w:tc>
+          <w:tcPr>
+            <w:tcW w:type="dxa" w:w="3019"/>
+          </w:tcPr>
+          <w:p>
+            <w:r>
+              <w:t>Descripción: Comprobar el cálculo automático y reactivo del contador unreadCount ante variaciones en la lista de notificaciones.</w:t>
+            </w:r>
+          </w:p>
+        </w:tc>
+      </w:tr>
+      <w:tr>
+        <w:tc>
+          <w:tcPr>
+            <w:tcW w:type="dxa" w:w="3021"/>
+          </w:tcPr>
+          <w:p>
+            <w:r>
+              <w:t>Prerrequisitos: NotificationsViewModel instanciado con repositorio mockeado.</w:t>
+            </w:r>
+          </w:p>
+        </w:tc>
+        <w:tc>
+          <w:tcPr>
+            <w:tcW w:type="dxa" w:w="3021"/>
+          </w:tcPr>
+          <w:p>
+            <w:r>
+              <w:t>Prerrequisitos: NotificationsViewModel instanciado con repositorio mockeado.</w:t>
+            </w:r>
+          </w:p>
+        </w:tc>
+        <w:tc>
+          <w:tcPr>
+            <w:tcW w:type="dxa" w:w="3019"/>
+          </w:tcPr>
+          <w:p>
+            <w:r>
+              <w:t>Prerrequisitos: NotificationsViewModel instanciado con repositorio mockeado.</w:t>
+            </w:r>
+          </w:p>
+        </w:tc>
+      </w:tr>
+      <w:tr>
+        <w:tc>
+          <w:tcPr>
+            <w:tcW w:type="dxa" w:w="3021"/>
+          </w:tcPr>
+          <w:p>
+            <w:r>
+              <w:t>Pasos: 1. Emitir una lista de notificaciones con 2 leídas y 1 no leída a través del StateFlow del repositorio. 2. Observar el valor de unreadCount.</w:t>
+            </w:r>
+          </w:p>
+        </w:tc>
+        <w:tc>
+          <w:tcPr>
+            <w:tcW w:type="dxa" w:w="3021"/>
+          </w:tcPr>
+          <w:p>
+            <w:r>
+              <w:t>Pasos: 1. Emitir una lista de notificaciones con 2 leídas y 1 no leída a través del StateFlow del repositorio. 2. Observar el valor de unreadCount.</w:t>
+            </w:r>
+          </w:p>
+        </w:tc>
+        <w:tc>
+          <w:tcPr>
+            <w:tcW w:type="dxa" w:w="3019"/>
+          </w:tcPr>
+          <w:p>
+            <w:r>
+              <w:t>Pasos: 1. Emitir una lista de notificaciones con 2 leídas y 1 no leída a través del StateFlow del repositorio. 2. Observar el valor de unreadCount.</w:t>
+            </w:r>
+          </w:p>
+        </w:tc>
+      </w:tr>
+      <w:tr>
+        <w:tc>
+          <w:tcPr>
+            <w:tcW w:type="dxa" w:w="3021"/>
+          </w:tcPr>
+          <w:p>
+            <w:r>
+              <w:t>Resultado esperado: El valor de unreadCount se actualiza reactivamente a 2.</w:t>
+            </w:r>
+          </w:p>
+        </w:tc>
+        <w:tc>
+          <w:tcPr>
+            <w:tcW w:type="dxa" w:w="3021"/>
+          </w:tcPr>
+          <w:p>
+            <w:r>
+              <w:t>Resultado esperado: El valor de unreadCount se actualiza reactivamente a 2.</w:t>
+            </w:r>
+          </w:p>
+        </w:tc>
+        <w:tc>
+          <w:tcPr>
+            <w:tcW w:type="dxa" w:w="3019"/>
+          </w:tcPr>
+          <w:p>
+            <w:r>
+              <w:t>Resultado esperado: El valor de unreadCount se actualiza reactivamente a 2.</w:t>
+            </w:r>
+          </w:p>
+        </w:tc>
+      </w:tr>
+      <w:tr>
+        <w:tc>
+          <w:tcPr>
+            <w:tcW w:type="dxa" w:w="3021"/>
+          </w:tcPr>
+          <w:p>
+            <w:r>
+              <w:t>Resultado obtenido: Ejecutado con éxito. Pruebas unitarias de la app Android pasadas al 100% en JUnit.</w:t>
+            </w:r>
+          </w:p>
+        </w:tc>
+        <w:tc>
+          <w:tcPr>
+            <w:tcW w:type="dxa" w:w="3021"/>
+          </w:tcPr>
+          <w:p>
+            <w:r>
+              <w:t>Resultado obtenido: Ejecutado con éxito. Pruebas unitarias de la app Android pasadas al 100% en JUnit.</w:t>
+            </w:r>
+          </w:p>
+        </w:tc>
+        <w:tc>
+          <w:tcPr>
+            <w:tcW w:type="dxa" w:w="3019"/>
+          </w:tcPr>
+          <w:p>
+            <w:r>
+              <w:t>Resultado obtenido: Ejecutado con éxito. Pruebas unitarias de la app Android pasadas al 100% en JUnit.</w:t>
+            </w:r>
+          </w:p>
+        </w:tc>
+      </w:tr>
+      <w:tr>
+        <w:tc>
+          <w:tcPr>
+            <w:tcW w:type="dxa" w:w="3021"/>
+          </w:tcPr>
+          <w:p>
+            <w:r>
+              <w:t>Prueba unitaria de marcar notificación como leída (NotificationsViewModel)</w:t>
+            </w:r>
+          </w:p>
+        </w:tc>
+        <w:tc>
+          <w:tcPr>
+            <w:tcW w:type="dxa" w:w="3021"/>
+          </w:tcPr>
+          <w:p>
+            <w:r>
+              <w:t>CP-54</w:t>
+            </w:r>
+          </w:p>
+        </w:tc>
+        <w:tc>
+          <w:tcPr>
+            <w:tcW w:type="dxa" w:w="3019"/>
+          </w:tcPr>
+          <w:p>
+            <w:r>
+              <w:t>CP-54</w:t>
+            </w:r>
+          </w:p>
+        </w:tc>
+      </w:tr>
+      <w:tr>
+        <w:tc>
+          <w:tcPr>
+            <w:tcW w:type="dxa" w:w="3021"/>
+          </w:tcPr>
+          <w:p>
+            <w:r>
+              <w:t>Prueba unitaria de marcar notificación como leída (NotificationsViewModel)</w:t>
+            </w:r>
+          </w:p>
+        </w:tc>
+        <w:tc>
+          <w:tcPr>
+            <w:tcW w:type="dxa" w:w="3021"/>
+          </w:tcPr>
+          <w:p>
+            <w:r>
+              <w:t>¿Prueba de despliegue?</w:t>
+            </w:r>
+          </w:p>
+        </w:tc>
+        <w:tc>
+          <w:tcPr>
+            <w:tcW w:type="dxa" w:w="3019"/>
+          </w:tcPr>
+          <w:p>
+            <w:r>
+              <w:t>No</w:t>
+            </w:r>
+          </w:p>
+        </w:tc>
+      </w:tr>
+      <w:tr>
+        <w:tc>
+          <w:tcPr>
+            <w:tcW w:type="dxa" w:w="3021"/>
+          </w:tcPr>
+          <w:p>
+            <w:r>
+              <w:t>Descripción: Validar la correcta delegación al repositorio de notificaciones para marcar una alerta específica como leída.</w:t>
+            </w:r>
+          </w:p>
+        </w:tc>
+        <w:tc>
+          <w:tcPr>
+            <w:tcW w:type="dxa" w:w="3021"/>
+          </w:tcPr>
+          <w:p>
+            <w:r>
+              <w:t>Descripción: Validar la correcta delegación al repositorio de notificaciones para marcar una alerta específica como leída.</w:t>
+            </w:r>
+          </w:p>
+        </w:tc>
+        <w:tc>
+          <w:tcPr>
+            <w:tcW w:type="dxa" w:w="3019"/>
+          </w:tcPr>
+          <w:p>
+            <w:r>
+              <w:t>Descripción: Validar la correcta delegación al repositorio de notificaciones para marcar una alerta específica como leída.</w:t>
+            </w:r>
+          </w:p>
+        </w:tc>
+      </w:tr>
+      <w:tr>
+        <w:tc>
+          <w:tcPr>
+            <w:tcW w:type="dxa" w:w="3021"/>
+          </w:tcPr>
+          <w:p>
+            <w:r>
+              <w:t>Prerrequisitos: NotificationsViewModel instanciado.</w:t>
+            </w:r>
+          </w:p>
+        </w:tc>
+        <w:tc>
+          <w:tcPr>
+            <w:tcW w:type="dxa" w:w="3021"/>
+          </w:tcPr>
+          <w:p>
+            <w:r>
+              <w:t>Prerrequisitos: NotificationsViewModel instanciado.</w:t>
+            </w:r>
+          </w:p>
+        </w:tc>
+        <w:tc>
+          <w:tcPr>
+            <w:tcW w:type="dxa" w:w="3019"/>
+          </w:tcPr>
+          <w:p>
+            <w:r>
+              <w:t>Prerrequisitos: NotificationsViewModel instanciado.</w:t>
+            </w:r>
+          </w:p>
+        </w:tc>
+      </w:tr>
+      <w:tr>
+        <w:tc>
+          <w:tcPr>
+            <w:tcW w:type="dxa" w:w="3021"/>
+          </w:tcPr>
+          <w:p>
+            <w:r>
+              <w:t>Pasos: 1. Invocar markAsRead('alerta_99') en el ViewModel. 2. Verificar la invocación de markAsRead('alerta_99') en el repositorio.</w:t>
+            </w:r>
+          </w:p>
+        </w:tc>
+        <w:tc>
+          <w:tcPr>
+            <w:tcW w:type="dxa" w:w="3021"/>
+          </w:tcPr>
+          <w:p>
+            <w:r>
+              <w:t>Pasos: 1. Invocar markAsRead('alerta_99') en el ViewModel. 2. Verificar la invocación de markAsRead('alerta_99') en el repositorio.</w:t>
+            </w:r>
+          </w:p>
+        </w:tc>
+        <w:tc>
+          <w:tcPr>
+            <w:tcW w:type="dxa" w:w="3019"/>
+          </w:tcPr>
+          <w:p>
+            <w:r>
+              <w:t>Pasos: 1. Invocar markAsRead('alerta_99') en el ViewModel. 2. Verificar la invocación de markAsRead('alerta_99') en el repositorio.</w:t>
+            </w:r>
+          </w:p>
+        </w:tc>
+      </w:tr>
+      <w:tr>
+        <w:tc>
+          <w:tcPr>
+            <w:tcW w:type="dxa" w:w="3021"/>
+          </w:tcPr>
+          <w:p>
+            <w:r>
+              <w:t>Resultado esperado: Se realiza la llamada con el ID correspondiente en el repositorio de notificaciones.</w:t>
+            </w:r>
+          </w:p>
+        </w:tc>
+        <w:tc>
+          <w:tcPr>
+            <w:tcW w:type="dxa" w:w="3021"/>
+          </w:tcPr>
+          <w:p>
+            <w:r>
+              <w:t>Resultado esperado: Se realiza la llamada con el ID correspondiente en el repositorio de notificaciones.</w:t>
+            </w:r>
+          </w:p>
+        </w:tc>
+        <w:tc>
+          <w:tcPr>
+            <w:tcW w:type="dxa" w:w="3019"/>
+          </w:tcPr>
+          <w:p>
+            <w:r>
+              <w:t>Resultado esperado: Se realiza la llamada con el ID correspondiente en el repositorio de notificaciones.</w:t>
+            </w:r>
+          </w:p>
+        </w:tc>
+      </w:tr>
+      <w:tr>
+        <w:tc>
+          <w:tcPr>
+            <w:tcW w:type="dxa" w:w="3021"/>
+          </w:tcPr>
+          <w:p>
+            <w:r>
+              <w:t>Resultado obtenido: Ejecutado con éxito. Pruebas unitarias de la app Android pasadas al 100% en JUnit.</w:t>
+            </w:r>
+          </w:p>
+        </w:tc>
+        <w:tc>
+          <w:tcPr>
+            <w:tcW w:type="dxa" w:w="3021"/>
+          </w:tcPr>
+          <w:p>
+            <w:r>
+              <w:t>Resultado obtenido: Ejecutado con éxito. Pruebas unitarias de la app Android pasadas al 100% en JUnit.</w:t>
+            </w:r>
+          </w:p>
+        </w:tc>
+        <w:tc>
+          <w:tcPr>
+            <w:tcW w:type="dxa" w:w="3019"/>
+          </w:tcPr>
+          <w:p>
+            <w:r>
+              <w:t>Resultado obtenido: Ejecutado con éxito. Pruebas unitarias de la app Android pasadas al 100% en JUnit.</w:t>
+            </w:r>
+          </w:p>
+        </w:tc>
+      </w:tr>
+      <w:tr>
+        <w:tc>
+          <w:tcPr>
+            <w:tcW w:type="dxa" w:w="3021"/>
+          </w:tcPr>
+          <w:p>
+            <w:r>
+              <w:t>Prueba unitaria de limpiar notificaciones no leídas (NotificationsViewModel)</w:t>
+            </w:r>
+          </w:p>
+        </w:tc>
+        <w:tc>
+          <w:tcPr>
+            <w:tcW w:type="dxa" w:w="3021"/>
+          </w:tcPr>
+          <w:p>
+            <w:r>
+              <w:t>CP-55</w:t>
+            </w:r>
+          </w:p>
+        </w:tc>
+        <w:tc>
+          <w:tcPr>
+            <w:tcW w:type="dxa" w:w="3019"/>
+          </w:tcPr>
+          <w:p>
+            <w:r>
+              <w:t>CP-55</w:t>
+            </w:r>
+          </w:p>
+        </w:tc>
+      </w:tr>
+      <w:tr>
+        <w:tc>
+          <w:tcPr>
+            <w:tcW w:type="dxa" w:w="3021"/>
+          </w:tcPr>
+          <w:p>
+            <w:r>
+              <w:t>Prueba unitaria de limpiar notificaciones no leídas (NotificationsViewModel)</w:t>
+            </w:r>
+          </w:p>
+        </w:tc>
+        <w:tc>
+          <w:tcPr>
+            <w:tcW w:type="dxa" w:w="3021"/>
+          </w:tcPr>
+          <w:p>
+            <w:r>
+              <w:t>¿Prueba de despliegue?</w:t>
+            </w:r>
+          </w:p>
+        </w:tc>
+        <w:tc>
+          <w:tcPr>
+            <w:tcW w:type="dxa" w:w="3019"/>
+          </w:tcPr>
+          <w:p>
+            <w:r>
+              <w:t>No</w:t>
+            </w:r>
+          </w:p>
+        </w:tc>
+      </w:tr>
+      <w:tr>
+        <w:tc>
+          <w:tcPr>
+            <w:tcW w:type="dxa" w:w="3021"/>
+          </w:tcPr>
+          <w:p>
+            <w:r>
+              <w:t>Descripción: Validar el marcado masivo e interactivo como leídas de todas las notificaciones actualmente no leídas.</w:t>
+            </w:r>
+          </w:p>
+        </w:tc>
+        <w:tc>
+          <w:tcPr>
+            <w:tcW w:type="dxa" w:w="3021"/>
+          </w:tcPr>
+          <w:p>
+            <w:r>
+              <w:t>Descripción: Validar el marcado masivo e interactivo como leídas de todas las notificaciones actualmente no leídas.</w:t>
+            </w:r>
+          </w:p>
+        </w:tc>
+        <w:tc>
+          <w:tcPr>
+            <w:tcW w:type="dxa" w:w="3019"/>
+          </w:tcPr>
+          <w:p>
+            <w:r>
+              <w:t>Descripción: Validar el marcado masivo e interactivo como leídas de todas las notificaciones actualmente no leídas.</w:t>
+            </w:r>
+          </w:p>
+        </w:tc>
+      </w:tr>
+      <w:tr>
+        <w:tc>
+          <w:tcPr>
+            <w:tcW w:type="dxa" w:w="3021"/>
+          </w:tcPr>
+          <w:p>
+            <w:r>
+              <w:t>Prerrequisitos: Lista de notificaciones con elementos pendientes.</w:t>
+            </w:r>
+          </w:p>
+        </w:tc>
+        <w:tc>
+          <w:tcPr>
+            <w:tcW w:type="dxa" w:w="3021"/>
+          </w:tcPr>
+          <w:p>
+            <w:r>
+              <w:t>Prerrequisitos: Lista de notificaciones con elementos pendientes.</w:t>
+            </w:r>
+          </w:p>
+        </w:tc>
+        <w:tc>
+          <w:tcPr>
+            <w:tcW w:type="dxa" w:w="3019"/>
+          </w:tcPr>
+          <w:p>
+            <w:r>
+              <w:t>Prerrequisitos: Lista de notificaciones con elementos pendientes.</w:t>
+            </w:r>
+          </w:p>
+        </w:tc>
+      </w:tr>
+      <w:tr>
+        <w:tc>
+          <w:tcPr>
+            <w:tcW w:type="dxa" w:w="3021"/>
+          </w:tcPr>
+          <w:p>
+            <w:r>
+              <w:t>Pasos: 1. Invocar clearUnread(). 2. Verificar que se llame a markAsRead en el repositorio solo para los elementos no leídos.</w:t>
+            </w:r>
+          </w:p>
+        </w:tc>
+        <w:tc>
+          <w:tcPr>
+            <w:tcW w:type="dxa" w:w="3021"/>
+          </w:tcPr>
+          <w:p>
+            <w:r>
+              <w:t>Pasos: 1. Invocar clearUnread(). 2. Verificar que se llame a markAsRead en el repositorio solo para los elementos no leídos.</w:t>
+            </w:r>
+          </w:p>
+        </w:tc>
+        <w:tc>
+          <w:tcPr>
+            <w:tcW w:type="dxa" w:w="3019"/>
+          </w:tcPr>
+          <w:p>
+            <w:r>
+              <w:t>Pasos: 1. Invocar clearUnread(). 2. Verificar que se llame a markAsRead en el repositorio solo para los elementos no leídos.</w:t>
+            </w:r>
+          </w:p>
+        </w:tc>
+      </w:tr>
+      <w:tr>
+        <w:tc>
+          <w:tcPr>
+            <w:tcW w:type="dxa" w:w="3021"/>
+          </w:tcPr>
+          <w:p>
+            <w:r>
+              <w:t>Resultado esperado: Se invoca la función en el repositorio solo para las notificaciones pendientes.</w:t>
+            </w:r>
+          </w:p>
+        </w:tc>
+        <w:tc>
+          <w:tcPr>
+            <w:tcW w:type="dxa" w:w="3021"/>
+          </w:tcPr>
+          <w:p>
+            <w:r>
+              <w:t>Resultado esperado: Se invoca la función en el repositorio solo para las notificaciones pendientes.</w:t>
+            </w:r>
+          </w:p>
+        </w:tc>
+        <w:tc>
+          <w:tcPr>
+            <w:tcW w:type="dxa" w:w="3019"/>
+          </w:tcPr>
+          <w:p>
+            <w:r>
+              <w:t>Resultado esperado: Se invoca la función en el repositorio solo para las notificaciones pendientes.</w:t>
+            </w:r>
+          </w:p>
+        </w:tc>
+      </w:tr>
+      <w:tr>
+        <w:tc>
+          <w:tcPr>
+            <w:tcW w:type="dxa" w:w="3021"/>
+          </w:tcPr>
+          <w:p>
+            <w:r>
+              <w:t>Resultado obtenido: Ejecutado con éxito. Pruebas unitarias de la app Android pasadas al 100% en JUnit.</w:t>
+            </w:r>
+          </w:p>
+        </w:tc>
+        <w:tc>
+          <w:tcPr>
+            <w:tcW w:type="dxa" w:w="3021"/>
+          </w:tcPr>
+          <w:p>
+            <w:r>
+              <w:t>Resultado obtenido: Ejecutado con éxito. Pruebas unitarias de la app Android pasadas al 100% en JUnit.</w:t>
+            </w:r>
+          </w:p>
+        </w:tc>
+        <w:tc>
+          <w:tcPr>
+            <w:tcW w:type="dxa" w:w="3019"/>
+          </w:tcPr>
+          <w:p>
+            <w:r>
+              <w:t>Resultado obtenido: Ejecutado con éxito. Pruebas unitarias de la app Android pasadas al 100% en JUnit.</w:t>
+            </w:r>
+          </w:p>
+        </w:tc>
+      </w:tr>
+      <w:tr>
+        <w:tc>
+          <w:tcPr>
+            <w:tcW w:type="dxa" w:w="3021"/>
+          </w:tcPr>
+          <w:p>
+            <w:r>
+              <w:t>Prueba unitaria de limpiar todas las notificaciones (NotificationsViewModel)</w:t>
+            </w:r>
+          </w:p>
+        </w:tc>
+        <w:tc>
+          <w:tcPr>
+            <w:tcW w:type="dxa" w:w="3021"/>
+          </w:tcPr>
+          <w:p>
+            <w:r>
+              <w:t>CP-56</w:t>
+            </w:r>
+          </w:p>
+        </w:tc>
+        <w:tc>
+          <w:tcPr>
+            <w:tcW w:type="dxa" w:w="3019"/>
+          </w:tcPr>
+          <w:p>
+            <w:r>
+              <w:t>CP-56</w:t>
+            </w:r>
+          </w:p>
+        </w:tc>
+      </w:tr>
+      <w:tr>
+        <w:tc>
+          <w:tcPr>
+            <w:tcW w:type="dxa" w:w="3021"/>
+          </w:tcPr>
+          <w:p>
+            <w:r>
+              <w:t>Prueba unitaria de limpiar todas las notificaciones (NotificationsViewModel)</w:t>
+            </w:r>
+          </w:p>
+        </w:tc>
+        <w:tc>
+          <w:tcPr>
+            <w:tcW w:type="dxa" w:w="3021"/>
+          </w:tcPr>
+          <w:p>
+            <w:r>
+              <w:t>¿Prueba de despliegue?</w:t>
+            </w:r>
+          </w:p>
+        </w:tc>
+        <w:tc>
+          <w:tcPr>
+            <w:tcW w:type="dxa" w:w="3019"/>
+          </w:tcPr>
+          <w:p>
+            <w:r>
+              <w:t>No</w:t>
+            </w:r>
+          </w:p>
+        </w:tc>
+      </w:tr>
+      <w:tr>
+        <w:tc>
+          <w:tcPr>
+            <w:tcW w:type="dxa" w:w="3021"/>
+          </w:tcPr>
+          <w:p>
+            <w:r>
+              <w:t>Descripción: Validar la delegación del limpiado masivo del historial completo de notificaciones.</w:t>
+            </w:r>
+          </w:p>
+        </w:tc>
+        <w:tc>
+          <w:tcPr>
+            <w:tcW w:type="dxa" w:w="3021"/>
+          </w:tcPr>
+          <w:p>
+            <w:r>
+              <w:t>Descripción: Validar la delegación del limpiado masivo del historial completo de notificaciones.</w:t>
+            </w:r>
+          </w:p>
+        </w:tc>
+        <w:tc>
+          <w:tcPr>
+            <w:tcW w:type="dxa" w:w="3019"/>
+          </w:tcPr>
+          <w:p>
+            <w:r>
+              <w:t>Descripción: Validar la delegación del limpiado masivo del historial completo de notificaciones.</w:t>
+            </w:r>
+          </w:p>
+        </w:tc>
+      </w:tr>
+      <w:tr>
+        <w:tc>
+          <w:tcPr>
+            <w:tcW w:type="dxa" w:w="3021"/>
+          </w:tcPr>
+          <w:p>
+            <w:r>
+              <w:t>Prerrequisitos: NotificationsViewModel instanciado.</w:t>
+            </w:r>
+          </w:p>
+        </w:tc>
+        <w:tc>
+          <w:tcPr>
+            <w:tcW w:type="dxa" w:w="3021"/>
+          </w:tcPr>
+          <w:p>
+            <w:r>
+              <w:t>Prerrequisitos: NotificationsViewModel instanciado.</w:t>
+            </w:r>
+          </w:p>
+        </w:tc>
+        <w:tc>
+          <w:tcPr>
+            <w:tcW w:type="dxa" w:w="3019"/>
+          </w:tcPr>
+          <w:p>
+            <w:r>
+              <w:t>Prerrequisitos: NotificationsViewModel instanciado.</w:t>
+            </w:r>
+          </w:p>
+        </w:tc>
+      </w:tr>
+      <w:tr>
+        <w:tc>
+          <w:tcPr>
+            <w:tcW w:type="dxa" w:w="3021"/>
+          </w:tcPr>
+          <w:p>
+            <w:r>
+              <w:t>Pasos: 1. Invocar clearAll() en el ViewModel. 2. Verificar que se llame a clearAll() en el repositorio.</w:t>
+            </w:r>
+          </w:p>
+        </w:tc>
+        <w:tc>
+          <w:tcPr>
+            <w:tcW w:type="dxa" w:w="3021"/>
+          </w:tcPr>
+          <w:p>
+            <w:r>
+              <w:t>Pasos: 1. Invocar clearAll() en el ViewModel. 2. Verificar que se llame a clearAll() en el repositorio.</w:t>
+            </w:r>
+          </w:p>
+        </w:tc>
+        <w:tc>
+          <w:tcPr>
+            <w:tcW w:type="dxa" w:w="3019"/>
+          </w:tcPr>
+          <w:p>
+            <w:r>
+              <w:t>Pasos: 1. Invocar clearAll() en el ViewModel. 2. Verificar que se llame a clearAll() en el repositorio.</w:t>
+            </w:r>
+          </w:p>
+        </w:tc>
+      </w:tr>
+      <w:tr>
+        <w:tc>
+          <w:tcPr>
+            <w:tcW w:type="dxa" w:w="3021"/>
+          </w:tcPr>
+          <w:p>
+            <w:r>
+              <w:t>Resultado esperado: Se realiza la llamada a clearAll() en el repositorio exactamente 1 vez.</w:t>
+            </w:r>
+          </w:p>
+        </w:tc>
+        <w:tc>
+          <w:tcPr>
+            <w:tcW w:type="dxa" w:w="3021"/>
+          </w:tcPr>
+          <w:p>
+            <w:r>
+              <w:t>Resultado esperado: Se realiza la llamada a clearAll() en el repositorio exactamente 1 vez.</w:t>
+            </w:r>
+          </w:p>
+        </w:tc>
+        <w:tc>
+          <w:tcPr>
+            <w:tcW w:type="dxa" w:w="3019"/>
+          </w:tcPr>
+          <w:p>
+            <w:r>
+              <w:t>Resultado esperado: Se realiza la llamada a clearAll() en el repositorio exactamente 1 vez.</w:t>
             </w:r>
           </w:p>
         </w:tc>
@@ -18725,6 +20235,196 @@
           <w:p>
             <w:r>
               <w:t>CP-51</w:t>
+            </w:r>
+          </w:p>
+        </w:tc>
+        <w:tc>
+          <w:tcPr>
+            <w:tcW w:type="dxa" w:w="2256"/>
+          </w:tcPr>
+          <w:p>
+            <w:r>
+              <w:t>X</w:t>
+            </w:r>
+          </w:p>
+        </w:tc>
+        <w:tc>
+          <w:tcPr>
+            <w:tcW w:type="dxa" w:w="2258"/>
+          </w:tcPr>
+          <w:p>
+            <w:r/>
+          </w:p>
+        </w:tc>
+        <w:tc>
+          <w:tcPr>
+            <w:tcW w:type="dxa" w:w="2296"/>
+          </w:tcPr>
+          <w:p>
+            <w:r/>
+          </w:p>
+        </w:tc>
+      </w:tr>
+      <w:tr>
+        <w:tc>
+          <w:tcPr>
+            <w:tcW w:type="dxa" w:w="2251"/>
+          </w:tcPr>
+          <w:p>
+            <w:r>
+              <w:t>CP-52</w:t>
+            </w:r>
+          </w:p>
+        </w:tc>
+        <w:tc>
+          <w:tcPr>
+            <w:tcW w:type="dxa" w:w="2256"/>
+          </w:tcPr>
+          <w:p>
+            <w:r>
+              <w:t>X</w:t>
+            </w:r>
+          </w:p>
+        </w:tc>
+        <w:tc>
+          <w:tcPr>
+            <w:tcW w:type="dxa" w:w="2258"/>
+          </w:tcPr>
+          <w:p>
+            <w:r/>
+          </w:p>
+        </w:tc>
+        <w:tc>
+          <w:tcPr>
+            <w:tcW w:type="dxa" w:w="2296"/>
+          </w:tcPr>
+          <w:p>
+            <w:r/>
+          </w:p>
+        </w:tc>
+      </w:tr>
+      <w:tr>
+        <w:tc>
+          <w:tcPr>
+            <w:tcW w:type="dxa" w:w="2251"/>
+          </w:tcPr>
+          <w:p>
+            <w:r>
+              <w:t>CP-53</w:t>
+            </w:r>
+          </w:p>
+        </w:tc>
+        <w:tc>
+          <w:tcPr>
+            <w:tcW w:type="dxa" w:w="2256"/>
+          </w:tcPr>
+          <w:p>
+            <w:r>
+              <w:t>X</w:t>
+            </w:r>
+          </w:p>
+        </w:tc>
+        <w:tc>
+          <w:tcPr>
+            <w:tcW w:type="dxa" w:w="2258"/>
+          </w:tcPr>
+          <w:p>
+            <w:r/>
+          </w:p>
+        </w:tc>
+        <w:tc>
+          <w:tcPr>
+            <w:tcW w:type="dxa" w:w="2296"/>
+          </w:tcPr>
+          <w:p>
+            <w:r/>
+          </w:p>
+        </w:tc>
+      </w:tr>
+      <w:tr>
+        <w:tc>
+          <w:tcPr>
+            <w:tcW w:type="dxa" w:w="2251"/>
+          </w:tcPr>
+          <w:p>
+            <w:r>
+              <w:t>CP-54</w:t>
+            </w:r>
+          </w:p>
+        </w:tc>
+        <w:tc>
+          <w:tcPr>
+            <w:tcW w:type="dxa" w:w="2256"/>
+          </w:tcPr>
+          <w:p>
+            <w:r>
+              <w:t>X</w:t>
+            </w:r>
+          </w:p>
+        </w:tc>
+        <w:tc>
+          <w:tcPr>
+            <w:tcW w:type="dxa" w:w="2258"/>
+          </w:tcPr>
+          <w:p>
+            <w:r/>
+          </w:p>
+        </w:tc>
+        <w:tc>
+          <w:tcPr>
+            <w:tcW w:type="dxa" w:w="2296"/>
+          </w:tcPr>
+          <w:p>
+            <w:r/>
+          </w:p>
+        </w:tc>
+      </w:tr>
+      <w:tr>
+        <w:tc>
+          <w:tcPr>
+            <w:tcW w:type="dxa" w:w="2251"/>
+          </w:tcPr>
+          <w:p>
+            <w:r>
+              <w:t>CP-55</w:t>
+            </w:r>
+          </w:p>
+        </w:tc>
+        <w:tc>
+          <w:tcPr>
+            <w:tcW w:type="dxa" w:w="2256"/>
+          </w:tcPr>
+          <w:p>
+            <w:r>
+              <w:t>X</w:t>
+            </w:r>
+          </w:p>
+        </w:tc>
+        <w:tc>
+          <w:tcPr>
+            <w:tcW w:type="dxa" w:w="2258"/>
+          </w:tcPr>
+          <w:p>
+            <w:r/>
+          </w:p>
+        </w:tc>
+        <w:tc>
+          <w:tcPr>
+            <w:tcW w:type="dxa" w:w="2296"/>
+          </w:tcPr>
+          <w:p>
+            <w:r/>
+          </w:p>
+        </w:tc>
+      </w:tr>
+      <w:tr>
+        <w:tc>
+          <w:tcPr>
+            <w:tcW w:type="dxa" w:w="2251"/>
+          </w:tcPr>
+          <w:p>
+            <w:r>
+              <w:t>CP-56</w:t>
             </w:r>
           </w:p>
         </w:tc>

</xml_diff>

<commit_message>
Pruebas unitarias frontend RegisterPage y actualizacion de plan de pruebas en Word y Excel (CP-62 a CP-64)
</commit_message>
<xml_diff>
--- a/Documentacion/Unidad #3/3.1.2 Plan Pruebas Funcionales.docx
+++ b/Documentacion/Unidad #3/3.1.2 Plan Pruebas Funcionales.docx
@@ -8219,6 +8219,240 @@
           </w:p>
         </w:tc>
       </w:tr>
+      <w:tr>
+        <w:tc>
+          <w:tcPr>
+            <w:tcW w:type="dxa" w:w="1007"/>
+          </w:tcPr>
+          <w:p>
+            <w:r>
+              <w:t>CP-62</w:t>
+            </w:r>
+          </w:p>
+        </w:tc>
+        <w:tc>
+          <w:tcPr>
+            <w:tcW w:type="dxa" w:w="1006"/>
+          </w:tcPr>
+          <w:p>
+            <w:r>
+              <w:t>X</w:t>
+            </w:r>
+          </w:p>
+        </w:tc>
+        <w:tc>
+          <w:tcPr>
+            <w:tcW w:type="dxa" w:w="1006"/>
+          </w:tcPr>
+          <w:p>
+            <w:r/>
+          </w:p>
+        </w:tc>
+        <w:tc>
+          <w:tcPr>
+            <w:tcW w:type="dxa" w:w="1007"/>
+          </w:tcPr>
+          <w:p>
+            <w:r/>
+          </w:p>
+        </w:tc>
+        <w:tc>
+          <w:tcPr>
+            <w:tcW w:type="dxa" w:w="1007"/>
+          </w:tcPr>
+          <w:p>
+            <w:r/>
+          </w:p>
+        </w:tc>
+        <w:tc>
+          <w:tcPr>
+            <w:tcW w:type="dxa" w:w="1007"/>
+          </w:tcPr>
+          <w:p>
+            <w:r/>
+          </w:p>
+        </w:tc>
+        <w:tc>
+          <w:tcPr>
+            <w:tcW w:type="dxa" w:w="1007"/>
+          </w:tcPr>
+          <w:p>
+            <w:r/>
+          </w:p>
+        </w:tc>
+        <w:tc>
+          <w:tcPr>
+            <w:tcW w:type="dxa" w:w="1007"/>
+          </w:tcPr>
+          <w:p>
+            <w:r/>
+          </w:p>
+        </w:tc>
+        <w:tc>
+          <w:tcPr>
+            <w:tcW w:type="dxa" w:w="1007"/>
+          </w:tcPr>
+          <w:p>
+            <w:r/>
+          </w:p>
+        </w:tc>
+      </w:tr>
+      <w:tr>
+        <w:tc>
+          <w:tcPr>
+            <w:tcW w:type="dxa" w:w="1007"/>
+          </w:tcPr>
+          <w:p>
+            <w:r>
+              <w:t>CP-63</w:t>
+            </w:r>
+          </w:p>
+        </w:tc>
+        <w:tc>
+          <w:tcPr>
+            <w:tcW w:type="dxa" w:w="1006"/>
+          </w:tcPr>
+          <w:p>
+            <w:r>
+              <w:t>X</w:t>
+            </w:r>
+          </w:p>
+        </w:tc>
+        <w:tc>
+          <w:tcPr>
+            <w:tcW w:type="dxa" w:w="1006"/>
+          </w:tcPr>
+          <w:p>
+            <w:r/>
+          </w:p>
+        </w:tc>
+        <w:tc>
+          <w:tcPr>
+            <w:tcW w:type="dxa" w:w="1007"/>
+          </w:tcPr>
+          <w:p>
+            <w:r/>
+          </w:p>
+        </w:tc>
+        <w:tc>
+          <w:tcPr>
+            <w:tcW w:type="dxa" w:w="1007"/>
+          </w:tcPr>
+          <w:p>
+            <w:r/>
+          </w:p>
+        </w:tc>
+        <w:tc>
+          <w:tcPr>
+            <w:tcW w:type="dxa" w:w="1007"/>
+          </w:tcPr>
+          <w:p>
+            <w:r/>
+          </w:p>
+        </w:tc>
+        <w:tc>
+          <w:tcPr>
+            <w:tcW w:type="dxa" w:w="1007"/>
+          </w:tcPr>
+          <w:p>
+            <w:r/>
+          </w:p>
+        </w:tc>
+        <w:tc>
+          <w:tcPr>
+            <w:tcW w:type="dxa" w:w="1007"/>
+          </w:tcPr>
+          <w:p>
+            <w:r/>
+          </w:p>
+        </w:tc>
+        <w:tc>
+          <w:tcPr>
+            <w:tcW w:type="dxa" w:w="1007"/>
+          </w:tcPr>
+          <w:p>
+            <w:r/>
+          </w:p>
+        </w:tc>
+      </w:tr>
+      <w:tr>
+        <w:tc>
+          <w:tcPr>
+            <w:tcW w:type="dxa" w:w="1007"/>
+          </w:tcPr>
+          <w:p>
+            <w:r>
+              <w:t>CP-64</w:t>
+            </w:r>
+          </w:p>
+        </w:tc>
+        <w:tc>
+          <w:tcPr>
+            <w:tcW w:type="dxa" w:w="1006"/>
+          </w:tcPr>
+          <w:p>
+            <w:r>
+              <w:t>X</w:t>
+            </w:r>
+          </w:p>
+        </w:tc>
+        <w:tc>
+          <w:tcPr>
+            <w:tcW w:type="dxa" w:w="1006"/>
+          </w:tcPr>
+          <w:p>
+            <w:r/>
+          </w:p>
+        </w:tc>
+        <w:tc>
+          <w:tcPr>
+            <w:tcW w:type="dxa" w:w="1007"/>
+          </w:tcPr>
+          <w:p>
+            <w:r/>
+          </w:p>
+        </w:tc>
+        <w:tc>
+          <w:tcPr>
+            <w:tcW w:type="dxa" w:w="1007"/>
+          </w:tcPr>
+          <w:p>
+            <w:r/>
+          </w:p>
+        </w:tc>
+        <w:tc>
+          <w:tcPr>
+            <w:tcW w:type="dxa" w:w="1007"/>
+          </w:tcPr>
+          <w:p>
+            <w:r/>
+          </w:p>
+        </w:tc>
+        <w:tc>
+          <w:tcPr>
+            <w:tcW w:type="dxa" w:w="1007"/>
+          </w:tcPr>
+          <w:p>
+            <w:r/>
+          </w:p>
+        </w:tc>
+        <w:tc>
+          <w:tcPr>
+            <w:tcW w:type="dxa" w:w="1007"/>
+          </w:tcPr>
+          <w:p>
+            <w:r/>
+          </w:p>
+        </w:tc>
+        <w:tc>
+          <w:tcPr>
+            <w:tcW w:type="dxa" w:w="1007"/>
+          </w:tcPr>
+          <w:p>
+            <w:r/>
+          </w:p>
+        </w:tc>
+      </w:tr>
     </w:tbl>
     <w:p>
       <w:pPr>
@@ -42048,6 +42282,678 @@
           <w:p>
             <w:r>
               <w:t>Resultado obtenido: Ejecutado con éxito. Pruebas unitarias de la app Android pasadas al 100% en JUnit.</w:t>
+            </w:r>
+          </w:p>
+        </w:tc>
+      </w:tr>
+      <w:tr>
+        <w:tc>
+          <w:tcPr>
+            <w:tcW w:type="dxa" w:w="3021"/>
+          </w:tcPr>
+          <w:p>
+            <w:r>
+              <w:t>Prueba de validación de fortaleza de contraseña (RegisterPage)</w:t>
+            </w:r>
+          </w:p>
+        </w:tc>
+        <w:tc>
+          <w:tcPr>
+            <w:tcW w:type="dxa" w:w="3020"/>
+          </w:tcPr>
+          <w:p>
+            <w:r>
+              <w:t>CP-62</w:t>
+            </w:r>
+          </w:p>
+        </w:tc>
+        <w:tc>
+          <w:tcPr>
+            <w:tcW w:type="dxa" w:w="3020"/>
+          </w:tcPr>
+          <w:p>
+            <w:r>
+              <w:t>CP-62</w:t>
+            </w:r>
+          </w:p>
+        </w:tc>
+      </w:tr>
+      <w:tr>
+        <w:tc>
+          <w:tcPr>
+            <w:tcW w:type="dxa" w:w="3021"/>
+          </w:tcPr>
+          <w:p>
+            <w:r>
+              <w:t>Prueba de validación de fortaleza de contraseña (RegisterPage)</w:t>
+            </w:r>
+          </w:p>
+        </w:tc>
+        <w:tc>
+          <w:tcPr>
+            <w:tcW w:type="dxa" w:w="3020"/>
+          </w:tcPr>
+          <w:p>
+            <w:r>
+              <w:t>¿Prueba de despliegue?</w:t>
+            </w:r>
+          </w:p>
+        </w:tc>
+        <w:tc>
+          <w:tcPr>
+            <w:tcW w:type="dxa" w:w="3020"/>
+          </w:tcPr>
+          <w:p>
+            <w:r>
+              <w:t>No</w:t>
+            </w:r>
+          </w:p>
+        </w:tc>
+      </w:tr>
+      <w:tr>
+        <w:tc>
+          <w:tcPr>
+            <w:tcW w:type="dxa" w:w="3021"/>
+          </w:tcPr>
+          <w:p>
+            <w:r>
+              <w:t>Descripción: Verificar que la contraseña ingresada en el formulario de registro deba cumplir con la fortaleza reglamentaria (mínimo 8 caracteres, al menos 1 mayúscula y 1 número).</w:t>
+            </w:r>
+          </w:p>
+        </w:tc>
+        <w:tc>
+          <w:tcPr>
+            <w:tcW w:type="dxa" w:w="3020"/>
+          </w:tcPr>
+          <w:p>
+            <w:r>
+              <w:t>Descripción: Verificar que la contraseña ingresada en el formulario de registro deba cumplir con la fortaleza reglamentaria (mínimo 8 caracteres, al menos 1 mayúscula y 1 número).</w:t>
+            </w:r>
+          </w:p>
+        </w:tc>
+        <w:tc>
+          <w:tcPr>
+            <w:tcW w:type="dxa" w:w="3020"/>
+          </w:tcPr>
+          <w:p>
+            <w:r>
+              <w:t>Descripción: Verificar que la contraseña ingresada en el formulario de registro deba cumplir con la fortaleza reglamentaria (mínimo 8 caracteres, al menos 1 mayúscula y 1 número).</w:t>
+            </w:r>
+          </w:p>
+        </w:tc>
+      </w:tr>
+      <w:tr>
+        <w:tc>
+          <w:tcPr>
+            <w:tcW w:type="dxa" w:w="3021"/>
+          </w:tcPr>
+          <w:p>
+            <w:r>
+              <w:t>Prerrequisitos: Formulario de registro renderizado en pantalla.</w:t>
+            </w:r>
+          </w:p>
+        </w:tc>
+        <w:tc>
+          <w:tcPr>
+            <w:tcW w:type="dxa" w:w="3020"/>
+          </w:tcPr>
+          <w:p>
+            <w:r>
+              <w:t>Prerrequisitos: Formulario de registro renderizado en pantalla.</w:t>
+            </w:r>
+          </w:p>
+        </w:tc>
+        <w:tc>
+          <w:tcPr>
+            <w:tcW w:type="dxa" w:w="3020"/>
+          </w:tcPr>
+          <w:p>
+            <w:r>
+              <w:t>Prerrequisitos: Formulario de registro renderizado en pantalla.</w:t>
+            </w:r>
+          </w:p>
+        </w:tc>
+      </w:tr>
+      <w:tr>
+        <w:tc>
+          <w:tcPr>
+            <w:tcW w:type="dxa" w:w="3021"/>
+          </w:tcPr>
+          <w:p>
+            <w:r>
+              <w:t>Pasos: 1. Cargar campos válidos. 2. Escribir contraseña débil ('weakpass'). 3. Intentar registrar.</w:t>
+            </w:r>
+          </w:p>
+        </w:tc>
+        <w:tc>
+          <w:tcPr>
+            <w:tcW w:type="dxa" w:w="3020"/>
+          </w:tcPr>
+          <w:p>
+            <w:r>
+              <w:t>Pasos: 1. Cargar campos válidos. 2. Escribir contraseña débil ('weakpass'). 3. Intentar registrar.</w:t>
+            </w:r>
+          </w:p>
+        </w:tc>
+        <w:tc>
+          <w:tcPr>
+            <w:tcW w:type="dxa" w:w="3020"/>
+          </w:tcPr>
+          <w:p>
+            <w:r>
+              <w:t>Pasos: 1. Cargar campos válidos. 2. Escribir contraseña débil ('weakpass'). 3. Intentar registrar.</w:t>
+            </w:r>
+          </w:p>
+        </w:tc>
+      </w:tr>
+      <w:tr>
+        <w:tc>
+          <w:tcPr>
+            <w:tcW w:type="dxa" w:w="3021"/>
+          </w:tcPr>
+          <w:p>
+            <w:r>
+              <w:t>Resultado esperado: El formulario se bloquea y muestra un error indicando las condiciones de fortaleza de contraseña.</w:t>
+            </w:r>
+          </w:p>
+        </w:tc>
+        <w:tc>
+          <w:tcPr>
+            <w:tcW w:type="dxa" w:w="3020"/>
+          </w:tcPr>
+          <w:p>
+            <w:r>
+              <w:t>Resultado esperado: El formulario se bloquea y muestra un error indicando las condiciones de fortaleza de contraseña.</w:t>
+            </w:r>
+          </w:p>
+        </w:tc>
+        <w:tc>
+          <w:tcPr>
+            <w:tcW w:type="dxa" w:w="3020"/>
+          </w:tcPr>
+          <w:p>
+            <w:r>
+              <w:t>Resultado esperado: El formulario se bloquea y muestra un error indicando las condiciones de fortaleza de contraseña.</w:t>
+            </w:r>
+          </w:p>
+        </w:tc>
+      </w:tr>
+      <w:tr>
+        <w:tc>
+          <w:tcPr>
+            <w:tcW w:type="dxa" w:w="3021"/>
+          </w:tcPr>
+          <w:p>
+            <w:r>
+              <w:t>Resultado obtenido: Ejecutado con éxito. Pruebas de integración del frontend pasadas al 100% en Vitest.</w:t>
+            </w:r>
+          </w:p>
+        </w:tc>
+        <w:tc>
+          <w:tcPr>
+            <w:tcW w:type="dxa" w:w="3020"/>
+          </w:tcPr>
+          <w:p>
+            <w:r>
+              <w:t>Resultado obtenido: Ejecutado con éxito. Pruebas de integración del frontend pasadas al 100% en Vitest.</w:t>
+            </w:r>
+          </w:p>
+        </w:tc>
+        <w:tc>
+          <w:tcPr>
+            <w:tcW w:type="dxa" w:w="3020"/>
+          </w:tcPr>
+          <w:p>
+            <w:r>
+              <w:t>Resultado obtenido: Ejecutado con éxito. Pruebas de integración del frontend pasadas al 100% en Vitest.</w:t>
+            </w:r>
+          </w:p>
+        </w:tc>
+      </w:tr>
+      <w:tr>
+        <w:tc>
+          <w:tcPr>
+            <w:tcW w:type="dxa" w:w="3021"/>
+          </w:tcPr>
+          <w:p>
+            <w:r>
+              <w:t>Prueba de coincidencia de contraseñas (RegisterPage)</w:t>
+            </w:r>
+          </w:p>
+        </w:tc>
+        <w:tc>
+          <w:tcPr>
+            <w:tcW w:type="dxa" w:w="3020"/>
+          </w:tcPr>
+          <w:p>
+            <w:r>
+              <w:t>CP-63</w:t>
+            </w:r>
+          </w:p>
+        </w:tc>
+        <w:tc>
+          <w:tcPr>
+            <w:tcW w:type="dxa" w:w="3020"/>
+          </w:tcPr>
+          <w:p>
+            <w:r>
+              <w:t>CP-63</w:t>
+            </w:r>
+          </w:p>
+        </w:tc>
+      </w:tr>
+      <w:tr>
+        <w:tc>
+          <w:tcPr>
+            <w:tcW w:type="dxa" w:w="3021"/>
+          </w:tcPr>
+          <w:p>
+            <w:r>
+              <w:t>Prueba de coincidencia de contraseñas (RegisterPage)</w:t>
+            </w:r>
+          </w:p>
+        </w:tc>
+        <w:tc>
+          <w:tcPr>
+            <w:tcW w:type="dxa" w:w="3020"/>
+          </w:tcPr>
+          <w:p>
+            <w:r>
+              <w:t>¿Prueba de despliegue?</w:t>
+            </w:r>
+          </w:p>
+        </w:tc>
+        <w:tc>
+          <w:tcPr>
+            <w:tcW w:type="dxa" w:w="3020"/>
+          </w:tcPr>
+          <w:p>
+            <w:r>
+              <w:t>No</w:t>
+            </w:r>
+          </w:p>
+        </w:tc>
+      </w:tr>
+      <w:tr>
+        <w:tc>
+          <w:tcPr>
+            <w:tcW w:type="dxa" w:w="3021"/>
+          </w:tcPr>
+          <w:p>
+            <w:r>
+              <w:t>Descripción: Comprobar que el formulario verifique que las contraseñas coincidan antes del envío.</w:t>
+            </w:r>
+          </w:p>
+        </w:tc>
+        <w:tc>
+          <w:tcPr>
+            <w:tcW w:type="dxa" w:w="3020"/>
+          </w:tcPr>
+          <w:p>
+            <w:r>
+              <w:t>Descripción: Comprobar que el formulario verifique que las contraseñas coincidan antes del envío.</w:t>
+            </w:r>
+          </w:p>
+        </w:tc>
+        <w:tc>
+          <w:tcPr>
+            <w:tcW w:type="dxa" w:w="3020"/>
+          </w:tcPr>
+          <w:p>
+            <w:r>
+              <w:t>Descripción: Comprobar que el formulario verifique que las contraseñas coincidan antes del envío.</w:t>
+            </w:r>
+          </w:p>
+        </w:tc>
+      </w:tr>
+      <w:tr>
+        <w:tc>
+          <w:tcPr>
+            <w:tcW w:type="dxa" w:w="3021"/>
+          </w:tcPr>
+          <w:p>
+            <w:r>
+              <w:t>Prerrequisitos: Formulario de registro renderizado.</w:t>
+            </w:r>
+          </w:p>
+        </w:tc>
+        <w:tc>
+          <w:tcPr>
+            <w:tcW w:type="dxa" w:w="3020"/>
+          </w:tcPr>
+          <w:p>
+            <w:r>
+              <w:t>Prerrequisitos: Formulario de registro renderizado.</w:t>
+            </w:r>
+          </w:p>
+        </w:tc>
+        <w:tc>
+          <w:tcPr>
+            <w:tcW w:type="dxa" w:w="3020"/>
+          </w:tcPr>
+          <w:p>
+            <w:r>
+              <w:t>Prerrequisitos: Formulario de registro renderizado.</w:t>
+            </w:r>
+          </w:p>
+        </w:tc>
+      </w:tr>
+      <w:tr>
+        <w:tc>
+          <w:tcPr>
+            <w:tcW w:type="dxa" w:w="3021"/>
+          </w:tcPr>
+          <w:p>
+            <w:r>
+              <w:t>Pasos: 1. Cargar campos válidos. 2. Escribir contraseñas diferentes en los campos de contraseña y confirmación. 3. Intentar registrar.</w:t>
+            </w:r>
+          </w:p>
+        </w:tc>
+        <w:tc>
+          <w:tcPr>
+            <w:tcW w:type="dxa" w:w="3020"/>
+          </w:tcPr>
+          <w:p>
+            <w:r>
+              <w:t>Pasos: 1. Cargar campos válidos. 2. Escribir contraseñas diferentes en los campos de contraseña y confirmación. 3. Intentar registrar.</w:t>
+            </w:r>
+          </w:p>
+        </w:tc>
+        <w:tc>
+          <w:tcPr>
+            <w:tcW w:type="dxa" w:w="3020"/>
+          </w:tcPr>
+          <w:p>
+            <w:r>
+              <w:t>Pasos: 1. Cargar campos válidos. 2. Escribir contraseñas diferentes en los campos de contraseña y confirmación. 3. Intentar registrar.</w:t>
+            </w:r>
+          </w:p>
+        </w:tc>
+      </w:tr>
+      <w:tr>
+        <w:tc>
+          <w:tcPr>
+            <w:tcW w:type="dxa" w:w="3021"/>
+          </w:tcPr>
+          <w:p>
+            <w:r>
+              <w:t>Resultado esperado: El formulario se bloquea y despliega el mensaje de error: 'Las contraseñas no coinciden'.</w:t>
+            </w:r>
+          </w:p>
+        </w:tc>
+        <w:tc>
+          <w:tcPr>
+            <w:tcW w:type="dxa" w:w="3020"/>
+          </w:tcPr>
+          <w:p>
+            <w:r>
+              <w:t>Resultado esperado: El formulario se bloquea y despliega el mensaje de error: 'Las contraseñas no coinciden'.</w:t>
+            </w:r>
+          </w:p>
+        </w:tc>
+        <w:tc>
+          <w:tcPr>
+            <w:tcW w:type="dxa" w:w="3020"/>
+          </w:tcPr>
+          <w:p>
+            <w:r>
+              <w:t>Resultado esperado: El formulario se bloquea y despliega el mensaje de error: 'Las contraseñas no coinciden'.</w:t>
+            </w:r>
+          </w:p>
+        </w:tc>
+      </w:tr>
+      <w:tr>
+        <w:tc>
+          <w:tcPr>
+            <w:tcW w:type="dxa" w:w="3021"/>
+          </w:tcPr>
+          <w:p>
+            <w:r>
+              <w:t>Resultado obtenido: Ejecutado con éxito. Pruebas de integración del frontend pasadas al 100% en Vitest.</w:t>
+            </w:r>
+          </w:p>
+        </w:tc>
+        <w:tc>
+          <w:tcPr>
+            <w:tcW w:type="dxa" w:w="3020"/>
+          </w:tcPr>
+          <w:p>
+            <w:r>
+              <w:t>Resultado obtenido: Ejecutado con éxito. Pruebas de integración del frontend pasadas al 100% en Vitest.</w:t>
+            </w:r>
+          </w:p>
+        </w:tc>
+        <w:tc>
+          <w:tcPr>
+            <w:tcW w:type="dxa" w:w="3020"/>
+          </w:tcPr>
+          <w:p>
+            <w:r>
+              <w:t>Resultado obtenido: Ejecutado con éxito. Pruebas de integración del frontend pasadas al 100% en Vitest.</w:t>
+            </w:r>
+          </w:p>
+        </w:tc>
+      </w:tr>
+      <w:tr>
+        <w:tc>
+          <w:tcPr>
+            <w:tcW w:type="dxa" w:w="3021"/>
+          </w:tcPr>
+          <w:p>
+            <w:r>
+              <w:t>Prueba de flujo completo de registro exitoso tras aceptar términos (RegisterPage)</w:t>
+            </w:r>
+          </w:p>
+        </w:tc>
+        <w:tc>
+          <w:tcPr>
+            <w:tcW w:type="dxa" w:w="3020"/>
+          </w:tcPr>
+          <w:p>
+            <w:r>
+              <w:t>CP-64</w:t>
+            </w:r>
+          </w:p>
+        </w:tc>
+        <w:tc>
+          <w:tcPr>
+            <w:tcW w:type="dxa" w:w="3020"/>
+          </w:tcPr>
+          <w:p>
+            <w:r>
+              <w:t>CP-64</w:t>
+            </w:r>
+          </w:p>
+        </w:tc>
+      </w:tr>
+      <w:tr>
+        <w:tc>
+          <w:tcPr>
+            <w:tcW w:type="dxa" w:w="3021"/>
+          </w:tcPr>
+          <w:p>
+            <w:r>
+              <w:t>Prueba de flujo completo de registro exitoso tras aceptar términos (RegisterPage)</w:t>
+            </w:r>
+          </w:p>
+        </w:tc>
+        <w:tc>
+          <w:tcPr>
+            <w:tcW w:type="dxa" w:w="3020"/>
+          </w:tcPr>
+          <w:p>
+            <w:r>
+              <w:t>¿Prueba de despliegue?</w:t>
+            </w:r>
+          </w:p>
+        </w:tc>
+        <w:tc>
+          <w:tcPr>
+            <w:tcW w:type="dxa" w:w="3020"/>
+          </w:tcPr>
+          <w:p>
+            <w:r>
+              <w:t>No</w:t>
+            </w:r>
+          </w:p>
+        </w:tc>
+      </w:tr>
+      <w:tr>
+        <w:tc>
+          <w:tcPr>
+            <w:tcW w:type="dxa" w:w="3021"/>
+          </w:tcPr>
+          <w:p>
+            <w:r>
+              <w:t>Descripción: Validar el flujo feliz completo de registro de un nuevo usuario, incluyendo aceptación de términos y almacenamiento de sesión.</w:t>
+            </w:r>
+          </w:p>
+        </w:tc>
+        <w:tc>
+          <w:tcPr>
+            <w:tcW w:type="dxa" w:w="3020"/>
+          </w:tcPr>
+          <w:p>
+            <w:r>
+              <w:t>Descripción: Validar el flujo feliz completo de registro de un nuevo usuario, incluyendo aceptación de términos y almacenamiento de sesión.</w:t>
+            </w:r>
+          </w:p>
+        </w:tc>
+        <w:tc>
+          <w:tcPr>
+            <w:tcW w:type="dxa" w:w="3020"/>
+          </w:tcPr>
+          <w:p>
+            <w:r>
+              <w:t>Descripción: Validar el flujo feliz completo de registro de un nuevo usuario, incluyendo aceptación de términos y almacenamiento de sesión.</w:t>
+            </w:r>
+          </w:p>
+        </w:tc>
+      </w:tr>
+      <w:tr>
+        <w:tc>
+          <w:tcPr>
+            <w:tcW w:type="dxa" w:w="3021"/>
+          </w:tcPr>
+          <w:p>
+            <w:r>
+              <w:t>Prerrequisitos: Formulario de registro cargado con campos válidos y mock de la API configurado para responder con éxito.</w:t>
+            </w:r>
+          </w:p>
+        </w:tc>
+        <w:tc>
+          <w:tcPr>
+            <w:tcW w:type="dxa" w:w="3020"/>
+          </w:tcPr>
+          <w:p>
+            <w:r>
+              <w:t>Prerrequisitos: Formulario de registro cargado con campos válidos y mock de la API configurado para responder con éxito.</w:t>
+            </w:r>
+          </w:p>
+        </w:tc>
+        <w:tc>
+          <w:tcPr>
+            <w:tcW w:type="dxa" w:w="3020"/>
+          </w:tcPr>
+          <w:p>
+            <w:r>
+              <w:t>Prerrequisitos: Formulario de registro cargado con campos válidos y mock de la API configurado para responder con éxito.</w:t>
+            </w:r>
+          </w:p>
+        </w:tc>
+      </w:tr>
+      <w:tr>
+        <w:tc>
+          <w:tcPr>
+            <w:tcW w:type="dxa" w:w="3021"/>
+          </w:tcPr>
+          <w:p>
+            <w:r>
+              <w:t>Pasos: 1. Rellenar campos válidos. 2. Intentar registrar y aceptar el diálogo de términos y privacidad. 3. Verificar almacenamiento local del token y redireccionamiento.</w:t>
+            </w:r>
+          </w:p>
+        </w:tc>
+        <w:tc>
+          <w:tcPr>
+            <w:tcW w:type="dxa" w:w="3020"/>
+          </w:tcPr>
+          <w:p>
+            <w:r>
+              <w:t>Pasos: 1. Rellenar campos válidos. 2. Intentar registrar y aceptar el diálogo de términos y privacidad. 3. Verificar almacenamiento local del token y redireccionamiento.</w:t>
+            </w:r>
+          </w:p>
+        </w:tc>
+        <w:tc>
+          <w:tcPr>
+            <w:tcW w:type="dxa" w:w="3020"/>
+          </w:tcPr>
+          <w:p>
+            <w:r>
+              <w:t>Pasos: 1. Rellenar campos válidos. 2. Intentar registrar y aceptar el diálogo de términos y privacidad. 3. Verificar almacenamiento local del token y redireccionamiento.</w:t>
+            </w:r>
+          </w:p>
+        </w:tc>
+      </w:tr>
+      <w:tr>
+        <w:tc>
+          <w:tcPr>
+            <w:tcW w:type="dxa" w:w="3021"/>
+          </w:tcPr>
+          <w:p>
+            <w:r>
+              <w:t>Resultado esperado: Se realiza el llamado, se guardan las credenciales en localStorage y se redirige a /trabajador/perfil.</w:t>
+            </w:r>
+          </w:p>
+        </w:tc>
+        <w:tc>
+          <w:tcPr>
+            <w:tcW w:type="dxa" w:w="3020"/>
+          </w:tcPr>
+          <w:p>
+            <w:r>
+              <w:t>Resultado esperado: Se realiza el llamado, se guardan las credenciales en localStorage y se redirige a /trabajador/perfil.</w:t>
+            </w:r>
+          </w:p>
+        </w:tc>
+        <w:tc>
+          <w:tcPr>
+            <w:tcW w:type="dxa" w:w="3020"/>
+          </w:tcPr>
+          <w:p>
+            <w:r>
+              <w:t>Resultado esperado: Se realiza el llamado, se guardan las credenciales en localStorage y se redirige a /trabajador/perfil.</w:t>
+            </w:r>
+          </w:p>
+        </w:tc>
+      </w:tr>
+      <w:tr>
+        <w:tc>
+          <w:tcPr>
+            <w:tcW w:type="dxa" w:w="3021"/>
+          </w:tcPr>
+          <w:p>
+            <w:r>
+              <w:t>Resultado obtenido: Ejecutado con éxito. Pruebas de integración del frontend pasadas al 100% en Vitest.</w:t>
+            </w:r>
+          </w:p>
+        </w:tc>
+        <w:tc>
+          <w:tcPr>
+            <w:tcW w:type="dxa" w:w="3020"/>
+          </w:tcPr>
+          <w:p>
+            <w:r>
+              <w:t>Resultado obtenido: Ejecutado con éxito. Pruebas de integración del frontend pasadas al 100% en Vitest.</w:t>
+            </w:r>
+          </w:p>
+        </w:tc>
+        <w:tc>
+          <w:tcPr>
+            <w:tcW w:type="dxa" w:w="3020"/>
+          </w:tcPr>
+          <w:p>
+            <w:r>
+              <w:t>Resultado obtenido: Ejecutado con éxito. Pruebas de integración del frontend pasadas al 100% en Vitest.</w:t>
             </w:r>
           </w:p>
         </w:tc>
@@ -46905,6 +47811,120 @@
           <w:p>
             <w:r>
               <w:t>CP-61</w:t>
+            </w:r>
+          </w:p>
+        </w:tc>
+        <w:tc>
+          <w:tcPr>
+            <w:tcW w:type="dxa" w:w="2256"/>
+          </w:tcPr>
+          <w:p>
+            <w:r>
+              <w:t>X</w:t>
+            </w:r>
+          </w:p>
+        </w:tc>
+        <w:tc>
+          <w:tcPr>
+            <w:tcW w:type="dxa" w:w="2258"/>
+          </w:tcPr>
+          <w:p>
+            <w:r/>
+          </w:p>
+        </w:tc>
+        <w:tc>
+          <w:tcPr>
+            <w:tcW w:type="dxa" w:w="2293"/>
+          </w:tcPr>
+          <w:p>
+            <w:r/>
+          </w:p>
+        </w:tc>
+      </w:tr>
+      <w:tr>
+        <w:tc>
+          <w:tcPr>
+            <w:tcW w:type="dxa" w:w="2254"/>
+          </w:tcPr>
+          <w:p>
+            <w:r>
+              <w:t>CP-62</w:t>
+            </w:r>
+          </w:p>
+        </w:tc>
+        <w:tc>
+          <w:tcPr>
+            <w:tcW w:type="dxa" w:w="2256"/>
+          </w:tcPr>
+          <w:p>
+            <w:r>
+              <w:t>X</w:t>
+            </w:r>
+          </w:p>
+        </w:tc>
+        <w:tc>
+          <w:tcPr>
+            <w:tcW w:type="dxa" w:w="2258"/>
+          </w:tcPr>
+          <w:p>
+            <w:r/>
+          </w:p>
+        </w:tc>
+        <w:tc>
+          <w:tcPr>
+            <w:tcW w:type="dxa" w:w="2293"/>
+          </w:tcPr>
+          <w:p>
+            <w:r/>
+          </w:p>
+        </w:tc>
+      </w:tr>
+      <w:tr>
+        <w:tc>
+          <w:tcPr>
+            <w:tcW w:type="dxa" w:w="2254"/>
+          </w:tcPr>
+          <w:p>
+            <w:r>
+              <w:t>CP-63</w:t>
+            </w:r>
+          </w:p>
+        </w:tc>
+        <w:tc>
+          <w:tcPr>
+            <w:tcW w:type="dxa" w:w="2256"/>
+          </w:tcPr>
+          <w:p>
+            <w:r>
+              <w:t>X</w:t>
+            </w:r>
+          </w:p>
+        </w:tc>
+        <w:tc>
+          <w:tcPr>
+            <w:tcW w:type="dxa" w:w="2258"/>
+          </w:tcPr>
+          <w:p>
+            <w:r/>
+          </w:p>
+        </w:tc>
+        <w:tc>
+          <w:tcPr>
+            <w:tcW w:type="dxa" w:w="2293"/>
+          </w:tcPr>
+          <w:p>
+            <w:r/>
+          </w:p>
+        </w:tc>
+      </w:tr>
+      <w:tr>
+        <w:tc>
+          <w:tcPr>
+            <w:tcW w:type="dxa" w:w="2254"/>
+          </w:tcPr>
+          <w:p>
+            <w:r>
+              <w:t>CP-64</w:t>
             </w:r>
           </w:p>
         </w:tc>

</xml_diff>

<commit_message>
Pruebas unitarias backend JwtService y WebpayController y actualizacion de plan de pruebas en Word y Excel (CP-65 a CP-72)
</commit_message>
<xml_diff>
--- a/Documentacion/Unidad #3/3.1.2 Plan Pruebas Funcionales.docx
+++ b/Documentacion/Unidad #3/3.1.2 Plan Pruebas Funcionales.docx
@@ -8453,6 +8453,630 @@
           </w:p>
         </w:tc>
       </w:tr>
+      <w:tr>
+        <w:tc>
+          <w:tcPr>
+            <w:tcW w:type="dxa" w:w="1007"/>
+          </w:tcPr>
+          <w:p>
+            <w:r>
+              <w:t>CP-65</w:t>
+            </w:r>
+          </w:p>
+        </w:tc>
+        <w:tc>
+          <w:tcPr>
+            <w:tcW w:type="dxa" w:w="1006"/>
+          </w:tcPr>
+          <w:p>
+            <w:r/>
+          </w:p>
+        </w:tc>
+        <w:tc>
+          <w:tcPr>
+            <w:tcW w:type="dxa" w:w="1006"/>
+          </w:tcPr>
+          <w:p>
+            <w:r>
+              <w:t>X</w:t>
+            </w:r>
+          </w:p>
+        </w:tc>
+        <w:tc>
+          <w:tcPr>
+            <w:tcW w:type="dxa" w:w="1007"/>
+          </w:tcPr>
+          <w:p>
+            <w:r/>
+          </w:p>
+        </w:tc>
+        <w:tc>
+          <w:tcPr>
+            <w:tcW w:type="dxa" w:w="1007"/>
+          </w:tcPr>
+          <w:p>
+            <w:r/>
+          </w:p>
+        </w:tc>
+        <w:tc>
+          <w:tcPr>
+            <w:tcW w:type="dxa" w:w="1007"/>
+          </w:tcPr>
+          <w:p>
+            <w:r/>
+          </w:p>
+        </w:tc>
+        <w:tc>
+          <w:tcPr>
+            <w:tcW w:type="dxa" w:w="1007"/>
+          </w:tcPr>
+          <w:p>
+            <w:r/>
+          </w:p>
+        </w:tc>
+        <w:tc>
+          <w:tcPr>
+            <w:tcW w:type="dxa" w:w="1007"/>
+          </w:tcPr>
+          <w:p>
+            <w:r/>
+          </w:p>
+        </w:tc>
+        <w:tc>
+          <w:tcPr>
+            <w:tcW w:type="dxa" w:w="1007"/>
+          </w:tcPr>
+          <w:p>
+            <w:r/>
+          </w:p>
+        </w:tc>
+      </w:tr>
+      <w:tr>
+        <w:tc>
+          <w:tcPr>
+            <w:tcW w:type="dxa" w:w="1007"/>
+          </w:tcPr>
+          <w:p>
+            <w:r>
+              <w:t>CP-66</w:t>
+            </w:r>
+          </w:p>
+        </w:tc>
+        <w:tc>
+          <w:tcPr>
+            <w:tcW w:type="dxa" w:w="1006"/>
+          </w:tcPr>
+          <w:p>
+            <w:r/>
+          </w:p>
+        </w:tc>
+        <w:tc>
+          <w:tcPr>
+            <w:tcW w:type="dxa" w:w="1006"/>
+          </w:tcPr>
+          <w:p>
+            <w:r>
+              <w:t>X</w:t>
+            </w:r>
+          </w:p>
+        </w:tc>
+        <w:tc>
+          <w:tcPr>
+            <w:tcW w:type="dxa" w:w="1007"/>
+          </w:tcPr>
+          <w:p>
+            <w:r/>
+          </w:p>
+        </w:tc>
+        <w:tc>
+          <w:tcPr>
+            <w:tcW w:type="dxa" w:w="1007"/>
+          </w:tcPr>
+          <w:p>
+            <w:r/>
+          </w:p>
+        </w:tc>
+        <w:tc>
+          <w:tcPr>
+            <w:tcW w:type="dxa" w:w="1007"/>
+          </w:tcPr>
+          <w:p>
+            <w:r/>
+          </w:p>
+        </w:tc>
+        <w:tc>
+          <w:tcPr>
+            <w:tcW w:type="dxa" w:w="1007"/>
+          </w:tcPr>
+          <w:p>
+            <w:r/>
+          </w:p>
+        </w:tc>
+        <w:tc>
+          <w:tcPr>
+            <w:tcW w:type="dxa" w:w="1007"/>
+          </w:tcPr>
+          <w:p>
+            <w:r/>
+          </w:p>
+        </w:tc>
+        <w:tc>
+          <w:tcPr>
+            <w:tcW w:type="dxa" w:w="1007"/>
+          </w:tcPr>
+          <w:p>
+            <w:r/>
+          </w:p>
+        </w:tc>
+      </w:tr>
+      <w:tr>
+        <w:tc>
+          <w:tcPr>
+            <w:tcW w:type="dxa" w:w="1007"/>
+          </w:tcPr>
+          <w:p>
+            <w:r>
+              <w:t>CP-67</w:t>
+            </w:r>
+          </w:p>
+        </w:tc>
+        <w:tc>
+          <w:tcPr>
+            <w:tcW w:type="dxa" w:w="1006"/>
+          </w:tcPr>
+          <w:p>
+            <w:r/>
+          </w:p>
+        </w:tc>
+        <w:tc>
+          <w:tcPr>
+            <w:tcW w:type="dxa" w:w="1006"/>
+          </w:tcPr>
+          <w:p>
+            <w:r>
+              <w:t>X</w:t>
+            </w:r>
+          </w:p>
+        </w:tc>
+        <w:tc>
+          <w:tcPr>
+            <w:tcW w:type="dxa" w:w="1007"/>
+          </w:tcPr>
+          <w:p>
+            <w:r/>
+          </w:p>
+        </w:tc>
+        <w:tc>
+          <w:tcPr>
+            <w:tcW w:type="dxa" w:w="1007"/>
+          </w:tcPr>
+          <w:p>
+            <w:r/>
+          </w:p>
+        </w:tc>
+        <w:tc>
+          <w:tcPr>
+            <w:tcW w:type="dxa" w:w="1007"/>
+          </w:tcPr>
+          <w:p>
+            <w:r/>
+          </w:p>
+        </w:tc>
+        <w:tc>
+          <w:tcPr>
+            <w:tcW w:type="dxa" w:w="1007"/>
+          </w:tcPr>
+          <w:p>
+            <w:r/>
+          </w:p>
+        </w:tc>
+        <w:tc>
+          <w:tcPr>
+            <w:tcW w:type="dxa" w:w="1007"/>
+          </w:tcPr>
+          <w:p>
+            <w:r/>
+          </w:p>
+        </w:tc>
+        <w:tc>
+          <w:tcPr>
+            <w:tcW w:type="dxa" w:w="1007"/>
+          </w:tcPr>
+          <w:p>
+            <w:r/>
+          </w:p>
+        </w:tc>
+      </w:tr>
+      <w:tr>
+        <w:tc>
+          <w:tcPr>
+            <w:tcW w:type="dxa" w:w="1007"/>
+          </w:tcPr>
+          <w:p>
+            <w:r>
+              <w:t>CP-68</w:t>
+            </w:r>
+          </w:p>
+        </w:tc>
+        <w:tc>
+          <w:tcPr>
+            <w:tcW w:type="dxa" w:w="1006"/>
+          </w:tcPr>
+          <w:p>
+            <w:r/>
+          </w:p>
+        </w:tc>
+        <w:tc>
+          <w:tcPr>
+            <w:tcW w:type="dxa" w:w="1006"/>
+          </w:tcPr>
+          <w:p>
+            <w:r>
+              <w:t>X</w:t>
+            </w:r>
+          </w:p>
+        </w:tc>
+        <w:tc>
+          <w:tcPr>
+            <w:tcW w:type="dxa" w:w="1007"/>
+          </w:tcPr>
+          <w:p>
+            <w:r/>
+          </w:p>
+        </w:tc>
+        <w:tc>
+          <w:tcPr>
+            <w:tcW w:type="dxa" w:w="1007"/>
+          </w:tcPr>
+          <w:p>
+            <w:r/>
+          </w:p>
+        </w:tc>
+        <w:tc>
+          <w:tcPr>
+            <w:tcW w:type="dxa" w:w="1007"/>
+          </w:tcPr>
+          <w:p>
+            <w:r/>
+          </w:p>
+        </w:tc>
+        <w:tc>
+          <w:tcPr>
+            <w:tcW w:type="dxa" w:w="1007"/>
+          </w:tcPr>
+          <w:p>
+            <w:r/>
+          </w:p>
+        </w:tc>
+        <w:tc>
+          <w:tcPr>
+            <w:tcW w:type="dxa" w:w="1007"/>
+          </w:tcPr>
+          <w:p>
+            <w:r/>
+          </w:p>
+        </w:tc>
+        <w:tc>
+          <w:tcPr>
+            <w:tcW w:type="dxa" w:w="1007"/>
+          </w:tcPr>
+          <w:p>
+            <w:r/>
+          </w:p>
+        </w:tc>
+      </w:tr>
+      <w:tr>
+        <w:tc>
+          <w:tcPr>
+            <w:tcW w:type="dxa" w:w="1007"/>
+          </w:tcPr>
+          <w:p>
+            <w:r>
+              <w:t>CP-69</w:t>
+            </w:r>
+          </w:p>
+        </w:tc>
+        <w:tc>
+          <w:tcPr>
+            <w:tcW w:type="dxa" w:w="1006"/>
+          </w:tcPr>
+          <w:p>
+            <w:r/>
+          </w:p>
+        </w:tc>
+        <w:tc>
+          <w:tcPr>
+            <w:tcW w:type="dxa" w:w="1006"/>
+          </w:tcPr>
+          <w:p>
+            <w:r/>
+          </w:p>
+        </w:tc>
+        <w:tc>
+          <w:tcPr>
+            <w:tcW w:type="dxa" w:w="1007"/>
+          </w:tcPr>
+          <w:p>
+            <w:r/>
+          </w:p>
+        </w:tc>
+        <w:tc>
+          <w:tcPr>
+            <w:tcW w:type="dxa" w:w="1007"/>
+          </w:tcPr>
+          <w:p>
+            <w:r>
+              <w:t>X</w:t>
+            </w:r>
+          </w:p>
+        </w:tc>
+        <w:tc>
+          <w:tcPr>
+            <w:tcW w:type="dxa" w:w="1007"/>
+          </w:tcPr>
+          <w:p>
+            <w:r/>
+          </w:p>
+        </w:tc>
+        <w:tc>
+          <w:tcPr>
+            <w:tcW w:type="dxa" w:w="1007"/>
+          </w:tcPr>
+          <w:p>
+            <w:r/>
+          </w:p>
+        </w:tc>
+        <w:tc>
+          <w:tcPr>
+            <w:tcW w:type="dxa" w:w="1007"/>
+          </w:tcPr>
+          <w:p>
+            <w:r/>
+          </w:p>
+        </w:tc>
+        <w:tc>
+          <w:tcPr>
+            <w:tcW w:type="dxa" w:w="1007"/>
+          </w:tcPr>
+          <w:p>
+            <w:r/>
+          </w:p>
+        </w:tc>
+      </w:tr>
+      <w:tr>
+        <w:tc>
+          <w:tcPr>
+            <w:tcW w:type="dxa" w:w="1007"/>
+          </w:tcPr>
+          <w:p>
+            <w:r>
+              <w:t>CP-70</w:t>
+            </w:r>
+          </w:p>
+        </w:tc>
+        <w:tc>
+          <w:tcPr>
+            <w:tcW w:type="dxa" w:w="1006"/>
+          </w:tcPr>
+          <w:p>
+            <w:r/>
+          </w:p>
+        </w:tc>
+        <w:tc>
+          <w:tcPr>
+            <w:tcW w:type="dxa" w:w="1006"/>
+          </w:tcPr>
+          <w:p>
+            <w:r/>
+          </w:p>
+        </w:tc>
+        <w:tc>
+          <w:tcPr>
+            <w:tcW w:type="dxa" w:w="1007"/>
+          </w:tcPr>
+          <w:p>
+            <w:r/>
+          </w:p>
+        </w:tc>
+        <w:tc>
+          <w:tcPr>
+            <w:tcW w:type="dxa" w:w="1007"/>
+          </w:tcPr>
+          <w:p>
+            <w:r>
+              <w:t>X</w:t>
+            </w:r>
+          </w:p>
+        </w:tc>
+        <w:tc>
+          <w:tcPr>
+            <w:tcW w:type="dxa" w:w="1007"/>
+          </w:tcPr>
+          <w:p>
+            <w:r/>
+          </w:p>
+        </w:tc>
+        <w:tc>
+          <w:tcPr>
+            <w:tcW w:type="dxa" w:w="1007"/>
+          </w:tcPr>
+          <w:p>
+            <w:r/>
+          </w:p>
+        </w:tc>
+        <w:tc>
+          <w:tcPr>
+            <w:tcW w:type="dxa" w:w="1007"/>
+          </w:tcPr>
+          <w:p>
+            <w:r/>
+          </w:p>
+        </w:tc>
+        <w:tc>
+          <w:tcPr>
+            <w:tcW w:type="dxa" w:w="1007"/>
+          </w:tcPr>
+          <w:p>
+            <w:r/>
+          </w:p>
+        </w:tc>
+      </w:tr>
+      <w:tr>
+        <w:tc>
+          <w:tcPr>
+            <w:tcW w:type="dxa" w:w="1007"/>
+          </w:tcPr>
+          <w:p>
+            <w:r>
+              <w:t>CP-71</w:t>
+            </w:r>
+          </w:p>
+        </w:tc>
+        <w:tc>
+          <w:tcPr>
+            <w:tcW w:type="dxa" w:w="1006"/>
+          </w:tcPr>
+          <w:p>
+            <w:r/>
+          </w:p>
+        </w:tc>
+        <w:tc>
+          <w:tcPr>
+            <w:tcW w:type="dxa" w:w="1006"/>
+          </w:tcPr>
+          <w:p>
+            <w:r/>
+          </w:p>
+        </w:tc>
+        <w:tc>
+          <w:tcPr>
+            <w:tcW w:type="dxa" w:w="1007"/>
+          </w:tcPr>
+          <w:p>
+            <w:r/>
+          </w:p>
+        </w:tc>
+        <w:tc>
+          <w:tcPr>
+            <w:tcW w:type="dxa" w:w="1007"/>
+          </w:tcPr>
+          <w:p>
+            <w:r>
+              <w:t>X</w:t>
+            </w:r>
+          </w:p>
+        </w:tc>
+        <w:tc>
+          <w:tcPr>
+            <w:tcW w:type="dxa" w:w="1007"/>
+          </w:tcPr>
+          <w:p>
+            <w:r/>
+          </w:p>
+        </w:tc>
+        <w:tc>
+          <w:tcPr>
+            <w:tcW w:type="dxa" w:w="1007"/>
+          </w:tcPr>
+          <w:p>
+            <w:r/>
+          </w:p>
+        </w:tc>
+        <w:tc>
+          <w:tcPr>
+            <w:tcW w:type="dxa" w:w="1007"/>
+          </w:tcPr>
+          <w:p>
+            <w:r/>
+          </w:p>
+        </w:tc>
+        <w:tc>
+          <w:tcPr>
+            <w:tcW w:type="dxa" w:w="1007"/>
+          </w:tcPr>
+          <w:p>
+            <w:r/>
+          </w:p>
+        </w:tc>
+      </w:tr>
+      <w:tr>
+        <w:tc>
+          <w:tcPr>
+            <w:tcW w:type="dxa" w:w="1007"/>
+          </w:tcPr>
+          <w:p>
+            <w:r>
+              <w:t>CP-72</w:t>
+            </w:r>
+          </w:p>
+        </w:tc>
+        <w:tc>
+          <w:tcPr>
+            <w:tcW w:type="dxa" w:w="1006"/>
+          </w:tcPr>
+          <w:p>
+            <w:r/>
+          </w:p>
+        </w:tc>
+        <w:tc>
+          <w:tcPr>
+            <w:tcW w:type="dxa" w:w="1006"/>
+          </w:tcPr>
+          <w:p>
+            <w:r/>
+          </w:p>
+        </w:tc>
+        <w:tc>
+          <w:tcPr>
+            <w:tcW w:type="dxa" w:w="1007"/>
+          </w:tcPr>
+          <w:p>
+            <w:r/>
+          </w:p>
+        </w:tc>
+        <w:tc>
+          <w:tcPr>
+            <w:tcW w:type="dxa" w:w="1007"/>
+          </w:tcPr>
+          <w:p>
+            <w:r>
+              <w:t>X</w:t>
+            </w:r>
+          </w:p>
+        </w:tc>
+        <w:tc>
+          <w:tcPr>
+            <w:tcW w:type="dxa" w:w="1007"/>
+          </w:tcPr>
+          <w:p>
+            <w:r/>
+          </w:p>
+        </w:tc>
+        <w:tc>
+          <w:tcPr>
+            <w:tcW w:type="dxa" w:w="1007"/>
+          </w:tcPr>
+          <w:p>
+            <w:r/>
+          </w:p>
+        </w:tc>
+        <w:tc>
+          <w:tcPr>
+            <w:tcW w:type="dxa" w:w="1007"/>
+          </w:tcPr>
+          <w:p>
+            <w:r/>
+          </w:p>
+        </w:tc>
+        <w:tc>
+          <w:tcPr>
+            <w:tcW w:type="dxa" w:w="1007"/>
+          </w:tcPr>
+          <w:p>
+            <w:r/>
+          </w:p>
+        </w:tc>
+      </w:tr>
     </w:tbl>
     <w:p>
       <w:pPr>
@@ -42954,6 +43578,1798 @@
           <w:p>
             <w:r>
               <w:t>Resultado obtenido: Ejecutado con éxito. Pruebas de integración del frontend pasadas al 100% en Vitest.</w:t>
+            </w:r>
+          </w:p>
+        </w:tc>
+      </w:tr>
+      <w:tr>
+        <w:tc>
+          <w:tcPr>
+            <w:tcW w:type="dxa" w:w="3021"/>
+          </w:tcPr>
+          <w:p>
+            <w:r>
+              <w:t>Prueba de generación exitosa de JWT (JwtService)</w:t>
+            </w:r>
+          </w:p>
+        </w:tc>
+        <w:tc>
+          <w:tcPr>
+            <w:tcW w:type="dxa" w:w="3020"/>
+          </w:tcPr>
+          <w:p>
+            <w:r>
+              <w:t>CP-65</w:t>
+            </w:r>
+          </w:p>
+        </w:tc>
+        <w:tc>
+          <w:tcPr>
+            <w:tcW w:type="dxa" w:w="3020"/>
+          </w:tcPr>
+          <w:p>
+            <w:r>
+              <w:t>CP-65</w:t>
+            </w:r>
+          </w:p>
+        </w:tc>
+      </w:tr>
+      <w:tr>
+        <w:tc>
+          <w:tcPr>
+            <w:tcW w:type="dxa" w:w="3021"/>
+          </w:tcPr>
+          <w:p>
+            <w:r>
+              <w:t>Prueba de generación exitosa de JWT (JwtService)</w:t>
+            </w:r>
+          </w:p>
+        </w:tc>
+        <w:tc>
+          <w:tcPr>
+            <w:tcW w:type="dxa" w:w="3020"/>
+          </w:tcPr>
+          <w:p>
+            <w:r>
+              <w:t>¿Prueba de despliegue?</w:t>
+            </w:r>
+          </w:p>
+        </w:tc>
+        <w:tc>
+          <w:tcPr>
+            <w:tcW w:type="dxa" w:w="3020"/>
+          </w:tcPr>
+          <w:p>
+            <w:r>
+              <w:t>No</w:t>
+            </w:r>
+          </w:p>
+        </w:tc>
+      </w:tr>
+      <w:tr>
+        <w:tc>
+          <w:tcPr>
+            <w:tcW w:type="dxa" w:w="3021"/>
+          </w:tcPr>
+          <w:p>
+            <w:r>
+              <w:t>Descripción: Verificar que la llamada a generateToken devuelva un string JWT compacto válido y no nulo cuando se le proveen parámetros correctos.</w:t>
+            </w:r>
+          </w:p>
+        </w:tc>
+        <w:tc>
+          <w:tcPr>
+            <w:tcW w:type="dxa" w:w="3020"/>
+          </w:tcPr>
+          <w:p>
+            <w:r>
+              <w:t>Descripción: Verificar que la llamada a generateToken devuelva un string JWT compacto válido y no nulo cuando se le proveen parámetros correctos.</w:t>
+            </w:r>
+          </w:p>
+        </w:tc>
+        <w:tc>
+          <w:tcPr>
+            <w:tcW w:type="dxa" w:w="3020"/>
+          </w:tcPr>
+          <w:p>
+            <w:r>
+              <w:t>Descripción: Verificar que la llamada a generateToken devuelva un string JWT compacto válido y no nulo cuando se le proveen parámetros correctos.</w:t>
+            </w:r>
+          </w:p>
+        </w:tc>
+      </w:tr>
+      <w:tr>
+        <w:tc>
+          <w:tcPr>
+            <w:tcW w:type="dxa" w:w="3021"/>
+          </w:tcPr>
+          <w:p>
+            <w:r>
+              <w:t>Prerrequisitos: Instancia de JwtService inicializada con clave secreta válida.</w:t>
+            </w:r>
+          </w:p>
+        </w:tc>
+        <w:tc>
+          <w:tcPr>
+            <w:tcW w:type="dxa" w:w="3020"/>
+          </w:tcPr>
+          <w:p>
+            <w:r>
+              <w:t>Prerrequisitos: Instancia de JwtService inicializada con clave secreta válida.</w:t>
+            </w:r>
+          </w:p>
+        </w:tc>
+        <w:tc>
+          <w:tcPr>
+            <w:tcW w:type="dxa" w:w="3020"/>
+          </w:tcPr>
+          <w:p>
+            <w:r>
+              <w:t>Prerrequisitos: Instancia de JwtService inicializada con clave secreta válida.</w:t>
+            </w:r>
+          </w:p>
+        </w:tc>
+      </w:tr>
+      <w:tr>
+        <w:tc>
+          <w:tcPr>
+            <w:tcW w:type="dxa" w:w="3021"/>
+          </w:tcPr>
+          <w:p>
+            <w:r>
+              <w:t>Pasos: 1. Invocar generateToken pasando subject 'user@test.com' y duración de 3600 segundos. 2. Verificar el resultado.</w:t>
+            </w:r>
+          </w:p>
+        </w:tc>
+        <w:tc>
+          <w:tcPr>
+            <w:tcW w:type="dxa" w:w="3020"/>
+          </w:tcPr>
+          <w:p>
+            <w:r>
+              <w:t>Pasos: 1. Invocar generateToken pasando subject 'user@test.com' y duración de 3600 segundos. 2. Verificar el resultado.</w:t>
+            </w:r>
+          </w:p>
+        </w:tc>
+        <w:tc>
+          <w:tcPr>
+            <w:tcW w:type="dxa" w:w="3020"/>
+          </w:tcPr>
+          <w:p>
+            <w:r>
+              <w:t>Pasos: 1. Invocar generateToken pasando subject 'user@test.com' y duración de 3600 segundos. 2. Verificar el resultado.</w:t>
+            </w:r>
+          </w:p>
+        </w:tc>
+      </w:tr>
+      <w:tr>
+        <w:tc>
+          <w:tcPr>
+            <w:tcW w:type="dxa" w:w="3021"/>
+          </w:tcPr>
+          <w:p>
+            <w:r>
+              <w:t>Resultado esperado: Se genera un string JWT compacto que tiene tres secciones separadas por puntos.</w:t>
+            </w:r>
+          </w:p>
+        </w:tc>
+        <w:tc>
+          <w:tcPr>
+            <w:tcW w:type="dxa" w:w="3020"/>
+          </w:tcPr>
+          <w:p>
+            <w:r>
+              <w:t>Resultado esperado: Se genera un string JWT compacto que tiene tres secciones separadas por puntos.</w:t>
+            </w:r>
+          </w:p>
+        </w:tc>
+        <w:tc>
+          <w:tcPr>
+            <w:tcW w:type="dxa" w:w="3020"/>
+          </w:tcPr>
+          <w:p>
+            <w:r>
+              <w:t>Resultado esperado: Se genera un string JWT compacto que tiene tres secciones separadas por puntos.</w:t>
+            </w:r>
+          </w:p>
+        </w:tc>
+      </w:tr>
+      <w:tr>
+        <w:tc>
+          <w:tcPr>
+            <w:tcW w:type="dxa" w:w="3021"/>
+          </w:tcPr>
+          <w:p>
+            <w:r>
+              <w:t>Resultado obtenido: Ejecutado con éxito. Pruebas unitarias de JWT pasadas al 100% en Maven.</w:t>
+            </w:r>
+          </w:p>
+        </w:tc>
+        <w:tc>
+          <w:tcPr>
+            <w:tcW w:type="dxa" w:w="3020"/>
+          </w:tcPr>
+          <w:p>
+            <w:r>
+              <w:t>Resultado obtenido: Ejecutado con éxito. Pruebas unitarias de JWT pasadas al 100% en Maven.</w:t>
+            </w:r>
+          </w:p>
+        </w:tc>
+        <w:tc>
+          <w:tcPr>
+            <w:tcW w:type="dxa" w:w="3020"/>
+          </w:tcPr>
+          <w:p>
+            <w:r>
+              <w:t>Resultado obtenido: Ejecutado con éxito. Pruebas unitarias de JWT pasadas al 100% en Maven.</w:t>
+            </w:r>
+          </w:p>
+        </w:tc>
+      </w:tr>
+      <w:tr>
+        <w:tc>
+          <w:tcPr>
+            <w:tcW w:type="dxa" w:w="3021"/>
+          </w:tcPr>
+          <w:p>
+            <w:r>
+              <w:t>Prueba de lectura correcta de Claims (JwtService)</w:t>
+            </w:r>
+          </w:p>
+        </w:tc>
+        <w:tc>
+          <w:tcPr>
+            <w:tcW w:type="dxa" w:w="3020"/>
+          </w:tcPr>
+          <w:p>
+            <w:r>
+              <w:t>CP-66</w:t>
+            </w:r>
+          </w:p>
+        </w:tc>
+        <w:tc>
+          <w:tcPr>
+            <w:tcW w:type="dxa" w:w="3020"/>
+          </w:tcPr>
+          <w:p>
+            <w:r>
+              <w:t>CP-66</w:t>
+            </w:r>
+          </w:p>
+        </w:tc>
+      </w:tr>
+      <w:tr>
+        <w:tc>
+          <w:tcPr>
+            <w:tcW w:type="dxa" w:w="3021"/>
+          </w:tcPr>
+          <w:p>
+            <w:r>
+              <w:t>Prueba de lectura correcta de Claims (JwtService)</w:t>
+            </w:r>
+          </w:p>
+        </w:tc>
+        <w:tc>
+          <w:tcPr>
+            <w:tcW w:type="dxa" w:w="3020"/>
+          </w:tcPr>
+          <w:p>
+            <w:r>
+              <w:t>¿Prueba de despliegue?</w:t>
+            </w:r>
+          </w:p>
+        </w:tc>
+        <w:tc>
+          <w:tcPr>
+            <w:tcW w:type="dxa" w:w="3020"/>
+          </w:tcPr>
+          <w:p>
+            <w:r>
+              <w:t>No</w:t>
+            </w:r>
+          </w:p>
+        </w:tc>
+      </w:tr>
+      <w:tr>
+        <w:tc>
+          <w:tcPr>
+            <w:tcW w:type="dxa" w:w="3021"/>
+          </w:tcPr>
+          <w:p>
+            <w:r>
+              <w:t>Descripción: Validar que parseClaims extraiga correctamente los claims originales de un token JWT generado de forma válida.</w:t>
+            </w:r>
+          </w:p>
+        </w:tc>
+        <w:tc>
+          <w:tcPr>
+            <w:tcW w:type="dxa" w:w="3020"/>
+          </w:tcPr>
+          <w:p>
+            <w:r>
+              <w:t>Descripción: Validar que parseClaims extraiga correctamente los claims originales de un token JWT generado de forma válida.</w:t>
+            </w:r>
+          </w:p>
+        </w:tc>
+        <w:tc>
+          <w:tcPr>
+            <w:tcW w:type="dxa" w:w="3020"/>
+          </w:tcPr>
+          <w:p>
+            <w:r>
+              <w:t>Descripción: Validar que parseClaims extraiga correctamente los claims originales de un token JWT generado de forma válida.</w:t>
+            </w:r>
+          </w:p>
+        </w:tc>
+      </w:tr>
+      <w:tr>
+        <w:tc>
+          <w:tcPr>
+            <w:tcW w:type="dxa" w:w="3021"/>
+          </w:tcPr>
+          <w:p>
+            <w:r>
+              <w:t>Prerrequisitos: Instancia de JwtService inicializada.</w:t>
+            </w:r>
+          </w:p>
+        </w:tc>
+        <w:tc>
+          <w:tcPr>
+            <w:tcW w:type="dxa" w:w="3020"/>
+          </w:tcPr>
+          <w:p>
+            <w:r>
+              <w:t>Prerrequisitos: Instancia de JwtService inicializada.</w:t>
+            </w:r>
+          </w:p>
+        </w:tc>
+        <w:tc>
+          <w:tcPr>
+            <w:tcW w:type="dxa" w:w="3020"/>
+          </w:tcPr>
+          <w:p>
+            <w:r>
+              <w:t>Prerrequisitos: Instancia de JwtService inicializada.</w:t>
+            </w:r>
+          </w:p>
+        </w:tc>
+      </w:tr>
+      <w:tr>
+        <w:tc>
+          <w:tcPr>
+            <w:tcW w:type="dxa" w:w="3021"/>
+          </w:tcPr>
+          <w:p>
+            <w:r>
+              <w:t>Pasos: 1. Generar token JWT para 'test-user-id-999' con expiración en 1800 segundos. 2. Invocar parseClaims con dicho token.</w:t>
+            </w:r>
+          </w:p>
+        </w:tc>
+        <w:tc>
+          <w:tcPr>
+            <w:tcW w:type="dxa" w:w="3020"/>
+          </w:tcPr>
+          <w:p>
+            <w:r>
+              <w:t>Pasos: 1. Generar token JWT para 'test-user-id-999' con expiración en 1800 segundos. 2. Invocar parseClaims con dicho token.</w:t>
+            </w:r>
+          </w:p>
+        </w:tc>
+        <w:tc>
+          <w:tcPr>
+            <w:tcW w:type="dxa" w:w="3020"/>
+          </w:tcPr>
+          <w:p>
+            <w:r>
+              <w:t>Pasos: 1. Generar token JWT para 'test-user-id-999' con expiración en 1800 segundos. 2. Invocar parseClaims con dicho token.</w:t>
+            </w:r>
+          </w:p>
+        </w:tc>
+      </w:tr>
+      <w:tr>
+        <w:tc>
+          <w:tcPr>
+            <w:tcW w:type="dxa" w:w="3021"/>
+          </w:tcPr>
+          <w:p>
+            <w:r>
+              <w:t>Resultado esperado: El subject y la fecha de expiración coinciden exactamente con los datos originales.</w:t>
+            </w:r>
+          </w:p>
+        </w:tc>
+        <w:tc>
+          <w:tcPr>
+            <w:tcW w:type="dxa" w:w="3020"/>
+          </w:tcPr>
+          <w:p>
+            <w:r>
+              <w:t>Resultado esperado: El subject y la fecha de expiración coinciden exactamente con los datos originales.</w:t>
+            </w:r>
+          </w:p>
+        </w:tc>
+        <w:tc>
+          <w:tcPr>
+            <w:tcW w:type="dxa" w:w="3020"/>
+          </w:tcPr>
+          <w:p>
+            <w:r>
+              <w:t>Resultado esperado: El subject y la fecha de expiración coinciden exactamente con los datos originales.</w:t>
+            </w:r>
+          </w:p>
+        </w:tc>
+      </w:tr>
+      <w:tr>
+        <w:tc>
+          <w:tcPr>
+            <w:tcW w:type="dxa" w:w="3021"/>
+          </w:tcPr>
+          <w:p>
+            <w:r>
+              <w:t>Resultado obtenido: Ejecutado con éxito. Pruebas unitarias de JWT pasadas al 100% en Maven.</w:t>
+            </w:r>
+          </w:p>
+        </w:tc>
+        <w:tc>
+          <w:tcPr>
+            <w:tcW w:type="dxa" w:w="3020"/>
+          </w:tcPr>
+          <w:p>
+            <w:r>
+              <w:t>Resultado obtenido: Ejecutado con éxito. Pruebas unitarias de JWT pasadas al 100% en Maven.</w:t>
+            </w:r>
+          </w:p>
+        </w:tc>
+        <w:tc>
+          <w:tcPr>
+            <w:tcW w:type="dxa" w:w="3020"/>
+          </w:tcPr>
+          <w:p>
+            <w:r>
+              <w:t>Resultado obtenido: Ejecutado con éxito. Pruebas unitarias de JWT pasadas al 100% en Maven.</w:t>
+            </w:r>
+          </w:p>
+        </w:tc>
+      </w:tr>
+      <w:tr>
+        <w:tc>
+          <w:tcPr>
+            <w:tcW w:type="dxa" w:w="3021"/>
+          </w:tcPr>
+          <w:p>
+            <w:r>
+              <w:t>Prueba de detección de alteración/tampering en token (JwtService)</w:t>
+            </w:r>
+          </w:p>
+        </w:tc>
+        <w:tc>
+          <w:tcPr>
+            <w:tcW w:type="dxa" w:w="3020"/>
+          </w:tcPr>
+          <w:p>
+            <w:r>
+              <w:t>CP-67</w:t>
+            </w:r>
+          </w:p>
+        </w:tc>
+        <w:tc>
+          <w:tcPr>
+            <w:tcW w:type="dxa" w:w="3020"/>
+          </w:tcPr>
+          <w:p>
+            <w:r>
+              <w:t>CP-67</w:t>
+            </w:r>
+          </w:p>
+        </w:tc>
+      </w:tr>
+      <w:tr>
+        <w:tc>
+          <w:tcPr>
+            <w:tcW w:type="dxa" w:w="3021"/>
+          </w:tcPr>
+          <w:p>
+            <w:r>
+              <w:t>Prueba de detección de alteración/tampering en token (JwtService)</w:t>
+            </w:r>
+          </w:p>
+        </w:tc>
+        <w:tc>
+          <w:tcPr>
+            <w:tcW w:type="dxa" w:w="3020"/>
+          </w:tcPr>
+          <w:p>
+            <w:r>
+              <w:t>¿Prueba de despliegue?</w:t>
+            </w:r>
+          </w:p>
+        </w:tc>
+        <w:tc>
+          <w:tcPr>
+            <w:tcW w:type="dxa" w:w="3020"/>
+          </w:tcPr>
+          <w:p>
+            <w:r>
+              <w:t>No</w:t>
+            </w:r>
+          </w:p>
+        </w:tc>
+      </w:tr>
+      <w:tr>
+        <w:tc>
+          <w:tcPr>
+            <w:tcW w:type="dxa" w:w="3021"/>
+          </w:tcPr>
+          <w:p>
+            <w:r>
+              <w:t>Descripción: Comprobar que parseClaims falle lanzando una excepción si la firma del token JWT ha sido alterada o manipulada.</w:t>
+            </w:r>
+          </w:p>
+        </w:tc>
+        <w:tc>
+          <w:tcPr>
+            <w:tcW w:type="dxa" w:w="3020"/>
+          </w:tcPr>
+          <w:p>
+            <w:r>
+              <w:t>Descripción: Comprobar que parseClaims falle lanzando una excepción si la firma del token JWT ha sido alterada o manipulada.</w:t>
+            </w:r>
+          </w:p>
+        </w:tc>
+        <w:tc>
+          <w:tcPr>
+            <w:tcW w:type="dxa" w:w="3020"/>
+          </w:tcPr>
+          <w:p>
+            <w:r>
+              <w:t>Descripción: Comprobar que parseClaims falle lanzando una excepción si la firma del token JWT ha sido alterada o manipulada.</w:t>
+            </w:r>
+          </w:p>
+        </w:tc>
+      </w:tr>
+      <w:tr>
+        <w:tc>
+          <w:tcPr>
+            <w:tcW w:type="dxa" w:w="3021"/>
+          </w:tcPr>
+          <w:p>
+            <w:r>
+              <w:t>Prerrequisitos: Instancia de JwtService inicializada y token válido generado.</w:t>
+            </w:r>
+          </w:p>
+        </w:tc>
+        <w:tc>
+          <w:tcPr>
+            <w:tcW w:type="dxa" w:w="3020"/>
+          </w:tcPr>
+          <w:p>
+            <w:r>
+              <w:t>Prerrequisitos: Instancia de JwtService inicializada y token válido generado.</w:t>
+            </w:r>
+          </w:p>
+        </w:tc>
+        <w:tc>
+          <w:tcPr>
+            <w:tcW w:type="dxa" w:w="3020"/>
+          </w:tcPr>
+          <w:p>
+            <w:r>
+              <w:t>Prerrequisitos: Instancia de JwtService inicializada y token válido generado.</w:t>
+            </w:r>
+          </w:p>
+        </w:tc>
+      </w:tr>
+      <w:tr>
+        <w:tc>
+          <w:tcPr>
+            <w:tcW w:type="dxa" w:w="3021"/>
+          </w:tcPr>
+          <w:p>
+            <w:r>
+              <w:t>Pasos: 1. Alterar el último caracter de la firma del token generado. 2. Intentar decodificar con parseClaims.</w:t>
+            </w:r>
+          </w:p>
+        </w:tc>
+        <w:tc>
+          <w:tcPr>
+            <w:tcW w:type="dxa" w:w="3020"/>
+          </w:tcPr>
+          <w:p>
+            <w:r>
+              <w:t>Pasos: 1. Alterar el último caracter de la firma del token generado. 2. Intentar decodificar con parseClaims.</w:t>
+            </w:r>
+          </w:p>
+        </w:tc>
+        <w:tc>
+          <w:tcPr>
+            <w:tcW w:type="dxa" w:w="3020"/>
+          </w:tcPr>
+          <w:p>
+            <w:r>
+              <w:t>Pasos: 1. Alterar el último caracter de la firma del token generado. 2. Intentar decodificar con parseClaims.</w:t>
+            </w:r>
+          </w:p>
+        </w:tc>
+      </w:tr>
+      <w:tr>
+        <w:tc>
+          <w:tcPr>
+            <w:tcW w:type="dxa" w:w="3021"/>
+          </w:tcPr>
+          <w:p>
+            <w:r>
+              <w:t>Resultado esperado: Se lanza de forma controlada la excepción de firma SignatureException.</w:t>
+            </w:r>
+          </w:p>
+        </w:tc>
+        <w:tc>
+          <w:tcPr>
+            <w:tcW w:type="dxa" w:w="3020"/>
+          </w:tcPr>
+          <w:p>
+            <w:r>
+              <w:t>Resultado esperado: Se lanza de forma controlada la excepción de firma SignatureException.</w:t>
+            </w:r>
+          </w:p>
+        </w:tc>
+        <w:tc>
+          <w:tcPr>
+            <w:tcW w:type="dxa" w:w="3020"/>
+          </w:tcPr>
+          <w:p>
+            <w:r>
+              <w:t>Resultado esperado: Se lanza de forma controlada la excepción de firma SignatureException.</w:t>
+            </w:r>
+          </w:p>
+        </w:tc>
+      </w:tr>
+      <w:tr>
+        <w:tc>
+          <w:tcPr>
+            <w:tcW w:type="dxa" w:w="3021"/>
+          </w:tcPr>
+          <w:p>
+            <w:r>
+              <w:t>Resultado obtenido: Ejecutado con éxito. Pruebas unitarias de JWT pasadas al 100% en Maven.</w:t>
+            </w:r>
+          </w:p>
+        </w:tc>
+        <w:tc>
+          <w:tcPr>
+            <w:tcW w:type="dxa" w:w="3020"/>
+          </w:tcPr>
+          <w:p>
+            <w:r>
+              <w:t>Resultado obtenido: Ejecutado con éxito. Pruebas unitarias de JWT pasadas al 100% en Maven.</w:t>
+            </w:r>
+          </w:p>
+        </w:tc>
+        <w:tc>
+          <w:tcPr>
+            <w:tcW w:type="dxa" w:w="3020"/>
+          </w:tcPr>
+          <w:p>
+            <w:r>
+              <w:t>Resultado obtenido: Ejecutado con éxito. Pruebas unitarias de JWT pasadas al 100% en Maven.</w:t>
+            </w:r>
+          </w:p>
+        </w:tc>
+      </w:tr>
+      <w:tr>
+        <w:tc>
+          <w:tcPr>
+            <w:tcW w:type="dxa" w:w="3021"/>
+          </w:tcPr>
+          <w:p>
+            <w:r>
+              <w:t>Prueba de control de expiración de token (JwtService)</w:t>
+            </w:r>
+          </w:p>
+        </w:tc>
+        <w:tc>
+          <w:tcPr>
+            <w:tcW w:type="dxa" w:w="3020"/>
+          </w:tcPr>
+          <w:p>
+            <w:r>
+              <w:t>CP-68</w:t>
+            </w:r>
+          </w:p>
+        </w:tc>
+        <w:tc>
+          <w:tcPr>
+            <w:tcW w:type="dxa" w:w="3020"/>
+          </w:tcPr>
+          <w:p>
+            <w:r>
+              <w:t>CP-68</w:t>
+            </w:r>
+          </w:p>
+        </w:tc>
+      </w:tr>
+      <w:tr>
+        <w:tc>
+          <w:tcPr>
+            <w:tcW w:type="dxa" w:w="3021"/>
+          </w:tcPr>
+          <w:p>
+            <w:r>
+              <w:t>Prueba de control de expiración de token (JwtService)</w:t>
+            </w:r>
+          </w:p>
+        </w:tc>
+        <w:tc>
+          <w:tcPr>
+            <w:tcW w:type="dxa" w:w="3020"/>
+          </w:tcPr>
+          <w:p>
+            <w:r>
+              <w:t>¿Prueba de despliegue?</w:t>
+            </w:r>
+          </w:p>
+        </w:tc>
+        <w:tc>
+          <w:tcPr>
+            <w:tcW w:type="dxa" w:w="3020"/>
+          </w:tcPr>
+          <w:p>
+            <w:r>
+              <w:t>No</w:t>
+            </w:r>
+          </w:p>
+        </w:tc>
+      </w:tr>
+      <w:tr>
+        <w:tc>
+          <w:tcPr>
+            <w:tcW w:type="dxa" w:w="3021"/>
+          </w:tcPr>
+          <w:p>
+            <w:r>
+              <w:t>Descripción: Validar que el descifrado lance una excepción de expiración si el token JWT tiene una fecha de vencimiento en el pasado.</w:t>
+            </w:r>
+          </w:p>
+        </w:tc>
+        <w:tc>
+          <w:tcPr>
+            <w:tcW w:type="dxa" w:w="3020"/>
+          </w:tcPr>
+          <w:p>
+            <w:r>
+              <w:t>Descripción: Validar que el descifrado lance una excepción de expiración si el token JWT tiene una fecha de vencimiento en el pasado.</w:t>
+            </w:r>
+          </w:p>
+        </w:tc>
+        <w:tc>
+          <w:tcPr>
+            <w:tcW w:type="dxa" w:w="3020"/>
+          </w:tcPr>
+          <w:p>
+            <w:r>
+              <w:t>Descripción: Validar que el descifrado lance una excepción de expiración si el token JWT tiene una fecha de vencimiento en el pasado.</w:t>
+            </w:r>
+          </w:p>
+        </w:tc>
+      </w:tr>
+      <w:tr>
+        <w:tc>
+          <w:tcPr>
+            <w:tcW w:type="dxa" w:w="3021"/>
+          </w:tcPr>
+          <w:p>
+            <w:r>
+              <w:t>Prerrequisitos: Instancia de JwtService inicializada.</w:t>
+            </w:r>
+          </w:p>
+        </w:tc>
+        <w:tc>
+          <w:tcPr>
+            <w:tcW w:type="dxa" w:w="3020"/>
+          </w:tcPr>
+          <w:p>
+            <w:r>
+              <w:t>Prerrequisitos: Instancia de JwtService inicializada.</w:t>
+            </w:r>
+          </w:p>
+        </w:tc>
+        <w:tc>
+          <w:tcPr>
+            <w:tcW w:type="dxa" w:w="3020"/>
+          </w:tcPr>
+          <w:p>
+            <w:r>
+              <w:t>Prerrequisitos: Instancia de JwtService inicializada.</w:t>
+            </w:r>
+          </w:p>
+        </w:tc>
+      </w:tr>
+      <w:tr>
+        <w:tc>
+          <w:tcPr>
+            <w:tcW w:type="dxa" w:w="3021"/>
+          </w:tcPr>
+          <w:p>
+            <w:r>
+              <w:t>Pasos: 1. Generar un token con duración de -10 segundos (vencido). 2. Intentar decodificar con parseClaims.</w:t>
+            </w:r>
+          </w:p>
+        </w:tc>
+        <w:tc>
+          <w:tcPr>
+            <w:tcW w:type="dxa" w:w="3020"/>
+          </w:tcPr>
+          <w:p>
+            <w:r>
+              <w:t>Pasos: 1. Generar un token con duración de -10 segundos (vencido). 2. Intentar decodificar con parseClaims.</w:t>
+            </w:r>
+          </w:p>
+        </w:tc>
+        <w:tc>
+          <w:tcPr>
+            <w:tcW w:type="dxa" w:w="3020"/>
+          </w:tcPr>
+          <w:p>
+            <w:r>
+              <w:t>Pasos: 1. Generar un token con duración de -10 segundos (vencido). 2. Intentar decodificar con parseClaims.</w:t>
+            </w:r>
+          </w:p>
+        </w:tc>
+      </w:tr>
+      <w:tr>
+        <w:tc>
+          <w:tcPr>
+            <w:tcW w:type="dxa" w:w="3021"/>
+          </w:tcPr>
+          <w:p>
+            <w:r>
+              <w:t>Resultado esperado: Se lanza de forma controlada la excepción ExpiredJwtException.</w:t>
+            </w:r>
+          </w:p>
+        </w:tc>
+        <w:tc>
+          <w:tcPr>
+            <w:tcW w:type="dxa" w:w="3020"/>
+          </w:tcPr>
+          <w:p>
+            <w:r>
+              <w:t>Resultado esperado: Se lanza de forma controlada la excepción ExpiredJwtException.</w:t>
+            </w:r>
+          </w:p>
+        </w:tc>
+        <w:tc>
+          <w:tcPr>
+            <w:tcW w:type="dxa" w:w="3020"/>
+          </w:tcPr>
+          <w:p>
+            <w:r>
+              <w:t>Resultado esperado: Se lanza de forma controlada la excepción ExpiredJwtException.</w:t>
+            </w:r>
+          </w:p>
+        </w:tc>
+      </w:tr>
+      <w:tr>
+        <w:tc>
+          <w:tcPr>
+            <w:tcW w:type="dxa" w:w="3021"/>
+          </w:tcPr>
+          <w:p>
+            <w:r>
+              <w:t>Resultado obtenido: Ejecutado con éxito. Pruebas unitarias de JWT pasadas al 100% en Maven.</w:t>
+            </w:r>
+          </w:p>
+        </w:tc>
+        <w:tc>
+          <w:tcPr>
+            <w:tcW w:type="dxa" w:w="3020"/>
+          </w:tcPr>
+          <w:p>
+            <w:r>
+              <w:t>Resultado obtenido: Ejecutado con éxito. Pruebas unitarias de JWT pasadas al 100% en Maven.</w:t>
+            </w:r>
+          </w:p>
+        </w:tc>
+        <w:tc>
+          <w:tcPr>
+            <w:tcW w:type="dxa" w:w="3020"/>
+          </w:tcPr>
+          <w:p>
+            <w:r>
+              <w:t>Resultado obtenido: Ejecutado con éxito. Pruebas unitarias de JWT pasadas al 100% en Maven.</w:t>
+            </w:r>
+          </w:p>
+        </w:tc>
+      </w:tr>
+      <w:tr>
+        <w:tc>
+          <w:tcPr>
+            <w:tcW w:type="dxa" w:w="3021"/>
+          </w:tcPr>
+          <w:p>
+            <w:r>
+              <w:t>Prueba de validación de parámetros faltantes al iniciar pago (WebpayController)</w:t>
+            </w:r>
+          </w:p>
+        </w:tc>
+        <w:tc>
+          <w:tcPr>
+            <w:tcW w:type="dxa" w:w="3020"/>
+          </w:tcPr>
+          <w:p>
+            <w:r>
+              <w:t>CP-69</w:t>
+            </w:r>
+          </w:p>
+        </w:tc>
+        <w:tc>
+          <w:tcPr>
+            <w:tcW w:type="dxa" w:w="3020"/>
+          </w:tcPr>
+          <w:p>
+            <w:r>
+              <w:t>CP-69</w:t>
+            </w:r>
+          </w:p>
+        </w:tc>
+      </w:tr>
+      <w:tr>
+        <w:tc>
+          <w:tcPr>
+            <w:tcW w:type="dxa" w:w="3021"/>
+          </w:tcPr>
+          <w:p>
+            <w:r>
+              <w:t>Prueba de validación de parámetros faltantes al iniciar pago (WebpayController)</w:t>
+            </w:r>
+          </w:p>
+        </w:tc>
+        <w:tc>
+          <w:tcPr>
+            <w:tcW w:type="dxa" w:w="3020"/>
+          </w:tcPr>
+          <w:p>
+            <w:r>
+              <w:t>¿Prueba de despliegue?</w:t>
+            </w:r>
+          </w:p>
+        </w:tc>
+        <w:tc>
+          <w:tcPr>
+            <w:tcW w:type="dxa" w:w="3020"/>
+          </w:tcPr>
+          <w:p>
+            <w:r>
+              <w:t>No</w:t>
+            </w:r>
+          </w:p>
+        </w:tc>
+      </w:tr>
+      <w:tr>
+        <w:tc>
+          <w:tcPr>
+            <w:tcW w:type="dxa" w:w="3021"/>
+          </w:tcPr>
+          <w:p>
+            <w:r>
+              <w:t>Descripción: Verificar que el endpoint /init devuelva Bad Request si faltan parámetros obligatorios en el cuerpo de la solicitud.</w:t>
+            </w:r>
+          </w:p>
+        </w:tc>
+        <w:tc>
+          <w:tcPr>
+            <w:tcW w:type="dxa" w:w="3020"/>
+          </w:tcPr>
+          <w:p>
+            <w:r>
+              <w:t>Descripción: Verificar que el endpoint /init devuelva Bad Request si faltan parámetros obligatorios en el cuerpo de la solicitud.</w:t>
+            </w:r>
+          </w:p>
+        </w:tc>
+        <w:tc>
+          <w:tcPr>
+            <w:tcW w:type="dxa" w:w="3020"/>
+          </w:tcPr>
+          <w:p>
+            <w:r>
+              <w:t>Descripción: Verificar que el endpoint /init devuelva Bad Request si faltan parámetros obligatorios en el cuerpo de la solicitud.</w:t>
+            </w:r>
+          </w:p>
+        </w:tc>
+      </w:tr>
+      <w:tr>
+        <w:tc>
+          <w:tcPr>
+            <w:tcW w:type="dxa" w:w="3021"/>
+          </w:tcPr>
+          <w:p>
+            <w:r>
+              <w:t>Prerrequisitos: Controlador de Webpay desplegado.</w:t>
+            </w:r>
+          </w:p>
+        </w:tc>
+        <w:tc>
+          <w:tcPr>
+            <w:tcW w:type="dxa" w:w="3020"/>
+          </w:tcPr>
+          <w:p>
+            <w:r>
+              <w:t>Prerrequisitos: Controlador de Webpay desplegado.</w:t>
+            </w:r>
+          </w:p>
+        </w:tc>
+        <w:tc>
+          <w:tcPr>
+            <w:tcW w:type="dxa" w:w="3020"/>
+          </w:tcPr>
+          <w:p>
+            <w:r>
+              <w:t>Prerrequisitos: Controlador de Webpay desplegado.</w:t>
+            </w:r>
+          </w:p>
+        </w:tc>
+      </w:tr>
+      <w:tr>
+        <w:tc>
+          <w:tcPr>
+            <w:tcW w:type="dxa" w:w="3021"/>
+          </w:tcPr>
+          <w:p>
+            <w:r>
+              <w:t>Pasos: 1. Enviar una petición POST a /profiles/webpay/init omitiendo el monto. 2. Comprobar la respuesta.</w:t>
+            </w:r>
+          </w:p>
+        </w:tc>
+        <w:tc>
+          <w:tcPr>
+            <w:tcW w:type="dxa" w:w="3020"/>
+          </w:tcPr>
+          <w:p>
+            <w:r>
+              <w:t>Pasos: 1. Enviar una petición POST a /profiles/webpay/init omitiendo el monto. 2. Comprobar la respuesta.</w:t>
+            </w:r>
+          </w:p>
+        </w:tc>
+        <w:tc>
+          <w:tcPr>
+            <w:tcW w:type="dxa" w:w="3020"/>
+          </w:tcPr>
+          <w:p>
+            <w:r>
+              <w:t>Pasos: 1. Enviar una petición POST a /profiles/webpay/init omitiendo el monto. 2. Comprobar la respuesta.</w:t>
+            </w:r>
+          </w:p>
+        </w:tc>
+      </w:tr>
+      <w:tr>
+        <w:tc>
+          <w:tcPr>
+            <w:tcW w:type="dxa" w:w="3021"/>
+          </w:tcPr>
+          <w:p>
+            <w:r>
+              <w:t>Resultado esperado: El servidor responde HTTP 400 Bad Request y un mensaje JSON indicando los parámetros requeridos.</w:t>
+            </w:r>
+          </w:p>
+        </w:tc>
+        <w:tc>
+          <w:tcPr>
+            <w:tcW w:type="dxa" w:w="3020"/>
+          </w:tcPr>
+          <w:p>
+            <w:r>
+              <w:t>Resultado esperado: El servidor responde HTTP 400 Bad Request y un mensaje JSON indicando los parámetros requeridos.</w:t>
+            </w:r>
+          </w:p>
+        </w:tc>
+        <w:tc>
+          <w:tcPr>
+            <w:tcW w:type="dxa" w:w="3020"/>
+          </w:tcPr>
+          <w:p>
+            <w:r>
+              <w:t>Resultado esperado: El servidor responde HTTP 400 Bad Request y un mensaje JSON indicando los parámetros requeridos.</w:t>
+            </w:r>
+          </w:p>
+        </w:tc>
+      </w:tr>
+      <w:tr>
+        <w:tc>
+          <w:tcPr>
+            <w:tcW w:type="dxa" w:w="3021"/>
+          </w:tcPr>
+          <w:p>
+            <w:r>
+              <w:t>Resultado obtenido: Ejecutado con éxito. Pruebas de integración MockMvc pasadas al 100% en Maven.</w:t>
+            </w:r>
+          </w:p>
+        </w:tc>
+        <w:tc>
+          <w:tcPr>
+            <w:tcW w:type="dxa" w:w="3020"/>
+          </w:tcPr>
+          <w:p>
+            <w:r>
+              <w:t>Resultado obtenido: Ejecutado con éxito. Pruebas de integración MockMvc pasadas al 100% en Maven.</w:t>
+            </w:r>
+          </w:p>
+        </w:tc>
+        <w:tc>
+          <w:tcPr>
+            <w:tcW w:type="dxa" w:w="3020"/>
+          </w:tcPr>
+          <w:p>
+            <w:r>
+              <w:t>Resultado obtenido: Ejecutado con éxito. Pruebas de integración MockMvc pasadas al 100% en Maven.</w:t>
+            </w:r>
+          </w:p>
+        </w:tc>
+      </w:tr>
+      <w:tr>
+        <w:tc>
+          <w:tcPr>
+            <w:tcW w:type="dxa" w:w="3021"/>
+          </w:tcPr>
+          <w:p>
+            <w:r>
+              <w:t>Prueba de inicialización exitosa de transacción (WebpayController)</w:t>
+            </w:r>
+          </w:p>
+        </w:tc>
+        <w:tc>
+          <w:tcPr>
+            <w:tcW w:type="dxa" w:w="3020"/>
+          </w:tcPr>
+          <w:p>
+            <w:r>
+              <w:t>CP-70</w:t>
+            </w:r>
+          </w:p>
+        </w:tc>
+        <w:tc>
+          <w:tcPr>
+            <w:tcW w:type="dxa" w:w="3020"/>
+          </w:tcPr>
+          <w:p>
+            <w:r>
+              <w:t>CP-70</w:t>
+            </w:r>
+          </w:p>
+        </w:tc>
+      </w:tr>
+      <w:tr>
+        <w:tc>
+          <w:tcPr>
+            <w:tcW w:type="dxa" w:w="3021"/>
+          </w:tcPr>
+          <w:p>
+            <w:r>
+              <w:t>Prueba de inicialización exitosa de transacción (WebpayController)</w:t>
+            </w:r>
+          </w:p>
+        </w:tc>
+        <w:tc>
+          <w:tcPr>
+            <w:tcW w:type="dxa" w:w="3020"/>
+          </w:tcPr>
+          <w:p>
+            <w:r>
+              <w:t>¿Prueba de despliegue?</w:t>
+            </w:r>
+          </w:p>
+        </w:tc>
+        <w:tc>
+          <w:tcPr>
+            <w:tcW w:type="dxa" w:w="3020"/>
+          </w:tcPr>
+          <w:p>
+            <w:r>
+              <w:t>No</w:t>
+            </w:r>
+          </w:p>
+        </w:tc>
+      </w:tr>
+      <w:tr>
+        <w:tc>
+          <w:tcPr>
+            <w:tcW w:type="dxa" w:w="3021"/>
+          </w:tcPr>
+          <w:p>
+            <w:r>
+              <w:t>Descripción: Validar que con parámetros correctos se llame al servicio de Webpay y responda HTTP 200 OK con los datos de transacción.</w:t>
+            </w:r>
+          </w:p>
+        </w:tc>
+        <w:tc>
+          <w:tcPr>
+            <w:tcW w:type="dxa" w:w="3020"/>
+          </w:tcPr>
+          <w:p>
+            <w:r>
+              <w:t>Descripción: Validar que con parámetros correctos se llame al servicio de Webpay y responda HTTP 200 OK con los datos de transacción.</w:t>
+            </w:r>
+          </w:p>
+        </w:tc>
+        <w:tc>
+          <w:tcPr>
+            <w:tcW w:type="dxa" w:w="3020"/>
+          </w:tcPr>
+          <w:p>
+            <w:r>
+              <w:t>Descripción: Validar que con parámetros correctos se llame al servicio de Webpay y responda HTTP 200 OK con los datos de transacción.</w:t>
+            </w:r>
+          </w:p>
+        </w:tc>
+      </w:tr>
+      <w:tr>
+        <w:tc>
+          <w:tcPr>
+            <w:tcW w:type="dxa" w:w="3021"/>
+          </w:tcPr>
+          <w:p>
+            <w:r>
+              <w:t>Prerrequisitos: Controlador y servicios de Webpay listos y mockeados.</w:t>
+            </w:r>
+          </w:p>
+        </w:tc>
+        <w:tc>
+          <w:tcPr>
+            <w:tcW w:type="dxa" w:w="3020"/>
+          </w:tcPr>
+          <w:p>
+            <w:r>
+              <w:t>Prerrequisitos: Controlador y servicios de Webpay listos y mockeados.</w:t>
+            </w:r>
+          </w:p>
+        </w:tc>
+        <w:tc>
+          <w:tcPr>
+            <w:tcW w:type="dxa" w:w="3020"/>
+          </w:tcPr>
+          <w:p>
+            <w:r>
+              <w:t>Prerrequisitos: Controlador y servicios de Webpay listos y mockeados.</w:t>
+            </w:r>
+          </w:p>
+        </w:tc>
+      </w:tr>
+      <w:tr>
+        <w:tc>
+          <w:tcPr>
+            <w:tcW w:type="dxa" w:w="3021"/>
+          </w:tcPr>
+          <w:p>
+            <w:r>
+              <w:t>Pasos: 1. Enviar petición POST a /profiles/webpay/init con todos los datos correctos. 2. Verificar la respuesta.</w:t>
+            </w:r>
+          </w:p>
+        </w:tc>
+        <w:tc>
+          <w:tcPr>
+            <w:tcW w:type="dxa" w:w="3020"/>
+          </w:tcPr>
+          <w:p>
+            <w:r>
+              <w:t>Pasos: 1. Enviar petición POST a /profiles/webpay/init con todos los datos correctos. 2. Verificar la respuesta.</w:t>
+            </w:r>
+          </w:p>
+        </w:tc>
+        <w:tc>
+          <w:tcPr>
+            <w:tcW w:type="dxa" w:w="3020"/>
+          </w:tcPr>
+          <w:p>
+            <w:r>
+              <w:t>Pasos: 1. Enviar petición POST a /profiles/webpay/init con todos los datos correctos. 2. Verificar la respuesta.</w:t>
+            </w:r>
+          </w:p>
+        </w:tc>
+      </w:tr>
+      <w:tr>
+        <w:tc>
+          <w:tcPr>
+            <w:tcW w:type="dxa" w:w="3021"/>
+          </w:tcPr>
+          <w:p>
+            <w:r>
+              <w:t>Resultado esperado: El servidor responde HTTP 200 OK y devuelve el token de transacción y la URL de redirección en un JSON.</w:t>
+            </w:r>
+          </w:p>
+        </w:tc>
+        <w:tc>
+          <w:tcPr>
+            <w:tcW w:type="dxa" w:w="3020"/>
+          </w:tcPr>
+          <w:p>
+            <w:r>
+              <w:t>Resultado esperado: El servidor responde HTTP 200 OK y devuelve el token de transacción y la URL de redirección en un JSON.</w:t>
+            </w:r>
+          </w:p>
+        </w:tc>
+        <w:tc>
+          <w:tcPr>
+            <w:tcW w:type="dxa" w:w="3020"/>
+          </w:tcPr>
+          <w:p>
+            <w:r>
+              <w:t>Resultado esperado: El servidor responde HTTP 200 OK y devuelve el token de transacción y la URL de redirección en un JSON.</w:t>
+            </w:r>
+          </w:p>
+        </w:tc>
+      </w:tr>
+      <w:tr>
+        <w:tc>
+          <w:tcPr>
+            <w:tcW w:type="dxa" w:w="3021"/>
+          </w:tcPr>
+          <w:p>
+            <w:r>
+              <w:t>Resultado obtenido: Ejecutado con éxito. Pruebas de integración MockMvc pasadas al 100% en Maven.</w:t>
+            </w:r>
+          </w:p>
+        </w:tc>
+        <w:tc>
+          <w:tcPr>
+            <w:tcW w:type="dxa" w:w="3020"/>
+          </w:tcPr>
+          <w:p>
+            <w:r>
+              <w:t>Resultado obtenido: Ejecutado con éxito. Pruebas de integración MockMvc pasadas al 100% en Maven.</w:t>
+            </w:r>
+          </w:p>
+        </w:tc>
+        <w:tc>
+          <w:tcPr>
+            <w:tcW w:type="dxa" w:w="3020"/>
+          </w:tcPr>
+          <w:p>
+            <w:r>
+              <w:t>Resultado obtenido: Ejecutado con éxito. Pruebas de integración MockMvc pasadas al 100% en Maven.</w:t>
+            </w:r>
+          </w:p>
+        </w:tc>
+      </w:tr>
+      <w:tr>
+        <w:tc>
+          <w:tcPr>
+            <w:tcW w:type="dxa" w:w="3021"/>
+          </w:tcPr>
+          <w:p>
+            <w:r>
+              <w:t>Prueba de validación de token faltante al confirmar pago (WebpayController)</w:t>
+            </w:r>
+          </w:p>
+        </w:tc>
+        <w:tc>
+          <w:tcPr>
+            <w:tcW w:type="dxa" w:w="3020"/>
+          </w:tcPr>
+          <w:p>
+            <w:r>
+              <w:t>CP-71</w:t>
+            </w:r>
+          </w:p>
+        </w:tc>
+        <w:tc>
+          <w:tcPr>
+            <w:tcW w:type="dxa" w:w="3020"/>
+          </w:tcPr>
+          <w:p>
+            <w:r>
+              <w:t>CP-71</w:t>
+            </w:r>
+          </w:p>
+        </w:tc>
+      </w:tr>
+      <w:tr>
+        <w:tc>
+          <w:tcPr>
+            <w:tcW w:type="dxa" w:w="3021"/>
+          </w:tcPr>
+          <w:p>
+            <w:r>
+              <w:t>Prueba de validación de token faltante al confirmar pago (WebpayController)</w:t>
+            </w:r>
+          </w:p>
+        </w:tc>
+        <w:tc>
+          <w:tcPr>
+            <w:tcW w:type="dxa" w:w="3020"/>
+          </w:tcPr>
+          <w:p>
+            <w:r>
+              <w:t>¿Prueba de despliegue?</w:t>
+            </w:r>
+          </w:p>
+        </w:tc>
+        <w:tc>
+          <w:tcPr>
+            <w:tcW w:type="dxa" w:w="3020"/>
+          </w:tcPr>
+          <w:p>
+            <w:r>
+              <w:t>No</w:t>
+            </w:r>
+          </w:p>
+        </w:tc>
+      </w:tr>
+      <w:tr>
+        <w:tc>
+          <w:tcPr>
+            <w:tcW w:type="dxa" w:w="3021"/>
+          </w:tcPr>
+          <w:p>
+            <w:r>
+              <w:t>Descripción: Verificar que el endpoint /confirm responda HTTP 400 Bad Request si no se provee el token en la petición.</w:t>
+            </w:r>
+          </w:p>
+        </w:tc>
+        <w:tc>
+          <w:tcPr>
+            <w:tcW w:type="dxa" w:w="3020"/>
+          </w:tcPr>
+          <w:p>
+            <w:r>
+              <w:t>Descripción: Verificar que el endpoint /confirm responda HTTP 400 Bad Request si no se provee el token en la petición.</w:t>
+            </w:r>
+          </w:p>
+        </w:tc>
+        <w:tc>
+          <w:tcPr>
+            <w:tcW w:type="dxa" w:w="3020"/>
+          </w:tcPr>
+          <w:p>
+            <w:r>
+              <w:t>Descripción: Verificar que el endpoint /confirm responda HTTP 400 Bad Request si no se provee el token en la petición.</w:t>
+            </w:r>
+          </w:p>
+        </w:tc>
+      </w:tr>
+      <w:tr>
+        <w:tc>
+          <w:tcPr>
+            <w:tcW w:type="dxa" w:w="3021"/>
+          </w:tcPr>
+          <w:p>
+            <w:r>
+              <w:t>Prerrequisitos: Controlador de Webpay desplegado.</w:t>
+            </w:r>
+          </w:p>
+        </w:tc>
+        <w:tc>
+          <w:tcPr>
+            <w:tcW w:type="dxa" w:w="3020"/>
+          </w:tcPr>
+          <w:p>
+            <w:r>
+              <w:t>Prerrequisitos: Controlador de Webpay desplegado.</w:t>
+            </w:r>
+          </w:p>
+        </w:tc>
+        <w:tc>
+          <w:tcPr>
+            <w:tcW w:type="dxa" w:w="3020"/>
+          </w:tcPr>
+          <w:p>
+            <w:r>
+              <w:t>Prerrequisitos: Controlador de Webpay desplegado.</w:t>
+            </w:r>
+          </w:p>
+        </w:tc>
+      </w:tr>
+      <w:tr>
+        <w:tc>
+          <w:tcPr>
+            <w:tcW w:type="dxa" w:w="3021"/>
+          </w:tcPr>
+          <w:p>
+            <w:r>
+              <w:t>Pasos: 1. Enviar petición POST a /profiles/webpay/confirm sin el campo 'token'. 2. Comprobar la respuesta.</w:t>
+            </w:r>
+          </w:p>
+        </w:tc>
+        <w:tc>
+          <w:tcPr>
+            <w:tcW w:type="dxa" w:w="3020"/>
+          </w:tcPr>
+          <w:p>
+            <w:r>
+              <w:t>Pasos: 1. Enviar petición POST a /profiles/webpay/confirm sin el campo 'token'. 2. Comprobar la respuesta.</w:t>
+            </w:r>
+          </w:p>
+        </w:tc>
+        <w:tc>
+          <w:tcPr>
+            <w:tcW w:type="dxa" w:w="3020"/>
+          </w:tcPr>
+          <w:p>
+            <w:r>
+              <w:t>Pasos: 1. Enviar petición POST a /profiles/webpay/confirm sin el campo 'token'. 2. Comprobar la respuesta.</w:t>
+            </w:r>
+          </w:p>
+        </w:tc>
+      </w:tr>
+      <w:tr>
+        <w:tc>
+          <w:tcPr>
+            <w:tcW w:type="dxa" w:w="3021"/>
+          </w:tcPr>
+          <w:p>
+            <w:r>
+              <w:t>Resultado esperado: El servidor responde HTTP 400 Bad Request con un JSON especificando que el token es requerido.</w:t>
+            </w:r>
+          </w:p>
+        </w:tc>
+        <w:tc>
+          <w:tcPr>
+            <w:tcW w:type="dxa" w:w="3020"/>
+          </w:tcPr>
+          <w:p>
+            <w:r>
+              <w:t>Resultado esperado: El servidor responde HTTP 400 Bad Request con un JSON especificando que el token es requerido.</w:t>
+            </w:r>
+          </w:p>
+        </w:tc>
+        <w:tc>
+          <w:tcPr>
+            <w:tcW w:type="dxa" w:w="3020"/>
+          </w:tcPr>
+          <w:p>
+            <w:r>
+              <w:t>Resultado esperado: El servidor responde HTTP 400 Bad Request con un JSON especificando que el token es requerido.</w:t>
+            </w:r>
+          </w:p>
+        </w:tc>
+      </w:tr>
+      <w:tr>
+        <w:tc>
+          <w:tcPr>
+            <w:tcW w:type="dxa" w:w="3021"/>
+          </w:tcPr>
+          <w:p>
+            <w:r>
+              <w:t>Resultado obtenido: Ejecutado con éxito. Pruebas de integración MockMvc pasadas al 100% en Maven.</w:t>
+            </w:r>
+          </w:p>
+        </w:tc>
+        <w:tc>
+          <w:tcPr>
+            <w:tcW w:type="dxa" w:w="3020"/>
+          </w:tcPr>
+          <w:p>
+            <w:r>
+              <w:t>Resultado obtenido: Ejecutado con éxito. Pruebas de integración MockMvc pasadas al 100% en Maven.</w:t>
+            </w:r>
+          </w:p>
+        </w:tc>
+        <w:tc>
+          <w:tcPr>
+            <w:tcW w:type="dxa" w:w="3020"/>
+          </w:tcPr>
+          <w:p>
+            <w:r>
+              <w:t>Resultado obtenido: Ejecutado con éxito. Pruebas de integración MockMvc pasadas al 100% en Maven.</w:t>
+            </w:r>
+          </w:p>
+        </w:tc>
+      </w:tr>
+      <w:tr>
+        <w:tc>
+          <w:tcPr>
+            <w:tcW w:type="dxa" w:w="3021"/>
+          </w:tcPr>
+          <w:p>
+            <w:r>
+              <w:t>Prueba de confirmación exitosa de transacción (WebpayController)</w:t>
+            </w:r>
+          </w:p>
+        </w:tc>
+        <w:tc>
+          <w:tcPr>
+            <w:tcW w:type="dxa" w:w="3020"/>
+          </w:tcPr>
+          <w:p>
+            <w:r>
+              <w:t>CP-72</w:t>
+            </w:r>
+          </w:p>
+        </w:tc>
+        <w:tc>
+          <w:tcPr>
+            <w:tcW w:type="dxa" w:w="3020"/>
+          </w:tcPr>
+          <w:p>
+            <w:r>
+              <w:t>CP-72</w:t>
+            </w:r>
+          </w:p>
+        </w:tc>
+      </w:tr>
+      <w:tr>
+        <w:tc>
+          <w:tcPr>
+            <w:tcW w:type="dxa" w:w="3021"/>
+          </w:tcPr>
+          <w:p>
+            <w:r>
+              <w:t>Prueba de confirmación exitosa de transacción (WebpayController)</w:t>
+            </w:r>
+          </w:p>
+        </w:tc>
+        <w:tc>
+          <w:tcPr>
+            <w:tcW w:type="dxa" w:w="3020"/>
+          </w:tcPr>
+          <w:p>
+            <w:r>
+              <w:t>¿Prueba de despliegue?</w:t>
+            </w:r>
+          </w:p>
+        </w:tc>
+        <w:tc>
+          <w:tcPr>
+            <w:tcW w:type="dxa" w:w="3020"/>
+          </w:tcPr>
+          <w:p>
+            <w:r>
+              <w:t>No</w:t>
+            </w:r>
+          </w:p>
+        </w:tc>
+      </w:tr>
+      <w:tr>
+        <w:tc>
+          <w:tcPr>
+            <w:tcW w:type="dxa" w:w="3021"/>
+          </w:tcPr>
+          <w:p>
+            <w:r>
+              <w:t>Descripción: Comprobar que al enviar un token a /confirm, se llame al servicio de Webpay y responda HTTP 200 OK indicando autorización.</w:t>
+            </w:r>
+          </w:p>
+        </w:tc>
+        <w:tc>
+          <w:tcPr>
+            <w:tcW w:type="dxa" w:w="3020"/>
+          </w:tcPr>
+          <w:p>
+            <w:r>
+              <w:t>Descripción: Comprobar que al enviar un token a /confirm, se llame al servicio de Webpay y responda HTTP 200 OK indicando autorización.</w:t>
+            </w:r>
+          </w:p>
+        </w:tc>
+        <w:tc>
+          <w:tcPr>
+            <w:tcW w:type="dxa" w:w="3020"/>
+          </w:tcPr>
+          <w:p>
+            <w:r>
+              <w:t>Descripción: Comprobar que al enviar un token a /confirm, se llame al servicio de Webpay y responda HTTP 200 OK indicando autorización.</w:t>
+            </w:r>
+          </w:p>
+        </w:tc>
+      </w:tr>
+      <w:tr>
+        <w:tc>
+          <w:tcPr>
+            <w:tcW w:type="dxa" w:w="3021"/>
+          </w:tcPr>
+          <w:p>
+            <w:r>
+              <w:t>Prerrequisitos: Controlador y servicios de Webpay listos y mockeados.</w:t>
+            </w:r>
+          </w:p>
+        </w:tc>
+        <w:tc>
+          <w:tcPr>
+            <w:tcW w:type="dxa" w:w="3020"/>
+          </w:tcPr>
+          <w:p>
+            <w:r>
+              <w:t>Prerrequisitos: Controlador y servicios de Webpay listos y mockeados.</w:t>
+            </w:r>
+          </w:p>
+        </w:tc>
+        <w:tc>
+          <w:tcPr>
+            <w:tcW w:type="dxa" w:w="3020"/>
+          </w:tcPr>
+          <w:p>
+            <w:r>
+              <w:t>Prerrequisitos: Controlador y servicios de Webpay listos y mockeados.</w:t>
+            </w:r>
+          </w:p>
+        </w:tc>
+      </w:tr>
+      <w:tr>
+        <w:tc>
+          <w:tcPr>
+            <w:tcW w:type="dxa" w:w="3021"/>
+          </w:tcPr>
+          <w:p>
+            <w:r>
+              <w:t>Pasos: 1. Enviar petición POST a /profiles/webpay/confirm con token válido. 2. Verificar la respuesta.</w:t>
+            </w:r>
+          </w:p>
+        </w:tc>
+        <w:tc>
+          <w:tcPr>
+            <w:tcW w:type="dxa" w:w="3020"/>
+          </w:tcPr>
+          <w:p>
+            <w:r>
+              <w:t>Pasos: 1. Enviar petición POST a /profiles/webpay/confirm con token válido. 2. Verificar la respuesta.</w:t>
+            </w:r>
+          </w:p>
+        </w:tc>
+        <w:tc>
+          <w:tcPr>
+            <w:tcW w:type="dxa" w:w="3020"/>
+          </w:tcPr>
+          <w:p>
+            <w:r>
+              <w:t>Pasos: 1. Enviar petición POST a /profiles/webpay/confirm con token válido. 2. Verificar la respuesta.</w:t>
+            </w:r>
+          </w:p>
+        </w:tc>
+      </w:tr>
+      <w:tr>
+        <w:tc>
+          <w:tcPr>
+            <w:tcW w:type="dxa" w:w="3021"/>
+          </w:tcPr>
+          <w:p>
+            <w:r>
+              <w:t>Resultado esperado: El servidor responde HTTP 200 OK con un JSON detallando que el estado es AUTHORIZED.</w:t>
+            </w:r>
+          </w:p>
+        </w:tc>
+        <w:tc>
+          <w:tcPr>
+            <w:tcW w:type="dxa" w:w="3020"/>
+          </w:tcPr>
+          <w:p>
+            <w:r>
+              <w:t>Resultado esperado: El servidor responde HTTP 200 OK con un JSON detallando que el estado es AUTHORIZED.</w:t>
+            </w:r>
+          </w:p>
+        </w:tc>
+        <w:tc>
+          <w:tcPr>
+            <w:tcW w:type="dxa" w:w="3020"/>
+          </w:tcPr>
+          <w:p>
+            <w:r>
+              <w:t>Resultado esperado: El servidor responde HTTP 200 OK con un JSON detallando que el estado es AUTHORIZED.</w:t>
+            </w:r>
+          </w:p>
+        </w:tc>
+      </w:tr>
+      <w:tr>
+        <w:tc>
+          <w:tcPr>
+            <w:tcW w:type="dxa" w:w="3021"/>
+          </w:tcPr>
+          <w:p>
+            <w:r>
+              <w:t>Resultado obtenido: Ejecutado con éxito. Pruebas de integración MockMvc pasadas al 100% en Maven.</w:t>
+            </w:r>
+          </w:p>
+        </w:tc>
+        <w:tc>
+          <w:tcPr>
+            <w:tcW w:type="dxa" w:w="3020"/>
+          </w:tcPr>
+          <w:p>
+            <w:r>
+              <w:t>Resultado obtenido: Ejecutado con éxito. Pruebas de integración MockMvc pasadas al 100% en Maven.</w:t>
+            </w:r>
+          </w:p>
+        </w:tc>
+        <w:tc>
+          <w:tcPr>
+            <w:tcW w:type="dxa" w:w="3020"/>
+          </w:tcPr>
+          <w:p>
+            <w:r>
+              <w:t>Resultado obtenido: Ejecutado con éxito. Pruebas de integración MockMvc pasadas al 100% en Maven.</w:t>
             </w:r>
           </w:p>
         </w:tc>
@@ -47925,6 +50341,310 @@
           <w:p>
             <w:r>
               <w:t>CP-64</w:t>
+            </w:r>
+          </w:p>
+        </w:tc>
+        <w:tc>
+          <w:tcPr>
+            <w:tcW w:type="dxa" w:w="2256"/>
+          </w:tcPr>
+          <w:p>
+            <w:r>
+              <w:t>X</w:t>
+            </w:r>
+          </w:p>
+        </w:tc>
+        <w:tc>
+          <w:tcPr>
+            <w:tcW w:type="dxa" w:w="2258"/>
+          </w:tcPr>
+          <w:p>
+            <w:r/>
+          </w:p>
+        </w:tc>
+        <w:tc>
+          <w:tcPr>
+            <w:tcW w:type="dxa" w:w="2293"/>
+          </w:tcPr>
+          <w:p>
+            <w:r/>
+          </w:p>
+        </w:tc>
+      </w:tr>
+      <w:tr>
+        <w:tc>
+          <w:tcPr>
+            <w:tcW w:type="dxa" w:w="2254"/>
+          </w:tcPr>
+          <w:p>
+            <w:r>
+              <w:t>CP-65</w:t>
+            </w:r>
+          </w:p>
+        </w:tc>
+        <w:tc>
+          <w:tcPr>
+            <w:tcW w:type="dxa" w:w="2256"/>
+          </w:tcPr>
+          <w:p>
+            <w:r>
+              <w:t>X</w:t>
+            </w:r>
+          </w:p>
+        </w:tc>
+        <w:tc>
+          <w:tcPr>
+            <w:tcW w:type="dxa" w:w="2258"/>
+          </w:tcPr>
+          <w:p>
+            <w:r/>
+          </w:p>
+        </w:tc>
+        <w:tc>
+          <w:tcPr>
+            <w:tcW w:type="dxa" w:w="2293"/>
+          </w:tcPr>
+          <w:p>
+            <w:r/>
+          </w:p>
+        </w:tc>
+      </w:tr>
+      <w:tr>
+        <w:tc>
+          <w:tcPr>
+            <w:tcW w:type="dxa" w:w="2254"/>
+          </w:tcPr>
+          <w:p>
+            <w:r>
+              <w:t>CP-66</w:t>
+            </w:r>
+          </w:p>
+        </w:tc>
+        <w:tc>
+          <w:tcPr>
+            <w:tcW w:type="dxa" w:w="2256"/>
+          </w:tcPr>
+          <w:p>
+            <w:r>
+              <w:t>X</w:t>
+            </w:r>
+          </w:p>
+        </w:tc>
+        <w:tc>
+          <w:tcPr>
+            <w:tcW w:type="dxa" w:w="2258"/>
+          </w:tcPr>
+          <w:p>
+            <w:r/>
+          </w:p>
+        </w:tc>
+        <w:tc>
+          <w:tcPr>
+            <w:tcW w:type="dxa" w:w="2293"/>
+          </w:tcPr>
+          <w:p>
+            <w:r/>
+          </w:p>
+        </w:tc>
+      </w:tr>
+      <w:tr>
+        <w:tc>
+          <w:tcPr>
+            <w:tcW w:type="dxa" w:w="2254"/>
+          </w:tcPr>
+          <w:p>
+            <w:r>
+              <w:t>CP-67</w:t>
+            </w:r>
+          </w:p>
+        </w:tc>
+        <w:tc>
+          <w:tcPr>
+            <w:tcW w:type="dxa" w:w="2256"/>
+          </w:tcPr>
+          <w:p>
+            <w:r>
+              <w:t>X</w:t>
+            </w:r>
+          </w:p>
+        </w:tc>
+        <w:tc>
+          <w:tcPr>
+            <w:tcW w:type="dxa" w:w="2258"/>
+          </w:tcPr>
+          <w:p>
+            <w:r/>
+          </w:p>
+        </w:tc>
+        <w:tc>
+          <w:tcPr>
+            <w:tcW w:type="dxa" w:w="2293"/>
+          </w:tcPr>
+          <w:p>
+            <w:r/>
+          </w:p>
+        </w:tc>
+      </w:tr>
+      <w:tr>
+        <w:tc>
+          <w:tcPr>
+            <w:tcW w:type="dxa" w:w="2254"/>
+          </w:tcPr>
+          <w:p>
+            <w:r>
+              <w:t>CP-68</w:t>
+            </w:r>
+          </w:p>
+        </w:tc>
+        <w:tc>
+          <w:tcPr>
+            <w:tcW w:type="dxa" w:w="2256"/>
+          </w:tcPr>
+          <w:p>
+            <w:r>
+              <w:t>X</w:t>
+            </w:r>
+          </w:p>
+        </w:tc>
+        <w:tc>
+          <w:tcPr>
+            <w:tcW w:type="dxa" w:w="2258"/>
+          </w:tcPr>
+          <w:p>
+            <w:r/>
+          </w:p>
+        </w:tc>
+        <w:tc>
+          <w:tcPr>
+            <w:tcW w:type="dxa" w:w="2293"/>
+          </w:tcPr>
+          <w:p>
+            <w:r/>
+          </w:p>
+        </w:tc>
+      </w:tr>
+      <w:tr>
+        <w:tc>
+          <w:tcPr>
+            <w:tcW w:type="dxa" w:w="2254"/>
+          </w:tcPr>
+          <w:p>
+            <w:r>
+              <w:t>CP-69</w:t>
+            </w:r>
+          </w:p>
+        </w:tc>
+        <w:tc>
+          <w:tcPr>
+            <w:tcW w:type="dxa" w:w="2256"/>
+          </w:tcPr>
+          <w:p>
+            <w:r>
+              <w:t>X</w:t>
+            </w:r>
+          </w:p>
+        </w:tc>
+        <w:tc>
+          <w:tcPr>
+            <w:tcW w:type="dxa" w:w="2258"/>
+          </w:tcPr>
+          <w:p>
+            <w:r/>
+          </w:p>
+        </w:tc>
+        <w:tc>
+          <w:tcPr>
+            <w:tcW w:type="dxa" w:w="2293"/>
+          </w:tcPr>
+          <w:p>
+            <w:r/>
+          </w:p>
+        </w:tc>
+      </w:tr>
+      <w:tr>
+        <w:tc>
+          <w:tcPr>
+            <w:tcW w:type="dxa" w:w="2254"/>
+          </w:tcPr>
+          <w:p>
+            <w:r>
+              <w:t>CP-70</w:t>
+            </w:r>
+          </w:p>
+        </w:tc>
+        <w:tc>
+          <w:tcPr>
+            <w:tcW w:type="dxa" w:w="2256"/>
+          </w:tcPr>
+          <w:p>
+            <w:r>
+              <w:t>X</w:t>
+            </w:r>
+          </w:p>
+        </w:tc>
+        <w:tc>
+          <w:tcPr>
+            <w:tcW w:type="dxa" w:w="2258"/>
+          </w:tcPr>
+          <w:p>
+            <w:r/>
+          </w:p>
+        </w:tc>
+        <w:tc>
+          <w:tcPr>
+            <w:tcW w:type="dxa" w:w="2293"/>
+          </w:tcPr>
+          <w:p>
+            <w:r/>
+          </w:p>
+        </w:tc>
+      </w:tr>
+      <w:tr>
+        <w:tc>
+          <w:tcPr>
+            <w:tcW w:type="dxa" w:w="2254"/>
+          </w:tcPr>
+          <w:p>
+            <w:r>
+              <w:t>CP-71</w:t>
+            </w:r>
+          </w:p>
+        </w:tc>
+        <w:tc>
+          <w:tcPr>
+            <w:tcW w:type="dxa" w:w="2256"/>
+          </w:tcPr>
+          <w:p>
+            <w:r>
+              <w:t>X</w:t>
+            </w:r>
+          </w:p>
+        </w:tc>
+        <w:tc>
+          <w:tcPr>
+            <w:tcW w:type="dxa" w:w="2258"/>
+          </w:tcPr>
+          <w:p>
+            <w:r/>
+          </w:p>
+        </w:tc>
+        <w:tc>
+          <w:tcPr>
+            <w:tcW w:type="dxa" w:w="2293"/>
+          </w:tcPr>
+          <w:p>
+            <w:r/>
+          </w:p>
+        </w:tc>
+      </w:tr>
+      <w:tr>
+        <w:tc>
+          <w:tcPr>
+            <w:tcW w:type="dxa" w:w="2254"/>
+          </w:tcPr>
+          <w:p>
+            <w:r>
+              <w:t>CP-72</w:t>
             </w:r>
           </w:p>
         </w:tc>

</xml_diff>